<commit_message>
docs(project_progress): 워크플로우 문서 제목-본문 정합 + As-Is→To-Be 표 추가
- 02: 제목을 검증(PoC) 성격에 맞게 변경(GUI 자동화 검증 (workflow 1)), §1 As-Is→To-Be 표 신설, 섹션 제목·번호·내부 참조 정리
- 03: 본문에 없던 '인식' 제거 + (workflow 2) 명시, As-Is→To-Be(등록 1장→consensus, 벤치 수치) 표 신설
- 04: 제목 어순 재배열 + (workflow 3) 명시, As-Is→To-Be(수동 5분→무인 1분) 표 신설
- 00: 목적 항목을 As-Is/To-Be 라벨로 재구성
- README 문서 목록 갱신, docx 재생성

Co-Authored-By: Claude Fable 5 <noreply@anthropic.com>
Claude-Session: https://claude.ai/code/session_01C5YbnVWaijoxPp44Dj1uc6
</commit_message>
<xml_diff>
--- a/docs/project_progress/project_progress_report.docx
+++ b/docs/project_progress/project_progress_report.docx
@@ -136,7 +136,7 @@
           <w:b w:val="0"/>
           <w:sz w:val="22"/>
         </w:rPr>
-        <w:t>02. 첫번째 워크플로우 구현 작업 — RCS GUI 자동화 및 CCTV 캡처 PoC</w:t>
+        <w:t>02. GUI 자동화 검증 (workflow 1) — RCS 자동 조작 및 CCTV 캡처 PoC</w:t>
       </w:r>
     </w:p>
     <w:p>
@@ -149,7 +149,7 @@
           <w:b w:val="0"/>
           <w:sz w:val="22"/>
         </w:rPr>
-        <w:t>03. Align Fail 인식과 위치 재조정을 위한 Computer Vision(CV) 평가</w:t>
+        <w:t>03. 정렬 위치 재조정 CV 정확도 평가 (workflow 2) — 오프라인 벤치</w:t>
       </w:r>
     </w:p>
     <w:p>
@@ -162,7 +162,7 @@
           <w:b w:val="0"/>
           <w:sz w:val="22"/>
         </w:rPr>
-        <w:t>04. 본격 PoC 구현 — 실시간 Align Fail 자동 대응 Agent</w:t>
+        <w:t>04. 실시간 Align Fail 자동 대응 Agent (workflow 3) — 본격 PoC 구현</w:t>
       </w:r>
     </w:p>
     <w:p>
@@ -260,14 +260,14 @@
           <w:b/>
           <w:sz w:val="21"/>
         </w:rPr>
-        <w:t>현재 대응 시간</w:t>
-      </w:r>
-      <w:r>
-        <w:rPr>
-          <w:rFonts w:ascii="맑은 고딕" w:hAnsi="맑은 고딕" w:eastAsia="맑은 고딕"/>
-          <w:sz w:val="21"/>
-        </w:rPr>
-        <w:t>: 1건당 평균 5분(구성원이 감지·접속·수동 재정렬).</w:t>
+        <w:t>As-Is (현재)</w:t>
+      </w:r>
+      <w:r>
+        <w:rPr>
+          <w:rFonts w:ascii="맑은 고딕" w:hAnsi="맑은 고딕" w:eastAsia="맑은 고딕"/>
+          <w:sz w:val="21"/>
+        </w:rPr>
+        <w:t>: Line 구성원이 직접 감지·접속·수동 재정렬 — 1건당 평균 5분.</w:t>
       </w:r>
     </w:p>
     <w:p>
@@ -290,14 +290,14 @@
           <w:b/>
           <w:sz w:val="21"/>
         </w:rPr>
-        <w:t>목표</w:t>
-      </w:r>
-      <w:r>
-        <w:rPr>
-          <w:rFonts w:ascii="맑은 고딕" w:hAnsi="맑은 고딕" w:eastAsia="맑은 고딕"/>
-          <w:sz w:val="21"/>
-        </w:rPr>
-        <w:t>: AI 자동 대응으로 1분까지 단축(4분 감소).</w:t>
+        <w:t>To-Be (목표)</w:t>
+      </w:r>
+      <w:r>
+        <w:rPr>
+          <w:rFonts w:ascii="맑은 고딕" w:hAnsi="맑은 고딕" w:eastAsia="맑은 고딕"/>
+          <w:sz w:val="21"/>
+        </w:rPr>
+        <w:t>: AI가 감지부터 보정까지 무인 자동 대응 — 1건당 1분까지 단축(4분 감소).</w:t>
       </w:r>
     </w:p>
     <w:p>
@@ -2978,7 +2978,7 @@
           <w:color w:val="142A55"/>
           <w:sz w:val="34"/>
         </w:rPr>
-        <w:t>02. 첫번째 워크플로우 구현 작업 — RCS GUI 자동화 및 CCTV 캡처 PoC</w:t>
+        <w:t>02. GUI 자동화 검증 (workflow 1) — RCS 자동 조작 및 CCTV 캡처 PoC</w:t>
       </w:r>
     </w:p>
     <w:p>
@@ -3018,7 +3018,7 @@
           <w:color w:val="556070"/>
           <w:sz w:val="20"/>
         </w:rPr>
-        <w:t xml:space="preserve"> 는 장비 제어로 들어가는 첫 관문(Gateway)입니다. 장비 자동화에 앞서 VLM이 RCS를 직접 조작할 수 있는 환경부터 갖춰야 합니다. 이 단계에서는 RCS GUI 자동화와, Align Fail 시점을 기록하기 위한 CCTV 캡처의 실현 가능성을 평가했습니다. 현재는 동결(frozen) 상태이며, 운영 경로는 실시간 통합 루프로 옮겼습니다.</w:t>
+        <w:t xml:space="preserve"> 는 장비 제어로 들어가는 첫 관문(Gateway)입니다. 장비 자동화에 앞서 VLM이 RCS를 직접 조작할 수 있는 환경부터 갖춰야 합니다. 이 단계에서는 RCS GUI 자동화와, Align Fail 시점을 기록하기 위한 CCTV 캡처의 실현 가능성을 평가했습니다. 현재는 동결(frozen) 상태이며, 운영 경로는 실시간 통합 루프(04 문서)로 옮겼습니다.</w:t>
       </w:r>
     </w:p>
     <w:p>
@@ -3032,7 +3032,7 @@
           <w:color w:val="142A55"/>
           <w:sz w:val="27"/>
         </w:rPr>
-        <w:t>1. 기술 구현 평가</w:t>
+        <w:t>1. As-Is → To-Be</w:t>
       </w:r>
     </w:p>
     <w:p>
@@ -3044,131 +3044,226 @@
           <w:rFonts w:ascii="맑은 고딕" w:hAnsi="맑은 고딕" w:eastAsia="맑은 고딕"/>
           <w:sz w:val="21"/>
         </w:rPr>
-        <w:t>VLM으로 RCS를 자동 조작하는 파이프라인을 구현하고 평가했습니다.</w:t>
-      </w:r>
+        <w:t>이 단계에서 자동화로 바꾸려는 대상과, 검증한 목표 상태는 다음과 같습니다.</w:t>
+      </w:r>
+    </w:p>
+    <w:tbl>
+      <w:tblPr>
+        <w:tblStyle w:val="LightGrid-Accent1"/>
+        <w:tblW w:type="auto" w:w="0"/>
+        <w:jc w:val="center"/>
+        <w:tblLook w:firstColumn="1" w:firstRow="1" w:lastColumn="0" w:lastRow="0" w:noHBand="0" w:noVBand="1" w:val="04A0"/>
+      </w:tblPr>
+      <w:tblGrid>
+        <w:gridCol w:w="2880"/>
+        <w:gridCol w:w="2880"/>
+        <w:gridCol w:w="2880"/>
+      </w:tblGrid>
+      <w:tr>
+        <w:tc>
+          <w:tcPr>
+            <w:tcW w:type="dxa" w:w="2880"/>
+            <w:shd w:val="clear" w:fill="142A55"/>
+          </w:tcPr>
+          <w:p>
+            <w:r/>
+            <w:r>
+              <w:rPr>
+                <w:rFonts w:ascii="맑은 고딕" w:hAnsi="맑은 고딕" w:eastAsia="맑은 고딕"/>
+                <w:b/>
+                <w:color w:val="FFFFFF"/>
+                <w:sz w:val="19"/>
+              </w:rPr>
+              <w:t>항목</w:t>
+            </w:r>
+          </w:p>
+        </w:tc>
+        <w:tc>
+          <w:tcPr>
+            <w:tcW w:type="dxa" w:w="2880"/>
+            <w:shd w:val="clear" w:fill="142A55"/>
+          </w:tcPr>
+          <w:p>
+            <w:r/>
+            <w:r>
+              <w:rPr>
+                <w:rFonts w:ascii="맑은 고딕" w:hAnsi="맑은 고딕" w:eastAsia="맑은 고딕"/>
+                <w:b/>
+                <w:color w:val="FFFFFF"/>
+                <w:sz w:val="19"/>
+              </w:rPr>
+              <w:t>As-Is (사람 수동)</w:t>
+            </w:r>
+          </w:p>
+        </w:tc>
+        <w:tc>
+          <w:tcPr>
+            <w:tcW w:type="dxa" w:w="2880"/>
+            <w:shd w:val="clear" w:fill="142A55"/>
+          </w:tcPr>
+          <w:p>
+            <w:r/>
+            <w:r>
+              <w:rPr>
+                <w:rFonts w:ascii="맑은 고딕" w:hAnsi="맑은 고딕" w:eastAsia="맑은 고딕"/>
+                <w:b/>
+                <w:color w:val="FFFFFF"/>
+                <w:sz w:val="19"/>
+              </w:rPr>
+              <w:t>To-Be (이 단계에서 검증한 자동화)</w:t>
+            </w:r>
+          </w:p>
+        </w:tc>
+      </w:tr>
+      <w:tr>
+        <w:tc>
+          <w:tcPr>
+            <w:tcW w:type="dxa" w:w="2880"/>
+          </w:tcPr>
+          <w:p>
+            <w:r/>
+            <w:r>
+              <w:rPr>
+                <w:rFonts w:ascii="맑은 고딕" w:hAnsi="맑은 고딕" w:eastAsia="맑은 고딕"/>
+                <w:sz w:val="19"/>
+              </w:rPr>
+              <w:t>RCS 조작</w:t>
+            </w:r>
+          </w:p>
+        </w:tc>
+        <w:tc>
+          <w:tcPr>
+            <w:tcW w:type="dxa" w:w="2880"/>
+          </w:tcPr>
+          <w:p>
+            <w:r/>
+            <w:r>
+              <w:rPr>
+                <w:rFonts w:ascii="맑은 고딕" w:hAnsi="맑은 고딕" w:eastAsia="맑은 고딕"/>
+                <w:sz w:val="19"/>
+              </w:rPr>
+              <w:t>엔지니어가 직접 로그인하고 장비 목록에서 대상 장비를 찾아 접속</w:t>
+            </w:r>
+          </w:p>
+        </w:tc>
+        <w:tc>
+          <w:tcPr>
+            <w:tcW w:type="dxa" w:w="2880"/>
+          </w:tcPr>
+          <w:p>
+            <w:r/>
+            <w:r>
+              <w:rPr>
+                <w:rFonts w:ascii="맑은 고딕" w:hAnsi="맑은 고딕" w:eastAsia="맑은 고딕"/>
+                <w:sz w:val="19"/>
+              </w:rPr>
+              <w:t>VLM이 화면 좌표를 찾아 로그인 → 장비 선택 → 대응 화면 진입까지 자동 수행</w:t>
+            </w:r>
+          </w:p>
+        </w:tc>
+      </w:tr>
+      <w:tr>
+        <w:tc>
+          <w:tcPr>
+            <w:tcW w:type="dxa" w:w="2880"/>
+          </w:tcPr>
+          <w:p>
+            <w:r/>
+            <w:r>
+              <w:rPr>
+                <w:rFonts w:ascii="맑은 고딕" w:hAnsi="맑은 고딕" w:eastAsia="맑은 고딕"/>
+                <w:sz w:val="19"/>
+              </w:rPr>
+              <w:t>알람 확인</w:t>
+            </w:r>
+          </w:p>
+        </w:tc>
+        <w:tc>
+          <w:tcPr>
+            <w:tcW w:type="dxa" w:w="2880"/>
+          </w:tcPr>
+          <w:p>
+            <w:r/>
+            <w:r>
+              <w:rPr>
+                <w:rFonts w:ascii="맑은 고딕" w:hAnsi="맑은 고딕" w:eastAsia="맑은 고딕"/>
+                <w:sz w:val="19"/>
+              </w:rPr>
+              <w:t>사람이 알람을 수시로 확인</w:t>
+            </w:r>
+          </w:p>
+        </w:tc>
+        <w:tc>
+          <w:tcPr>
+            <w:tcW w:type="dxa" w:w="2880"/>
+          </w:tcPr>
+          <w:p>
+            <w:r/>
+            <w:r>
+              <w:rPr>
+                <w:rFonts w:ascii="맑은 고딕" w:hAnsi="맑은 고딕" w:eastAsia="맑은 고딕"/>
+                <w:sz w:val="19"/>
+              </w:rPr>
+              <w:t>1~2분 주기로 자동 확인, 정렬 실패 알람만 선별(중복·지연 보고 처리)</w:t>
+            </w:r>
+          </w:p>
+        </w:tc>
+      </w:tr>
+      <w:tr>
+        <w:tc>
+          <w:tcPr>
+            <w:tcW w:type="dxa" w:w="2880"/>
+          </w:tcPr>
+          <w:p>
+            <w:r/>
+            <w:r>
+              <w:rPr>
+                <w:rFonts w:ascii="맑은 고딕" w:hAnsi="맑은 고딕" w:eastAsia="맑은 고딕"/>
+                <w:sz w:val="19"/>
+              </w:rPr>
+              <w:t>실패 시점 기록</w:t>
+            </w:r>
+          </w:p>
+        </w:tc>
+        <w:tc>
+          <w:tcPr>
+            <w:tcW w:type="dxa" w:w="2880"/>
+          </w:tcPr>
+          <w:p>
+            <w:r/>
+            <w:r>
+              <w:rPr>
+                <w:rFonts w:ascii="맑은 고딕" w:hAnsi="맑은 고딕" w:eastAsia="맑은 고딕"/>
+                <w:sz w:val="19"/>
+              </w:rPr>
+              <w:t>기록이 남지 않아 원인 분석 시 재현이 어려움</w:t>
+            </w:r>
+          </w:p>
+        </w:tc>
+        <w:tc>
+          <w:tcPr>
+            <w:tcW w:type="dxa" w:w="2880"/>
+          </w:tcPr>
+          <w:p>
+            <w:r/>
+            <w:r>
+              <w:rPr>
+                <w:rFonts w:ascii="맑은 고딕" w:hAnsi="맑은 고딕" w:eastAsia="맑은 고딕"/>
+                <w:sz w:val="19"/>
+              </w:rPr>
+              <w:t>Align Fail 시점 화면을 자동 캡처·저장</w:t>
+            </w:r>
+          </w:p>
+        </w:tc>
+      </w:tr>
+    </w:tbl>
+    <w:p>
+      <w:pPr>
+        <w:spacing w:after="80"/>
+      </w:pPr>
     </w:p>
     <w:p>
       <w:pPr>
-        <w:spacing w:after="60"/>
-        <w:ind w:left="360"/>
-      </w:pPr>
-      <w:r>
-        <w:rPr>
-          <w:rFonts w:ascii="맑은 고딕" w:hAnsi="맑은 고딕" w:eastAsia="맑은 고딕"/>
-          <w:b/>
-          <w:color w:val="142A55"/>
-          <w:sz w:val="21"/>
-        </w:rPr>
-        <w:t xml:space="preserve">1. </w:t>
-      </w:r>
-      <w:r>
-        <w:rPr>
-          <w:rFonts w:ascii="맑은 고딕" w:hAnsi="맑은 고딕" w:eastAsia="맑은 고딕"/>
-          <w:b/>
-          <w:sz w:val="21"/>
-        </w:rPr>
-        <w:t>로그인 &amp; 탐색</w:t>
-      </w:r>
-      <w:r>
-        <w:rPr>
-          <w:rFonts w:ascii="맑은 고딕" w:hAnsi="맑은 고딕" w:eastAsia="맑은 고딕"/>
-          <w:sz w:val="21"/>
-        </w:rPr>
-        <w:t xml:space="preserve"> — RCS를 실행해 로그인한 뒤 장비 목록으로 들어갑니다.</w:t>
-      </w:r>
-    </w:p>
-    <w:p>
-      <w:pPr>
-        <w:spacing w:after="60"/>
-        <w:ind w:left="360"/>
-      </w:pPr>
-      <w:r>
-        <w:rPr>
-          <w:rFonts w:ascii="맑은 고딕" w:hAnsi="맑은 고딕" w:eastAsia="맑은 고딕"/>
-          <w:b/>
-          <w:color w:val="142A55"/>
-          <w:sz w:val="21"/>
-        </w:rPr>
-        <w:t xml:space="preserve">2. </w:t>
-      </w:r>
-      <w:r>
-        <w:rPr>
-          <w:rFonts w:ascii="맑은 고딕" w:hAnsi="맑은 고딕" w:eastAsia="맑은 고딕"/>
-          <w:b/>
-          <w:sz w:val="21"/>
-        </w:rPr>
-        <w:t>정렬 실패 알람 감지</w:t>
-      </w:r>
-      <w:r>
-        <w:rPr>
-          <w:rFonts w:ascii="맑은 고딕" w:hAnsi="맑은 고딕" w:eastAsia="맑은 고딕"/>
-          <w:sz w:val="21"/>
-        </w:rPr>
-        <w:t xml:space="preserve"> — 계측 알람을 1~2분 주기로 확인해 정렬 실패 알람만 골라냅니다. 중복 알람이나 뒤늦게 보고되는 알람도 놓치지 않습니다.</w:t>
-      </w:r>
-    </w:p>
-    <w:p>
-      <w:pPr>
-        <w:spacing w:after="60"/>
-        <w:ind w:left="360"/>
-      </w:pPr>
-      <w:r>
-        <w:rPr>
-          <w:rFonts w:ascii="맑은 고딕" w:hAnsi="맑은 고딕" w:eastAsia="맑은 고딕"/>
-          <w:b/>
-          <w:color w:val="142A55"/>
-          <w:sz w:val="21"/>
-        </w:rPr>
-        <w:t xml:space="preserve">3. </w:t>
-      </w:r>
-      <w:r>
-        <w:rPr>
-          <w:rFonts w:ascii="맑은 고딕" w:hAnsi="맑은 고딕" w:eastAsia="맑은 고딕"/>
-          <w:b/>
-          <w:sz w:val="21"/>
-        </w:rPr>
-        <w:t>대응 화면 진입</w:t>
-      </w:r>
-      <w:r>
-        <w:rPr>
-          <w:rFonts w:ascii="맑은 고딕" w:hAnsi="맑은 고딕" w:eastAsia="맑은 고딕"/>
-          <w:sz w:val="21"/>
-        </w:rPr>
-        <w:t xml:space="preserve"> — 감지된 장비에 접속해 대응 화면으로 이동합니다.</w:t>
-      </w:r>
-    </w:p>
-    <w:p>
-      <w:pPr>
-        <w:spacing w:after="60"/>
-        <w:ind w:left="360"/>
-      </w:pPr>
-      <w:r>
-        <w:rPr>
-          <w:rFonts w:ascii="맑은 고딕" w:hAnsi="맑은 고딕" w:eastAsia="맑은 고딕"/>
-          <w:b/>
-          <w:color w:val="142A55"/>
-          <w:sz w:val="21"/>
-        </w:rPr>
-        <w:t xml:space="preserve">4. </w:t>
-      </w:r>
-      <w:r>
-        <w:rPr>
-          <w:rFonts w:ascii="맑은 고딕" w:hAnsi="맑은 고딕" w:eastAsia="맑은 고딕"/>
-          <w:b/>
-          <w:sz w:val="21"/>
-        </w:rPr>
-        <w:t>알림 &amp; 로그</w:t>
-      </w:r>
-      <w:r>
-        <w:rPr>
-          <w:rFonts w:ascii="맑은 고딕" w:hAnsi="맑은 고딕" w:eastAsia="맑은 고딕"/>
-          <w:sz w:val="21"/>
-        </w:rPr>
-        <w:t xml:space="preserve"> — 처리 결과는 팝업과 로그로 남기고, 같은 장비에서 중복으로 뜨는 알람은 해제한 뒤 재발할 때만 다시 알립니다.</w:t>
-      </w:r>
-    </w:p>
-    <w:p>
-      <w:pPr>
         <w:spacing w:after="120"/>
       </w:pPr>
       <w:r>
@@ -3176,7 +3271,7 @@
           <w:rFonts w:ascii="맑은 고딕" w:hAnsi="맑은 고딕" w:eastAsia="맑은 고딕"/>
           <w:sz w:val="21"/>
         </w:rPr>
-        <w:t>여기에 더해 Align Fail 시점의 기록을 확보하려고 CCTV 캡처도 함께 평가했습니다(§4 한계 참조).</w:t>
+        <w:t>검증 결과: RCS 자동 조작은 클릭·타이핑 정확도 90% 이상으로 가능성을 증명했고(§3), CCTV 기반 기록 추출은 한계를 확인해 중단했습니다(§5). 검증된 자동화의 운영은 실시간 통합 루프(04 문서)로 이관했습니다.</w:t>
       </w:r>
     </w:p>
     <w:p>
@@ -3190,7 +3285,7 @@
           <w:color w:val="142A55"/>
           <w:sz w:val="27"/>
         </w:rPr>
-        <w:t>2. 핵심 확보 기술</w:t>
+        <w:t>2. 검증한 자동화 파이프라인</w:t>
       </w:r>
     </w:p>
     <w:p>
@@ -3202,7 +3297,7 @@
           <w:rFonts w:ascii="맑은 고딕" w:hAnsi="맑은 고딕" w:eastAsia="맑은 고딕"/>
           <w:sz w:val="21"/>
         </w:rPr>
-        <w:t>RCS는 화면 요소가 표준 컴포넌트로 만들어져 있지 않아, 일반 UI 자동화 도구로는 버튼이나 입력창을 인식하지 못합니다. 그래서 화면을 이미지로 보고 좌표를 찾는 VLM 방식으로 구현했습니다.</w:t>
+        <w:t>VLM으로 RCS를 자동 조작하는 파이프라인을 구현하고 평가했습니다.</w:t>
       </w:r>
     </w:p>
     <w:p>
@@ -3214,10 +3309,10 @@
         <w:rPr>
           <w:rFonts w:ascii="맑은 고딕" w:hAnsi="맑은 고딕" w:eastAsia="맑은 고딕"/>
           <w:b/>
-          <w:color w:val="E86A1F"/>
-          <w:sz w:val="21"/>
-        </w:rPr>
-        <w:t xml:space="preserve">• </w:t>
+          <w:color w:val="142A55"/>
+          <w:sz w:val="21"/>
+        </w:rPr>
+        <w:t xml:space="preserve">1. </w:t>
       </w:r>
       <w:r>
         <w:rPr>
@@ -3225,14 +3320,14 @@
           <w:b/>
           <w:sz w:val="21"/>
         </w:rPr>
-        <w:t>Coarse + Crop &amp; Zoom (2단계 좌표 인식)</w:t>
-      </w:r>
-      <w:r>
-        <w:rPr>
-          <w:rFonts w:ascii="맑은 고딕" w:hAnsi="맑은 고딕" w:eastAsia="맑은 고딕"/>
-          <w:sz w:val="21"/>
-        </w:rPr>
-        <w:t>: 전체 화면에서 대략적인 위치를 먼저 잡고(Coarse), 그 영역을 잘라 확대(Crop &amp; Zoom)한 뒤 정밀 좌표를 정합니다. 이 방식으로 VLM 버튼 클릭·키보드 타이핑 정확도 90% 이상을 확보했습니다.</w:t>
+        <w:t>로그인 &amp; 탐색</w:t>
+      </w:r>
+      <w:r>
+        <w:rPr>
+          <w:rFonts w:ascii="맑은 고딕" w:hAnsi="맑은 고딕" w:eastAsia="맑은 고딕"/>
+          <w:sz w:val="21"/>
+        </w:rPr>
+        <w:t xml:space="preserve"> — RCS를 실행해 로그인한 뒤 장비 목록으로 들어갑니다.</w:t>
       </w:r>
     </w:p>
     <w:p>
@@ -3244,10 +3339,10 @@
         <w:rPr>
           <w:rFonts w:ascii="맑은 고딕" w:hAnsi="맑은 고딕" w:eastAsia="맑은 고딕"/>
           <w:b/>
-          <w:color w:val="E86A1F"/>
-          <w:sz w:val="21"/>
-        </w:rPr>
-        <w:t xml:space="preserve">• </w:t>
+          <w:color w:val="142A55"/>
+          <w:sz w:val="21"/>
+        </w:rPr>
+        <w:t xml:space="preserve">2. </w:t>
       </w:r>
       <w:r>
         <w:rPr>
@@ -3255,14 +3350,14 @@
           <w:b/>
           <w:sz w:val="21"/>
         </w:rPr>
-        <w:t>재시도 &amp; fallback</w:t>
-      </w:r>
-      <w:r>
-        <w:rPr>
-          <w:rFonts w:ascii="맑은 고딕" w:hAnsi="맑은 고딕" w:eastAsia="맑은 고딕"/>
-          <w:sz w:val="21"/>
-        </w:rPr>
-        <w:t>: 실패하면 재시도하고, 그래도 안 되면 대체 경로(fallback)로 넘어가도록 해 무인 신뢰도를 높였습니다.</w:t>
+        <w:t>정렬 실패 알람 감지</w:t>
+      </w:r>
+      <w:r>
+        <w:rPr>
+          <w:rFonts w:ascii="맑은 고딕" w:hAnsi="맑은 고딕" w:eastAsia="맑은 고딕"/>
+          <w:sz w:val="21"/>
+        </w:rPr>
+        <w:t xml:space="preserve"> — 계측 알람을 1~2분 주기로 확인해 정렬 실패 알람만 골라냅니다. 중복 알람이나 뒤늦게 보고되는 알람도 놓치지 않습니다.</w:t>
       </w:r>
     </w:p>
     <w:p>
@@ -3274,10 +3369,10 @@
         <w:rPr>
           <w:rFonts w:ascii="맑은 고딕" w:hAnsi="맑은 고딕" w:eastAsia="맑은 고딕"/>
           <w:b/>
-          <w:color w:val="E86A1F"/>
-          <w:sz w:val="21"/>
-        </w:rPr>
-        <w:t xml:space="preserve">• </w:t>
+          <w:color w:val="142A55"/>
+          <w:sz w:val="21"/>
+        </w:rPr>
+        <w:t xml:space="preserve">3. </w:t>
       </w:r>
       <w:r>
         <w:rPr>
@@ -3285,14 +3380,14 @@
           <w:b/>
           <w:sz w:val="21"/>
         </w:rPr>
-        <w:t>OCR 확인</w:t>
-      </w:r>
-      <w:r>
-        <w:rPr>
-          <w:rFonts w:ascii="맑은 고딕" w:hAnsi="맑은 고딕" w:eastAsia="맑은 고딕"/>
-          <w:sz w:val="21"/>
-        </w:rPr>
-        <w:t>: 클릭·입력 후 화면 텍스트를 OCR로 읽어 의도대로 됐는지 검증합니다.</w:t>
+        <w:t>대응 화면 진입</w:t>
+      </w:r>
+      <w:r>
+        <w:rPr>
+          <w:rFonts w:ascii="맑은 고딕" w:hAnsi="맑은 고딕" w:eastAsia="맑은 고딕"/>
+          <w:sz w:val="21"/>
+        </w:rPr>
+        <w:t xml:space="preserve"> — 감지된 장비에 접속해 대응 화면으로 이동합니다.</w:t>
       </w:r>
     </w:p>
     <w:p>
@@ -3304,10 +3399,10 @@
         <w:rPr>
           <w:rFonts w:ascii="맑은 고딕" w:hAnsi="맑은 고딕" w:eastAsia="맑은 고딕"/>
           <w:b/>
-          <w:color w:val="E86A1F"/>
-          <w:sz w:val="21"/>
-        </w:rPr>
-        <w:t xml:space="preserve">• </w:t>
+          <w:color w:val="142A55"/>
+          <w:sz w:val="21"/>
+        </w:rPr>
+        <w:t xml:space="preserve">4. </w:t>
       </w:r>
       <w:r>
         <w:rPr>
@@ -3315,14 +3410,26 @@
           <w:b/>
           <w:sz w:val="21"/>
         </w:rPr>
-        <w:t>이미지 크기 보정(rescale)</w:t>
-      </w:r>
-      <w:r>
-        <w:rPr>
-          <w:rFonts w:ascii="맑은 고딕" w:hAnsi="맑은 고딕" w:eastAsia="맑은 고딕"/>
-          <w:sz w:val="21"/>
-        </w:rPr>
-        <w:t>: recipe에 등록된 이미지 크기와 RCS의 Tool Monitor에 실제로 표시되는 이미지 크기가 달라(등록 이미지보다 작게 표시됨) 좌표가 어긋날 수 있습니다. 두 크기의 비율로 rescale 보정 변환을 구현해 클릭 좌표를 맞췄습니다.</w:t>
+        <w:t>알림 &amp; 로그</w:t>
+      </w:r>
+      <w:r>
+        <w:rPr>
+          <w:rFonts w:ascii="맑은 고딕" w:hAnsi="맑은 고딕" w:eastAsia="맑은 고딕"/>
+          <w:sz w:val="21"/>
+        </w:rPr>
+        <w:t xml:space="preserve"> — 처리 결과는 팝업과 로그로 남기고, 같은 장비에서 중복으로 뜨는 알람은 해제한 뒤 재발할 때만 다시 알립니다.</w:t>
+      </w:r>
+    </w:p>
+    <w:p>
+      <w:pPr>
+        <w:spacing w:after="120"/>
+      </w:pPr>
+      <w:r>
+        <w:rPr>
+          <w:rFonts w:ascii="맑은 고딕" w:hAnsi="맑은 고딕" w:eastAsia="맑은 고딕"/>
+          <w:sz w:val="21"/>
+        </w:rPr>
+        <w:t>여기에 더해 Align Fail 시점의 기록을 확보하려고 CCTV 캡처도 함께 평가했습니다(§5 한계 참조).</w:t>
       </w:r>
     </w:p>
     <w:p>
@@ -3336,11 +3443,23 @@
           <w:color w:val="142A55"/>
           <w:sz w:val="27"/>
         </w:rPr>
-        <w:t>3. 데이터 자산화</w:t>
+        <w:t>3. 핵심 확보 기술</w:t>
       </w:r>
     </w:p>
     <w:p>
       <w:pPr>
+        <w:spacing w:after="120"/>
+      </w:pPr>
+      <w:r>
+        <w:rPr>
+          <w:rFonts w:ascii="맑은 고딕" w:hAnsi="맑은 고딕" w:eastAsia="맑은 고딕"/>
+          <w:sz w:val="21"/>
+        </w:rPr>
+        <w:t>RCS는 화면 요소가 표준 컴포넌트로 만들어져 있지 않아, 일반 UI 자동화 도구로는 버튼이나 입력창을 인식하지 못합니다. 그래서 화면을 이미지로 보고 좌표를 찾는 VLM 방식으로 구현했습니다.</w:t>
+      </w:r>
+    </w:p>
+    <w:p>
+      <w:pPr>
         <w:spacing w:after="60"/>
         <w:ind w:left="360"/>
       </w:pPr>
@@ -3359,14 +3478,14 @@
           <w:b/>
           <w:sz w:val="21"/>
         </w:rPr>
-        <w:t>성공 align 이미지 저장</w:t>
-      </w:r>
-      <w:r>
-        <w:rPr>
-          <w:rFonts w:ascii="맑은 고딕" w:hAnsi="맑은 고딕" w:eastAsia="맑은 고딕"/>
-          <w:sz w:val="21"/>
-        </w:rPr>
-        <w:t>: Align Fail이 잦은 recipe는 엔지니어가 수동으로 작업해 성공한 align 이미지를 저장해 둡니다. 이후 같은 recipe에서 Align Fail이 재발하면 VLM이 참고할 자료로 씁니다.</w:t>
+        <w:t>Coarse + Crop &amp; Zoom (2단계 좌표 인식)</w:t>
+      </w:r>
+      <w:r>
+        <w:rPr>
+          <w:rFonts w:ascii="맑은 고딕" w:hAnsi="맑은 고딕" w:eastAsia="맑은 고딕"/>
+          <w:sz w:val="21"/>
+        </w:rPr>
+        <w:t>: 전체 화면에서 대략적인 위치를 먼저 잡고(Coarse), 그 영역을 잘라 확대(Crop &amp; Zoom)한 뒤 정밀 좌표를 정합니다. 이 방식으로 VLM 버튼 클릭·키보드 타이핑 정확도 90% 이상을 확보했습니다.</w:t>
       </w:r>
     </w:p>
     <w:p>
@@ -3389,14 +3508,74 @@
           <w:b/>
           <w:sz w:val="21"/>
         </w:rPr>
-        <w:t>엔지니어 작업 기록 저장</w:t>
-      </w:r>
-      <w:r>
-        <w:rPr>
-          <w:rFonts w:ascii="맑은 고딕" w:hAnsi="맑은 고딕" w:eastAsia="맑은 고딕"/>
-          <w:sz w:val="21"/>
-        </w:rPr>
-        <w:t>: 엔지니어의 작업 과정(마우스 이동·클릭·장비 컨트롤 등)을 이미지로 캡처해 저장합니다. 앞으로 필터링을 거쳐 VLM 학습에 쓸 수 있는 형태로 변환할 계획입니다 (Langgraph 기반 워크플로우).</w:t>
+        <w:t>재시도 &amp; fallback</w:t>
+      </w:r>
+      <w:r>
+        <w:rPr>
+          <w:rFonts w:ascii="맑은 고딕" w:hAnsi="맑은 고딕" w:eastAsia="맑은 고딕"/>
+          <w:sz w:val="21"/>
+        </w:rPr>
+        <w:t>: 실패하면 재시도하고, 그래도 안 되면 대체 경로(fallback)로 넘어가도록 해 무인 신뢰도를 높였습니다.</w:t>
+      </w:r>
+    </w:p>
+    <w:p>
+      <w:pPr>
+        <w:spacing w:after="60"/>
+        <w:ind w:left="360"/>
+      </w:pPr>
+      <w:r>
+        <w:rPr>
+          <w:rFonts w:ascii="맑은 고딕" w:hAnsi="맑은 고딕" w:eastAsia="맑은 고딕"/>
+          <w:b/>
+          <w:color w:val="E86A1F"/>
+          <w:sz w:val="21"/>
+        </w:rPr>
+        <w:t xml:space="preserve">• </w:t>
+      </w:r>
+      <w:r>
+        <w:rPr>
+          <w:rFonts w:ascii="맑은 고딕" w:hAnsi="맑은 고딕" w:eastAsia="맑은 고딕"/>
+          <w:b/>
+          <w:sz w:val="21"/>
+        </w:rPr>
+        <w:t>OCR 확인</w:t>
+      </w:r>
+      <w:r>
+        <w:rPr>
+          <w:rFonts w:ascii="맑은 고딕" w:hAnsi="맑은 고딕" w:eastAsia="맑은 고딕"/>
+          <w:sz w:val="21"/>
+        </w:rPr>
+        <w:t>: 클릭·입력 후 화면 텍스트를 OCR로 읽어 의도대로 됐는지 검증합니다.</w:t>
+      </w:r>
+    </w:p>
+    <w:p>
+      <w:pPr>
+        <w:spacing w:after="60"/>
+        <w:ind w:left="360"/>
+      </w:pPr>
+      <w:r>
+        <w:rPr>
+          <w:rFonts w:ascii="맑은 고딕" w:hAnsi="맑은 고딕" w:eastAsia="맑은 고딕"/>
+          <w:b/>
+          <w:color w:val="E86A1F"/>
+          <w:sz w:val="21"/>
+        </w:rPr>
+        <w:t xml:space="preserve">• </w:t>
+      </w:r>
+      <w:r>
+        <w:rPr>
+          <w:rFonts w:ascii="맑은 고딕" w:hAnsi="맑은 고딕" w:eastAsia="맑은 고딕"/>
+          <w:b/>
+          <w:sz w:val="21"/>
+        </w:rPr>
+        <w:t>이미지 크기 보정(rescale)</w:t>
+      </w:r>
+      <w:r>
+        <w:rPr>
+          <w:rFonts w:ascii="맑은 고딕" w:hAnsi="맑은 고딕" w:eastAsia="맑은 고딕"/>
+          <w:sz w:val="21"/>
+        </w:rPr>
+        <w:t>: recipe에 등록된 이미지 크기와 RCS의 Tool Monitor에 실제로 표시되는 이미지 크기가 달라(등록 이미지보다 작게 표시됨) 좌표가 어긋날 수 있습니다. 두 크기의 비율로 rescale 보정 변환을 구현해 클릭 좌표를 맞췄습니다.</w:t>
       </w:r>
     </w:p>
     <w:p>
@@ -3410,7 +3589,7 @@
           <w:color w:val="142A55"/>
           <w:sz w:val="27"/>
         </w:rPr>
-        <w:t>4. 한계 및 개선 필요 사항</w:t>
+        <w:t>4. 데이터 자산화</w:t>
       </w:r>
     </w:p>
     <w:p>
@@ -3433,14 +3612,14 @@
           <w:b/>
           <w:sz w:val="21"/>
         </w:rPr>
-        <w:t>CCTV 기록 추출의 복잡성</w:t>
-      </w:r>
-      <w:r>
-        <w:rPr>
-          <w:rFonts w:ascii="맑은 고딕" w:hAnsi="맑은 고딕" w:eastAsia="맑은 고딕"/>
-          <w:sz w:val="21"/>
-        </w:rPr>
-        <w:t>: CCTV로 과거 기록을 뽑아 워크플로우로 만들어 보려 했지만, CCTV 화면을 추출하는 과정이 복잡해 구현에 시간이 오래 걸렸습니다. 가능성만 확인한 채 추가 평가는 중단했습니다.</w:t>
+        <w:t>성공 align 이미지 저장</w:t>
+      </w:r>
+      <w:r>
+        <w:rPr>
+          <w:rFonts w:ascii="맑은 고딕" w:hAnsi="맑은 고딕" w:eastAsia="맑은 고딕"/>
+          <w:sz w:val="21"/>
+        </w:rPr>
+        <w:t>: Align Fail이 잦은 recipe는 엔지니어가 수동으로 작업해 성공한 align 이미지를 저장해 둡니다. 이후 같은 recipe에서 Align Fail이 재발하면 VLM이 참고할 자료로 씁니다.</w:t>
       </w:r>
     </w:p>
     <w:p>
@@ -3463,44 +3642,14 @@
           <w:b/>
           <w:sz w:val="21"/>
         </w:rPr>
-        <w:t>개선 방향</w:t>
-      </w:r>
-      <w:r>
-        <w:rPr>
-          <w:rFonts w:ascii="맑은 고딕" w:hAnsi="맑은 고딕" w:eastAsia="맑은 고딕"/>
-          <w:sz w:val="21"/>
-        </w:rPr>
-        <w:t>: RCS의 녹화 자료가 저장되는 DB에 직접 접속해 파일을 추출하는 방식이 필요합니다.</w:t>
-      </w:r>
-    </w:p>
-    <w:p>
-      <w:pPr>
-        <w:spacing w:after="60"/>
-        <w:ind w:left="360"/>
-      </w:pPr>
-      <w:r>
-        <w:rPr>
-          <w:rFonts w:ascii="맑은 고딕" w:hAnsi="맑은 고딕" w:eastAsia="맑은 고딕"/>
-          <w:b/>
-          <w:color w:val="E86A1F"/>
-          <w:sz w:val="21"/>
-        </w:rPr>
-        <w:t xml:space="preserve">• </w:t>
-      </w:r>
-      <w:r>
-        <w:rPr>
-          <w:rFonts w:ascii="맑은 고딕" w:hAnsi="맑은 고딕" w:eastAsia="맑은 고딕"/>
-          <w:b/>
-          <w:sz w:val="21"/>
-        </w:rPr>
-        <w:t>배운 점</w:t>
-      </w:r>
-      <w:r>
-        <w:rPr>
-          <w:rFonts w:ascii="맑은 고딕" w:hAnsi="맑은 고딕" w:eastAsia="맑은 고딕"/>
-          <w:sz w:val="21"/>
-        </w:rPr>
-        <w:t>: GUI "화면 읽기"가 곧 Align Key "찾기"는 아니며, Align Key 정밀 매칭은 CV의 영역입니다. 또한 모든 단계를 VLM 호출에만 의존하면 비용과 지연 부담이 커집니다.</w:t>
+        <w:t>엔지니어 작업 기록 저장</w:t>
+      </w:r>
+      <w:r>
+        <w:rPr>
+          <w:rFonts w:ascii="맑은 고딕" w:hAnsi="맑은 고딕" w:eastAsia="맑은 고딕"/>
+          <w:sz w:val="21"/>
+        </w:rPr>
+        <w:t>: 엔지니어의 작업 과정(마우스 이동·클릭·장비 컨트롤 등)을 이미지로 캡처해 저장합니다. 앞으로 필터링을 거쳐 VLM 학습에 쓸 수 있는 형태로 변환할 계획입니다 (Langgraph 기반 워크플로우).</w:t>
       </w:r>
     </w:p>
     <w:p>
@@ -3514,7 +3663,7 @@
           <w:color w:val="142A55"/>
           <w:sz w:val="27"/>
         </w:rPr>
-        <w:t>5. 동결(frozen) 사유</w:t>
+        <w:t>5. 한계와 배운 점</w:t>
       </w:r>
     </w:p>
     <w:p>
@@ -3534,9 +3683,113 @@
       <w:r>
         <w:rPr>
           <w:rFonts w:ascii="맑은 고딕" w:hAnsi="맑은 고딕" w:eastAsia="맑은 고딕"/>
-          <w:sz w:val="21"/>
-        </w:rPr>
-        <w:t>운영 화면 자동화는 유지보수를 일원화하기 위해 실시간 통합 루프로 옮겼습니다.</w:t>
+          <w:b/>
+          <w:sz w:val="21"/>
+        </w:rPr>
+        <w:t>CCTV 기록 추출의 복잡성</w:t>
+      </w:r>
+      <w:r>
+        <w:rPr>
+          <w:rFonts w:ascii="맑은 고딕" w:hAnsi="맑은 고딕" w:eastAsia="맑은 고딕"/>
+          <w:sz w:val="21"/>
+        </w:rPr>
+        <w:t>: CCTV로 과거 기록을 뽑아 워크플로우로 만들어 보려 했지만, CCTV 화면을 추출하는 과정이 복잡해 구현에 시간이 오래 걸렸습니다. 가능성만 확인한 채 추가 평가는 중단했습니다.</w:t>
+      </w:r>
+    </w:p>
+    <w:p>
+      <w:pPr>
+        <w:spacing w:after="60"/>
+        <w:ind w:left="360"/>
+      </w:pPr>
+      <w:r>
+        <w:rPr>
+          <w:rFonts w:ascii="맑은 고딕" w:hAnsi="맑은 고딕" w:eastAsia="맑은 고딕"/>
+          <w:b/>
+          <w:color w:val="E86A1F"/>
+          <w:sz w:val="21"/>
+        </w:rPr>
+        <w:t xml:space="preserve">• </w:t>
+      </w:r>
+      <w:r>
+        <w:rPr>
+          <w:rFonts w:ascii="맑은 고딕" w:hAnsi="맑은 고딕" w:eastAsia="맑은 고딕"/>
+          <w:b/>
+          <w:sz w:val="21"/>
+        </w:rPr>
+        <w:t>개선 방향</w:t>
+      </w:r>
+      <w:r>
+        <w:rPr>
+          <w:rFonts w:ascii="맑은 고딕" w:hAnsi="맑은 고딕" w:eastAsia="맑은 고딕"/>
+          <w:sz w:val="21"/>
+        </w:rPr>
+        <w:t>: RCS의 녹화 자료가 저장되는 DB에 직접 접속해 파일을 추출하는 방식이 필요합니다.</w:t>
+      </w:r>
+    </w:p>
+    <w:p>
+      <w:pPr>
+        <w:spacing w:after="60"/>
+        <w:ind w:left="360"/>
+      </w:pPr>
+      <w:r>
+        <w:rPr>
+          <w:rFonts w:ascii="맑은 고딕" w:hAnsi="맑은 고딕" w:eastAsia="맑은 고딕"/>
+          <w:b/>
+          <w:color w:val="E86A1F"/>
+          <w:sz w:val="21"/>
+        </w:rPr>
+        <w:t xml:space="preserve">• </w:t>
+      </w:r>
+      <w:r>
+        <w:rPr>
+          <w:rFonts w:ascii="맑은 고딕" w:hAnsi="맑은 고딕" w:eastAsia="맑은 고딕"/>
+          <w:b/>
+          <w:sz w:val="21"/>
+        </w:rPr>
+        <w:t>배운 점</w:t>
+      </w:r>
+      <w:r>
+        <w:rPr>
+          <w:rFonts w:ascii="맑은 고딕" w:hAnsi="맑은 고딕" w:eastAsia="맑은 고딕"/>
+          <w:sz w:val="21"/>
+        </w:rPr>
+        <w:t>: GUI "화면 읽기"가 곧 Align Key "찾기"는 아니며, Align Key 정밀 매칭은 CV의 영역입니다. 또한 모든 단계를 VLM 호출에만 의존하면 비용과 지연 부담이 커집니다.</w:t>
+      </w:r>
+    </w:p>
+    <w:p>
+      <w:pPr>
+        <w:spacing w:before="200" w:after="120"/>
+      </w:pPr>
+      <w:r>
+        <w:rPr>
+          <w:rFonts w:ascii="맑은 고딕" w:hAnsi="맑은 고딕" w:eastAsia="맑은 고딕"/>
+          <w:b/>
+          <w:color w:val="142A55"/>
+          <w:sz w:val="27"/>
+        </w:rPr>
+        <w:t>6. 동결(frozen) 사유</w:t>
+      </w:r>
+    </w:p>
+    <w:p>
+      <w:pPr>
+        <w:spacing w:after="60"/>
+        <w:ind w:left="360"/>
+      </w:pPr>
+      <w:r>
+        <w:rPr>
+          <w:rFonts w:ascii="맑은 고딕" w:hAnsi="맑은 고딕" w:eastAsia="맑은 고딕"/>
+          <w:b/>
+          <w:color w:val="E86A1F"/>
+          <w:sz w:val="21"/>
+        </w:rPr>
+        <w:t xml:space="preserve">• </w:t>
+      </w:r>
+      <w:r>
+        <w:rPr>
+          <w:rFonts w:ascii="맑은 고딕" w:hAnsi="맑은 고딕" w:eastAsia="맑은 고딕"/>
+          <w:sz w:val="21"/>
+        </w:rPr>
+        <w:t>운영 화면 자동화는 유지보수를 일원화하기 위해 실시간 통합 루프(04 문서)로 옮겼습니다.</w:t>
       </w:r>
     </w:p>
     <w:p>
@@ -3577,7 +3830,7 @@
           <w:color w:val="142A55"/>
           <w:sz w:val="34"/>
         </w:rPr>
-        <w:t>03. Align Fail 인식과 위치 재조정을 위한 Computer Vision(CV) 평가</w:t>
+        <w:t>03. 정렬 위치 재조정 CV 정확도 평가 (workflow 2) — 오프라인 벤치</w:t>
       </w:r>
     </w:p>
     <w:p>
@@ -3600,7 +3853,7 @@
           <w:color w:val="556070"/>
           <w:sz w:val="20"/>
         </w:rPr>
-        <w:t>목적: Align Fail이 난 이미지에서 CV로 정렬 위치를 다시 찾았을 때, Recipe에 등록된 이미지와 같은 지점을 정확히 짚어낼 수 있는지를 오프라인으로 평가합니다. 검증을 통과한 방식만 실시간 운영 루프에 반영합니다.</w:t>
+        <w:t>목적: Align Fail이 난 이미지에서 CV로 정렬 위치를 다시 찾았을 때, Recipe에 등록된 이미지와 같은 지점을 정확히 짚어낼 수 있는지를 오프라인으로 평가합니다. 검증을 통과한 방식만 실시간 운영 루프(04 문서)에 반영합니다.</w:t>
       </w:r>
     </w:p>
     <w:p>
@@ -3614,97 +3867,269 @@
           <w:color w:val="142A55"/>
           <w:sz w:val="27"/>
         </w:rPr>
-        <w:t>1. 평가 배경과 목적</w:t>
+        <w:t>1. As-Is → To-Be</w:t>
       </w:r>
     </w:p>
     <w:p>
       <w:pPr>
-        <w:spacing w:after="60"/>
-        <w:ind w:left="360"/>
-      </w:pPr>
-      <w:r>
-        <w:rPr>
-          <w:rFonts w:ascii="맑은 고딕" w:hAnsi="맑은 고딕" w:eastAsia="맑은 고딕"/>
-          <w:b/>
-          <w:color w:val="E86A1F"/>
-          <w:sz w:val="21"/>
-        </w:rPr>
-        <w:t xml:space="preserve">• </w:t>
-      </w:r>
-      <w:r>
-        <w:rPr>
-          <w:rFonts w:ascii="맑은 고딕" w:hAnsi="맑은 고딕" w:eastAsia="맑은 고딕"/>
-          <w:b/>
-          <w:sz w:val="21"/>
-        </w:rPr>
-        <w:t>샘플</w:t>
-      </w:r>
-      <w:r>
-        <w:rPr>
-          <w:rFonts w:ascii="맑은 고딕" w:hAnsi="맑은 고딕" w:eastAsia="맑은 고딕"/>
-          <w:sz w:val="21"/>
-        </w:rPr>
-        <w:t>: Recipe 200개를 무작위로 뽑았습니다. Recipe마다 ① 등록된 Align 이미지와 ② 과거 Align Fail이 났던 이미지들을 장비에서 내려받아, 실장비는 건드리지 않고 오프라인(offline)으로 평가했습니다.</w:t>
-      </w:r>
+        <w:spacing w:after="120"/>
+      </w:pPr>
+      <w:r>
+        <w:rPr>
+          <w:rFonts w:ascii="맑은 고딕" w:hAnsi="맑은 고딕" w:eastAsia="맑은 고딕"/>
+          <w:sz w:val="21"/>
+        </w:rPr>
+        <w:t>이 평가로 검증한 "무엇을 기준으로 재조정할 것인가"의 전환은 다음과 같습니다.</w:t>
+      </w:r>
+    </w:p>
+    <w:tbl>
+      <w:tblPr>
+        <w:tblStyle w:val="LightGrid-Accent1"/>
+        <w:tblW w:type="auto" w:w="0"/>
+        <w:jc w:val="center"/>
+        <w:tblLook w:firstColumn="1" w:firstRow="1" w:lastColumn="0" w:lastRow="0" w:noHBand="0" w:noVBand="1" w:val="04A0"/>
+      </w:tblPr>
+      <w:tblGrid>
+        <w:gridCol w:w="2880"/>
+        <w:gridCol w:w="2880"/>
+        <w:gridCol w:w="2880"/>
+      </w:tblGrid>
+      <w:tr>
+        <w:tc>
+          <w:tcPr>
+            <w:tcW w:type="dxa" w:w="2880"/>
+            <w:shd w:val="clear" w:fill="142A55"/>
+          </w:tcPr>
+          <w:p>
+            <w:r/>
+            <w:r>
+              <w:rPr>
+                <w:rFonts w:ascii="맑은 고딕" w:hAnsi="맑은 고딕" w:eastAsia="맑은 고딕"/>
+                <w:b/>
+                <w:color w:val="FFFFFF"/>
+                <w:sz w:val="19"/>
+              </w:rPr>
+              <w:t>항목</w:t>
+            </w:r>
+          </w:p>
+        </w:tc>
+        <w:tc>
+          <w:tcPr>
+            <w:tcW w:type="dxa" w:w="2880"/>
+            <w:shd w:val="clear" w:fill="142A55"/>
+          </w:tcPr>
+          <w:p>
+            <w:r/>
+            <w:r>
+              <w:rPr>
+                <w:rFonts w:ascii="맑은 고딕" w:hAnsi="맑은 고딕" w:eastAsia="맑은 고딕"/>
+                <w:b/>
+                <w:color w:val="FFFFFF"/>
+                <w:sz w:val="19"/>
+              </w:rPr>
+              <w:t>As-Is</w:t>
+            </w:r>
+          </w:p>
+        </w:tc>
+        <w:tc>
+          <w:tcPr>
+            <w:tcW w:type="dxa" w:w="2880"/>
+            <w:shd w:val="clear" w:fill="142A55"/>
+          </w:tcPr>
+          <w:p>
+            <w:r/>
+            <w:r>
+              <w:rPr>
+                <w:rFonts w:ascii="맑은 고딕" w:hAnsi="맑은 고딕" w:eastAsia="맑은 고딕"/>
+                <w:b/>
+                <w:color w:val="FFFFFF"/>
+                <w:sz w:val="19"/>
+              </w:rPr>
+              <w:t>To-Be (이 평가로 검증한 방식)</w:t>
+            </w:r>
+          </w:p>
+        </w:tc>
+      </w:tr>
+      <w:tr>
+        <w:tc>
+          <w:tcPr>
+            <w:tcW w:type="dxa" w:w="2880"/>
+          </w:tcPr>
+          <w:p>
+            <w:r/>
+            <w:r>
+              <w:rPr>
+                <w:rFonts w:ascii="맑은 고딕" w:hAnsi="맑은 고딕" w:eastAsia="맑은 고딕"/>
+                <w:sz w:val="19"/>
+              </w:rPr>
+              <w:t>재조정 주체</w:t>
+            </w:r>
+          </w:p>
+        </w:tc>
+        <w:tc>
+          <w:tcPr>
+            <w:tcW w:type="dxa" w:w="2880"/>
+          </w:tcPr>
+          <w:p>
+            <w:r/>
+            <w:r>
+              <w:rPr>
+                <w:rFonts w:ascii="맑은 고딕" w:hAnsi="맑은 고딕" w:eastAsia="맑은 고딕"/>
+                <w:sz w:val="19"/>
+              </w:rPr>
+              <w:t>엔지니어가 장비에 접속해 수동 재정렬</w:t>
+            </w:r>
+          </w:p>
+        </w:tc>
+        <w:tc>
+          <w:tcPr>
+            <w:tcW w:type="dxa" w:w="2880"/>
+          </w:tcPr>
+          <w:p>
+            <w:r/>
+            <w:r>
+              <w:rPr>
+                <w:rFonts w:ascii="맑은 고딕" w:hAnsi="맑은 고딕" w:eastAsia="맑은 고딕"/>
+                <w:sz w:val="19"/>
+              </w:rPr>
+              <w:t>CV가 정렬 위치를 자동 재조정(검증 통과 방식만 운영 반영)</w:t>
+            </w:r>
+          </w:p>
+        </w:tc>
+      </w:tr>
+      <w:tr>
+        <w:tc>
+          <w:tcPr>
+            <w:tcW w:type="dxa" w:w="2880"/>
+          </w:tcPr>
+          <w:p>
+            <w:r/>
+            <w:r>
+              <w:rPr>
+                <w:rFonts w:ascii="맑은 고딕" w:hAnsi="맑은 고딕" w:eastAsia="맑은 고딕"/>
+                <w:sz w:val="19"/>
+              </w:rPr>
+              <w:t>기준 이미지</w:t>
+            </w:r>
+          </w:p>
+        </w:tc>
+        <w:tc>
+          <w:tcPr>
+            <w:tcW w:type="dxa" w:w="2880"/>
+          </w:tcPr>
+          <w:p>
+            <w:r/>
+            <w:r>
+              <w:rPr>
+                <w:rFonts w:ascii="맑은 고딕" w:hAnsi="맑은 고딕" w:eastAsia="맑은 고딕"/>
+                <w:sz w:val="19"/>
+              </w:rPr>
+              <w:t>Recipe 등록 이미지 1장</w:t>
+            </w:r>
+          </w:p>
+        </w:tc>
+        <w:tc>
+          <w:tcPr>
+            <w:tcW w:type="dxa" w:w="2880"/>
+          </w:tcPr>
+          <w:p>
+            <w:r/>
+            <w:r>
+              <w:rPr>
+                <w:rFonts w:ascii="맑은 고딕" w:hAnsi="맑은 고딕" w:eastAsia="맑은 고딕"/>
+                <w:sz w:val="19"/>
+              </w:rPr>
+              <w:t>최근 성공 사례 종합(consensus) 우선, 부족·저품질이면 등록 이미지로 자동 폴백</w:t>
+            </w:r>
+          </w:p>
+        </w:tc>
+      </w:tr>
+      <w:tr>
+        <w:tc>
+          <w:tcPr>
+            <w:tcW w:type="dxa" w:w="2880"/>
+          </w:tcPr>
+          <w:p>
+            <w:r/>
+            <w:r>
+              <w:rPr>
+                <w:rFonts w:ascii="맑은 고딕" w:hAnsi="맑은 고딕" w:eastAsia="맑은 고딕"/>
+                <w:sz w:val="19"/>
+              </w:rPr>
+              <w:t>정확도(오프라인 벤치)</w:t>
+            </w:r>
+          </w:p>
+        </w:tc>
+        <w:tc>
+          <w:tcPr>
+            <w:tcW w:type="dxa" w:w="2880"/>
+          </w:tcPr>
+          <w:p>
+            <w:r/>
+            <w:r>
+              <w:rPr>
+                <w:rFonts w:ascii="맑은 고딕" w:hAnsi="맑은 고딕" w:eastAsia="맑은 고딕"/>
+                <w:sz w:val="19"/>
+              </w:rPr>
+              <w:t>후보 포함률 0.434 / 1순위 적중률 0.318</w:t>
+            </w:r>
+          </w:p>
+        </w:tc>
+        <w:tc>
+          <w:tcPr>
+            <w:tcW w:type="dxa" w:w="2880"/>
+          </w:tcPr>
+          <w:p>
+            <w:r/>
+            <w:r>
+              <w:rPr>
+                <w:rFonts w:ascii="맑은 고딕" w:hAnsi="맑은 고딕" w:eastAsia="맑은 고딕"/>
+                <w:sz w:val="19"/>
+              </w:rPr>
+              <w:t xml:space="preserve">후보 포함률 </w:t>
+            </w:r>
+            <w:r>
+              <w:rPr>
+                <w:rFonts w:ascii="맑은 고딕" w:hAnsi="맑은 고딕" w:eastAsia="맑은 고딕"/>
+                <w:b/>
+                <w:sz w:val="19"/>
+              </w:rPr>
+              <w:t>0.876</w:t>
+            </w:r>
+            <w:r>
+              <w:rPr>
+                <w:rFonts w:ascii="맑은 고딕" w:hAnsi="맑은 고딕" w:eastAsia="맑은 고딕"/>
+                <w:sz w:val="19"/>
+              </w:rPr>
+              <w:t xml:space="preserve"> / 1순위 적중률 </w:t>
+            </w:r>
+            <w:r>
+              <w:rPr>
+                <w:rFonts w:ascii="맑은 고딕" w:hAnsi="맑은 고딕" w:eastAsia="맑은 고딕"/>
+                <w:b/>
+                <w:sz w:val="19"/>
+              </w:rPr>
+              <w:t>0.764</w:t>
+            </w:r>
+          </w:p>
+        </w:tc>
+      </w:tr>
+    </w:tbl>
+    <w:p>
+      <w:pPr>
+        <w:spacing w:after="80"/>
+      </w:pPr>
     </w:p>
     <w:p>
       <w:pPr>
-        <w:spacing w:after="60"/>
-        <w:ind w:left="360"/>
-      </w:pPr>
-      <w:r>
-        <w:rPr>
-          <w:rFonts w:ascii="맑은 고딕" w:hAnsi="맑은 고딕" w:eastAsia="맑은 고딕"/>
-          <w:b/>
-          <w:color w:val="E86A1F"/>
-          <w:sz w:val="21"/>
-        </w:rPr>
-        <w:t xml:space="preserve">• </w:t>
-      </w:r>
-      <w:r>
-        <w:rPr>
-          <w:rFonts w:ascii="맑은 고딕" w:hAnsi="맑은 고딕" w:eastAsia="맑은 고딕"/>
-          <w:b/>
-          <w:sz w:val="21"/>
-        </w:rPr>
-        <w:t>목적</w:t>
-      </w:r>
-      <w:r>
-        <w:rPr>
-          <w:rFonts w:ascii="맑은 고딕" w:hAnsi="맑은 고딕" w:eastAsia="맑은 고딕"/>
-          <w:sz w:val="21"/>
-        </w:rPr>
-        <w:t>: CV가 Align Fail 이미지 위에서 정렬 위치를 재조정했을 때 Recipe 등록 이미지와 같은 지점을 찾아내는지, 이를 수치로 확인하는 것입니다.</w:t>
-      </w:r>
-    </w:p>
-    <w:p>
-      <w:pPr>
-        <w:spacing w:after="60"/>
-        <w:ind w:left="360"/>
-      </w:pPr>
-      <w:r>
-        <w:rPr>
-          <w:rFonts w:ascii="맑은 고딕" w:hAnsi="맑은 고딕" w:eastAsia="맑은 고딕"/>
-          <w:b/>
-          <w:color w:val="E86A1F"/>
-          <w:sz w:val="21"/>
-        </w:rPr>
-        <w:t xml:space="preserve">• </w:t>
-      </w:r>
-      <w:r>
-        <w:rPr>
-          <w:rFonts w:ascii="맑은 고딕" w:hAnsi="맑은 고딕" w:eastAsia="맑은 고딕"/>
-          <w:b/>
-          <w:sz w:val="21"/>
-        </w:rPr>
-        <w:t>예상 허들</w:t>
-      </w:r>
-      <w:r>
-        <w:rPr>
-          <w:rFonts w:ascii="맑은 고딕" w:hAnsi="맑은 고딕" w:eastAsia="맑은 고딕"/>
-          <w:sz w:val="21"/>
-        </w:rPr>
-        <w:t>: Align Fail이 나는 원인 자체가 등록 이미지와 실제로 찍힌 이미지의 차이입니다. 두 이미지가 이미 벌어진 상태에서 그 차이를 딛고 정렬 위치를 다시 맞출 수 있느냐가 애초에 미지수였고, 이 평가는 그 가능성을 데이터로 따져 보는 작업입니다.</w:t>
+        <w:spacing w:after="120"/>
+      </w:pPr>
+      <w:r>
+        <w:rPr>
+          <w:rFonts w:ascii="맑은 고딕" w:hAnsi="맑은 고딕" w:eastAsia="맑은 고딕"/>
+          <w:sz w:val="21"/>
+        </w:rPr>
+        <w:t>(수치 상세와 지표 정의는 §6 측정 결과 참조. 오피스 실데이터 최종 확정은 §8에 정리한 남은 평가 항목입니다.)</w:t>
       </w:r>
     </w:p>
     <w:p>
@@ -3718,19 +4143,37 @@
           <w:color w:val="142A55"/>
           <w:sz w:val="27"/>
         </w:rPr>
-        <w:t>2. 평가한 두 가지 방식</w:t>
+        <w:t>2. 평가 배경과 목적</w:t>
       </w:r>
     </w:p>
     <w:p>
       <w:pPr>
-        <w:spacing w:after="120"/>
-      </w:pPr>
-      <w:r>
-        <w:rPr>
-          <w:rFonts w:ascii="맑은 고딕" w:hAnsi="맑은 고딕" w:eastAsia="맑은 고딕"/>
-          <w:sz w:val="21"/>
-        </w:rPr>
-        <w:t>위치를 재조정할 때 무엇을 기준 이미지로 삼을지, 두 가지 방식을 나눠 비교했습니다.</w:t>
+        <w:spacing w:after="60"/>
+        <w:ind w:left="360"/>
+      </w:pPr>
+      <w:r>
+        <w:rPr>
+          <w:rFonts w:ascii="맑은 고딕" w:hAnsi="맑은 고딕" w:eastAsia="맑은 고딕"/>
+          <w:b/>
+          <w:color w:val="E86A1F"/>
+          <w:sz w:val="21"/>
+        </w:rPr>
+        <w:t xml:space="preserve">• </w:t>
+      </w:r>
+      <w:r>
+        <w:rPr>
+          <w:rFonts w:ascii="맑은 고딕" w:hAnsi="맑은 고딕" w:eastAsia="맑은 고딕"/>
+          <w:b/>
+          <w:sz w:val="21"/>
+        </w:rPr>
+        <w:t>샘플</w:t>
+      </w:r>
+      <w:r>
+        <w:rPr>
+          <w:rFonts w:ascii="맑은 고딕" w:hAnsi="맑은 고딕" w:eastAsia="맑은 고딕"/>
+          <w:sz w:val="21"/>
+        </w:rPr>
+        <w:t>: Recipe 200개를 무작위로 뽑았습니다. Recipe마다 ① 등록된 Align 이미지와 ② 과거 Align Fail이 났던 이미지들을 장비에서 내려받아, 실장비는 건드리지 않고 오프라인(offline)으로 평가했습니다.</w:t>
       </w:r>
     </w:p>
     <w:p>
@@ -3742,10 +4185,10 @@
         <w:rPr>
           <w:rFonts w:ascii="맑은 고딕" w:hAnsi="맑은 고딕" w:eastAsia="맑은 고딕"/>
           <w:b/>
-          <w:color w:val="142A55"/>
-          <w:sz w:val="21"/>
-        </w:rPr>
-        <w:t xml:space="preserve">1. </w:t>
+          <w:color w:val="E86A1F"/>
+          <w:sz w:val="21"/>
+        </w:rPr>
+        <w:t xml:space="preserve">• </w:t>
       </w:r>
       <w:r>
         <w:rPr>
@@ -3753,14 +4196,14 @@
           <w:b/>
           <w:sz w:val="21"/>
         </w:rPr>
-        <w:t>등록 이미지 1장 기준</w:t>
-      </w:r>
-      <w:r>
-        <w:rPr>
-          <w:rFonts w:ascii="맑은 고딕" w:hAnsi="맑은 고딕" w:eastAsia="맑은 고딕"/>
-          <w:sz w:val="21"/>
-        </w:rPr>
-        <w:t>: Recipe에 등록된 Align 이미지 한 장하고만 비교해 위치를 재조정합니다. 가장 단순한 방식입니다.</w:t>
+        <w:t>목적</w:t>
+      </w:r>
+      <w:r>
+        <w:rPr>
+          <w:rFonts w:ascii="맑은 고딕" w:hAnsi="맑은 고딕" w:eastAsia="맑은 고딕"/>
+          <w:sz w:val="21"/>
+        </w:rPr>
+        <w:t>: CV가 Align Fail 이미지 위에서 정렬 위치를 재조정했을 때 Recipe 등록 이미지와 같은 지점을 찾아내는지, 이를 수치로 확인하는 것입니다.</w:t>
       </w:r>
     </w:p>
     <w:p>
@@ -3772,10 +4215,10 @@
         <w:rPr>
           <w:rFonts w:ascii="맑은 고딕" w:hAnsi="맑은 고딕" w:eastAsia="맑은 고딕"/>
           <w:b/>
-          <w:color w:val="142A55"/>
-          <w:sz w:val="21"/>
-        </w:rPr>
-        <w:t xml:space="preserve">2. </w:t>
+          <w:color w:val="E86A1F"/>
+          <w:sz w:val="21"/>
+        </w:rPr>
+        <w:t xml:space="preserve">• </w:t>
       </w:r>
       <w:r>
         <w:rPr>
@@ -3783,14 +4226,14 @@
           <w:b/>
           <w:sz w:val="21"/>
         </w:rPr>
-        <w:t>성공 사례 종합 기준</w:t>
-      </w:r>
-      <w:r>
-        <w:rPr>
-          <w:rFonts w:ascii="맑은 고딕" w:hAnsi="맑은 고딕" w:eastAsia="맑은 고딕"/>
-          <w:sz w:val="21"/>
-        </w:rPr>
-        <w:t>: 같은 Recipe에서 과거 정렬에 성공했던 이미지 5~6장을 모아, 이를 종합한 기준으로 위치를 재조정합니다. 이후 결과에서는 이 방식을 consensus(성공 사례 종합)라고 부릅니다.</w:t>
+        <w:t>예상 허들</w:t>
+      </w:r>
+      <w:r>
+        <w:rPr>
+          <w:rFonts w:ascii="맑은 고딕" w:hAnsi="맑은 고딕" w:eastAsia="맑은 고딕"/>
+          <w:sz w:val="21"/>
+        </w:rPr>
+        <w:t>: Align Fail이 나는 원인 자체가 등록 이미지와 실제로 찍힌 이미지의 차이입니다. 두 이미지가 이미 벌어진 상태에서 그 차이를 딛고 정렬 위치를 다시 맞출 수 있느냐가 애초에 미지수였고, 이 평가는 그 가능성을 데이터로 따져 보는 작업입니다.</w:t>
       </w:r>
     </w:p>
     <w:p>
@@ -3804,11 +4247,23 @@
           <w:color w:val="142A55"/>
           <w:sz w:val="27"/>
         </w:rPr>
-        <w:t>3. 핵심 기법 (쉽게 풀어서)</w:t>
+        <w:t>3. 평가한 두 가지 방식</w:t>
       </w:r>
     </w:p>
     <w:p>
       <w:pPr>
+        <w:spacing w:after="120"/>
+      </w:pPr>
+      <w:r>
+        <w:rPr>
+          <w:rFonts w:ascii="맑은 고딕" w:hAnsi="맑은 고딕" w:eastAsia="맑은 고딕"/>
+          <w:sz w:val="21"/>
+        </w:rPr>
+        <w:t>위치를 재조정할 때 무엇을 기준 이미지로 삼을지, 두 가지 방식을 나눠 비교했습니다.</w:t>
+      </w:r>
+    </w:p>
+    <w:p>
+      <w:pPr>
         <w:spacing w:after="60"/>
         <w:ind w:left="360"/>
       </w:pPr>
@@ -3816,10 +4271,10 @@
         <w:rPr>
           <w:rFonts w:ascii="맑은 고딕" w:hAnsi="맑은 고딕" w:eastAsia="맑은 고딕"/>
           <w:b/>
-          <w:color w:val="E86A1F"/>
-          <w:sz w:val="21"/>
-        </w:rPr>
-        <w:t xml:space="preserve">• </w:t>
+          <w:color w:val="142A55"/>
+          <w:sz w:val="21"/>
+        </w:rPr>
+        <w:t xml:space="preserve">1. </w:t>
       </w:r>
       <w:r>
         <w:rPr>
@@ -3827,14 +4282,14 @@
           <w:b/>
           <w:sz w:val="21"/>
         </w:rPr>
-        <w:t>여러 매칭 방식을 종합해 후보를 고름 (Ensemble)</w:t>
-      </w:r>
-      <w:r>
-        <w:rPr>
-          <w:rFonts w:ascii="맑은 고딕" w:hAnsi="맑은 고딕" w:eastAsia="맑은 고딕"/>
-          <w:sz w:val="21"/>
-        </w:rPr>
-        <w:t>: 매칭 방식을 하나만 쓰면 화면 상태에 따라 잘 맞기도, 크게 빗나가기도 합니다. 그래서 성격이 다른 매칭 방식 여러 개로 각각 후보 위치를 뽑고, 이를 투표하듯 종합(RRF, 순위 기반 합산)해 안정적인 후보군을 추립니다. 그런 다음 상위 후보만 다시 정밀 비교(NCC, 밝기 패턴 상관도)해 최종 한 곳을 정합니다.</w:t>
+        <w:t>등록 이미지 1장 기준</w:t>
+      </w:r>
+      <w:r>
+        <w:rPr>
+          <w:rFonts w:ascii="맑은 고딕" w:hAnsi="맑은 고딕" w:eastAsia="맑은 고딕"/>
+          <w:sz w:val="21"/>
+        </w:rPr>
+        <w:t>: Recipe에 등록된 Align 이미지 한 장하고만 비교해 위치를 재조정합니다. 가장 단순한 방식입니다.</w:t>
       </w:r>
     </w:p>
     <w:p>
@@ -3846,10 +4301,10 @@
         <w:rPr>
           <w:rFonts w:ascii="맑은 고딕" w:hAnsi="맑은 고딕" w:eastAsia="맑은 고딕"/>
           <w:b/>
-          <w:color w:val="E86A1F"/>
-          <w:sz w:val="21"/>
-        </w:rPr>
-        <w:t xml:space="preserve">• </w:t>
+          <w:color w:val="142A55"/>
+          <w:sz w:val="21"/>
+        </w:rPr>
+        <w:t xml:space="preserve">2. </w:t>
       </w:r>
       <w:r>
         <w:rPr>
@@ -3857,44 +4312,14 @@
           <w:b/>
           <w:sz w:val="21"/>
         </w:rPr>
-        <w:t>성공 사례 종합 = consensus</w:t>
-      </w:r>
-      <w:r>
-        <w:rPr>
-          <w:rFonts w:ascii="맑은 고딕" w:hAnsi="맑은 고딕" w:eastAsia="맑은 고딕"/>
-          <w:sz w:val="21"/>
-        </w:rPr>
-        <w:t>: 처음 등록한 이미지는 시간이 지나면 공정 변화로 실제 웨이퍼 외관과 달라져 매칭이 약해집니다. 그래서 최근 성공한 이미지 여러 장을 위치를 맞춰 겹친 뒤 평균 내어 합성하고, 이렇게 "지금의 웨이퍼 외관을 따라가는" 기준 이미지를 만듭니다. 합성 결과가 흐릿하면 등록 이미지로 되돌리는 안전장치도 뒀습니다.</w:t>
-      </w:r>
-    </w:p>
-    <w:p>
-      <w:pPr>
-        <w:spacing w:after="60"/>
-        <w:ind w:left="360"/>
-      </w:pPr>
-      <w:r>
-        <w:rPr>
-          <w:rFonts w:ascii="맑은 고딕" w:hAnsi="맑은 고딕" w:eastAsia="맑은 고딕"/>
-          <w:b/>
-          <w:color w:val="E86A1F"/>
-          <w:sz w:val="21"/>
-        </w:rPr>
-        <w:t xml:space="preserve">• </w:t>
-      </w:r>
-      <w:r>
-        <w:rPr>
-          <w:rFonts w:ascii="맑은 고딕" w:hAnsi="맑은 고딕" w:eastAsia="맑은 고딕"/>
-          <w:b/>
-          <w:sz w:val="21"/>
-        </w:rPr>
-        <w:t>정답 판정 기준을 데이터로 보정</w:t>
-      </w:r>
-      <w:r>
-        <w:rPr>
-          <w:rFonts w:ascii="맑은 고딕" w:hAnsi="맑은 고딕" w:eastAsia="맑은 고딕"/>
-          <w:sz w:val="21"/>
-        </w:rPr>
-        <w:t>: "이 정도면 정답"이라고 볼 점수 임계값은 임의로 정하지 않고, 성공·실패 이미지의 실제 점수 분포를 모아 통계로 결정합니다.</w:t>
+        <w:t>성공 사례 종합 기준</w:t>
+      </w:r>
+      <w:r>
+        <w:rPr>
+          <w:rFonts w:ascii="맑은 고딕" w:hAnsi="맑은 고딕" w:eastAsia="맑은 고딕"/>
+          <w:sz w:val="21"/>
+        </w:rPr>
+        <w:t>: 같은 Recipe에서 과거 정렬에 성공했던 이미지 5~6장을 모아, 이를 종합한 기준으로 위치를 재조정합니다. 이후 결과에서는 이 방식을 consensus(성공 사례 종합)라고 부릅니다.</w:t>
       </w:r>
     </w:p>
     <w:p>
@@ -3908,7 +4333,7 @@
           <w:color w:val="142A55"/>
           <w:sz w:val="27"/>
         </w:rPr>
-        <w:t>4. 평가 방법론 (쉽게 풀어서)</w:t>
+        <w:t>4. 핵심 기법 (쉽게 풀어서)</w:t>
       </w:r>
     </w:p>
     <w:p>
@@ -3931,14 +4356,14 @@
           <w:b/>
           <w:sz w:val="21"/>
         </w:rPr>
-        <w:t>정답 위치는 사람이 아니라 저장된 조건 정보로 산출</w:t>
-      </w:r>
-      <w:r>
-        <w:rPr>
-          <w:rFonts w:ascii="맑은 고딕" w:hAnsi="맑은 고딕" w:eastAsia="맑은 고딕"/>
-          <w:sz w:val="21"/>
-        </w:rPr>
-        <w:t>: 이미지마다 등록 당시의 조건 정보(정렬 박스· 십자선 좌표)가 함께 저장돼 있습니다. 정답을 CV로 다시 검출하면 채점 대상과 정답이 같은 도구에서 나와 순환 오류가 생기므로, 정답 위치는 이 조건 정보로만 계산합니다.</w:t>
+        <w:t>여러 매칭 방식을 종합해 후보를 고름 (Ensemble)</w:t>
+      </w:r>
+      <w:r>
+        <w:rPr>
+          <w:rFonts w:ascii="맑은 고딕" w:hAnsi="맑은 고딕" w:eastAsia="맑은 고딕"/>
+          <w:sz w:val="21"/>
+        </w:rPr>
+        <w:t>: 매칭 방식을 하나만 쓰면 화면 상태에 따라 잘 맞기도, 크게 빗나가기도 합니다. 그래서 성격이 다른 매칭 방식 여러 개로 각각 후보 위치를 뽑고, 이를 투표하듯 종합(RRF, 순위 기반 합산)해 안정적인 후보군을 추립니다. 그런 다음 상위 후보만 다시 정밀 비교(NCC, 밝기 패턴 상관도)해 최종 한 곳을 정합니다.</w:t>
       </w:r>
     </w:p>
     <w:p>
@@ -3961,14 +4386,14 @@
           <w:b/>
           <w:sz w:val="21"/>
         </w:rPr>
-        <w:t>정답 미리보기 방지(교차검증)</w:t>
-      </w:r>
-      <w:r>
-        <w:rPr>
-          <w:rFonts w:ascii="맑은 고딕" w:hAnsi="맑은 고딕" w:eastAsia="맑은 고딕"/>
-          <w:sz w:val="21"/>
-        </w:rPr>
-        <w:t>: 성공 이미지로 기준을 만들 때 평가 대상 이미지는 기준에서 빼둡니다. 그러지 않으면 정답을 미리 본 셈이라 성능이 부풀려집니다.</w:t>
+        <w:t>성공 사례 종합 = consensus</w:t>
+      </w:r>
+      <w:r>
+        <w:rPr>
+          <w:rFonts w:ascii="맑은 고딕" w:hAnsi="맑은 고딕" w:eastAsia="맑은 고딕"/>
+          <w:sz w:val="21"/>
+        </w:rPr>
+        <w:t>: 처음 등록한 이미지는 시간이 지나면 공정 변화로 실제 웨이퍼 외관과 달라져 매칭이 약해집니다. 그래서 최근 성공한 이미지 여러 장을 위치를 맞춰 겹친 뒤 평균 내어 합성하고, 이렇게 "지금의 웨이퍼 외관을 따라가는" 기준 이미지를 만듭니다. 합성 결과가 흐릿하면 등록 이미지로 되돌리는 안전장치도 뒀습니다.</w:t>
       </w:r>
     </w:p>
     <w:p>
@@ -3991,14 +4416,14 @@
           <w:b/>
           <w:sz w:val="21"/>
         </w:rPr>
-        <w:t>성공 이미지 공유 규칙</w:t>
-      </w:r>
-      <w:r>
-        <w:rPr>
-          <w:rFonts w:ascii="맑은 고딕" w:hAnsi="맑은 고딕" w:eastAsia="맑은 고딕"/>
-          <w:sz w:val="21"/>
-        </w:rPr>
-        <w:t>: 같은 Recipe라면 장비가 달라도 정렬 대상이 같으므로 성공 이미지를 함께 씁니다. 최근 성공 이미지 8~10장을 최신순으로 유지합니다.</w:t>
+        <w:t>정답 판정 기준을 데이터로 보정</w:t>
+      </w:r>
+      <w:r>
+        <w:rPr>
+          <w:rFonts w:ascii="맑은 고딕" w:hAnsi="맑은 고딕" w:eastAsia="맑은 고딕"/>
+          <w:sz w:val="21"/>
+        </w:rPr>
+        <w:t>: "이 정도면 정답"이라고 볼 점수 임계값은 임의로 정하지 않고, 성공·실패 이미지의 실제 점수 분포를 모아 통계로 결정합니다.</w:t>
       </w:r>
     </w:p>
     <w:p>
@@ -4012,7 +4437,111 @@
           <w:color w:val="142A55"/>
           <w:sz w:val="27"/>
         </w:rPr>
-        <w:t>5. 측정 결과</w:t>
+        <w:t>5. 평가 방법론 (쉽게 풀어서)</w:t>
+      </w:r>
+    </w:p>
+    <w:p>
+      <w:pPr>
+        <w:spacing w:after="60"/>
+        <w:ind w:left="360"/>
+      </w:pPr>
+      <w:r>
+        <w:rPr>
+          <w:rFonts w:ascii="맑은 고딕" w:hAnsi="맑은 고딕" w:eastAsia="맑은 고딕"/>
+          <w:b/>
+          <w:color w:val="E86A1F"/>
+          <w:sz w:val="21"/>
+        </w:rPr>
+        <w:t xml:space="preserve">• </w:t>
+      </w:r>
+      <w:r>
+        <w:rPr>
+          <w:rFonts w:ascii="맑은 고딕" w:hAnsi="맑은 고딕" w:eastAsia="맑은 고딕"/>
+          <w:b/>
+          <w:sz w:val="21"/>
+        </w:rPr>
+        <w:t>정답 위치는 사람이 아니라 저장된 조건 정보로 산출</w:t>
+      </w:r>
+      <w:r>
+        <w:rPr>
+          <w:rFonts w:ascii="맑은 고딕" w:hAnsi="맑은 고딕" w:eastAsia="맑은 고딕"/>
+          <w:sz w:val="21"/>
+        </w:rPr>
+        <w:t>: 이미지마다 등록 당시의 조건 정보(정렬 박스· 십자선 좌표)가 함께 저장돼 있습니다. 정답을 CV로 다시 검출하면 채점 대상과 정답이 같은 도구에서 나와 순환 오류가 생기므로, 정답 위치는 이 조건 정보로만 계산합니다.</w:t>
+      </w:r>
+    </w:p>
+    <w:p>
+      <w:pPr>
+        <w:spacing w:after="60"/>
+        <w:ind w:left="360"/>
+      </w:pPr>
+      <w:r>
+        <w:rPr>
+          <w:rFonts w:ascii="맑은 고딕" w:hAnsi="맑은 고딕" w:eastAsia="맑은 고딕"/>
+          <w:b/>
+          <w:color w:val="E86A1F"/>
+          <w:sz w:val="21"/>
+        </w:rPr>
+        <w:t xml:space="preserve">• </w:t>
+      </w:r>
+      <w:r>
+        <w:rPr>
+          <w:rFonts w:ascii="맑은 고딕" w:hAnsi="맑은 고딕" w:eastAsia="맑은 고딕"/>
+          <w:b/>
+          <w:sz w:val="21"/>
+        </w:rPr>
+        <w:t>정답 미리보기 방지(교차검증)</w:t>
+      </w:r>
+      <w:r>
+        <w:rPr>
+          <w:rFonts w:ascii="맑은 고딕" w:hAnsi="맑은 고딕" w:eastAsia="맑은 고딕"/>
+          <w:sz w:val="21"/>
+        </w:rPr>
+        <w:t>: 성공 이미지로 기준을 만들 때 평가 대상 이미지는 기준에서 빼둡니다. 그러지 않으면 정답을 미리 본 셈이라 성능이 부풀려집니다.</w:t>
+      </w:r>
+    </w:p>
+    <w:p>
+      <w:pPr>
+        <w:spacing w:after="60"/>
+        <w:ind w:left="360"/>
+      </w:pPr>
+      <w:r>
+        <w:rPr>
+          <w:rFonts w:ascii="맑은 고딕" w:hAnsi="맑은 고딕" w:eastAsia="맑은 고딕"/>
+          <w:b/>
+          <w:color w:val="E86A1F"/>
+          <w:sz w:val="21"/>
+        </w:rPr>
+        <w:t xml:space="preserve">• </w:t>
+      </w:r>
+      <w:r>
+        <w:rPr>
+          <w:rFonts w:ascii="맑은 고딕" w:hAnsi="맑은 고딕" w:eastAsia="맑은 고딕"/>
+          <w:b/>
+          <w:sz w:val="21"/>
+        </w:rPr>
+        <w:t>성공 이미지 공유 규칙</w:t>
+      </w:r>
+      <w:r>
+        <w:rPr>
+          <w:rFonts w:ascii="맑은 고딕" w:hAnsi="맑은 고딕" w:eastAsia="맑은 고딕"/>
+          <w:sz w:val="21"/>
+        </w:rPr>
+        <w:t>: 같은 Recipe라면 장비가 달라도 정렬 대상이 같으므로 성공 이미지를 함께 씁니다. 최근 성공 이미지 8~10장을 최신순으로 유지합니다.</w:t>
+      </w:r>
+    </w:p>
+    <w:p>
+      <w:pPr>
+        <w:spacing w:before="200" w:after="120"/>
+      </w:pPr>
+      <w:r>
+        <w:rPr>
+          <w:rFonts w:ascii="맑은 고딕" w:hAnsi="맑은 고딕" w:eastAsia="맑은 고딕"/>
+          <w:b/>
+          <w:color w:val="142A55"/>
+          <w:sz w:val="27"/>
+        </w:rPr>
+        <w:t>6. 측정 결과</w:t>
       </w:r>
     </w:p>
     <w:p>
@@ -4583,7 +5112,7 @@
           <w:color w:val="142A55"/>
           <w:sz w:val="27"/>
         </w:rPr>
-        <w:t>6. 최근 평가한 아이디어들 (풀어서)</w:t>
+        <w:t>7. 최근 평가한 아이디어들 (풀어서)</w:t>
       </w:r>
     </w:p>
     <w:p>
@@ -4842,7 +5371,7 @@
           <w:color w:val="142A55"/>
           <w:sz w:val="27"/>
         </w:rPr>
-        <w:t>7. 결정 사항과 남은 평가</w:t>
+        <w:t>8. 결정 사항과 남은 평가</w:t>
       </w:r>
     </w:p>
     <w:p>
@@ -5086,7 +5615,7 @@
           <w:color w:val="142A55"/>
           <w:sz w:val="34"/>
         </w:rPr>
-        <w:t>04. 본격 PoC 구현 — 실시간 Align Fail 자동 대응 Agent</w:t>
+        <w:t>04. 실시간 Align Fail 자동 대응 Agent (workflow 3) — 본격 PoC 구현</w:t>
       </w:r>
     </w:p>
     <w:p>
@@ -5109,7 +5638,7 @@
           <w:color w:val="556070"/>
           <w:sz w:val="20"/>
         </w:rPr>
-        <w:t>목적: 앞서 만든 GUI 자동화와 CV 정렬 보정을 하나로 묶어, Align Fail을 사람 없이 감지하고 보정하는 실시간 대응 Agent를 구현합니다. 지금 가장 힘을 쏟고 있는 단계입니다.</w:t>
+        <w:t>목적: 앞서 검증한 GUI 자동화(workflow 1)와 CV 정렬 보정(workflow 2)을 하나로 묶어, Align Fail을 사람 없이 감지하고 보정하는 실시간 대응 Agent를 구현합니다. 지금 가장 힘을 쏟고 있는 단계입니다.</w:t>
       </w:r>
     </w:p>
     <w:p>
@@ -5123,7 +5652,7 @@
           <w:color w:val="142A55"/>
           <w:sz w:val="27"/>
         </w:rPr>
-        <w:t>1. 실시간 알람 감지</w:t>
+        <w:t>1. As-Is → To-Be</w:t>
       </w:r>
     </w:p>
     <w:p>
@@ -5135,8 +5664,317 @@
           <w:rFonts w:ascii="맑은 고딕" w:hAnsi="맑은 고딕" w:eastAsia="맑은 고딕"/>
           <w:sz w:val="21"/>
         </w:rPr>
-        <w:t>10초마다 Smart Alarm System에 R3 CD-SEM의 알람 코드를 물어봅니다. 이 중에서 Align Fail(알람코드 9006)이 잡히면 곧바로 자동 대응 루프를 시작합니다.</w:t>
-      </w:r>
+        <w:t>사람이 하던 대응 전체를 아래와 같이 무인 자동 대응으로 바꾸는 것이 이 단계의 목표입니다.</w:t>
+      </w:r>
+    </w:p>
+    <w:tbl>
+      <w:tblPr>
+        <w:tblStyle w:val="LightGrid-Accent1"/>
+        <w:tblW w:type="auto" w:w="0"/>
+        <w:jc w:val="center"/>
+        <w:tblLook w:firstColumn="1" w:firstRow="1" w:lastColumn="0" w:lastRow="0" w:noHBand="0" w:noVBand="1" w:val="04A0"/>
+      </w:tblPr>
+      <w:tblGrid>
+        <w:gridCol w:w="2880"/>
+        <w:gridCol w:w="2880"/>
+        <w:gridCol w:w="2880"/>
+      </w:tblGrid>
+      <w:tr>
+        <w:tc>
+          <w:tcPr>
+            <w:tcW w:type="dxa" w:w="2880"/>
+            <w:shd w:val="clear" w:fill="142A55"/>
+          </w:tcPr>
+          <w:p>
+            <w:r/>
+            <w:r>
+              <w:rPr>
+                <w:rFonts w:ascii="맑은 고딕" w:hAnsi="맑은 고딕" w:eastAsia="맑은 고딕"/>
+                <w:b/>
+                <w:color w:val="FFFFFF"/>
+                <w:sz w:val="19"/>
+              </w:rPr>
+              <w:t>항목</w:t>
+            </w:r>
+          </w:p>
+        </w:tc>
+        <w:tc>
+          <w:tcPr>
+            <w:tcW w:type="dxa" w:w="2880"/>
+            <w:shd w:val="clear" w:fill="142A55"/>
+          </w:tcPr>
+          <w:p>
+            <w:r/>
+            <w:r>
+              <w:rPr>
+                <w:rFonts w:ascii="맑은 고딕" w:hAnsi="맑은 고딕" w:eastAsia="맑은 고딕"/>
+                <w:b/>
+                <w:color w:val="FFFFFF"/>
+                <w:sz w:val="19"/>
+              </w:rPr>
+              <w:t>As-Is (사람 수동 대응)</w:t>
+            </w:r>
+          </w:p>
+        </w:tc>
+        <w:tc>
+          <w:tcPr>
+            <w:tcW w:type="dxa" w:w="2880"/>
+            <w:shd w:val="clear" w:fill="142A55"/>
+          </w:tcPr>
+          <w:p>
+            <w:r/>
+            <w:r>
+              <w:rPr>
+                <w:rFonts w:ascii="맑은 고딕" w:hAnsi="맑은 고딕" w:eastAsia="맑은 고딕"/>
+                <w:b/>
+                <w:color w:val="FFFFFF"/>
+                <w:sz w:val="19"/>
+              </w:rPr>
+              <w:t>To-Be (무인 자동 대응 Agent)</w:t>
+            </w:r>
+          </w:p>
+        </w:tc>
+      </w:tr>
+      <w:tr>
+        <w:tc>
+          <w:tcPr>
+            <w:tcW w:type="dxa" w:w="2880"/>
+          </w:tcPr>
+          <w:p>
+            <w:r/>
+            <w:r>
+              <w:rPr>
+                <w:rFonts w:ascii="맑은 고딕" w:hAnsi="맑은 고딕" w:eastAsia="맑은 고딕"/>
+                <w:sz w:val="19"/>
+              </w:rPr>
+              <w:t>감지</w:t>
+            </w:r>
+          </w:p>
+        </w:tc>
+        <w:tc>
+          <w:tcPr>
+            <w:tcW w:type="dxa" w:w="2880"/>
+          </w:tcPr>
+          <w:p>
+            <w:r/>
+            <w:r>
+              <w:rPr>
+                <w:rFonts w:ascii="맑은 고딕" w:hAnsi="맑은 고딕" w:eastAsia="맑은 고딕"/>
+                <w:sz w:val="19"/>
+              </w:rPr>
+              <w:t>Line 구성원이 알람을 확인</w:t>
+            </w:r>
+          </w:p>
+        </w:tc>
+        <w:tc>
+          <w:tcPr>
+            <w:tcW w:type="dxa" w:w="2880"/>
+          </w:tcPr>
+          <w:p>
+            <w:r/>
+            <w:r>
+              <w:rPr>
+                <w:rFonts w:ascii="맑은 고딕" w:hAnsi="맑은 고딕" w:eastAsia="맑은 고딕"/>
+                <w:sz w:val="19"/>
+              </w:rPr>
+              <w:t>10초 주기 자동 확인, Align Fail(9006)만 선별</w:t>
+            </w:r>
+          </w:p>
+        </w:tc>
+      </w:tr>
+      <w:tr>
+        <w:tc>
+          <w:tcPr>
+            <w:tcW w:type="dxa" w:w="2880"/>
+          </w:tcPr>
+          <w:p>
+            <w:r/>
+            <w:r>
+              <w:rPr>
+                <w:rFonts w:ascii="맑은 고딕" w:hAnsi="맑은 고딕" w:eastAsia="맑은 고딕"/>
+                <w:sz w:val="19"/>
+              </w:rPr>
+              <w:t>접속·보정</w:t>
+            </w:r>
+          </w:p>
+        </w:tc>
+        <w:tc>
+          <w:tcPr>
+            <w:tcW w:type="dxa" w:w="2880"/>
+          </w:tcPr>
+          <w:p>
+            <w:r/>
+            <w:r>
+              <w:rPr>
+                <w:rFonts w:ascii="맑은 고딕" w:hAnsi="맑은 고딕" w:eastAsia="맑은 고딕"/>
+                <w:sz w:val="19"/>
+              </w:rPr>
+              <w:t>엔지니어가 RCS로 장비에 접속해 수동 재정렬</w:t>
+            </w:r>
+          </w:p>
+        </w:tc>
+        <w:tc>
+          <w:tcPr>
+            <w:tcW w:type="dxa" w:w="2880"/>
+          </w:tcPr>
+          <w:p>
+            <w:r/>
+            <w:r>
+              <w:rPr>
+                <w:rFonts w:ascii="맑은 고딕" w:hAnsi="맑은 고딕" w:eastAsia="맑은 고딕"/>
+                <w:sz w:val="19"/>
+              </w:rPr>
+              <w:t>RCS 자동 접속 → 성공 사례 기반 자동 보정(등록 이미지 자동 폴백)</w:t>
+            </w:r>
+          </w:p>
+        </w:tc>
+      </w:tr>
+      <w:tr>
+        <w:tc>
+          <w:tcPr>
+            <w:tcW w:type="dxa" w:w="2880"/>
+          </w:tcPr>
+          <w:p>
+            <w:r/>
+            <w:r>
+              <w:rPr>
+                <w:rFonts w:ascii="맑은 고딕" w:hAnsi="맑은 고딕" w:eastAsia="맑은 고딕"/>
+                <w:sz w:val="19"/>
+              </w:rPr>
+              <w:t>보정 실패·오측</w:t>
+            </w:r>
+          </w:p>
+        </w:tc>
+        <w:tc>
+          <w:tcPr>
+            <w:tcW w:type="dxa" w:w="2880"/>
+          </w:tcPr>
+          <w:p>
+            <w:r/>
+            <w:r>
+              <w:rPr>
+                <w:rFonts w:ascii="맑은 고딕" w:hAnsi="맑은 고딕" w:eastAsia="맑은 고딕"/>
+                <w:sz w:val="19"/>
+              </w:rPr>
+              <w:t>사람이 발견할 때까지 지연</w:t>
+            </w:r>
+          </w:p>
+        </w:tc>
+        <w:tc>
+          <w:tcPr>
+            <w:tcW w:type="dxa" w:w="2880"/>
+          </w:tcPr>
+          <w:p>
+            <w:r/>
+            <w:r>
+              <w:rPr>
+                <w:rFonts w:ascii="맑은 고딕" w:hAnsi="맑은 고딕" w:eastAsia="맑은 고딕"/>
+                <w:sz w:val="19"/>
+              </w:rPr>
+              <w:t>실패 시 담당자 알림, 오측 감지 시 측정 중단 + Cube 알람</w:t>
+            </w:r>
+          </w:p>
+        </w:tc>
+      </w:tr>
+      <w:tr>
+        <w:tc>
+          <w:tcPr>
+            <w:tcW w:type="dxa" w:w="2880"/>
+          </w:tcPr>
+          <w:p>
+            <w:r/>
+            <w:r>
+              <w:rPr>
+                <w:rFonts w:ascii="맑은 고딕" w:hAnsi="맑은 고딕" w:eastAsia="맑은 고딕"/>
+                <w:sz w:val="19"/>
+              </w:rPr>
+              <w:t>기록</w:t>
+            </w:r>
+          </w:p>
+        </w:tc>
+        <w:tc>
+          <w:tcPr>
+            <w:tcW w:type="dxa" w:w="2880"/>
+          </w:tcPr>
+          <w:p>
+            <w:r/>
+            <w:r>
+              <w:rPr>
+                <w:rFonts w:ascii="맑은 고딕" w:hAnsi="맑은 고딕" w:eastAsia="맑은 고딕"/>
+                <w:sz w:val="19"/>
+              </w:rPr>
+              <w:t>별도 기록 없음</w:t>
+            </w:r>
+          </w:p>
+        </w:tc>
+        <w:tc>
+          <w:tcPr>
+            <w:tcW w:type="dxa" w:w="2880"/>
+          </w:tcPr>
+          <w:p>
+            <w:r/>
+            <w:r>
+              <w:rPr>
+                <w:rFonts w:ascii="맑은 고딕" w:hAnsi="맑은 고딕" w:eastAsia="맑은 고딕"/>
+                <w:sz w:val="19"/>
+              </w:rPr>
+              <w:t>상시 녹화 + 성공/실패 이미지 자동 저장(지식 자산화)</w:t>
+            </w:r>
+          </w:p>
+        </w:tc>
+      </w:tr>
+      <w:tr>
+        <w:tc>
+          <w:tcPr>
+            <w:tcW w:type="dxa" w:w="2880"/>
+          </w:tcPr>
+          <w:p>
+            <w:r/>
+            <w:r>
+              <w:rPr>
+                <w:rFonts w:ascii="맑은 고딕" w:hAnsi="맑은 고딕" w:eastAsia="맑은 고딕"/>
+                <w:sz w:val="19"/>
+              </w:rPr>
+              <w:t>1건당 대응 시간</w:t>
+            </w:r>
+          </w:p>
+        </w:tc>
+        <w:tc>
+          <w:tcPr>
+            <w:tcW w:type="dxa" w:w="2880"/>
+          </w:tcPr>
+          <w:p>
+            <w:r/>
+            <w:r>
+              <w:rPr>
+                <w:rFonts w:ascii="맑은 고딕" w:hAnsi="맑은 고딕" w:eastAsia="맑은 고딕"/>
+                <w:sz w:val="19"/>
+              </w:rPr>
+              <w:t>평균 5분</w:t>
+            </w:r>
+          </w:p>
+        </w:tc>
+        <w:tc>
+          <w:tcPr>
+            <w:tcW w:type="dxa" w:w="2880"/>
+          </w:tcPr>
+          <w:p>
+            <w:r/>
+            <w:r>
+              <w:rPr>
+                <w:rFonts w:ascii="맑은 고딕" w:hAnsi="맑은 고딕" w:eastAsia="맑은 고딕"/>
+                <w:sz w:val="19"/>
+              </w:rPr>
+              <w:t>목표 1분</w:t>
+            </w:r>
+          </w:p>
+        </w:tc>
+      </w:tr>
+    </w:tbl>
+    <w:p>
+      <w:pPr>
+        <w:spacing w:after="80"/>
+      </w:pPr>
     </w:p>
     <w:p>
       <w:pPr>
@@ -5149,7 +5987,7 @@
           <w:color w:val="142A55"/>
           <w:sz w:val="27"/>
         </w:rPr>
-        <w:t>2. 작동 루프 개요</w:t>
+        <w:t>2. 실시간 알람 감지</w:t>
       </w:r>
     </w:p>
     <w:p>
@@ -5161,32 +5999,7 @@
           <w:rFonts w:ascii="맑은 고딕" w:hAnsi="맑은 고딕" w:eastAsia="맑은 고딕"/>
           <w:sz w:val="21"/>
         </w:rPr>
-        <w:t>Align Fail(9006)이 감지되면 다음 순서로 움직입니다.</w:t>
-      </w:r>
-    </w:p>
-    <w:p>
-      <w:pPr>
-        <w:spacing w:after="120"/>
-      </w:pPr>
-      <w:r>
-        <w:rPr>
-          <w:rFonts w:ascii="맑은 고딕" w:hAnsi="맑은 고딕" w:eastAsia="맑은 고딕"/>
-          <w:b/>
-          <w:sz w:val="21"/>
-        </w:rPr>
-        <w:t>RCS 실행 → 해당 장비 모니터 접속 → 자동 정렬 보정 → (실패 시) 담당자 알림 → 상시 녹화 → 자동 종료 → 다음 알람 대기</w:t>
-      </w:r>
-    </w:p>
-    <w:p>
-      <w:pPr>
-        <w:spacing w:after="120"/>
-      </w:pPr>
-      <w:r>
-        <w:rPr>
-          <w:rFonts w:ascii="맑은 고딕" w:hAnsi="맑은 고딕" w:eastAsia="맑은 고딕"/>
-          <w:sz w:val="21"/>
-        </w:rPr>
-        <w:t>알람이 잡히면 이 대응 루프와 동시에, 과거 정렬 성공 이미지를 추적·다운로드하는 작업(consensus gather)이 백그라운드에서 함께 돕니다. 보정에 쓸 최신 성공 이미지를 미리 확보해 두려는 것이며, 대응 루프의 속도를 늦추지 않습니다.</w:t>
+        <w:t>10초마다 Smart Alarm System에 R3 CD-SEM의 알람 코드를 물어봅니다. 이 중에서 Align Fail(알람코드 9006)이 잡히면 곧바로 자동 대응 루프를 시작합니다.</w:t>
       </w:r>
     </w:p>
     <w:p>
@@ -5200,187 +6013,44 @@
           <w:color w:val="142A55"/>
           <w:sz w:val="27"/>
         </w:rPr>
-        <w:t>3. 핵심 기능</w:t>
+        <w:t>3. 작동 루프 개요</w:t>
       </w:r>
     </w:p>
     <w:p>
       <w:pPr>
-        <w:spacing w:after="60"/>
-        <w:ind w:left="360"/>
-      </w:pPr>
-      <w:r>
-        <w:rPr>
-          <w:rFonts w:ascii="맑은 고딕" w:hAnsi="맑은 고딕" w:eastAsia="맑은 고딕"/>
-          <w:b/>
-          <w:color w:val="E86A1F"/>
-          <w:sz w:val="21"/>
-        </w:rPr>
-        <w:t xml:space="preserve">• </w:t>
-      </w:r>
-      <w:r>
-        <w:rPr>
-          <w:rFonts w:ascii="맑은 고딕" w:hAnsi="맑은 고딕" w:eastAsia="맑은 고딕"/>
-          <w:b/>
-          <w:sz w:val="21"/>
-        </w:rPr>
-        <w:t>알람 1건 단위의 안전한 처리</w:t>
-      </w:r>
-      <w:r>
-        <w:rPr>
-          <w:rFonts w:ascii="맑은 고딕" w:hAnsi="맑은 고딕" w:eastAsia="맑은 고딕"/>
-          <w:sz w:val="21"/>
-        </w:rPr>
-        <w:t>: 알람 한 건마다 장비 접속부터 정렬 보정까지 순서대로 처리합니다. 도중에 오류가 나더라도 녹화 종료, 장비 창 닫기, 팝업 정리 같은 뒷정리는 반드시 수행해, 장비를 늘 깨끗한 상태로 되돌립니다.</w:t>
+        <w:spacing w:after="120"/>
+      </w:pPr>
+      <w:r>
+        <w:rPr>
+          <w:rFonts w:ascii="맑은 고딕" w:hAnsi="맑은 고딕" w:eastAsia="맑은 고딕"/>
+          <w:sz w:val="21"/>
+        </w:rPr>
+        <w:t>Align Fail(9006)이 감지되면 다음 순서로 움직입니다.</w:t>
       </w:r>
     </w:p>
     <w:p>
       <w:pPr>
-        <w:spacing w:after="60"/>
-        <w:ind w:left="360"/>
+        <w:spacing w:after="120"/>
       </w:pPr>
       <w:r>
         <w:rPr>
           <w:rFonts w:ascii="맑은 고딕" w:hAnsi="맑은 고딕" w:eastAsia="맑은 고딕"/>
           <w:b/>
-          <w:color w:val="E86A1F"/>
-          <w:sz w:val="21"/>
-        </w:rPr>
-        <w:t xml:space="preserve">• </w:t>
-      </w:r>
-      <w:r>
-        <w:rPr>
-          <w:rFonts w:ascii="맑은 고딕" w:hAnsi="맑은 고딕" w:eastAsia="맑은 고딕"/>
-          <w:b/>
-          <w:sz w:val="21"/>
-        </w:rPr>
-        <w:t>성공 사례 기반 자동 보정</w:t>
-      </w:r>
-      <w:r>
-        <w:rPr>
-          <w:rFonts w:ascii="맑은 고딕" w:hAnsi="맑은 고딕" w:eastAsia="맑은 고딕"/>
-          <w:sz w:val="21"/>
-        </w:rPr>
-        <w:t>: 최근 정렬 성공 이미지를 종합한 기준으로 정렬 위치를 다시 찾아 보정합니다. 성공 이미지가 부족하거나 품질이 떨어지면 처음 등록된 이미지로 자동 전환해, 어떤 경우에도 안전하게 동작합니다.</w:t>
+          <w:sz w:val="21"/>
+        </w:rPr>
+        <w:t>RCS 실행 → 해당 장비 모니터 접속 → 자동 정렬 보정 → (실패 시) 담당자 알림 → 상시 녹화 → 자동 종료 → 다음 알람 대기</w:t>
       </w:r>
     </w:p>
     <w:p>
       <w:pPr>
-        <w:spacing w:after="60"/>
-        <w:ind w:left="360"/>
-      </w:pPr>
-      <w:r>
-        <w:rPr>
-          <w:rFonts w:ascii="맑은 고딕" w:hAnsi="맑은 고딕" w:eastAsia="맑은 고딕"/>
-          <w:b/>
-          <w:color w:val="E86A1F"/>
-          <w:sz w:val="21"/>
-        </w:rPr>
-        <w:t xml:space="preserve">• </w:t>
-      </w:r>
-      <w:r>
-        <w:rPr>
-          <w:rFonts w:ascii="맑은 고딕" w:hAnsi="맑은 고딕" w:eastAsia="맑은 고딕"/>
-          <w:b/>
-          <w:sz w:val="21"/>
-        </w:rPr>
-        <w:t>엔지니어 작업 자동 감지</w:t>
-      </w:r>
-      <w:r>
-        <w:rPr>
-          <w:rFonts w:ascii="맑은 고딕" w:hAnsi="맑은 고딕" w:eastAsia="맑은 고딕"/>
-          <w:sz w:val="21"/>
-        </w:rPr>
-        <w:t>: 엔지니어가 직접 재정렬에 나서면 이를 알아채고 자동 감시를 끝낸 뒤 장비 창을 닫습니다. 사람의 작업을 방해하지 않기 위해서입니다.</w:t>
-      </w:r>
-    </w:p>
-    <w:p>
-      <w:pPr>
-        <w:spacing w:after="60"/>
-        <w:ind w:left="360"/>
-      </w:pPr>
-      <w:r>
-        <w:rPr>
-          <w:rFonts w:ascii="맑은 고딕" w:hAnsi="맑은 고딕" w:eastAsia="맑은 고딕"/>
-          <w:b/>
-          <w:color w:val="E86A1F"/>
-          <w:sz w:val="21"/>
-        </w:rPr>
-        <w:t xml:space="preserve">• </w:t>
-      </w:r>
-      <w:r>
-        <w:rPr>
-          <w:rFonts w:ascii="맑은 고딕" w:hAnsi="맑은 고딕" w:eastAsia="맑은 고딕"/>
-          <w:b/>
-          <w:sz w:val="21"/>
-        </w:rPr>
-        <w:t>보정 가능 여부 판정과 재등록 권고</w:t>
-      </w:r>
-      <w:r>
-        <w:rPr>
-          <w:rFonts w:ascii="맑은 고딕" w:hAnsi="맑은 고딕" w:eastAsia="맑은 고딕"/>
-          <w:sz w:val="21"/>
-        </w:rPr>
-        <w:t>: 지금 화면에서 정렬 위치를 확실히 찾을 수 있는지 판정합니다. 비슷한 후보가 많아 근본적으로 헷갈리는 Recipe는 "더 뚜렷한 위치로 재등록 권고"를 기록으로 남깁니다.</w:t>
-      </w:r>
-    </w:p>
-    <w:p>
-      <w:pPr>
-        <w:spacing w:after="60"/>
-        <w:ind w:left="360"/>
-      </w:pPr>
-      <w:r>
-        <w:rPr>
-          <w:rFonts w:ascii="맑은 고딕" w:hAnsi="맑은 고딕" w:eastAsia="맑은 고딕"/>
-          <w:b/>
-          <w:color w:val="E86A1F"/>
-          <w:sz w:val="21"/>
-        </w:rPr>
-        <w:t xml:space="preserve">• </w:t>
-      </w:r>
-      <w:r>
-        <w:rPr>
-          <w:rFonts w:ascii="맑은 고딕" w:hAnsi="맑은 고딕" w:eastAsia="맑은 고딕"/>
-          <w:b/>
-          <w:sz w:val="21"/>
-        </w:rPr>
-        <w:t>여러 배율로 탐색</w:t>
-      </w:r>
-      <w:r>
-        <w:rPr>
-          <w:rFonts w:ascii="맑은 고딕" w:hAnsi="맑은 고딕" w:eastAsia="맑은 고딕"/>
-          <w:sz w:val="21"/>
-        </w:rPr>
-        <w:t>: 정렬 위치가 어느 배율에서 잘 보이는지 애매할 때는 화면 배율을 바꿔 가며 다시 찾습니다. 마우스 휠로 배율이 안 바뀌는 일부 장비는 배율 조절 버튼을 씁니다.</w:t>
-      </w:r>
-    </w:p>
-    <w:p>
-      <w:pPr>
-        <w:spacing w:after="60"/>
-        <w:ind w:left="360"/>
-      </w:pPr>
-      <w:r>
-        <w:rPr>
-          <w:rFonts w:ascii="맑은 고딕" w:hAnsi="맑은 고딕" w:eastAsia="맑은 고딕"/>
-          <w:b/>
-          <w:color w:val="E86A1F"/>
-          <w:sz w:val="21"/>
-        </w:rPr>
-        <w:t xml:space="preserve">• </w:t>
-      </w:r>
-      <w:r>
-        <w:rPr>
-          <w:rFonts w:ascii="맑은 고딕" w:hAnsi="맑은 고딕" w:eastAsia="맑은 고딕"/>
-          <w:b/>
-          <w:sz w:val="21"/>
-        </w:rPr>
-        <w:t>점검 전용 모드</w:t>
-      </w:r>
-      <w:r>
-        <w:rPr>
-          <w:rFonts w:ascii="맑은 고딕" w:hAnsi="맑은 고딕" w:eastAsia="맑은 고딕"/>
-          <w:sz w:val="21"/>
-        </w:rPr>
-        <w:t>: 실제 보정 없이 접속 → 화면 1장 캡처 → 판정 → 종료만 수행하는 진단·점검용 모드도 갖췄습니다.</w:t>
+        <w:spacing w:after="120"/>
+      </w:pPr>
+      <w:r>
+        <w:rPr>
+          <w:rFonts w:ascii="맑은 고딕" w:hAnsi="맑은 고딕" w:eastAsia="맑은 고딕"/>
+          <w:sz w:val="21"/>
+        </w:rPr>
+        <w:t>알람이 잡히면 이 대응 루프와 동시에, 과거 정렬 성공 이미지를 추적·다운로드하는 작업(consensus gather)이 백그라운드에서 함께 돕니다. 보정에 쓸 최신 성공 이미지를 미리 확보해 두려는 것이며, 대응 루프의 속도를 늦추지 않습니다.</w:t>
       </w:r>
     </w:p>
     <w:p>
@@ -5394,19 +6064,187 @@
           <w:color w:val="142A55"/>
           <w:sz w:val="27"/>
         </w:rPr>
-        <w:t>4. 안전 장치 — 오측 감지 시 사람 개입</w:t>
+        <w:t>4. 핵심 기능</w:t>
       </w:r>
     </w:p>
     <w:p>
       <w:pPr>
-        <w:spacing w:after="120"/>
-      </w:pPr>
-      <w:r>
-        <w:rPr>
-          <w:rFonts w:ascii="맑은 고딕" w:hAnsi="맑은 고딕" w:eastAsia="맑은 고딕"/>
-          <w:sz w:val="21"/>
-        </w:rPr>
-        <w:t>VLM이 실제 보정을 마친 뒤에도 이후 측정 과정을 계속 지켜봅니다. 여기서 잘못된 보정(오측)이 감지되면 즉시 측정을 멈추고, 담당 Engineer에게 Cube로 알람을 보내 사람이 확인·개입하도록 했습니다. 자동 보정이 틀렸을 때 잘못된 상태로 측정이 이어지지 않도록, 사람이 반드시 한 번 확인하는 안전장치를 둔 것입니다.</w:t>
+        <w:spacing w:after="60"/>
+        <w:ind w:left="360"/>
+      </w:pPr>
+      <w:r>
+        <w:rPr>
+          <w:rFonts w:ascii="맑은 고딕" w:hAnsi="맑은 고딕" w:eastAsia="맑은 고딕"/>
+          <w:b/>
+          <w:color w:val="E86A1F"/>
+          <w:sz w:val="21"/>
+        </w:rPr>
+        <w:t xml:space="preserve">• </w:t>
+      </w:r>
+      <w:r>
+        <w:rPr>
+          <w:rFonts w:ascii="맑은 고딕" w:hAnsi="맑은 고딕" w:eastAsia="맑은 고딕"/>
+          <w:b/>
+          <w:sz w:val="21"/>
+        </w:rPr>
+        <w:t>알람 1건 단위의 안전한 처리</w:t>
+      </w:r>
+      <w:r>
+        <w:rPr>
+          <w:rFonts w:ascii="맑은 고딕" w:hAnsi="맑은 고딕" w:eastAsia="맑은 고딕"/>
+          <w:sz w:val="21"/>
+        </w:rPr>
+        <w:t>: 알람 한 건마다 장비 접속부터 정렬 보정까지 순서대로 처리합니다. 도중에 오류가 나더라도 녹화 종료, 장비 창 닫기, 팝업 정리 같은 뒷정리는 반드시 수행해, 장비를 늘 깨끗한 상태로 되돌립니다.</w:t>
+      </w:r>
+    </w:p>
+    <w:p>
+      <w:pPr>
+        <w:spacing w:after="60"/>
+        <w:ind w:left="360"/>
+      </w:pPr>
+      <w:r>
+        <w:rPr>
+          <w:rFonts w:ascii="맑은 고딕" w:hAnsi="맑은 고딕" w:eastAsia="맑은 고딕"/>
+          <w:b/>
+          <w:color w:val="E86A1F"/>
+          <w:sz w:val="21"/>
+        </w:rPr>
+        <w:t xml:space="preserve">• </w:t>
+      </w:r>
+      <w:r>
+        <w:rPr>
+          <w:rFonts w:ascii="맑은 고딕" w:hAnsi="맑은 고딕" w:eastAsia="맑은 고딕"/>
+          <w:b/>
+          <w:sz w:val="21"/>
+        </w:rPr>
+        <w:t>성공 사례 기반 자동 보정</w:t>
+      </w:r>
+      <w:r>
+        <w:rPr>
+          <w:rFonts w:ascii="맑은 고딕" w:hAnsi="맑은 고딕" w:eastAsia="맑은 고딕"/>
+          <w:sz w:val="21"/>
+        </w:rPr>
+        <w:t>: 최근 정렬 성공 이미지를 종합한 기준으로 정렬 위치를 다시 찾아 보정합니다. 성공 이미지가 부족하거나 품질이 떨어지면 처음 등록된 이미지로 자동 전환해, 어떤 경우에도 안전하게 동작합니다.</w:t>
+      </w:r>
+    </w:p>
+    <w:p>
+      <w:pPr>
+        <w:spacing w:after="60"/>
+        <w:ind w:left="360"/>
+      </w:pPr>
+      <w:r>
+        <w:rPr>
+          <w:rFonts w:ascii="맑은 고딕" w:hAnsi="맑은 고딕" w:eastAsia="맑은 고딕"/>
+          <w:b/>
+          <w:color w:val="E86A1F"/>
+          <w:sz w:val="21"/>
+        </w:rPr>
+        <w:t xml:space="preserve">• </w:t>
+      </w:r>
+      <w:r>
+        <w:rPr>
+          <w:rFonts w:ascii="맑은 고딕" w:hAnsi="맑은 고딕" w:eastAsia="맑은 고딕"/>
+          <w:b/>
+          <w:sz w:val="21"/>
+        </w:rPr>
+        <w:t>엔지니어 작업 자동 감지</w:t>
+      </w:r>
+      <w:r>
+        <w:rPr>
+          <w:rFonts w:ascii="맑은 고딕" w:hAnsi="맑은 고딕" w:eastAsia="맑은 고딕"/>
+          <w:sz w:val="21"/>
+        </w:rPr>
+        <w:t>: 엔지니어가 직접 재정렬에 나서면 이를 알아채고 자동 감시를 끝낸 뒤 장비 창을 닫습니다. 사람의 작업을 방해하지 않기 위해서입니다.</w:t>
+      </w:r>
+    </w:p>
+    <w:p>
+      <w:pPr>
+        <w:spacing w:after="60"/>
+        <w:ind w:left="360"/>
+      </w:pPr>
+      <w:r>
+        <w:rPr>
+          <w:rFonts w:ascii="맑은 고딕" w:hAnsi="맑은 고딕" w:eastAsia="맑은 고딕"/>
+          <w:b/>
+          <w:color w:val="E86A1F"/>
+          <w:sz w:val="21"/>
+        </w:rPr>
+        <w:t xml:space="preserve">• </w:t>
+      </w:r>
+      <w:r>
+        <w:rPr>
+          <w:rFonts w:ascii="맑은 고딕" w:hAnsi="맑은 고딕" w:eastAsia="맑은 고딕"/>
+          <w:b/>
+          <w:sz w:val="21"/>
+        </w:rPr>
+        <w:t>보정 가능 여부 판정과 재등록 권고</w:t>
+      </w:r>
+      <w:r>
+        <w:rPr>
+          <w:rFonts w:ascii="맑은 고딕" w:hAnsi="맑은 고딕" w:eastAsia="맑은 고딕"/>
+          <w:sz w:val="21"/>
+        </w:rPr>
+        <w:t>: 지금 화면에서 정렬 위치를 확실히 찾을 수 있는지 판정합니다. 비슷한 후보가 많아 근본적으로 헷갈리는 Recipe는 "더 뚜렷한 위치로 재등록 권고"를 기록으로 남깁니다.</w:t>
+      </w:r>
+    </w:p>
+    <w:p>
+      <w:pPr>
+        <w:spacing w:after="60"/>
+        <w:ind w:left="360"/>
+      </w:pPr>
+      <w:r>
+        <w:rPr>
+          <w:rFonts w:ascii="맑은 고딕" w:hAnsi="맑은 고딕" w:eastAsia="맑은 고딕"/>
+          <w:b/>
+          <w:color w:val="E86A1F"/>
+          <w:sz w:val="21"/>
+        </w:rPr>
+        <w:t xml:space="preserve">• </w:t>
+      </w:r>
+      <w:r>
+        <w:rPr>
+          <w:rFonts w:ascii="맑은 고딕" w:hAnsi="맑은 고딕" w:eastAsia="맑은 고딕"/>
+          <w:b/>
+          <w:sz w:val="21"/>
+        </w:rPr>
+        <w:t>여러 배율로 탐색</w:t>
+      </w:r>
+      <w:r>
+        <w:rPr>
+          <w:rFonts w:ascii="맑은 고딕" w:hAnsi="맑은 고딕" w:eastAsia="맑은 고딕"/>
+          <w:sz w:val="21"/>
+        </w:rPr>
+        <w:t>: 정렬 위치가 어느 배율에서 잘 보이는지 애매할 때는 화면 배율을 바꿔 가며 다시 찾습니다. 마우스 휠로 배율이 안 바뀌는 일부 장비는 배율 조절 버튼을 씁니다.</w:t>
+      </w:r>
+    </w:p>
+    <w:p>
+      <w:pPr>
+        <w:spacing w:after="60"/>
+        <w:ind w:left="360"/>
+      </w:pPr>
+      <w:r>
+        <w:rPr>
+          <w:rFonts w:ascii="맑은 고딕" w:hAnsi="맑은 고딕" w:eastAsia="맑은 고딕"/>
+          <w:b/>
+          <w:color w:val="E86A1F"/>
+          <w:sz w:val="21"/>
+        </w:rPr>
+        <w:t xml:space="preserve">• </w:t>
+      </w:r>
+      <w:r>
+        <w:rPr>
+          <w:rFonts w:ascii="맑은 고딕" w:hAnsi="맑은 고딕" w:eastAsia="맑은 고딕"/>
+          <w:b/>
+          <w:sz w:val="21"/>
+        </w:rPr>
+        <w:t>점검 전용 모드</w:t>
+      </w:r>
+      <w:r>
+        <w:rPr>
+          <w:rFonts w:ascii="맑은 고딕" w:hAnsi="맑은 고딕" w:eastAsia="맑은 고딕"/>
+          <w:sz w:val="21"/>
+        </w:rPr>
+        <w:t>: 실제 보정 없이 접속 → 화면 1장 캡처 → 판정 → 종료만 수행하는 진단·점검용 모드도 갖췄습니다.</w:t>
       </w:r>
     </w:p>
     <w:p>
@@ -5420,67 +6258,19 @@
           <w:color w:val="142A55"/>
           <w:sz w:val="27"/>
         </w:rPr>
-        <w:t>5. 암묵지 지식 자산화 구조</w:t>
+        <w:t>5. 안전 장치 — 오측 감지 시 사람 개입</w:t>
       </w:r>
     </w:p>
     <w:p>
       <w:pPr>
-        <w:spacing w:after="60"/>
-        <w:ind w:left="360"/>
-      </w:pPr>
-      <w:r>
-        <w:rPr>
-          <w:rFonts w:ascii="맑은 고딕" w:hAnsi="맑은 고딕" w:eastAsia="맑은 고딕"/>
-          <w:b/>
-          <w:color w:val="E86A1F"/>
-          <w:sz w:val="21"/>
-        </w:rPr>
-        <w:t xml:space="preserve">• </w:t>
-      </w:r>
-      <w:r>
-        <w:rPr>
-          <w:rFonts w:ascii="맑은 고딕" w:hAnsi="맑은 고딕" w:eastAsia="맑은 고딕"/>
-          <w:b/>
-          <w:sz w:val="21"/>
-        </w:rPr>
-        <w:t>정렬 성공/실패 이미지 저장</w:t>
-      </w:r>
-      <w:r>
-        <w:rPr>
-          <w:rFonts w:ascii="맑은 고딕" w:hAnsi="맑은 고딕" w:eastAsia="맑은 고딕"/>
-          <w:sz w:val="21"/>
-        </w:rPr>
-        <w:t>: align에 성공한 이미지와 실패한 이미지를 저장하고, 최신 이미지가 계속 자동으로 갱신되도록 했습니다. 다음에 같은 Recipe에서 Align Fail이 나면 VLM이 참고할 최신 자료가 됩니다.</w:t>
-      </w:r>
-    </w:p>
-    <w:p>
-      <w:pPr>
-        <w:spacing w:after="60"/>
-        <w:ind w:left="360"/>
-      </w:pPr>
-      <w:r>
-        <w:rPr>
-          <w:rFonts w:ascii="맑은 고딕" w:hAnsi="맑은 고딕" w:eastAsia="맑은 고딕"/>
-          <w:b/>
-          <w:color w:val="E86A1F"/>
-          <w:sz w:val="21"/>
-        </w:rPr>
-        <w:t xml:space="preserve">• </w:t>
-      </w:r>
-      <w:r>
-        <w:rPr>
-          <w:rFonts w:ascii="맑은 고딕" w:hAnsi="맑은 고딕" w:eastAsia="맑은 고딕"/>
-          <w:b/>
-          <w:sz w:val="21"/>
-        </w:rPr>
-        <w:t>녹화를 VLM 학습·분석에 활용</w:t>
-      </w:r>
-      <w:r>
-        <w:rPr>
-          <w:rFonts w:ascii="맑은 고딕" w:hAnsi="맑은 고딕" w:eastAsia="맑은 고딕"/>
-          <w:sz w:val="21"/>
-        </w:rPr>
-        <w:t>: 엔지니어가 장비를 조작하는 과정을 녹화해 두고, 이를 VLM workflow(학습·분석)에 쓸 수 있는 형태로 만듭니다. 사람이 손으로 쌓아 온 암묵지, 즉 작업 노하우를 데이터로 자산화하는 구조입니다.</w:t>
+        <w:spacing w:after="120"/>
+      </w:pPr>
+      <w:r>
+        <w:rPr>
+          <w:rFonts w:ascii="맑은 고딕" w:hAnsi="맑은 고딕" w:eastAsia="맑은 고딕"/>
+          <w:sz w:val="21"/>
+        </w:rPr>
+        <w:t>VLM이 실제 보정을 마친 뒤에도 이후 측정 과정을 계속 지켜봅니다. 여기서 잘못된 보정(오측)이 감지되면 즉시 측정을 멈추고, 담당 Engineer에게 Cube로 알람을 보내 사람이 확인·개입하도록 했습니다. 자동 보정이 틀렸을 때 잘못된 상태로 측정이 이어지지 않도록, 사람이 반드시 한 번 확인하는 안전장치를 둔 것입니다.</w:t>
       </w:r>
     </w:p>
     <w:p>
@@ -5494,7 +6284,81 @@
           <w:color w:val="142A55"/>
           <w:sz w:val="27"/>
         </w:rPr>
-        <w:t>6. 진행 현황</w:t>
+        <w:t>6. 암묵지 지식 자산화 구조</w:t>
+      </w:r>
+    </w:p>
+    <w:p>
+      <w:pPr>
+        <w:spacing w:after="60"/>
+        <w:ind w:left="360"/>
+      </w:pPr>
+      <w:r>
+        <w:rPr>
+          <w:rFonts w:ascii="맑은 고딕" w:hAnsi="맑은 고딕" w:eastAsia="맑은 고딕"/>
+          <w:b/>
+          <w:color w:val="E86A1F"/>
+          <w:sz w:val="21"/>
+        </w:rPr>
+        <w:t xml:space="preserve">• </w:t>
+      </w:r>
+      <w:r>
+        <w:rPr>
+          <w:rFonts w:ascii="맑은 고딕" w:hAnsi="맑은 고딕" w:eastAsia="맑은 고딕"/>
+          <w:b/>
+          <w:sz w:val="21"/>
+        </w:rPr>
+        <w:t>정렬 성공/실패 이미지 저장</w:t>
+      </w:r>
+      <w:r>
+        <w:rPr>
+          <w:rFonts w:ascii="맑은 고딕" w:hAnsi="맑은 고딕" w:eastAsia="맑은 고딕"/>
+          <w:sz w:val="21"/>
+        </w:rPr>
+        <w:t>: align에 성공한 이미지와 실패한 이미지를 저장하고, 최신 이미지가 계속 자동으로 갱신되도록 했습니다. 다음에 같은 Recipe에서 Align Fail이 나면 VLM이 참고할 최신 자료가 됩니다.</w:t>
+      </w:r>
+    </w:p>
+    <w:p>
+      <w:pPr>
+        <w:spacing w:after="60"/>
+        <w:ind w:left="360"/>
+      </w:pPr>
+      <w:r>
+        <w:rPr>
+          <w:rFonts w:ascii="맑은 고딕" w:hAnsi="맑은 고딕" w:eastAsia="맑은 고딕"/>
+          <w:b/>
+          <w:color w:val="E86A1F"/>
+          <w:sz w:val="21"/>
+        </w:rPr>
+        <w:t xml:space="preserve">• </w:t>
+      </w:r>
+      <w:r>
+        <w:rPr>
+          <w:rFonts w:ascii="맑은 고딕" w:hAnsi="맑은 고딕" w:eastAsia="맑은 고딕"/>
+          <w:b/>
+          <w:sz w:val="21"/>
+        </w:rPr>
+        <w:t>녹화를 VLM 학습·분석에 활용</w:t>
+      </w:r>
+      <w:r>
+        <w:rPr>
+          <w:rFonts w:ascii="맑은 고딕" w:hAnsi="맑은 고딕" w:eastAsia="맑은 고딕"/>
+          <w:sz w:val="21"/>
+        </w:rPr>
+        <w:t>: 엔지니어가 장비를 조작하는 과정을 녹화해 두고, 이를 VLM workflow(학습·분석)에 쓸 수 있는 형태로 만듭니다. 사람이 손으로 쌓아 온 암묵지, 즉 작업 노하우를 데이터로 자산화하는 구조입니다.</w:t>
+      </w:r>
+    </w:p>
+    <w:p>
+      <w:pPr>
+        <w:spacing w:before="200" w:after="120"/>
+      </w:pPr>
+      <w:r>
+        <w:rPr>
+          <w:rFonts w:ascii="맑은 고딕" w:hAnsi="맑은 고딕" w:eastAsia="맑은 고딕"/>
+          <w:b/>
+          <w:color w:val="142A55"/>
+          <w:sz w:val="27"/>
+        </w:rPr>
+        <w:t>7. 진행 현황</w:t>
       </w:r>
     </w:p>
     <w:p>
@@ -5970,7 +6834,7 @@
           <w:color w:val="142A55"/>
           <w:sz w:val="27"/>
         </w:rPr>
-        <w:t>7. 향후 일정</w:t>
+        <w:t>8. 향후 일정</w:t>
       </w:r>
     </w:p>
     <w:p>

</xml_diff>

<commit_message>
docs(project_progress): 부록 As-Is→To-Be 시각화 + 예상 허들 섹션 신설
- _appendix.html: 새 섹션 01 As-Is→To-Be 비교 카드(감지/접속·보정/실패·오측/기록/대응 시간), 기존 섹션 02~08 번호 조정, 정확도 범례에 As-Is/To-Be 라벨, §08에 예상 허들 카드
- 04: §8 '예상 허들과 대응' 신설(벤치-현장 갭, 성공 이미지 적재, 재등록, 환경 편차, 서버 가용성, 단계적 활성화), 향후 일정 §9로
- 00: §8 '예상 허들 (Risks)' 압축본 + 04 참조 문구 갱신
- README 04 요약 갱신, docx 재생성 (부록은 브라우저 렌더링 검증)

Co-Authored-By: Claude Fable 5 <noreply@anthropic.com>
Claude-Session: https://claude.ai/code/session_01C5YbnVWaijoxPp44Dj1uc6
</commit_message>
<xml_diff>
--- a/docs/project_progress/project_progress_report.docx
+++ b/docs/project_progress/project_progress_report.docx
@@ -1836,6 +1836,140 @@
     </w:p>
     <w:p>
       <w:pPr>
+        <w:spacing w:before="200" w:after="120"/>
+      </w:pPr>
+      <w:r>
+        <w:rPr>
+          <w:rFonts w:ascii="맑은 고딕" w:hAnsi="맑은 고딕" w:eastAsia="맑은 고딕"/>
+          <w:b/>
+          <w:color w:val="142A55"/>
+          <w:sz w:val="27"/>
+        </w:rPr>
+        <w:t>8. 예상 허들 (Risks)</w:t>
+      </w:r>
+    </w:p>
+    <w:p>
+      <w:pPr>
+        <w:spacing w:after="60"/>
+        <w:ind w:left="360"/>
+      </w:pPr>
+      <w:r>
+        <w:rPr>
+          <w:rFonts w:ascii="맑은 고딕" w:hAnsi="맑은 고딕" w:eastAsia="맑은 고딕"/>
+          <w:b/>
+          <w:color w:val="E86A1F"/>
+          <w:sz w:val="21"/>
+        </w:rPr>
+        <w:t xml:space="preserve">• </w:t>
+      </w:r>
+      <w:r>
+        <w:rPr>
+          <w:rFonts w:ascii="맑은 고딕" w:hAnsi="맑은 고딕" w:eastAsia="맑은 고딕"/>
+          <w:b/>
+          <w:sz w:val="21"/>
+        </w:rPr>
+        <w:t>정확도 수치의 현장 검증 갭</w:t>
+      </w:r>
+      <w:r>
+        <w:rPr>
+          <w:rFonts w:ascii="맑은 고딕" w:hAnsi="맑은 고딕" w:eastAsia="맑은 고딕"/>
+          <w:sz w:val="21"/>
+        </w:rPr>
+        <w:t>: 정렬 정확도는 오프라인 벤치 기준으로, 오피스 실데이터 검증에서 달라질 수 있습니다(확정 전에는 보수적 기준 운영).</w:t>
+      </w:r>
+    </w:p>
+    <w:p>
+      <w:pPr>
+        <w:spacing w:after="60"/>
+        <w:ind w:left="360"/>
+      </w:pPr>
+      <w:r>
+        <w:rPr>
+          <w:rFonts w:ascii="맑은 고딕" w:hAnsi="맑은 고딕" w:eastAsia="맑은 고딕"/>
+          <w:b/>
+          <w:color w:val="E86A1F"/>
+          <w:sz w:val="21"/>
+        </w:rPr>
+        <w:t xml:space="preserve">• </w:t>
+      </w:r>
+      <w:r>
+        <w:rPr>
+          <w:rFonts w:ascii="맑은 고딕" w:hAnsi="맑은 고딕" w:eastAsia="맑은 고딕"/>
+          <w:b/>
+          <w:sz w:val="21"/>
+        </w:rPr>
+        <w:t>성공 이미지 적재가 선행 조건</w:t>
+      </w:r>
+      <w:r>
+        <w:rPr>
+          <w:rFonts w:ascii="맑은 고딕" w:hAnsi="맑은 고딕" w:eastAsia="맑은 고딕"/>
+          <w:sz w:val="21"/>
+        </w:rPr>
+        <w:t>: 성공 사례 기반 보정은 Recipe별 성공 이미지가 쌓여야 효과를 내며, 수집 기능 구현이 활성화 조건입니다.</w:t>
+      </w:r>
+    </w:p>
+    <w:p>
+      <w:pPr>
+        <w:spacing w:after="60"/>
+        <w:ind w:left="360"/>
+      </w:pPr>
+      <w:r>
+        <w:rPr>
+          <w:rFonts w:ascii="맑은 고딕" w:hAnsi="맑은 고딕" w:eastAsia="맑은 고딕"/>
+          <w:b/>
+          <w:color w:val="E86A1F"/>
+          <w:sz w:val="21"/>
+        </w:rPr>
+        <w:t xml:space="preserve">• </w:t>
+      </w:r>
+      <w:r>
+        <w:rPr>
+          <w:rFonts w:ascii="맑은 고딕" w:hAnsi="맑은 고딕" w:eastAsia="맑은 고딕"/>
+          <w:b/>
+          <w:sz w:val="21"/>
+        </w:rPr>
+        <w:t>재등록이 필요한 Recipe</w:t>
+      </w:r>
+      <w:r>
+        <w:rPr>
+          <w:rFonts w:ascii="맑은 고딕" w:hAnsi="맑은 고딕" w:eastAsia="맑은 고딕"/>
+          <w:sz w:val="21"/>
+        </w:rPr>
+        <w:t>: 헷갈리기 쉬운 위치에 등록된 정렬 키는 알고리즘 개선만으로 풀리지 않아, 엔지니어와 협의한 재등록이 필요합니다.</w:t>
+      </w:r>
+    </w:p>
+    <w:p>
+      <w:pPr>
+        <w:spacing w:after="60"/>
+        <w:ind w:left="360"/>
+      </w:pPr>
+      <w:r>
+        <w:rPr>
+          <w:rFonts w:ascii="맑은 고딕" w:hAnsi="맑은 고딕" w:eastAsia="맑은 고딕"/>
+          <w:b/>
+          <w:color w:val="E86A1F"/>
+          <w:sz w:val="21"/>
+        </w:rPr>
+        <w:t xml:space="preserve">• </w:t>
+      </w:r>
+      <w:r>
+        <w:rPr>
+          <w:rFonts w:ascii="맑은 고딕" w:hAnsi="맑은 고딕" w:eastAsia="맑은 고딕"/>
+          <w:b/>
+          <w:sz w:val="21"/>
+        </w:rPr>
+        <w:t>VLM 서버 가용성</w:t>
+      </w:r>
+      <w:r>
+        <w:rPr>
+          <w:rFonts w:ascii="맑은 고딕" w:hAnsi="맑은 고딕" w:eastAsia="맑은 고딕"/>
+          <w:sz w:val="21"/>
+        </w:rPr>
+        <w:t>: 서버 메모리 제약과 재시작 시 재설치 소요(약 3~4시간)가 무인 운영의 가용성 리스크입니다.</w:t>
+      </w:r>
+    </w:p>
+    <w:p>
+      <w:pPr>
         <w:spacing w:after="120"/>
       </w:pPr>
       <w:r>
@@ -1843,7 +1977,7 @@
           <w:rFonts w:ascii="맑은 고딕" w:hAnsi="맑은 고딕" w:eastAsia="맑은 고딕"/>
           <w:sz w:val="21"/>
         </w:rPr>
-        <w:t xml:space="preserve">상세 진행 현황과 향후 일정은 </w:t>
+        <w:t xml:space="preserve">상세 진행 현황·예상 허들과 대응·향후 일정은 </w:t>
       </w:r>
       <w:r>
         <w:rPr>
@@ -6834,7 +6968,213 @@
           <w:color w:val="142A55"/>
           <w:sz w:val="27"/>
         </w:rPr>
-        <w:t>8. 향후 일정</w:t>
+        <w:t>8. 예상 허들과 대응</w:t>
+      </w:r>
+    </w:p>
+    <w:p>
+      <w:pPr>
+        <w:spacing w:after="120"/>
+      </w:pPr>
+      <w:r>
+        <w:rPr>
+          <w:rFonts w:ascii="맑은 고딕" w:hAnsi="맑은 고딕" w:eastAsia="맑은 고딕"/>
+          <w:sz w:val="21"/>
+        </w:rPr>
+        <w:t>실전 적용까지 예상되는 허들과 대응 방안은 다음과 같습니다.</w:t>
+      </w:r>
+    </w:p>
+    <w:p>
+      <w:pPr>
+        <w:spacing w:after="60"/>
+        <w:ind w:left="360"/>
+      </w:pPr>
+      <w:r>
+        <w:rPr>
+          <w:rFonts w:ascii="맑은 고딕" w:hAnsi="맑은 고딕" w:eastAsia="맑은 고딕"/>
+          <w:b/>
+          <w:color w:val="E86A1F"/>
+          <w:sz w:val="21"/>
+        </w:rPr>
+        <w:t xml:space="preserve">• </w:t>
+      </w:r>
+      <w:r>
+        <w:rPr>
+          <w:rFonts w:ascii="맑은 고딕" w:hAnsi="맑은 고딕" w:eastAsia="맑은 고딕"/>
+          <w:b/>
+          <w:sz w:val="21"/>
+        </w:rPr>
+        <w:t>정확도 수치의 현장 검증 갭</w:t>
+      </w:r>
+      <w:r>
+        <w:rPr>
+          <w:rFonts w:ascii="맑은 고딕" w:hAnsi="맑은 고딕" w:eastAsia="맑은 고딕"/>
+          <w:sz w:val="21"/>
+        </w:rPr>
+        <w:t>: 지금까지의 정렬 정확도는 오프라인 벤치 기준이라, 오피스 실데이터 에서는 수치가 달라질 수 있습니다. → 현장 검증(진행 중)으로 확정하고, 확정 전에는 성공 사례를 더 많이 요구하는 보수적 기준으로 운영합니다.</w:t>
+      </w:r>
+    </w:p>
+    <w:p>
+      <w:pPr>
+        <w:spacing w:after="60"/>
+        <w:ind w:left="360"/>
+      </w:pPr>
+      <w:r>
+        <w:rPr>
+          <w:rFonts w:ascii="맑은 고딕" w:hAnsi="맑은 고딕" w:eastAsia="맑은 고딕"/>
+          <w:b/>
+          <w:color w:val="E86A1F"/>
+          <w:sz w:val="21"/>
+        </w:rPr>
+        <w:t xml:space="preserve">• </w:t>
+      </w:r>
+      <w:r>
+        <w:rPr>
+          <w:rFonts w:ascii="맑은 고딕" w:hAnsi="맑은 고딕" w:eastAsia="맑은 고딕"/>
+          <w:b/>
+          <w:sz w:val="21"/>
+        </w:rPr>
+        <w:t>성공 이미지 적재가 선행 조건</w:t>
+      </w:r>
+      <w:r>
+        <w:rPr>
+          <w:rFonts w:ascii="맑은 고딕" w:hAnsi="맑은 고딕" w:eastAsia="맑은 고딕"/>
+          <w:sz w:val="21"/>
+        </w:rPr>
+        <w:t>: 성공 사례 기반 보정은 Recipe별 최근 성공 이미지가 충분히 쌓여야 효과를 냅니다. 적재 전에는 등록 이미지 폴백으로만 동작해 개선 폭이 제한됩니다. → 성공 이미지 수집·적재 기능 구현을 최우선 활성화 조건으로 진행합니다.</w:t>
+      </w:r>
+    </w:p>
+    <w:p>
+      <w:pPr>
+        <w:spacing w:after="60"/>
+        <w:ind w:left="360"/>
+      </w:pPr>
+      <w:r>
+        <w:rPr>
+          <w:rFonts w:ascii="맑은 고딕" w:hAnsi="맑은 고딕" w:eastAsia="맑은 고딕"/>
+          <w:b/>
+          <w:color w:val="E86A1F"/>
+          <w:sz w:val="21"/>
+        </w:rPr>
+        <w:t xml:space="preserve">• </w:t>
+      </w:r>
+      <w:r>
+        <w:rPr>
+          <w:rFonts w:ascii="맑은 고딕" w:hAnsi="맑은 고딕" w:eastAsia="맑은 고딕"/>
+          <w:b/>
+          <w:sz w:val="21"/>
+        </w:rPr>
+        <w:t>재등록이 필요한 Recipe</w:t>
+      </w:r>
+      <w:r>
+        <w:rPr>
+          <w:rFonts w:ascii="맑은 고딕" w:hAnsi="맑은 고딕" w:eastAsia="맑은 고딕"/>
+          <w:sz w:val="21"/>
+        </w:rPr>
+        <w:t>: 헷갈리기 쉬운 위치에 등록된 정렬 키(특히 고배율 SEM)는 매칭 알고리즘 개선만으로 풀리지 않습니다. → 재등록 우선순위 리포트로 대상 Recipe를 순위화해, 엔지니어와 협의해 더 뚜렷한 위치로 재등록을 추진합니다(자동화만으로는 해결되지 않는 협업 과제).</w:t>
+      </w:r>
+    </w:p>
+    <w:p>
+      <w:pPr>
+        <w:spacing w:after="60"/>
+        <w:ind w:left="360"/>
+      </w:pPr>
+      <w:r>
+        <w:rPr>
+          <w:rFonts w:ascii="맑은 고딕" w:hAnsi="맑은 고딕" w:eastAsia="맑은 고딕"/>
+          <w:b/>
+          <w:color w:val="E86A1F"/>
+          <w:sz w:val="21"/>
+        </w:rPr>
+        <w:t xml:space="preserve">• </w:t>
+      </w:r>
+      <w:r>
+        <w:rPr>
+          <w:rFonts w:ascii="맑은 고딕" w:hAnsi="맑은 고딕" w:eastAsia="맑은 고딕"/>
+          <w:b/>
+          <w:sz w:val="21"/>
+        </w:rPr>
+        <w:t>장비·PC 환경 편차</w:t>
+      </w:r>
+      <w:r>
+        <w:rPr>
+          <w:rFonts w:ascii="맑은 고딕" w:hAnsi="맑은 고딕" w:eastAsia="맑은 고딕"/>
+          <w:sz w:val="21"/>
+        </w:rPr>
+        <w:t>: 장비마다 배율 조작 방식이 다르고(휠/버튼), 다른 엔지니어가 장비를 점유 중일 수 있으며, PC 권한·화면 배율 차이도 있습니다. → 장비별 캘리브레이션과 예외 처리(점유 시 양보 후 재시도 등)로 흡수하되, 현장 검증에서 최종 확인합니다.</w:t>
+      </w:r>
+    </w:p>
+    <w:p>
+      <w:pPr>
+        <w:spacing w:after="60"/>
+        <w:ind w:left="360"/>
+      </w:pPr>
+      <w:r>
+        <w:rPr>
+          <w:rFonts w:ascii="맑은 고딕" w:hAnsi="맑은 고딕" w:eastAsia="맑은 고딕"/>
+          <w:b/>
+          <w:color w:val="E86A1F"/>
+          <w:sz w:val="21"/>
+        </w:rPr>
+        <w:t xml:space="preserve">• </w:t>
+      </w:r>
+      <w:r>
+        <w:rPr>
+          <w:rFonts w:ascii="맑은 고딕" w:hAnsi="맑은 고딕" w:eastAsia="맑은 고딕"/>
+          <w:b/>
+          <w:sz w:val="21"/>
+        </w:rPr>
+        <w:t>VLM 서버 가용성</w:t>
+      </w:r>
+      <w:r>
+        <w:rPr>
+          <w:rFonts w:ascii="맑은 고딕" w:hAnsi="맑은 고딕" w:eastAsia="맑은 고딕"/>
+          <w:sz w:val="21"/>
+        </w:rPr>
+        <w:t>: 서버 메모리 제약으로 다중 이미지 일괄 처리가 어렵고, 서버 재시작 시 구동 환경 재설치에 약 3~4시간이 걸려 그동안 자동 대응이 중단됩니다. → 운영상 제약으로 관리하며, 재설치 절차 표준화가 필요합니다.</w:t>
+      </w:r>
+    </w:p>
+    <w:p>
+      <w:pPr>
+        <w:spacing w:after="60"/>
+        <w:ind w:left="360"/>
+      </w:pPr>
+      <w:r>
+        <w:rPr>
+          <w:rFonts w:ascii="맑은 고딕" w:hAnsi="맑은 고딕" w:eastAsia="맑은 고딕"/>
+          <w:b/>
+          <w:color w:val="E86A1F"/>
+          <w:sz w:val="21"/>
+        </w:rPr>
+        <w:t xml:space="preserve">• </w:t>
+      </w:r>
+      <w:r>
+        <w:rPr>
+          <w:rFonts w:ascii="맑은 고딕" w:hAnsi="맑은 고딕" w:eastAsia="맑은 고딕"/>
+          <w:b/>
+          <w:sz w:val="21"/>
+        </w:rPr>
+        <w:t>실보정 전환 리스크</w:t>
+      </w:r>
+      <w:r>
+        <w:rPr>
+          <w:rFonts w:ascii="맑은 고딕" w:hAnsi="맑은 고딕" w:eastAsia="맑은 고딕"/>
+          <w:sz w:val="21"/>
+        </w:rPr>
+        <w:t>: 실제 장비 클릭은 오동작 시 측정에 영향을 줄 수 있습니다. → 관찰 전용(점검 모드) → 단일 장비 pilot → 확대 순서의 단계적 활성화로 리스크를 관리합니다.</w:t>
+      </w:r>
+    </w:p>
+    <w:p>
+      <w:pPr>
+        <w:spacing w:before="200" w:after="120"/>
+      </w:pPr>
+      <w:r>
+        <w:rPr>
+          <w:rFonts w:ascii="맑은 고딕" w:hAnsi="맑은 고딕" w:eastAsia="맑은 고딕"/>
+          <w:b/>
+          <w:color w:val="142A55"/>
+          <w:sz w:val="27"/>
+        </w:rPr>
+        <w:t>9. 향후 일정</w:t>
       </w:r>
     </w:p>
     <w:p>

</xml_diff>

<commit_message>
docs(progress): 2026-07-07 이후 진행분으로 보고서 갱신
7월 7일 이후 6주치(재순위 포팅, 루프 하드닝, mai-ui 통일, 반자동 개통,
수동 녹화/절차 추출)가 보고서에 없었다. 04 를 전면 갱신하고 00/01/03 을
그에 맞춰 조정한다.

  * 04: 실장비 보정 반자동 개통(재조정 자동 / 확정은 사람) + 개통 전에
    보정 단계가 SEM 패널 ROI 확보 실패로 한 번도 실행된 적 없었다는 사실.
    완료 감지 우선순위 재설계, 루프 실패경로 하드닝, 지식 자산화(알람 없는
    녹화 -> 조작 타임라인 -> 절차서) 절 신설. 상태표를 구현/오피스 검증/
    실알람 경험 3단으로 쪼갰다 - "구현 완료"와 "실제로 돌았다"가 같은 칸에
    있으면 보고서가 실제보다 앞서 읽힌다.
  * 00: 성과 3건(2종 운영 정리, 반자동 개통, 자산화 경로) + 현황표/리스크.
  * 01: 5종 평가 -> 2종 상시 운영. 2단계 로케이터의 효과는 모델 2개가 아니라
    판단 2단계였다는 정정(현재 양단 모두 mai-ui).
  * 03: 촬영 모드별 재순위 채택(SEM +0.073 / OM +0.021, 전체 0.826) +
    남은 개선의 87%가 재등록 몫이라 순위 교정 축은 소진됐다는 결론.

한국어는 humanize-korean(standard)으로 다듬었다. 04 는 진단->윤문 2콜,
변경률 게이트 OK(5.4%); 00/01/03 은 이번에 새로 쓴 문단만 같은 패턴으로
손봤다(7월 본문은 무변경). 표/수치/영문 용어/hedge 강도는 불변.

docx 는 .md 를 파싱해 재생성한 산출물이라 함께 커밋한다.

Co-Authored-By: Claude Opus 5 (1M context) <noreply@anthropic.com>
</commit_message>
<xml_diff>
--- a/docs/project_progress/project_progress_report.docx
+++ b/docs/project_progress/project_progress_report.docx
@@ -182,6 +182,29 @@
           <w:sz w:val="34"/>
         </w:rPr>
         <w:t>00. 요약 (Summary)</w:t>
+      </w:r>
+    </w:p>
+    <w:p>
+      <w:pPr>
+        <w:spacing w:after="120" w:before="80"/>
+        <w:ind w:left="280"/>
+      </w:pPr>
+      <w:r>
+        <w:rPr>
+          <w:rFonts w:ascii="맑은 고딕" w:hAnsi="맑은 고딕" w:eastAsia="맑은 고딕"/>
+          <w:b/>
+          <w:color w:val="E86A1F"/>
+          <w:sz w:val="21"/>
+        </w:rPr>
+        <w:t xml:space="preserve">▎ </w:t>
+      </w:r>
+      <w:r>
+        <w:rPr>
+          <w:rFonts w:ascii="맑은 고딕" w:hAnsi="맑은 고딕" w:eastAsia="맑은 고딕"/>
+          <w:color w:val="556070"/>
+          <w:sz w:val="20"/>
+        </w:rPr>
+        <w:t>최종 갱신: 2026-08-16 (2026-07-07 이후 진행분 반영 — 실장비 보정 반자동 개통, 촬영 모드별 재순위 채택, VLM 운영 구성 정리, 지식 자산화 경로 구축.)</w:t>
       </w:r>
     </w:p>
     <w:p>
@@ -972,7 +995,22 @@
           <w:rFonts w:ascii="맑은 고딕" w:hAnsi="맑은 고딕" w:eastAsia="맑은 고딕"/>
           <w:sz w:val="21"/>
         </w:rPr>
-        <w:t>: 화면 좌표 인식과 문자 인식(OCR)에 필요한 능력을 자사 HCP에 GPU 1~2장 규모의 소형 오픈소스 모델(화면 이해 VLM 3종 + OCR 2종)로 나눠 배포했습니다. 대규모 GPU가 필요한 단일 거대 모델 없이도 사내에서 자체 구동하며, 외부 의존 없이 기반기술센터가 직접 서비스할 수 있는 역량을 갖췄습니다.</w:t>
+        <w:t xml:space="preserve">: 화면 좌표 인식과 문자 인식(OCR)에 필요한 능력을 자사 HCP에 GPU 1~2장 규모의 소형 오픈소스 모델(화면 이해 VLM 3종 + OCR 2종)로 나눠 배포했습니다. 대규모 GPU가 필요한 단일 거대 모델 없이도 사내에서 자체 구동하며, 외부 의존 없이 기반기술센터가 직접 서비스할 수 있는 역량을 갖췄습니다. 이후 실제 업무 화면 벤치로 모델을 비교했습니다. </w:t>
+      </w:r>
+      <w:r>
+        <w:rPr>
+          <w:rFonts w:ascii="맑은 고딕" w:hAnsi="맑은 고딕" w:eastAsia="맑은 고딕"/>
+          <w:b/>
+          <w:sz w:val="21"/>
+        </w:rPr>
+        <w:t>이긴 모델만 남겨 2종 상시 운영 체제로 정리</w:t>
+      </w:r>
+      <w:r>
+        <w:rPr>
+          <w:rFonts w:ascii="맑은 고딕" w:hAnsi="맑은 고딕" w:eastAsia="맑은 고딕"/>
+          <w:sz w:val="21"/>
+        </w:rPr>
+        <w:t>했고, 모델 교체를 측정으로 결정하는 체계도 함께 확보했습니다.</w:t>
       </w:r>
     </w:p>
     <w:p>
@@ -1032,7 +1070,22 @@
           <w:rFonts w:ascii="맑은 고딕" w:hAnsi="맑은 고딕" w:eastAsia="맑은 고딕"/>
           <w:sz w:val="21"/>
         </w:rPr>
-        <w:t>: recipe에 처음 등록된 Align Key만 쓸 때보다 최근 성공 사례를 종합한 기준 이미지를 썼을 때 Align Key 탐색 정확도가 크게 올랐습니다(오프라인 평가 기준: 후보 포함률 0.434 → 0.876, 1순위 적중률 0.318 → 0.764). 다만 이 수치는 오프라인 평가 기준이고, 오피스 실데이터 현장 검증은 진행 예정입니다(실제 운영에서는 성공 사례를 더 많이 요구하는 보수적 기준을 적용합니다).</w:t>
+        <w:t xml:space="preserve">: recipe에 처음 등록된 Align Key만 쓸 때보다 최근 성공 사례를 종합한 기준 이미지를 썼을 때 Align Key 탐색 정확도가 크게 올랐습니다(오프라인 평가 기준: 후보 포함률 0.434 → 0.876, 1순위 적중률 0.318 → 0.764). 다만 이 수치는 오프라인 평가 기준이고, 오피스 실데이터 현장 검증은 진행 예정입니다(실제 운영에서는 성공 사례를 더 많이 요구하는 보수적 기준을 적용합니다). 여기에 </w:t>
+      </w:r>
+      <w:r>
+        <w:rPr>
+          <w:rFonts w:ascii="맑은 고딕" w:hAnsi="맑은 고딕" w:eastAsia="맑은 고딕"/>
+          <w:b/>
+          <w:sz w:val="21"/>
+        </w:rPr>
+        <w:t>저배율(OM)과 고배율(SEM)에 서로 다른 심판을 쓰는 재순위</w:t>
+      </w:r>
+      <w:r>
+        <w:rPr>
+          <w:rFonts w:ascii="맑은 고딕" w:hAnsi="맑은 고딕" w:eastAsia="맑은 고딕"/>
+          <w:sz w:val="21"/>
+        </w:rPr>
+        <w:t>를 A/B로 검증해 추가 반영했습니다(고배율 1순위 적중률 약 +0.07).</w:t>
       </w:r>
     </w:p>
     <w:p>
@@ -1063,6 +1116,111 @@
           <w:sz w:val="21"/>
         </w:rPr>
         <w:t>: 알람 감지 → 장비 접속 → 자동 보정 → 실패 시 담당자 알림 → 상시 녹화 → 자동 종료로 이어지는 end-to-end 무인 루프를 구축했습니다.</w:t>
+      </w:r>
+    </w:p>
+    <w:p>
+      <w:pPr>
+        <w:spacing w:after="60"/>
+        <w:ind w:left="360"/>
+      </w:pPr>
+      <w:r>
+        <w:rPr>
+          <w:rFonts w:ascii="맑은 고딕" w:hAnsi="맑은 고딕" w:eastAsia="맑은 고딕"/>
+          <w:b/>
+          <w:color w:val="E86A1F"/>
+          <w:sz w:val="21"/>
+        </w:rPr>
+        <w:t xml:space="preserve">• </w:t>
+      </w:r>
+      <w:r>
+        <w:rPr>
+          <w:rFonts w:ascii="맑은 고딕" w:hAnsi="맑은 고딕" w:eastAsia="맑은 고딕"/>
+          <w:b/>
+          <w:sz w:val="21"/>
+        </w:rPr>
+        <w:t>실장비 보정을 반자동으로 개통(2026-08)</w:t>
+      </w:r>
+      <w:r>
+        <w:rPr>
+          <w:rFonts w:ascii="맑은 고딕" w:hAnsi="맑은 고딕" w:eastAsia="맑은 고딕"/>
+          <w:sz w:val="21"/>
+        </w:rPr>
+        <w:t xml:space="preserve">: 실제 장비 화면에서 정렬 위치를 다시 잡는 단계를 열었습니다. </w:t>
+      </w:r>
+      <w:r>
+        <w:rPr>
+          <w:rFonts w:ascii="맑은 고딕" w:hAnsi="맑은 고딕" w:eastAsia="맑은 고딕"/>
+          <w:b/>
+          <w:sz w:val="21"/>
+        </w:rPr>
+        <w:t>위치 재조정까지는 자동, 마지막 확정은 엔지니어</w:t>
+      </w:r>
+      <w:r>
+        <w:rPr>
+          <w:rFonts w:ascii="맑은 고딕" w:hAnsi="맑은 고딕" w:eastAsia="맑은 고딕"/>
+          <w:sz w:val="21"/>
+        </w:rPr>
+        <w:t xml:space="preserve">가 누르는 반자동 운영입니다. 개통 과정에서 보정 단계가 화면 영역 확보 실패로 </w:t>
+      </w:r>
+      <w:r>
+        <w:rPr>
+          <w:rFonts w:ascii="맑은 고딕" w:hAnsi="맑은 고딕" w:eastAsia="맑은 고딕"/>
+          <w:b/>
+          <w:sz w:val="21"/>
+        </w:rPr>
+        <w:t>한 번도 실제 실행되지 않고 있었다는 사실</w:t>
+      </w:r>
+      <w:r>
+        <w:rPr>
+          <w:rFonts w:ascii="맑은 고딕" w:hAnsi="맑은 고딕" w:eastAsia="맑은 고딕"/>
+          <w:sz w:val="21"/>
+        </w:rPr>
+        <w:t>을 발견해 원인을 제거했습니다. 촬영 모드도 화면에서 읽어 판단합니다. 잘못된 기준 이미지로 매칭하던 조용한 오류가 함께 사라졌습니다.</w:t>
+      </w:r>
+    </w:p>
+    <w:p>
+      <w:pPr>
+        <w:spacing w:after="60"/>
+        <w:ind w:left="360"/>
+      </w:pPr>
+      <w:r>
+        <w:rPr>
+          <w:rFonts w:ascii="맑은 고딕" w:hAnsi="맑은 고딕" w:eastAsia="맑은 고딕"/>
+          <w:b/>
+          <w:color w:val="E86A1F"/>
+          <w:sz w:val="21"/>
+        </w:rPr>
+        <w:t xml:space="preserve">• </w:t>
+      </w:r>
+      <w:r>
+        <w:rPr>
+          <w:rFonts w:ascii="맑은 고딕" w:hAnsi="맑은 고딕" w:eastAsia="맑은 고딕"/>
+          <w:b/>
+          <w:sz w:val="21"/>
+        </w:rPr>
+        <w:t>암묵지 자산화 경로 구축</w:t>
+      </w:r>
+      <w:r>
+        <w:rPr>
+          <w:rFonts w:ascii="맑은 고딕" w:hAnsi="맑은 고딕" w:eastAsia="맑은 고딕"/>
+          <w:sz w:val="21"/>
+        </w:rPr>
+        <w:t xml:space="preserve">: 알람 없이도 엔지니어 조작을 녹화하고, 그 녹화를 </w:t>
+      </w:r>
+      <w:r>
+        <w:rPr>
+          <w:rFonts w:ascii="맑은 고딕" w:hAnsi="맑은 고딕" w:eastAsia="맑은 고딕"/>
+          <w:b/>
+          <w:sz w:val="21"/>
+        </w:rPr>
+        <w:t>조작 타임라인 → 사람이 읽는 한국어 절차서</w:t>
+      </w:r>
+      <w:r>
+        <w:rPr>
+          <w:rFonts w:ascii="맑은 고딕" w:hAnsi="맑은 고딕" w:eastAsia="맑은 고딕"/>
+          <w:sz w:val="21"/>
+        </w:rPr>
+        <w:t>로 바꾸는 경로를 만들었습니다. 입력은 후킹하지 않고 화면만 관측합니다. 동의 범위를 코드에 고정한 것입니다.</w:t>
       </w:r>
     </w:p>
     <w:p>
@@ -1631,7 +1789,7 @@
                 <w:rFonts w:ascii="맑은 고딕" w:hAnsi="맑은 고딕" w:eastAsia="맑은 고딕"/>
                 <w:sz w:val="19"/>
               </w:rPr>
-              <w:t>✅ 운영 중</w:t>
+              <w:t>✅ 운영 중 (벤치 비교 후 2종 상시 운영으로 정리)</w:t>
             </w:r>
           </w:p>
         </w:tc>
@@ -1695,7 +1853,7 @@
                 <w:rFonts w:ascii="맑은 고딕" w:hAnsi="맑은 고딕" w:eastAsia="맑은 고딕"/>
                 <w:sz w:val="19"/>
               </w:rPr>
-              <w:t>✅ 활성 (오피스 실측 대기)</w:t>
+              <w:t>✅ 활성 (오피스 실측 대기) — 순위 교정 축은 소진, 남은 몫은 재등록</w:t>
             </w:r>
           </w:p>
         </w:tc>
@@ -1728,6 +1886,78 @@
                 <w:sz w:val="19"/>
               </w:rPr>
               <w:t>✅ 개발 완료</w:t>
+            </w:r>
+          </w:p>
+        </w:tc>
+      </w:tr>
+      <w:tr>
+        <w:tc>
+          <w:tcPr>
+            <w:tcW w:type="dxa" w:w="4320"/>
+          </w:tcPr>
+          <w:p>
+            <w:r/>
+            <w:r>
+              <w:rPr>
+                <w:rFonts w:ascii="맑은 고딕" w:hAnsi="맑은 고딕" w:eastAsia="맑은 고딕"/>
+                <w:sz w:val="19"/>
+              </w:rPr>
+              <w:t>실장비 보정(반자동: 재조정 자동 / 확정은 사람)</w:t>
+            </w:r>
+          </w:p>
+        </w:tc>
+        <w:tc>
+          <w:tcPr>
+            <w:tcW w:type="dxa" w:w="4320"/>
+          </w:tcPr>
+          <w:p>
+            <w:r/>
+            <w:r>
+              <w:rPr>
+                <w:rFonts w:ascii="맑은 고딕" w:hAnsi="맑은 고딕" w:eastAsia="맑은 고딕"/>
+                <w:sz w:val="19"/>
+              </w:rPr>
+              <w:t xml:space="preserve">✅ 개통(2026-08) · 🟡 </w:t>
+            </w:r>
+            <w:r>
+              <w:rPr>
+                <w:rFonts w:ascii="맑은 고딕" w:hAnsi="맑은 고딕" w:eastAsia="맑은 고딕"/>
+                <w:b/>
+                <w:sz w:val="19"/>
+              </w:rPr>
+              <w:t>첫 실알람 완주 대기</w:t>
+            </w:r>
+          </w:p>
+        </w:tc>
+      </w:tr>
+      <w:tr>
+        <w:tc>
+          <w:tcPr>
+            <w:tcW w:type="dxa" w:w="4320"/>
+          </w:tcPr>
+          <w:p>
+            <w:r/>
+            <w:r>
+              <w:rPr>
+                <w:rFonts w:ascii="맑은 고딕" w:hAnsi="맑은 고딕" w:eastAsia="맑은 고딕"/>
+                <w:sz w:val="19"/>
+              </w:rPr>
+              <w:t>루프 실패 경로 하드닝(뒷정리 보장·오클릭 차단·쿨다운)</w:t>
+            </w:r>
+          </w:p>
+        </w:tc>
+        <w:tc>
+          <w:tcPr>
+            <w:tcW w:type="dxa" w:w="4320"/>
+          </w:tcPr>
+          <w:p>
+            <w:r/>
+            <w:r>
+              <w:rPr>
+                <w:rFonts w:ascii="맑은 고딕" w:hAnsi="맑은 고딕" w:eastAsia="맑은 고딕"/>
+                <w:sz w:val="19"/>
+              </w:rPr>
+              <w:t>✅ 완료</w:t>
             </w:r>
           </w:p>
         </w:tc>
@@ -1791,7 +2021,71 @@
                 <w:rFonts w:ascii="맑은 고딕" w:hAnsi="맑은 고딕" w:eastAsia="맑은 고딕"/>
                 <w:sz w:val="19"/>
               </w:rPr>
-              <w:t>✅ 완료</w:t>
+              <w:t>✅ 완료 (완료 감지는 재설계 후 판독 확인 예정)</w:t>
+            </w:r>
+          </w:p>
+        </w:tc>
+      </w:tr>
+      <w:tr>
+        <w:tc>
+          <w:tcPr>
+            <w:tcW w:type="dxa" w:w="4320"/>
+          </w:tcPr>
+          <w:p>
+            <w:r/>
+            <w:r>
+              <w:rPr>
+                <w:rFonts w:ascii="맑은 고딕" w:hAnsi="맑은 고딕" w:eastAsia="맑은 고딕"/>
+                <w:sz w:val="19"/>
+              </w:rPr>
+              <w:t>지식 자산화(엔지니어 조작 녹화 → 절차서 추출)</w:t>
+            </w:r>
+          </w:p>
+        </w:tc>
+        <w:tc>
+          <w:tcPr>
+            <w:tcW w:type="dxa" w:w="4320"/>
+          </w:tcPr>
+          <w:p>
+            <w:r/>
+            <w:r>
+              <w:rPr>
+                <w:rFonts w:ascii="맑은 고딕" w:hAnsi="맑은 고딕" w:eastAsia="맑은 고딕"/>
+                <w:sz w:val="19"/>
+              </w:rPr>
+              <w:t>✅ 녹화 확보 · 🟡 추출 오피스 미실행</w:t>
+            </w:r>
+          </w:p>
+        </w:tc>
+      </w:tr>
+      <w:tr>
+        <w:tc>
+          <w:tcPr>
+            <w:tcW w:type="dxa" w:w="4320"/>
+          </w:tcPr>
+          <w:p>
+            <w:r/>
+            <w:r>
+              <w:rPr>
+                <w:rFonts w:ascii="맑은 고딕" w:hAnsi="맑은 고딕" w:eastAsia="맑은 고딕"/>
+                <w:sz w:val="19"/>
+              </w:rPr>
+              <w:t>엔지니어 PC 배포 방식</w:t>
+            </w:r>
+          </w:p>
+        </w:tc>
+        <w:tc>
+          <w:tcPr>
+            <w:tcW w:type="dxa" w:w="4320"/>
+          </w:tcPr>
+          <w:p>
+            <w:r/>
+            <w:r>
+              <w:rPr>
+                <w:rFonts w:ascii="맑은 고딕" w:hAnsi="맑은 고딕" w:eastAsia="맑은 고딕"/>
+                <w:sz w:val="19"/>
+              </w:rPr>
+              <w:t>🟡 타당성 검토 완료 · 방식 결정 대기</w:t>
             </w:r>
           </w:p>
         </w:tc>
@@ -1855,7 +2149,7 @@
                 <w:rFonts w:ascii="맑은 고딕" w:hAnsi="맑은 고딕" w:eastAsia="맑은 고딕"/>
                 <w:sz w:val="19"/>
               </w:rPr>
-              <w:t>🟡 예정(7~8월)</w:t>
+              <w:t>🟡 예정(8~9월)</w:t>
             </w:r>
           </w:p>
         </w:tc>
@@ -1900,14 +2194,14 @@
           <w:b/>
           <w:sz w:val="21"/>
         </w:rPr>
-        <w:t>정확도 수치의 현장 검증 갭</w:t>
-      </w:r>
-      <w:r>
-        <w:rPr>
-          <w:rFonts w:ascii="맑은 고딕" w:hAnsi="맑은 고딕" w:eastAsia="맑은 고딕"/>
-          <w:sz w:val="21"/>
-        </w:rPr>
-        <w:t>: 정렬 정확도는 오프라인 벤치 기준으로, 오피스 실데이터 검증에서 달라질 수 있습니다(확정 전에는 보수적 기준 운영).</w:t>
+        <w:t>개통과 완주는 다릅니다</w:t>
+      </w:r>
+      <w:r>
+        <w:rPr>
+          <w:rFonts w:ascii="맑은 고딕" w:hAnsi="맑은 고딕" w:eastAsia="맑은 고딕"/>
+          <w:sz w:val="21"/>
+        </w:rPr>
+        <w:t>: 실보정은 열렸지만 아직 실제 Align Fail 알람에서 완주한 사례가 없습니다. 첫 완주 확인이 가장 가까운 관문입니다. 첫 실알람은 엔지니어 입회하에 관찰합니다.</w:t>
       </w:r>
     </w:p>
     <w:p>
@@ -1930,14 +2224,14 @@
           <w:b/>
           <w:sz w:val="21"/>
         </w:rPr>
-        <w:t>성공 이미지 적재가 선행 조건</w:t>
-      </w:r>
-      <w:r>
-        <w:rPr>
-          <w:rFonts w:ascii="맑은 고딕" w:hAnsi="맑은 고딕" w:eastAsia="맑은 고딕"/>
-          <w:sz w:val="21"/>
-        </w:rPr>
-        <w:t>: 성공 사례 기반 보정은 Recipe별 성공 이미지가 쌓여야 효과를 내며, 수집 기능 구현이 활성화 조건입니다.</w:t>
+        <w:t>정확도 수치의 현장 검증 갭</w:t>
+      </w:r>
+      <w:r>
+        <w:rPr>
+          <w:rFonts w:ascii="맑은 고딕" w:hAnsi="맑은 고딕" w:eastAsia="맑은 고딕"/>
+          <w:sz w:val="21"/>
+        </w:rPr>
+        <w:t>: 정렬 정확도는 오프라인 벤치 기준으로, 오피스 실데이터 검증에서 달라질 수 있습니다(확정 전에는 보수적 기준 운영).</w:t>
       </w:r>
     </w:p>
     <w:p>
@@ -1960,14 +2254,14 @@
           <w:b/>
           <w:sz w:val="21"/>
         </w:rPr>
-        <w:t>재등록이 필요한 Recipe</w:t>
-      </w:r>
-      <w:r>
-        <w:rPr>
-          <w:rFonts w:ascii="맑은 고딕" w:hAnsi="맑은 고딕" w:eastAsia="맑은 고딕"/>
-          <w:sz w:val="21"/>
-        </w:rPr>
-        <w:t>: 헷갈리기 쉬운 위치에 등록된 정렬 키는 알고리즘 개선만으로 풀리지 않아, 엔지니어와 협의한 재등록이 필요합니다.</w:t>
+        <w:t>성공 이미지 적재가 선행 조건</w:t>
+      </w:r>
+      <w:r>
+        <w:rPr>
+          <w:rFonts w:ascii="맑은 고딕" w:hAnsi="맑은 고딕" w:eastAsia="맑은 고딕"/>
+          <w:sz w:val="21"/>
+        </w:rPr>
+        <w:t>: 성공 사례 기반 보정은 Recipe별 성공 이미지가 쌓여야 효과를 내며, 수집 기능 구현이 활성화 조건입니다.</w:t>
       </w:r>
     </w:p>
     <w:p>
@@ -1990,49 +2284,109 @@
           <w:b/>
           <w:sz w:val="21"/>
         </w:rPr>
-        <w:t>VLM 서버 가용성</w:t>
-      </w:r>
-      <w:r>
-        <w:rPr>
-          <w:rFonts w:ascii="맑은 고딕" w:hAnsi="맑은 고딕" w:eastAsia="맑은 고딕"/>
-          <w:sz w:val="21"/>
-        </w:rPr>
-        <w:t>: 서버 메모리 제약과 재시작 시 재설치 소요(약 3~4시간)가 무인 운영의 가용성 리스크입니다.</w:t>
+        <w:t>재등록이 필요한 Recipe</w:t>
+      </w:r>
+      <w:r>
+        <w:rPr>
+          <w:rFonts w:ascii="맑은 고딕" w:hAnsi="맑은 고딕" w:eastAsia="맑은 고딕"/>
+          <w:sz w:val="21"/>
+        </w:rPr>
+        <w:t>: 헷갈리기 쉬운 위치에 등록된 정렬 키는 알고리즘 개선만으로 풀리지 않아, 엔지니어와 협의한 재등록이 필요합니다. 남은 개선 여지의 약 87%가 이 몫으로 확인됐습니다.</w:t>
       </w:r>
     </w:p>
     <w:p>
       <w:pPr>
-        <w:spacing w:after="120"/>
-      </w:pPr>
-      <w:r>
-        <w:rPr>
-          <w:rFonts w:ascii="맑은 고딕" w:hAnsi="맑은 고딕" w:eastAsia="맑은 고딕"/>
-          <w:sz w:val="21"/>
-        </w:rPr>
-        <w:t xml:space="preserve">상세 진행 현황·예상 허들과 대응·향후 일정은 </w:t>
-      </w:r>
-      <w:r>
-        <w:rPr>
-          <w:rFonts w:ascii="맑은 고딕" w:hAnsi="맑은 고딕" w:eastAsia="맑은 고딕"/>
-          <w:sz w:val="21"/>
-        </w:rPr>
-        <w:t>04_workflow_3.md</w:t>
-      </w:r>
-      <w:r>
-        <w:rPr>
-          <w:rFonts w:ascii="맑은 고딕" w:hAnsi="맑은 고딕" w:eastAsia="맑은 고딕"/>
-          <w:sz w:val="21"/>
-        </w:rPr>
-        <w:t>를 참조해 주시기 바랍니다.</w:t>
+        <w:spacing w:after="60"/>
+        <w:ind w:left="360"/>
+      </w:pPr>
+      <w:r>
+        <w:rPr>
+          <w:rFonts w:ascii="맑은 고딕" w:hAnsi="맑은 고딕" w:eastAsia="맑은 고딕"/>
+          <w:b/>
+          <w:color w:val="E86A1F"/>
+          <w:sz w:val="21"/>
+        </w:rPr>
+        <w:t xml:space="preserve">• </w:t>
+      </w:r>
+      <w:r>
+        <w:rPr>
+          <w:rFonts w:ascii="맑은 고딕" w:hAnsi="맑은 고딕" w:eastAsia="맑은 고딕"/>
+          <w:b/>
+          <w:sz w:val="21"/>
+        </w:rPr>
+        <w:t>VLM 서버 가용성과 호출 예산</w:t>
+      </w:r>
+      <w:r>
+        <w:rPr>
+          <w:rFonts w:ascii="맑은 고딕" w:hAnsi="맑은 고딕" w:eastAsia="맑은 고딕"/>
+          <w:sz w:val="21"/>
+        </w:rPr>
+        <w:t>: 서버 메모리 제약(동시 구동 모델 수 제한)과 재시작 시 재설치 소요(약 3~4시간)가 무인 운영의 가용성 리스크입니다. 녹화 분석처럼 호출이 많은 작업은 실시간 루프 밖에서 상한을 걸고 돌립니다.</w:t>
       </w:r>
     </w:p>
     <w:p>
-      <w:r>
-        <w:br w:type="page"/>
+      <w:pPr>
+        <w:spacing w:after="60"/>
+        <w:ind w:left="360"/>
+      </w:pPr>
+      <w:r>
+        <w:rPr>
+          <w:rFonts w:ascii="맑은 고딕" w:hAnsi="맑은 고딕" w:eastAsia="맑은 고딕"/>
+          <w:b/>
+          <w:color w:val="E86A1F"/>
+          <w:sz w:val="21"/>
+        </w:rPr>
+        <w:t xml:space="preserve">• </w:t>
+      </w:r>
+      <w:r>
+        <w:rPr>
+          <w:rFonts w:ascii="맑은 고딕" w:hAnsi="맑은 고딕" w:eastAsia="맑은 고딕"/>
+          <w:b/>
+          <w:sz w:val="21"/>
+        </w:rPr>
+        <w:t>엔지니어 PC 배포 마찰</w:t>
+      </w:r>
+      <w:r>
+        <w:rPr>
+          <w:rFonts w:ascii="맑은 고딕" w:hAnsi="맑은 고딕" w:eastAsia="맑은 고딕"/>
+          <w:sz w:val="21"/>
+        </w:rPr>
+        <w:t>: 대상 PC에 개발 도구가 없어 더블클릭 실행 형태가 필요합니다. 실행 환경을 구성하는 세 경로를 모두 사내 자원으로 고정해야 PC마다 다른 결과가 나오지 않습니다.</w:t>
       </w:r>
     </w:p>
     <w:p>
       <w:pPr>
+        <w:spacing w:after="120"/>
+      </w:pPr>
+      <w:r>
+        <w:rPr>
+          <w:rFonts w:ascii="맑은 고딕" w:hAnsi="맑은 고딕" w:eastAsia="맑은 고딕"/>
+          <w:sz w:val="21"/>
+        </w:rPr>
+        <w:t xml:space="preserve">상세 진행 현황·예상 허들과 대응·향후 일정은 </w:t>
+      </w:r>
+      <w:r>
+        <w:rPr>
+          <w:rFonts w:ascii="맑은 고딕" w:hAnsi="맑은 고딕" w:eastAsia="맑은 고딕"/>
+          <w:sz w:val="21"/>
+        </w:rPr>
+        <w:t>04_workflow_3.md</w:t>
+      </w:r>
+      <w:r>
+        <w:rPr>
+          <w:rFonts w:ascii="맑은 고딕" w:hAnsi="맑은 고딕" w:eastAsia="맑은 고딕"/>
+          <w:sz w:val="21"/>
+        </w:rPr>
+        <w:t>를 참조해 주시기 바랍니다.</w:t>
+      </w:r>
+    </w:p>
+    <w:p>
+      <w:r>
+        <w:br w:type="page"/>
+      </w:r>
+    </w:p>
+    <w:p>
+      <w:pPr>
         <w:spacing w:before="280" w:after="120"/>
       </w:pPr>
       <w:r>
@@ -2104,6 +2458,29 @@
     </w:p>
     <w:p>
       <w:pPr>
+        <w:spacing w:after="120" w:before="80"/>
+        <w:ind w:left="280"/>
+      </w:pPr>
+      <w:r>
+        <w:rPr>
+          <w:rFonts w:ascii="맑은 고딕" w:hAnsi="맑은 고딕" w:eastAsia="맑은 고딕"/>
+          <w:b/>
+          <w:color w:val="E86A1F"/>
+          <w:sz w:val="21"/>
+        </w:rPr>
+        <w:t xml:space="preserve">▎ </w:t>
+      </w:r>
+      <w:r>
+        <w:rPr>
+          <w:rFonts w:ascii="맑은 고딕" w:hAnsi="맑은 고딕" w:eastAsia="맑은 고딕"/>
+          <w:color w:val="556070"/>
+          <w:sz w:val="20"/>
+        </w:rPr>
+        <w:t>최종 갱신: 2026-08-16 (모델 비교 평가를 거쳐 상시 운영 구성을 2종으로 정리했습니다. §5 참조.)</w:t>
+      </w:r>
+    </w:p>
+    <w:p>
+      <w:pPr>
         <w:spacing w:before="200" w:after="120"/>
       </w:pPr>
       <w:r>
@@ -2113,7 +2490,7 @@
           <w:color w:val="142A55"/>
           <w:sz w:val="27"/>
         </w:rPr>
-        <w:t>1. 설치한 모델 (5종)</w:t>
+        <w:t>1. 설치·평가한 모델 (5종)</w:t>
       </w:r>
     </w:p>
     <w:p>
@@ -2140,7 +2517,7 @@
           <w:rFonts w:ascii="맑은 고딕" w:hAnsi="맑은 고딕" w:eastAsia="맑은 고딕"/>
           <w:sz w:val="21"/>
         </w:rPr>
-        <w:t xml:space="preserve">을 골라 내려받아 설치했습니다. 화면을 이해하는 </w:t>
+        <w:t xml:space="preserve">을 골라 내려받아 설치하고 비교 평가했습니다. 화면을 이해하는 </w:t>
       </w:r>
       <w:r>
         <w:rPr>
@@ -2181,14 +2558,15 @@
         <w:tblLook w:firstColumn="1" w:firstRow="1" w:lastColumn="0" w:lastRow="0" w:noHBand="0" w:noVBand="1" w:val="04A0"/>
       </w:tblPr>
       <w:tblGrid>
-        <w:gridCol w:w="2880"/>
-        <w:gridCol w:w="2880"/>
-        <w:gridCol w:w="2880"/>
+        <w:gridCol w:w="2160"/>
+        <w:gridCol w:w="2160"/>
+        <w:gridCol w:w="2160"/>
+        <w:gridCol w:w="2160"/>
       </w:tblGrid>
       <w:tr>
         <w:tc>
           <w:tcPr>
-            <w:tcW w:type="dxa" w:w="2880"/>
+            <w:tcW w:type="dxa" w:w="2160"/>
             <w:shd w:val="clear" w:fill="142A55"/>
           </w:tcPr>
           <w:p>
@@ -2206,7 +2584,7 @@
         </w:tc>
         <w:tc>
           <w:tcPr>
-            <w:tcW w:type="dxa" w:w="2880"/>
+            <w:tcW w:type="dxa" w:w="2160"/>
             <w:shd w:val="clear" w:fill="142A55"/>
           </w:tcPr>
           <w:p>
@@ -2224,7 +2602,7 @@
         </w:tc>
         <w:tc>
           <w:tcPr>
-            <w:tcW w:type="dxa" w:w="2880"/>
+            <w:tcW w:type="dxa" w:w="2160"/>
             <w:shd w:val="clear" w:fill="142A55"/>
           </w:tcPr>
           <w:p>
@@ -2240,11 +2618,29 @@
             </w:r>
           </w:p>
         </w:tc>
+        <w:tc>
+          <w:tcPr>
+            <w:tcW w:type="dxa" w:w="2160"/>
+            <w:shd w:val="clear" w:fill="142A55"/>
+          </w:tcPr>
+          <w:p>
+            <w:r/>
+            <w:r>
+              <w:rPr>
+                <w:rFonts w:ascii="맑은 고딕" w:hAnsi="맑은 고딕" w:eastAsia="맑은 고딕"/>
+                <w:b/>
+                <w:color w:val="FFFFFF"/>
+                <w:sz w:val="19"/>
+              </w:rPr>
+              <w:t>현재</w:t>
+            </w:r>
+          </w:p>
+        </w:tc>
       </w:tr>
       <w:tr>
         <w:tc>
           <w:tcPr>
-            <w:tcW w:type="dxa" w:w="2880"/>
+            <w:tcW w:type="dxa" w:w="2160"/>
           </w:tcPr>
           <w:p>
             <w:r/>
@@ -2259,7 +2655,71 @@
         </w:tc>
         <w:tc>
           <w:tcPr>
-            <w:tcW w:type="dxa" w:w="2880"/>
+            <w:tcW w:type="dxa" w:w="2160"/>
+          </w:tcPr>
+          <w:p>
+            <w:r/>
+            <w:r>
+              <w:rPr>
+                <w:rFonts w:ascii="맑은 고딕" w:hAnsi="맑은 고딕" w:eastAsia="맑은 고딕"/>
+                <w:b/>
+                <w:sz w:val="19"/>
+              </w:rPr>
+              <w:t>MAI-UI</w:t>
+            </w:r>
+          </w:p>
+        </w:tc>
+        <w:tc>
+          <w:tcPr>
+            <w:tcW w:type="dxa" w:w="2160"/>
+          </w:tcPr>
+          <w:p>
+            <w:r/>
+            <w:r>
+              <w:rPr>
+                <w:rFonts w:ascii="맑은 고딕" w:hAnsi="맑은 고딕" w:eastAsia="맑은 고딕"/>
+                <w:sz w:val="19"/>
+              </w:rPr>
+              <w:t>화면 좌표 인식 — 대략 영역과 정밀 클릭점 모두 담당</w:t>
+            </w:r>
+          </w:p>
+        </w:tc>
+        <w:tc>
+          <w:tcPr>
+            <w:tcW w:type="dxa" w:w="2160"/>
+          </w:tcPr>
+          <w:p>
+            <w:r/>
+            <w:r>
+              <w:rPr>
+                <w:rFonts w:ascii="맑은 고딕" w:hAnsi="맑은 고딕" w:eastAsia="맑은 고딕"/>
+                <w:b/>
+                <w:sz w:val="19"/>
+              </w:rPr>
+              <w:t>상시 운영</w:t>
+            </w:r>
+          </w:p>
+        </w:tc>
+      </w:tr>
+      <w:tr>
+        <w:tc>
+          <w:tcPr>
+            <w:tcW w:type="dxa" w:w="2160"/>
+          </w:tcPr>
+          <w:p>
+            <w:r/>
+            <w:r>
+              <w:rPr>
+                <w:rFonts w:ascii="맑은 고딕" w:hAnsi="맑은 고딕" w:eastAsia="맑은 고딕"/>
+                <w:sz w:val="19"/>
+              </w:rPr>
+              <w:t>VLM</w:t>
+            </w:r>
+          </w:p>
+        </w:tc>
+        <w:tc>
+          <w:tcPr>
+            <w:tcW w:type="dxa" w:w="2160"/>
           </w:tcPr>
           <w:p>
             <w:r/>
@@ -2275,7 +2735,7 @@
         </w:tc>
         <w:tc>
           <w:tcPr>
-            <w:tcW w:type="dxa" w:w="2880"/>
+            <w:tcW w:type="dxa" w:w="2160"/>
           </w:tcPr>
           <w:p>
             <w:r/>
@@ -2284,7 +2744,22 @@
                 <w:rFonts w:ascii="맑은 고딕" w:hAnsi="맑은 고딕" w:eastAsia="맑은 고딕"/>
                 <w:sz w:val="19"/>
               </w:rPr>
-              <w:t>대략 위치 인식 — 전체 화면에서 타겟 UI의 대략 영역</w:t>
+              <w:t>대략 위치 인식 — 초기 구성의 1단계 담당</w:t>
+            </w:r>
+          </w:p>
+        </w:tc>
+        <w:tc>
+          <w:tcPr>
+            <w:tcW w:type="dxa" w:w="2160"/>
+          </w:tcPr>
+          <w:p>
+            <w:r/>
+            <w:r>
+              <w:rPr>
+                <w:rFonts w:ascii="맑은 고딕" w:hAnsi="맑은 고딕" w:eastAsia="맑은 고딕"/>
+                <w:sz w:val="19"/>
+              </w:rPr>
+              <w:t>대기(즉시 복귀 가능)</w:t>
             </w:r>
           </w:p>
         </w:tc>
@@ -2292,7 +2767,7 @@
       <w:tr>
         <w:tc>
           <w:tcPr>
-            <w:tcW w:type="dxa" w:w="2880"/>
+            <w:tcW w:type="dxa" w:w="2160"/>
           </w:tcPr>
           <w:p>
             <w:r/>
@@ -2307,55 +2782,7 @@
         </w:tc>
         <w:tc>
           <w:tcPr>
-            <w:tcW w:type="dxa" w:w="2880"/>
-          </w:tcPr>
-          <w:p>
-            <w:r/>
-            <w:r>
-              <w:rPr>
-                <w:rFonts w:ascii="맑은 고딕" w:hAnsi="맑은 고딕" w:eastAsia="맑은 고딕"/>
-                <w:b/>
-                <w:sz w:val="19"/>
-              </w:rPr>
-              <w:t>MAI-UI</w:t>
-            </w:r>
-          </w:p>
-        </w:tc>
-        <w:tc>
-          <w:tcPr>
-            <w:tcW w:type="dxa" w:w="2880"/>
-          </w:tcPr>
-          <w:p>
-            <w:r/>
-            <w:r>
-              <w:rPr>
-                <w:rFonts w:ascii="맑은 고딕" w:hAnsi="맑은 고딕" w:eastAsia="맑은 고딕"/>
-                <w:sz w:val="19"/>
-              </w:rPr>
-              <w:t>정밀 좌표 — 대략 영역을 확대해 픽셀 단위 클릭점 결정</w:t>
-            </w:r>
-          </w:p>
-        </w:tc>
-      </w:tr>
-      <w:tr>
-        <w:tc>
-          <w:tcPr>
-            <w:tcW w:type="dxa" w:w="2880"/>
-          </w:tcPr>
-          <w:p>
-            <w:r/>
-            <w:r>
-              <w:rPr>
-                <w:rFonts w:ascii="맑은 고딕" w:hAnsi="맑은 고딕" w:eastAsia="맑은 고딕"/>
-                <w:sz w:val="19"/>
-              </w:rPr>
-              <w:t>VLM</w:t>
-            </w:r>
-          </w:p>
-        </w:tc>
-        <w:tc>
-          <w:tcPr>
-            <w:tcW w:type="dxa" w:w="2880"/>
+            <w:tcW w:type="dxa" w:w="2160"/>
           </w:tcPr>
           <w:p>
             <w:r/>
@@ -2371,7 +2798,7 @@
         </w:tc>
         <w:tc>
           <w:tcPr>
-            <w:tcW w:type="dxa" w:w="2880"/>
+            <w:tcW w:type="dxa" w:w="2160"/>
           </w:tcPr>
           <w:p>
             <w:r/>
@@ -2380,7 +2807,22 @@
                 <w:rFonts w:ascii="맑은 고딕" w:hAnsi="맑은 고딕" w:eastAsia="맑은 고딕"/>
                 <w:sz w:val="19"/>
               </w:rPr>
-              <w:t>단일 모델 화면 조작(Action) 대안 — 좌표 정확도 문제로 현재 비활성</w:t>
+              <w:t>단일 모델 화면 조작(Action) 대안 — 좌표 정확도 문제로 비활성</w:t>
+            </w:r>
+          </w:p>
+        </w:tc>
+        <w:tc>
+          <w:tcPr>
+            <w:tcW w:type="dxa" w:w="2160"/>
+          </w:tcPr>
+          <w:p>
+            <w:r/>
+            <w:r>
+              <w:rPr>
+                <w:rFonts w:ascii="맑은 고딕" w:hAnsi="맑은 고딕" w:eastAsia="맑은 고딕"/>
+                <w:sz w:val="19"/>
+              </w:rPr>
+              <w:t>비활성</w:t>
             </w:r>
           </w:p>
         </w:tc>
@@ -2388,7 +2830,7 @@
       <w:tr>
         <w:tc>
           <w:tcPr>
-            <w:tcW w:type="dxa" w:w="2880"/>
+            <w:tcW w:type="dxa" w:w="2160"/>
           </w:tcPr>
           <w:p>
             <w:r/>
@@ -2403,7 +2845,7 @@
         </w:tc>
         <w:tc>
           <w:tcPr>
-            <w:tcW w:type="dxa" w:w="2880"/>
+            <w:tcW w:type="dxa" w:w="2160"/>
           </w:tcPr>
           <w:p>
             <w:r/>
@@ -2419,7 +2861,7 @@
         </w:tc>
         <w:tc>
           <w:tcPr>
-            <w:tcW w:type="dxa" w:w="2880"/>
+            <w:tcW w:type="dxa" w:w="2160"/>
           </w:tcPr>
           <w:p>
             <w:r/>
@@ -2432,11 +2874,27 @@
             </w:r>
           </w:p>
         </w:tc>
+        <w:tc>
+          <w:tcPr>
+            <w:tcW w:type="dxa" w:w="2160"/>
+          </w:tcPr>
+          <w:p>
+            <w:r/>
+            <w:r>
+              <w:rPr>
+                <w:rFonts w:ascii="맑은 고딕" w:hAnsi="맑은 고딕" w:eastAsia="맑은 고딕"/>
+                <w:b/>
+                <w:sz w:val="19"/>
+              </w:rPr>
+              <w:t>상시 운영</w:t>
+            </w:r>
+          </w:p>
+        </w:tc>
       </w:tr>
       <w:tr>
         <w:tc>
           <w:tcPr>
-            <w:tcW w:type="dxa" w:w="2880"/>
+            <w:tcW w:type="dxa" w:w="2160"/>
           </w:tcPr>
           <w:p>
             <w:r/>
@@ -2451,7 +2909,7 @@
         </w:tc>
         <w:tc>
           <w:tcPr>
-            <w:tcW w:type="dxa" w:w="2880"/>
+            <w:tcW w:type="dxa" w:w="2160"/>
           </w:tcPr>
           <w:p>
             <w:r/>
@@ -2467,7 +2925,7 @@
         </w:tc>
         <w:tc>
           <w:tcPr>
-            <w:tcW w:type="dxa" w:w="2880"/>
+            <w:tcW w:type="dxa" w:w="2160"/>
           </w:tcPr>
           <w:p>
             <w:r/>
@@ -2480,6 +2938,21 @@
             </w:r>
           </w:p>
         </w:tc>
+        <w:tc>
+          <w:tcPr>
+            <w:tcW w:type="dxa" w:w="2160"/>
+          </w:tcPr>
+          <w:p>
+            <w:r/>
+            <w:r>
+              <w:rPr>
+                <w:rFonts w:ascii="맑은 고딕" w:hAnsi="맑은 고딕" w:eastAsia="맑은 고딕"/>
+                <w:sz w:val="19"/>
+              </w:rPr>
+              <w:t>대기</w:t>
+            </w:r>
+          </w:p>
+        </w:tc>
       </w:tr>
     </w:tbl>
     <w:p>
@@ -2626,14 +3099,14 @@
           <w:b/>
           <w:sz w:val="21"/>
         </w:rPr>
-        <w:t>소형 모델 두 개를 단계적으로 사용</w:t>
-      </w:r>
-      <w:r>
-        <w:rPr>
-          <w:rFonts w:ascii="맑은 고딕" w:hAnsi="맑은 고딕" w:eastAsia="맑은 고딕"/>
-          <w:sz w:val="21"/>
-        </w:rPr>
-        <w:t>해, 클릭 위치를 2번에 걸쳐 좁혀 잡도록 했습니다.</w:t>
+        <w:t>판단을 2단계로 나눠</w:t>
+      </w:r>
+      <w:r>
+        <w:rPr>
+          <w:rFonts w:ascii="맑은 고딕" w:hAnsi="맑은 고딕" w:eastAsia="맑은 고딕"/>
+          <w:sz w:val="21"/>
+        </w:rPr>
+        <w:t>, 클릭 위치를 2번에 걸쳐 좁혀 잡도록 했습니다.</w:t>
       </w:r>
     </w:p>
     <w:p>
@@ -2656,7 +3129,7 @@
           <w:b/>
           <w:sz w:val="21"/>
         </w:rPr>
-        <w:t>1단계 · 대략 위치 (UI-Venus)</w:t>
+        <w:t>1단계 · 대략 위치</w:t>
       </w:r>
       <w:r>
         <w:rPr>
@@ -2678,7 +3151,7 @@
           <w:rFonts w:ascii="맑은 고딕" w:hAnsi="맑은 고딕" w:eastAsia="맑은 고딕"/>
           <w:sz w:val="21"/>
         </w:rPr>
-        <w:t>을 빠르게 찾습니다. 넓은 화면을 한눈에 훑어 후보 영역을 잡는 데 강합니다.</w:t>
+        <w:t>을 빠르게 찾습니다.</w:t>
       </w:r>
     </w:p>
     <w:p>
@@ -2701,7 +3174,7 @@
           <w:b/>
           <w:sz w:val="21"/>
         </w:rPr>
-        <w:t>2단계 · 정밀 좌표 (MAI-UI)</w:t>
+        <w:t>2단계 · 정밀 좌표</w:t>
       </w:r>
       <w:r>
         <w:rPr>
@@ -2738,7 +3211,7 @@
           <w:rFonts w:ascii="맑은 고딕" w:hAnsi="맑은 고딕" w:eastAsia="맑은 고딕"/>
           <w:sz w:val="21"/>
         </w:rPr>
-        <w:t>을 결정합니다. 좁은 영역에서 세밀하게 위치를 짚는 일에 능합니다.</w:t>
+        <w:t>을 결정합니다.</w:t>
       </w:r>
     </w:p>
     <w:p>
@@ -2750,7 +3223,37 @@
           <w:rFonts w:ascii="맑은 고딕" w:hAnsi="맑은 고딕" w:eastAsia="맑은 고딕"/>
           <w:sz w:val="21"/>
         </w:rPr>
-        <w:t>작은 화면으로 좁혀 두 번 판단한 덕분에, 단일 모델에서 나타나던 좌표 어긋남을 크게 줄였습니다.</w:t>
+        <w:t xml:space="preserve">작은 화면으로 좁혀 두 번 판단한 덕분에, 단일 모델에서 나타나던 좌표 어긋남을 크게 줄였습니다. 여기서 효과를 낸 것은 모델을 2개 쓴 것이 아니라 </w:t>
+      </w:r>
+      <w:r>
+        <w:rPr>
+          <w:rFonts w:ascii="맑은 고딕" w:hAnsi="맑은 고딕" w:eastAsia="맑은 고딕"/>
+          <w:b/>
+          <w:sz w:val="21"/>
+        </w:rPr>
+        <w:t>판단을 2단계로 나눈 것</w:t>
+      </w:r>
+      <w:r>
+        <w:rPr>
+          <w:rFonts w:ascii="맑은 고딕" w:hAnsi="맑은 고딕" w:eastAsia="맑은 고딕"/>
+          <w:sz w:val="21"/>
+        </w:rPr>
+        <w:t xml:space="preserve">이었습니다. 처음에는 1단계에 UI-Venus, 2단계에 MAI-UI를 썼습니다. 두 모델을 같은 과제로 비교해 보니 두 단계 모두 MAI-UI가 나았고, 지금은 </w:t>
+      </w:r>
+      <w:r>
+        <w:rPr>
+          <w:rFonts w:ascii="맑은 고딕" w:hAnsi="맑은 고딕" w:eastAsia="맑은 고딕"/>
+          <w:b/>
+          <w:sz w:val="21"/>
+        </w:rPr>
+        <w:t>한 모델이 두 단계를 모두 담당</w:t>
+      </w:r>
+      <w:r>
+        <w:rPr>
+          <w:rFonts w:ascii="맑은 고딕" w:hAnsi="맑은 고딕" w:eastAsia="맑은 고딕"/>
+          <w:sz w:val="21"/>
+        </w:rPr>
+        <w:t>합니다(§5).</w:t>
       </w:r>
     </w:p>
     <w:p>
@@ -2795,7 +3298,22 @@
           <w:rFonts w:ascii="맑은 고딕" w:hAnsi="맑은 고딕" w:eastAsia="맑은 고딕"/>
           <w:sz w:val="21"/>
         </w:rPr>
-        <w:t>합니다. 확인되지 않으면 다시 시도해 무인 신뢰도를 높입니다.</w:t>
+        <w:t xml:space="preserve">합니다. 확인되지 않으면 다시 시도해 무인 신뢰도를 높입니다. 확인되지 않으면 </w:t>
+      </w:r>
+      <w:r>
+        <w:rPr>
+          <w:rFonts w:ascii="맑은 고딕" w:hAnsi="맑은 고딕" w:eastAsia="맑은 고딕"/>
+          <w:b/>
+          <w:sz w:val="21"/>
+        </w:rPr>
+        <w:t>누르지 않는 것</w:t>
+      </w:r>
+      <w:r>
+        <w:rPr>
+          <w:rFonts w:ascii="맑은 고딕" w:hAnsi="맑은 고딕" w:eastAsia="맑은 고딕"/>
+          <w:sz w:val="21"/>
+        </w:rPr>
+        <w:t>이 원칙입니다.</w:t>
       </w:r>
     </w:p>
     <w:p>
@@ -2917,7 +3435,7 @@
     <w:p>
       <w:pPr>
         <w:spacing w:after="60"/>
-        <w:ind w:left="360"/>
+        <w:ind w:left="680"/>
       </w:pPr>
       <w:r>
         <w:rPr>
@@ -2926,41 +3444,93 @@
           <w:color w:val="E86A1F"/>
           <w:sz w:val="21"/>
         </w:rPr>
-        <w:t xml:space="preserve">• </w:t>
-      </w:r>
-      <w:r>
-        <w:rPr>
-          <w:rFonts w:ascii="맑은 고딕" w:hAnsi="맑은 고딕" w:eastAsia="맑은 고딕"/>
-          <w:b/>
-          <w:sz w:val="21"/>
-        </w:rPr>
-        <w:t>서버 재시작 시 재설치 부담</w:t>
-      </w:r>
-      <w:r>
-        <w:rPr>
-          <w:rFonts w:ascii="맑은 고딕" w:hAnsi="맑은 고딕" w:eastAsia="맑은 고딕"/>
-          <w:sz w:val="21"/>
-        </w:rPr>
-        <w:t xml:space="preserve">: HCP 서버가 재시작되면 VLM 구동 환경 패키지를 매번 새로 깔아야 하고, 여기에 </w:t>
-      </w:r>
-      <w:r>
-        <w:rPr>
-          <w:rFonts w:ascii="맑은 고딕" w:hAnsi="맑은 고딕" w:eastAsia="맑은 고딕"/>
-          <w:b/>
-          <w:sz w:val="21"/>
-        </w:rPr>
-        <w:t>약 3~4시간</w:t>
-      </w:r>
-      <w:r>
-        <w:rPr>
-          <w:rFonts w:ascii="맑은 고딕" w:hAnsi="맑은 고딕" w:eastAsia="맑은 고딕"/>
-          <w:sz w:val="21"/>
-        </w:rPr>
-        <w:t>이 걸립니다.</w:t>
+        <w:t xml:space="preserve">◦ </w:t>
+      </w:r>
+      <w:r>
+        <w:rPr>
+          <w:rFonts w:ascii="맑은 고딕" w:hAnsi="맑은 고딕" w:eastAsia="맑은 고딕"/>
+          <w:sz w:val="21"/>
+        </w:rPr>
+        <w:t xml:space="preserve">운영하며 확인해 보니 </w:t>
+      </w:r>
+      <w:r>
+        <w:rPr>
+          <w:rFonts w:ascii="맑은 고딕" w:hAnsi="맑은 고딕" w:eastAsia="맑은 고딕"/>
+          <w:b/>
+          <w:sz w:val="21"/>
+        </w:rPr>
+        <w:t>진짜 제약은 GPU가 아니라 동시에 띄울 수 있는 모델 프로세스 수</w:t>
+      </w:r>
+      <w:r>
+        <w:rPr>
+          <w:rFonts w:ascii="맑은 고딕" w:hAnsi="맑은 고딕" w:eastAsia="맑은 고딕"/>
+          <w:sz w:val="21"/>
+        </w:rPr>
+        <w:t xml:space="preserve">였습니다. GPU는 남아도 모델을 하나 더 띄우면 시스템 메모리가 먼저 바닥납니다. 그래서 </w:t>
+      </w:r>
+      <w:r>
+        <w:rPr>
+          <w:rFonts w:ascii="맑은 고딕" w:hAnsi="맑은 고딕" w:eastAsia="맑은 고딕"/>
+          <w:b/>
+          <w:sz w:val="21"/>
+        </w:rPr>
+        <w:t>쓰지 않는 모델은 GPU가 남아 있어도 내립니다.</w:t>
+      </w:r>
+      <w:r>
+        <w:rPr>
+          <w:rFonts w:ascii="맑은 고딕" w:hAnsi="맑은 고딕" w:eastAsia="맑은 고딕"/>
+          <w:sz w:val="21"/>
+        </w:rPr>
+        <w:t xml:space="preserve"> 이것을 운영 원칙으로 삼았습니다.</w:t>
       </w:r>
     </w:p>
     <w:p>
       <w:pPr>
+        <w:spacing w:after="60"/>
+        <w:ind w:left="360"/>
+      </w:pPr>
+      <w:r>
+        <w:rPr>
+          <w:rFonts w:ascii="맑은 고딕" w:hAnsi="맑은 고딕" w:eastAsia="맑은 고딕"/>
+          <w:b/>
+          <w:color w:val="E86A1F"/>
+          <w:sz w:val="21"/>
+        </w:rPr>
+        <w:t xml:space="preserve">• </w:t>
+      </w:r>
+      <w:r>
+        <w:rPr>
+          <w:rFonts w:ascii="맑은 고딕" w:hAnsi="맑은 고딕" w:eastAsia="맑은 고딕"/>
+          <w:b/>
+          <w:sz w:val="21"/>
+        </w:rPr>
+        <w:t>서버 재시작 시 재설치 부담</w:t>
+      </w:r>
+      <w:r>
+        <w:rPr>
+          <w:rFonts w:ascii="맑은 고딕" w:hAnsi="맑은 고딕" w:eastAsia="맑은 고딕"/>
+          <w:sz w:val="21"/>
+        </w:rPr>
+        <w:t xml:space="preserve">: HCP 서버가 재시작되면 VLM 구동 환경 패키지를 매번 새로 깔아야 하고, 여기에 </w:t>
+      </w:r>
+      <w:r>
+        <w:rPr>
+          <w:rFonts w:ascii="맑은 고딕" w:hAnsi="맑은 고딕" w:eastAsia="맑은 고딕"/>
+          <w:b/>
+          <w:sz w:val="21"/>
+        </w:rPr>
+        <w:t>약 3~4시간</w:t>
+      </w:r>
+      <w:r>
+        <w:rPr>
+          <w:rFonts w:ascii="맑은 고딕" w:hAnsi="맑은 고딕" w:eastAsia="맑은 고딕"/>
+          <w:sz w:val="21"/>
+        </w:rPr>
+        <w:t>이 걸립니다.</w:t>
+      </w:r>
+    </w:p>
+    <w:p>
+      <w:pPr>
         <w:spacing w:before="200" w:after="120"/>
       </w:pPr>
       <w:r>
@@ -2970,11 +3540,38 @@
           <w:color w:val="142A55"/>
           <w:sz w:val="27"/>
         </w:rPr>
-        <w:t>5. 확보한 역량</w:t>
+        <w:t>5. 모델 구성 정리 — 5종 평가 → 2종 상시 운영 (2026-08)</w:t>
       </w:r>
     </w:p>
     <w:p>
       <w:pPr>
+        <w:spacing w:after="120"/>
+      </w:pPr>
+      <w:r>
+        <w:rPr>
+          <w:rFonts w:ascii="맑은 고딕" w:hAnsi="맑은 고딕" w:eastAsia="맑은 고딕"/>
+          <w:sz w:val="21"/>
+        </w:rPr>
+        <w:t xml:space="preserve">여러 모델을 동시에 띄우는 대신, </w:t>
+      </w:r>
+      <w:r>
+        <w:rPr>
+          <w:rFonts w:ascii="맑은 고딕" w:hAnsi="맑은 고딕" w:eastAsia="맑은 고딕"/>
+          <w:b/>
+          <w:sz w:val="21"/>
+        </w:rPr>
+        <w:t>비교 평가로 이긴 모델만 상시 운영</w:t>
+      </w:r>
+      <w:r>
+        <w:rPr>
+          <w:rFonts w:ascii="맑은 고딕" w:hAnsi="맑은 고딕" w:eastAsia="맑은 고딕"/>
+          <w:sz w:val="21"/>
+        </w:rPr>
+        <w:t>하도록 구성을 정리했습니다.</w:t>
+      </w:r>
+    </w:p>
+    <w:p>
+      <w:pPr>
         <w:spacing w:after="60"/>
         <w:ind w:left="360"/>
       </w:pPr>
@@ -2990,24 +3587,17 @@
       <w:r>
         <w:rPr>
           <w:rFonts w:ascii="맑은 고딕" w:hAnsi="맑은 고딕" w:eastAsia="맑은 고딕"/>
-          <w:sz w:val="21"/>
-        </w:rPr>
-        <w:t xml:space="preserve">HCP 서버 안에서 </w:t>
-      </w:r>
-      <w:r>
-        <w:rPr>
-          <w:rFonts w:ascii="맑은 고딕" w:hAnsi="맑은 고딕" w:eastAsia="맑은 고딕"/>
-          <w:b/>
-          <w:sz w:val="21"/>
-        </w:rPr>
-        <w:t>Flask로 여러 VLM 모델을 함께 운영하는 knowhow</w:t>
-      </w:r>
-      <w:r>
-        <w:rPr>
-          <w:rFonts w:ascii="맑은 고딕" w:hAnsi="맑은 고딕" w:eastAsia="맑은 고딕"/>
-          <w:sz w:val="21"/>
-        </w:rPr>
-        <w:t>를 쌓았습니다.</w:t>
+          <w:b/>
+          <w:sz w:val="21"/>
+        </w:rPr>
+        <w:t>비교는 감이 아니라 벤치로 했습니다</w:t>
+      </w:r>
+      <w:r>
+        <w:rPr>
+          <w:rFonts w:ascii="맑은 고딕" w:hAnsi="맑은 고딕" w:eastAsia="맑은 고딕"/>
+          <w:sz w:val="21"/>
+        </w:rPr>
+        <w:t>: 실제 업무 화면에서 ① 장비 목록에서 목표 장비 행을 고르는 과제와 ② 장비 창 안의 버튼·커서를 읽는 과제로 모델을 반복 측정했습니다. 두 과제 모두 MAI-UI가 우세했습니다. 버튼 판독은 정확도 1.000이었습니다. 이 벤치는 실제 클릭을 하지 않으므로 알람 없이도 언제든 다시 돌릴 수 있습니다.</w:t>
       </w:r>
     </w:p>
     <w:p>
@@ -3027,28 +3617,66 @@
       <w:r>
         <w:rPr>
           <w:rFonts w:ascii="맑은 고딕" w:hAnsi="맑은 고딕" w:eastAsia="맑은 고딕"/>
-          <w:sz w:val="21"/>
-        </w:rPr>
-        <w:t xml:space="preserve">외부에 기대지 않고 </w:t>
-      </w:r>
-      <w:r>
-        <w:rPr>
-          <w:rFonts w:ascii="맑은 고딕" w:hAnsi="맑은 고딕" w:eastAsia="맑은 고딕"/>
-          <w:b/>
-          <w:sz w:val="21"/>
-        </w:rPr>
-        <w:t>자체적으로 모델을 구동해 기반기술센터 안에서 서비스할 수 있는 역량</w:t>
-      </w:r>
-      <w:r>
-        <w:rPr>
-          <w:rFonts w:ascii="맑은 고딕" w:hAnsi="맑은 고딕" w:eastAsia="맑은 고딕"/>
-          <w:sz w:val="21"/>
-        </w:rPr>
-        <w:t>을 갖췄습니다.</w:t>
+          <w:b/>
+          <w:sz w:val="21"/>
+        </w:rPr>
+        <w:t>결과</w:t>
+      </w:r>
+      <w:r>
+        <w:rPr>
+          <w:rFonts w:ascii="맑은 고딕" w:hAnsi="맑은 고딕" w:eastAsia="맑은 고딕"/>
+          <w:sz w:val="21"/>
+        </w:rPr>
+        <w:t xml:space="preserve">: 화면 좌표 인식은 MAI-UI 1종, 문자 확인은 PaddleOCR-VL 1종의 </w:t>
+      </w:r>
+      <w:r>
+        <w:rPr>
+          <w:rFonts w:ascii="맑은 고딕" w:hAnsi="맑은 고딕" w:eastAsia="맑은 고딕"/>
+          <w:b/>
+          <w:sz w:val="21"/>
+        </w:rPr>
+        <w:t>2종 상시 운영</w:t>
+      </w:r>
+      <w:r>
+        <w:rPr>
+          <w:rFonts w:ascii="맑은 고딕" w:hAnsi="맑은 고딕" w:eastAsia="맑은 고딕"/>
+          <w:sz w:val="21"/>
+        </w:rPr>
+        <w:t xml:space="preserve"> 체제로 정리했습니다. 남는 GPU는 두 모델에 재배분했습니다.</w:t>
       </w:r>
     </w:p>
     <w:p>
       <w:pPr>
+        <w:spacing w:after="60"/>
+        <w:ind w:left="360"/>
+      </w:pPr>
+      <w:r>
+        <w:rPr>
+          <w:rFonts w:ascii="맑은 고딕" w:hAnsi="맑은 고딕" w:eastAsia="맑은 고딕"/>
+          <w:b/>
+          <w:color w:val="E86A1F"/>
+          <w:sz w:val="21"/>
+        </w:rPr>
+        <w:t xml:space="preserve">• </w:t>
+      </w:r>
+      <w:r>
+        <w:rPr>
+          <w:rFonts w:ascii="맑은 고딕" w:hAnsi="맑은 고딕" w:eastAsia="맑은 고딕"/>
+          <w:b/>
+          <w:sz w:val="21"/>
+        </w:rPr>
+        <w:t>되돌릴 수 있게 남겨 뒀습니다</w:t>
+      </w:r>
+      <w:r>
+        <w:rPr>
+          <w:rFonts w:ascii="맑은 고딕" w:hAnsi="맑은 고딕" w:eastAsia="맑은 고딕"/>
+          <w:sz w:val="21"/>
+        </w:rPr>
+        <w:t>: 내린 모델도 등록 정보는 그대로 유지합니다. 설정 한 줄로 이전 구성에 복귀할 수 있습니다. 새 모델이 나왔을 때 같은 벤치로 곧바로 비교·교체하기 위한 구조이기도 합니다.</w:t>
+      </w:r>
+    </w:p>
+    <w:p>
+      <w:pPr>
         <w:spacing w:before="200" w:after="120"/>
       </w:pPr>
       <w:r>
@@ -3058,7 +3686,132 @@
           <w:color w:val="142A55"/>
           <w:sz w:val="27"/>
         </w:rPr>
-        <w:t>6. 향후 계획</w:t>
+        <w:t>6. 확보한 역량</w:t>
+      </w:r>
+    </w:p>
+    <w:p>
+      <w:pPr>
+        <w:spacing w:after="60"/>
+        <w:ind w:left="360"/>
+      </w:pPr>
+      <w:r>
+        <w:rPr>
+          <w:rFonts w:ascii="맑은 고딕" w:hAnsi="맑은 고딕" w:eastAsia="맑은 고딕"/>
+          <w:b/>
+          <w:color w:val="E86A1F"/>
+          <w:sz w:val="21"/>
+        </w:rPr>
+        <w:t xml:space="preserve">• </w:t>
+      </w:r>
+      <w:r>
+        <w:rPr>
+          <w:rFonts w:ascii="맑은 고딕" w:hAnsi="맑은 고딕" w:eastAsia="맑은 고딕"/>
+          <w:sz w:val="21"/>
+        </w:rPr>
+        <w:t xml:space="preserve">HCP 서버 안에서 </w:t>
+      </w:r>
+      <w:r>
+        <w:rPr>
+          <w:rFonts w:ascii="맑은 고딕" w:hAnsi="맑은 고딕" w:eastAsia="맑은 고딕"/>
+          <w:b/>
+          <w:sz w:val="21"/>
+        </w:rPr>
+        <w:t>Flask로 여러 VLM 모델을 함께 운영하는 knowhow</w:t>
+      </w:r>
+      <w:r>
+        <w:rPr>
+          <w:rFonts w:ascii="맑은 고딕" w:hAnsi="맑은 고딕" w:eastAsia="맑은 고딕"/>
+          <w:sz w:val="21"/>
+        </w:rPr>
+        <w:t>를 쌓았습니다.</w:t>
+      </w:r>
+    </w:p>
+    <w:p>
+      <w:pPr>
+        <w:spacing w:after="60"/>
+        <w:ind w:left="360"/>
+      </w:pPr>
+      <w:r>
+        <w:rPr>
+          <w:rFonts w:ascii="맑은 고딕" w:hAnsi="맑은 고딕" w:eastAsia="맑은 고딕"/>
+          <w:b/>
+          <w:color w:val="E86A1F"/>
+          <w:sz w:val="21"/>
+        </w:rPr>
+        <w:t xml:space="preserve">• </w:t>
+      </w:r>
+      <w:r>
+        <w:rPr>
+          <w:rFonts w:ascii="맑은 고딕" w:hAnsi="맑은 고딕" w:eastAsia="맑은 고딕"/>
+          <w:sz w:val="21"/>
+        </w:rPr>
+        <w:t xml:space="preserve">외부에 기대지 않고 </w:t>
+      </w:r>
+      <w:r>
+        <w:rPr>
+          <w:rFonts w:ascii="맑은 고딕" w:hAnsi="맑은 고딕" w:eastAsia="맑은 고딕"/>
+          <w:b/>
+          <w:sz w:val="21"/>
+        </w:rPr>
+        <w:t>자체적으로 모델을 구동해 기반기술센터 안에서 서비스할 수 있는 역량</w:t>
+      </w:r>
+      <w:r>
+        <w:rPr>
+          <w:rFonts w:ascii="맑은 고딕" w:hAnsi="맑은 고딕" w:eastAsia="맑은 고딕"/>
+          <w:sz w:val="21"/>
+        </w:rPr>
+        <w:t>을 갖췄습니다.</w:t>
+      </w:r>
+    </w:p>
+    <w:p>
+      <w:pPr>
+        <w:spacing w:after="60"/>
+        <w:ind w:left="360"/>
+      </w:pPr>
+      <w:r>
+        <w:rPr>
+          <w:rFonts w:ascii="맑은 고딕" w:hAnsi="맑은 고딕" w:eastAsia="맑은 고딕"/>
+          <w:b/>
+          <w:color w:val="E86A1F"/>
+          <w:sz w:val="21"/>
+        </w:rPr>
+        <w:t xml:space="preserve">• </w:t>
+      </w:r>
+      <w:r>
+        <w:rPr>
+          <w:rFonts w:ascii="맑은 고딕" w:hAnsi="맑은 고딕" w:eastAsia="맑은 고딕"/>
+          <w:sz w:val="21"/>
+        </w:rPr>
+        <w:t xml:space="preserve">모델을 </w:t>
+      </w:r>
+      <w:r>
+        <w:rPr>
+          <w:rFonts w:ascii="맑은 고딕" w:hAnsi="맑은 고딕" w:eastAsia="맑은 고딕"/>
+          <w:b/>
+          <w:sz w:val="21"/>
+        </w:rPr>
+        <w:t>업무 과제 기준으로 비교·교체할 수 있는 벤치 체계</w:t>
+      </w:r>
+      <w:r>
+        <w:rPr>
+          <w:rFonts w:ascii="맑은 고딕" w:hAnsi="맑은 고딕" w:eastAsia="맑은 고딕"/>
+          <w:sz w:val="21"/>
+        </w:rPr>
+        <w:t>를 갖췄습니다. 모델 교체는 이제 측정으로 결정합니다.</w:t>
+      </w:r>
+    </w:p>
+    <w:p>
+      <w:pPr>
+        <w:spacing w:before="200" w:after="120"/>
+      </w:pPr>
+      <w:r>
+        <w:rPr>
+          <w:rFonts w:ascii="맑은 고딕" w:hAnsi="맑은 고딕" w:eastAsia="맑은 고딕"/>
+          <w:b/>
+          <w:color w:val="142A55"/>
+          <w:sz w:val="27"/>
+        </w:rPr>
+        <w:t>7. 향후 계획</w:t>
       </w:r>
     </w:p>
     <w:p>
@@ -4020,6 +4773,29 @@
           <w:sz w:val="20"/>
         </w:rPr>
         <w:t>목적: Align Fail이 난 이미지에서 CV로 정렬 위치를 다시 찾았을 때, Recipe에 등록된 이미지와 같은 지점을 정확히 짚어낼 수 있는지를 오프라인으로 평가합니다. 검증을 통과한 방식만 실시간 운영 루프(04 문서)에 반영합니다.</w:t>
+      </w:r>
+    </w:p>
+    <w:p>
+      <w:pPr>
+        <w:spacing w:after="120" w:before="80"/>
+        <w:ind w:left="280"/>
+      </w:pPr>
+      <w:r>
+        <w:rPr>
+          <w:rFonts w:ascii="맑은 고딕" w:hAnsi="맑은 고딕" w:eastAsia="맑은 고딕"/>
+          <w:b/>
+          <w:color w:val="E86A1F"/>
+          <w:sz w:val="21"/>
+        </w:rPr>
+        <w:t xml:space="preserve">▎ </w:t>
+      </w:r>
+      <w:r>
+        <w:rPr>
+          <w:rFonts w:ascii="맑은 고딕" w:hAnsi="맑은 고딕" w:eastAsia="맑은 고딕"/>
+          <w:color w:val="556070"/>
+          <w:sz w:val="20"/>
+        </w:rPr>
+        <w:t>최종 갱신: 2026-08-16 (촬영 모드별 재순위 채택과 개선 여지 분해 결과를 §7~§8에 추가했습니다.)</w:t>
       </w:r>
     </w:p>
     <w:p>
@@ -5290,7 +6066,7 @@
           <w:rFonts w:ascii="맑은 고딕" w:hAnsi="맑은 고딕" w:eastAsia="맑은 고딕"/>
           <w:sz w:val="21"/>
         </w:rPr>
-        <w:t>핵심 방식(성공 사례 종합) 위에서 정확도를 더 올릴 수 있을지, 아이디어 몇 가지를 추가로 평가했습니다. 아래 항목들은 효과가 없거나 미미해 운영에는 반영하지 않았습니다.</w:t>
+        <w:t>핵심 방식(성공 사례 종합) 위에서 정확도를 더 올릴 수 있을지, 아이디어 몇 가지를 추가로 평가했습니다. 아래 첫 항목(촬영 모드별 재순위)은 검증을 통과해 운영에 반영했고, 나머지는 효과가 없거나 미미해 반영하지 않았습니다.</w:t>
       </w:r>
     </w:p>
     <w:p>
@@ -5313,18 +6089,105 @@
           <w:b/>
           <w:sz w:val="21"/>
         </w:rPr>
-        <w:t>OM/SEM 모드별 분리 평가</w:t>
-      </w:r>
-      <w:r>
-        <w:rPr>
-          <w:rFonts w:ascii="맑은 고딕" w:hAnsi="맑은 고딕" w:eastAsia="맑은 고딕"/>
-          <w:sz w:val="21"/>
-        </w:rPr>
-        <w:t>: 같은 Recipe라도 OM과 SEM은 실패 양상이 다르므로, 정확도와 실패 유형을 모드별로 나눠 보는 체계를 갖췄습니다. 덕분에 SEM이 더 어려운 잔여 과제임을 데이터로 확인했습니다 (위 표). → 채택(분석 체계로 유지).</w:t>
+        <w:t>촬영 모드별 재순위 (채택, 2026-07)</w:t>
+      </w:r>
+      <w:r>
+        <w:rPr>
+          <w:rFonts w:ascii="맑은 고딕" w:hAnsi="맑은 고딕" w:eastAsia="맑은 고딕"/>
+          <w:sz w:val="21"/>
+        </w:rPr>
+        <w:t xml:space="preserve">: 후보를 뽑는 단계는 그대로 두고 </w:t>
+      </w:r>
+      <w:r>
+        <w:rPr>
+          <w:rFonts w:ascii="맑은 고딕" w:hAnsi="맑은 고딕" w:eastAsia="맑은 고딕"/>
+          <w:b/>
+          <w:sz w:val="21"/>
+        </w:rPr>
+        <w:t>뽑힌 후보들의 순위만 다시 매기는 심판</w:t>
+      </w:r>
+      <w:r>
+        <w:rPr>
+          <w:rFonts w:ascii="맑은 고딕" w:hAnsi="맑은 고딕" w:eastAsia="맑은 고딕"/>
+          <w:sz w:val="21"/>
+        </w:rPr>
+        <w:t xml:space="preserve">을 붙여 봤습니다. 심판 후보를 여러 개 만들어 A/B한 결과, 저배율(OM)과 고배율(SEM)에서 </w:t>
+      </w:r>
+      <w:r>
+        <w:rPr>
+          <w:rFonts w:ascii="맑은 고딕" w:hAnsi="맑은 고딕" w:eastAsia="맑은 고딕"/>
+          <w:b/>
+          <w:sz w:val="21"/>
+        </w:rPr>
+        <w:t>서로 다른 심판이 이긴다</w:t>
+      </w:r>
+      <w:r>
+        <w:rPr>
+          <w:rFonts w:ascii="맑은 고딕" w:hAnsi="맑은 고딕" w:eastAsia="맑은 고딕"/>
+          <w:sz w:val="21"/>
+        </w:rPr>
+        <w:t xml:space="preserve">는 것이 드러났습니다. OM에서 좋은 심판은 SEM에서 손해였고, 그 반대도 마찬가지였습니다. 촬영 모드는 화면에서 읽어 판별할 수 있습니다. 그래서 </w:t>
+      </w:r>
+      <w:r>
+        <w:rPr>
+          <w:rFonts w:ascii="맑은 고딕" w:hAnsi="맑은 고딕" w:eastAsia="맑은 고딕"/>
+          <w:b/>
+          <w:sz w:val="21"/>
+        </w:rPr>
+        <w:t>모드에 따라 심판을 바꿔 쓰는 방식</w:t>
+      </w:r>
+      <w:r>
+        <w:rPr>
+          <w:rFonts w:ascii="맑은 고딕" w:hAnsi="맑은 고딕" w:eastAsia="맑은 고딕"/>
+          <w:sz w:val="21"/>
+        </w:rPr>
+        <w:t>을 채택했습니다. 재순위 전용 평가 세트 기준으로, 재순위를 쓰지 않을 때 대비 1순위 적중률이 SEM에서 약 +0.073, OM에서 약 +0.021 올랐습니다(OM 무손실 확인). 전체 0.826이 최종 채택 구성입니다.</w:t>
       </w:r>
     </w:p>
     <w:p>
       <w:pPr>
+        <w:spacing w:after="120"/>
+      </w:pPr>
+      <w:r>
+        <w:rPr>
+          <w:rFonts w:ascii="맑은 고딕" w:hAnsi="맑은 고딕" w:eastAsia="맑은 고딕"/>
+          <w:sz w:val="21"/>
+        </w:rPr>
+        <w:t xml:space="preserve">이 과정에서 얻은 교훈이 하나 더 있습니다. 처음에는 심판들을 </w:t>
+      </w:r>
+      <w:r>
+        <w:rPr>
+          <w:rFonts w:ascii="맑은 고딕" w:hAnsi="맑은 고딕" w:eastAsia="맑은 고딕"/>
+          <w:b/>
+          <w:sz w:val="21"/>
+        </w:rPr>
+        <w:t>섞어서(투표로 종합)</w:t>
+      </w:r>
+      <w:r>
+        <w:rPr>
+          <w:rFonts w:ascii="맑은 고딕" w:hAnsi="맑은 고딕" w:eastAsia="맑은 고딕"/>
+          <w:sz w:val="21"/>
+        </w:rPr>
+        <w:t xml:space="preserve"> 썼는데 성적이 오히려 떨어졌습니다. 고배율에서 압도적으로 잘 맞히는 심판을 약한 심판들과 섞으니 그 판단이 희석됐습니다. </w:t>
+      </w:r>
+      <w:r>
+        <w:rPr>
+          <w:rFonts w:ascii="맑은 고딕" w:hAnsi="맑은 고딕" w:eastAsia="맑은 고딕"/>
+          <w:b/>
+          <w:sz w:val="21"/>
+        </w:rPr>
+        <w:t>한 심판이 특정 국면을 지배할 때는 종합이 아니라 전환</w:t>
+      </w:r>
+      <w:r>
+        <w:rPr>
+          <w:rFonts w:ascii="맑은 고딕" w:hAnsi="맑은 고딕" w:eastAsia="맑은 고딕"/>
+          <w:sz w:val="21"/>
+        </w:rPr>
+        <w:t>이 옳다는 사실을 데이터로 확인하고 구성을 바꿨습니다. 이 개선은 후보의 순위만 바꿀 뿐 새로운 좌표를 만들어 내지 않습니다. 잘못되더라도 기존 결과보다 나빠지지 않습니다.</w:t>
+      </w:r>
+    </w:p>
+    <w:p>
+      <w:pPr>
         <w:spacing w:after="60"/>
         <w:ind w:left="360"/>
       </w:pPr>
@@ -5343,22 +6206,44 @@
           <w:b/>
           <w:sz w:val="21"/>
         </w:rPr>
-        <w:t>관심 영역 축소(box-crop)</w:t>
-      </w:r>
-      <w:r>
-        <w:rPr>
-          <w:rFonts w:ascii="맑은 고딕" w:hAnsi="맑은 고딕" w:eastAsia="맑은 고딕"/>
-          <w:sz w:val="21"/>
-        </w:rPr>
-        <w:t xml:space="preserve">: SEM은 정렬 키가 화면을 가득 채우니 등록된 흰 박스 영역만 잘라내면 주변 방해 요소가 줄어 매칭이 오르리라 봤습니다. 막상 A/B해 보니 정확도가 오히려 떨어졌습니다 (OM 약 −0.04, SEM 약 −0.11). 방해가 되는 반복 패턴이 정렬 키 바깥이 아니라 키 내부에 있어서, 잘라내도 방해가 그대로 남기 때문입니다. → </w:t>
-      </w:r>
-      <w:r>
-        <w:rPr>
-          <w:rFonts w:ascii="맑은 고딕" w:hAnsi="맑은 고딕" w:eastAsia="맑은 고딕"/>
-          <w:b/>
-          <w:sz w:val="21"/>
-        </w:rPr>
-        <w:t>효과 없음, 반영 안 함.</w:t>
+        <w:t>개선 여지가 어디에 남았는지 분해</w:t>
+      </w:r>
+      <w:r>
+        <w:rPr>
+          <w:rFonts w:ascii="맑은 고딕" w:hAnsi="맑은 고딕" w:eastAsia="맑은 고딕"/>
+          <w:sz w:val="21"/>
+        </w:rPr>
+        <w:t xml:space="preserve">: 위 재순위를 반영한 뒤 남은 실패를 원인별로 갈라 봤습니다. </w:t>
+      </w:r>
+      <w:r>
+        <w:rPr>
+          <w:rFonts w:ascii="맑은 고딕" w:hAnsi="맑은 고딕" w:eastAsia="맑은 고딕"/>
+          <w:b/>
+          <w:sz w:val="21"/>
+        </w:rPr>
+        <w:t>약 87%가 "정답이 애초에 후보 목록에 없어서 어떤 재순위로도 고칠 수 없는" 경우</w:t>
+      </w:r>
+      <w:r>
+        <w:rPr>
+          <w:rFonts w:ascii="맑은 고딕" w:hAnsi="맑은 고딕" w:eastAsia="맑은 고딕"/>
+          <w:sz w:val="21"/>
+        </w:rPr>
+        <w:t xml:space="preserve">였습니다. 순위를 교정하는 축은 사실상 소진됐습니다. 남은 몫은 </w:t>
+      </w:r>
+      <w:r>
+        <w:rPr>
+          <w:rFonts w:ascii="맑은 고딕" w:hAnsi="맑은 고딕" w:eastAsia="맑은 고딕"/>
+          <w:b/>
+          <w:sz w:val="21"/>
+        </w:rPr>
+        <w:t>정렬 키를 더 잘 구별되는 위치로 다시 등록하는 일</w:t>
+      </w:r>
+      <w:r>
+        <w:rPr>
+          <w:rFonts w:ascii="맑은 고딕" w:hAnsi="맑은 고딕" w:eastAsia="맑은 고딕"/>
+          <w:sz w:val="21"/>
+        </w:rPr>
+        <w:t>입니다. 이 결론에 따라 CV 알고리즘 개선에서 실시간 루프의 실운전 안정화(04 문서)로 무게중심을 옮겼습니다.</w:t>
       </w:r>
     </w:p>
     <w:p>
@@ -5381,29 +6266,14 @@
           <w:b/>
           <w:sz w:val="21"/>
         </w:rPr>
-        <w:t>성공 이미지를 개별로 보관하는 방식(template bank)</w:t>
-      </w:r>
-      <w:r>
-        <w:rPr>
-          <w:rFonts w:ascii="맑은 고딕" w:hAnsi="맑은 고딕" w:eastAsia="맑은 고딕"/>
-          <w:sz w:val="21"/>
-        </w:rPr>
-        <w:t xml:space="preserve">: 성공 이미지 여러 장을 하나로 합성(consensus) 하는 대신, 각 장을 그대로 두고 장마다 매칭한 결과를 합쳐 봤습니다. 후보 포함률은 consensus보다 좋았지만(OM 약 0.96 / SEM 약 0.94), 정작 맨 위 한 곳을 맞히는 1순위 적중률이 두 모드 모두 약 0.5, 동전 던지기 수준으로 무너졌습니다. 성공 이미지를 어떻게 조합하든 SEM에서는 "많은 후보 중 진짜 하나를 골라내는 일" 자체가 안 된다는 뜻입니다. → </w:t>
-      </w:r>
-      <w:r>
-        <w:rPr>
-          <w:rFonts w:ascii="맑은 고딕" w:hAnsi="맑은 고딕" w:eastAsia="맑은 고딕"/>
-          <w:b/>
-          <w:sz w:val="21"/>
-        </w:rPr>
-        <w:t>반영 안 함.</w:t>
-      </w:r>
-      <w:r>
-        <w:rPr>
-          <w:rFonts w:ascii="맑은 고딕" w:hAnsi="맑은 고딕" w:eastAsia="맑은 고딕"/>
-          <w:sz w:val="21"/>
-        </w:rPr>
-        <w:t xml:space="preserve"> 대신 매칭 방식 개선만으로는 SEM의 한계를 넘을 수 없다는 중요한 결론을 얻었습니다.</w:t>
+        <w:t>OM/SEM 모드별 분리 평가</w:t>
+      </w:r>
+      <w:r>
+        <w:rPr>
+          <w:rFonts w:ascii="맑은 고딕" w:hAnsi="맑은 고딕" w:eastAsia="맑은 고딕"/>
+          <w:sz w:val="21"/>
+        </w:rPr>
+        <w:t>: 같은 Recipe라도 OM과 SEM은 실패 양상이 다르므로, 정확도와 실패 유형을 모드별로 나눠 보는 체계를 갖췄습니다. 덕분에 SEM이 더 어려운 잔여 과제임을 데이터로 확인했습니다 (위 표). → 채택(분석 체계로 유지).</w:t>
       </w:r>
     </w:p>
     <w:p>
@@ -5426,14 +6296,22 @@
           <w:b/>
           <w:sz w:val="21"/>
         </w:rPr>
-        <w:t>새 매칭 채널 추가(윤곽선 기반)</w:t>
-      </w:r>
-      <w:r>
-        <w:rPr>
-          <w:rFonts w:ascii="맑은 고딕" w:hAnsi="맑은 고딕" w:eastAsia="맑은 고딕"/>
-          <w:sz w:val="21"/>
-        </w:rPr>
-        <w:t>: 윤곽선에 직접 상관도를 재는 매칭 방식을 후보로 넣어 봤습니다. OM만 아주 조금(약 +0.9%p) 나아졌고 SEM에는 효과가 없어, 복잡도에 견줘 이득이 없었습니다. → 반영 안 함.</w:t>
+        <w:t>관심 영역 축소(box-crop)</w:t>
+      </w:r>
+      <w:r>
+        <w:rPr>
+          <w:rFonts w:ascii="맑은 고딕" w:hAnsi="맑은 고딕" w:eastAsia="맑은 고딕"/>
+          <w:sz w:val="21"/>
+        </w:rPr>
+        <w:t xml:space="preserve">: SEM은 정렬 키가 화면을 가득 채우니 등록된 흰 박스 영역만 잘라내면 주변 방해 요소가 줄어 매칭이 오르리라 봤습니다. 막상 A/B해 보니 정확도가 오히려 떨어졌습니다 (OM 약 −0.04, SEM 약 −0.11). 방해가 되는 반복 패턴이 정렬 키 바깥이 아니라 키 내부에 있어서, 잘라내도 방해가 그대로 남기 때문입니다. → </w:t>
+      </w:r>
+      <w:r>
+        <w:rPr>
+          <w:rFonts w:ascii="맑은 고딕" w:hAnsi="맑은 고딕" w:eastAsia="맑은 고딕"/>
+          <w:b/>
+          <w:sz w:val="21"/>
+        </w:rPr>
+        <w:t>효과 없음, 반영 안 함.</w:t>
       </w:r>
     </w:p>
     <w:p>
@@ -5456,14 +6334,29 @@
           <w:b/>
           <w:sz w:val="21"/>
         </w:rPr>
-        <w:t>성공 사례 종합에 매칭 종합을 한 번 더 얹기</w:t>
-      </w:r>
-      <w:r>
-        <w:rPr>
-          <w:rFonts w:ascii="맑은 고딕" w:hAnsi="맑은 고딕" w:eastAsia="맑은 고딕"/>
-          <w:sz w:val="21"/>
-        </w:rPr>
-        <w:t>: consensus 위에 여러 매칭 방식 종합을 다시 적용해 봤습니다. 그런데 남은 실패의 절반가량이 화면에 정답 단서가 거의 없는 구조적 케이스라, 아무리 정교화해도 정확도 천장이 +2~6%p에 그쳤습니다. → 이득이 작아 반영 안 함.</w:t>
+        <w:t>성공 이미지를 개별로 보관하는 방식(template bank)</w:t>
+      </w:r>
+      <w:r>
+        <w:rPr>
+          <w:rFonts w:ascii="맑은 고딕" w:hAnsi="맑은 고딕" w:eastAsia="맑은 고딕"/>
+          <w:sz w:val="21"/>
+        </w:rPr>
+        <w:t xml:space="preserve">: 성공 이미지 여러 장을 하나로 합성(consensus) 하는 대신, 각 장을 그대로 두고 장마다 매칭한 결과를 합쳐 봤습니다. 후보 포함률은 consensus보다 좋았지만(OM 약 0.96 / SEM 약 0.94), 정작 맨 위 한 곳을 맞히는 1순위 적중률이 두 모드 모두 약 0.5, 동전 던지기 수준으로 무너졌습니다. 성공 이미지를 어떻게 조합하든 SEM에서는 "많은 후보 중 진짜 하나를 골라내는 일" 자체가 안 된다는 뜻입니다. → </w:t>
+      </w:r>
+      <w:r>
+        <w:rPr>
+          <w:rFonts w:ascii="맑은 고딕" w:hAnsi="맑은 고딕" w:eastAsia="맑은 고딕"/>
+          <w:b/>
+          <w:sz w:val="21"/>
+        </w:rPr>
+        <w:t>반영 안 함.</w:t>
+      </w:r>
+      <w:r>
+        <w:rPr>
+          <w:rFonts w:ascii="맑은 고딕" w:hAnsi="맑은 고딕" w:eastAsia="맑은 고딕"/>
+          <w:sz w:val="21"/>
+        </w:rPr>
+        <w:t xml:space="preserve"> 대신 매칭 방식 개선만으로는 SEM의 한계를 넘을 수 없다는 중요한 결론을 얻었습니다.</w:t>
       </w:r>
     </w:p>
     <w:p>
@@ -5486,14 +6379,14 @@
           <w:b/>
           <w:sz w:val="21"/>
         </w:rPr>
-        <w:t>십자선(crosshair) 제거 비교</w:t>
-      </w:r>
-      <w:r>
-        <w:rPr>
-          <w:rFonts w:ascii="맑은 고딕" w:hAnsi="맑은 고딕" w:eastAsia="맑은 고딕"/>
-          <w:sz w:val="21"/>
-        </w:rPr>
-        <w:t>: 측정 이미지의 십자선을 지우면 매칭이 나아질지 비교했습니다. 지운 쪽이 오히려 약간 낮았고(차이 약 −2%p), 십자선을 지우면 그 자리에 가짜로 잘 맞는 것처럼 보이는 함정이 생길 수 있어 원본을 그대로 쓰기로 했습니다.</w:t>
+        <w:t>새 매칭 채널 추가(윤곽선 기반)</w:t>
+      </w:r>
+      <w:r>
+        <w:rPr>
+          <w:rFonts w:ascii="맑은 고딕" w:hAnsi="맑은 고딕" w:eastAsia="맑은 고딕"/>
+          <w:sz w:val="21"/>
+        </w:rPr>
+        <w:t>: 윤곽선에 직접 상관도를 재는 매칭 방식을 후보로 넣어 봤습니다. OM만 아주 조금(약 +0.9%p) 나아졌고 SEM에는 효과가 없어, 복잡도에 견줘 이득이 없었습니다. → 반영 안 함.</w:t>
       </w:r>
     </w:p>
     <w:p>
@@ -5516,18 +6409,78 @@
           <w:b/>
           <w:sz w:val="21"/>
         </w:rPr>
-        <w:t>재등록 우선순위 리포트</w:t>
-      </w:r>
-      <w:r>
-        <w:rPr>
-          <w:rFonts w:ascii="맑은 고딕" w:hAnsi="맑은 고딕" w:eastAsia="맑은 고딕"/>
-          <w:sz w:val="21"/>
-        </w:rPr>
-        <w:t>: 정렬 키가 반복 패턴 위에 등록돼 근본적으로 헷갈리는 Recipe를 순위 매기고, 더 잘 구별되는 대체 위치를 제안하는 도구를 만들었습니다. 평가한 Recipe 중 SEM은 104개 중 84개(81%)가 재등록이 필요한 비변별 키였고(OM은 89개 중 42개), 앞서 "SEM이 구조적으로 어렵다"던 결론과 맞아떨어졌습니다. 실패(E) 이미지로 한 번 더 확인하는 단계도 해 봤지만, 등록 키가 성공 이미지에서조차 매칭 점수가 낮아(약 0.2~0.3) 성공↔실패 점수 차이로 판정하기 어려워 지금은 보류 중입니다. 이 역시 등록 키 자체의 구별력이 약하다는 점을 다시 확인해 줍니다.</w:t>
+        <w:t>성공 사례 종합에 매칭 종합을 한 번 더 얹기</w:t>
+      </w:r>
+      <w:r>
+        <w:rPr>
+          <w:rFonts w:ascii="맑은 고딕" w:hAnsi="맑은 고딕" w:eastAsia="맑은 고딕"/>
+          <w:sz w:val="21"/>
+        </w:rPr>
+        <w:t>: consensus 위에 여러 매칭 방식 종합을 다시 적용해 봤습니다. 그런데 남은 실패의 절반가량이 화면에 정답 단서가 거의 없는 구조적 케이스라, 아무리 정교화해도 정확도 천장이 +2~6%p에 그쳤습니다. → 이득이 작아 반영 안 함.</w:t>
       </w:r>
     </w:p>
     <w:p>
       <w:pPr>
+        <w:spacing w:after="60"/>
+        <w:ind w:left="360"/>
+      </w:pPr>
+      <w:r>
+        <w:rPr>
+          <w:rFonts w:ascii="맑은 고딕" w:hAnsi="맑은 고딕" w:eastAsia="맑은 고딕"/>
+          <w:b/>
+          <w:color w:val="E86A1F"/>
+          <w:sz w:val="21"/>
+        </w:rPr>
+        <w:t xml:space="preserve">• </w:t>
+      </w:r>
+      <w:r>
+        <w:rPr>
+          <w:rFonts w:ascii="맑은 고딕" w:hAnsi="맑은 고딕" w:eastAsia="맑은 고딕"/>
+          <w:b/>
+          <w:sz w:val="21"/>
+        </w:rPr>
+        <w:t>십자선(crosshair) 제거 비교</w:t>
+      </w:r>
+      <w:r>
+        <w:rPr>
+          <w:rFonts w:ascii="맑은 고딕" w:hAnsi="맑은 고딕" w:eastAsia="맑은 고딕"/>
+          <w:sz w:val="21"/>
+        </w:rPr>
+        <w:t>: 측정 이미지의 십자선을 지우면 매칭이 나아질지 비교했습니다. 지운 쪽이 오히려 약간 낮았고(차이 약 −2%p), 십자선을 지우면 그 자리에 가짜로 잘 맞는 것처럼 보이는 함정이 생길 수 있어 원본을 그대로 쓰기로 했습니다.</w:t>
+      </w:r>
+    </w:p>
+    <w:p>
+      <w:pPr>
+        <w:spacing w:after="60"/>
+        <w:ind w:left="360"/>
+      </w:pPr>
+      <w:r>
+        <w:rPr>
+          <w:rFonts w:ascii="맑은 고딕" w:hAnsi="맑은 고딕" w:eastAsia="맑은 고딕"/>
+          <w:b/>
+          <w:color w:val="E86A1F"/>
+          <w:sz w:val="21"/>
+        </w:rPr>
+        <w:t xml:space="preserve">• </w:t>
+      </w:r>
+      <w:r>
+        <w:rPr>
+          <w:rFonts w:ascii="맑은 고딕" w:hAnsi="맑은 고딕" w:eastAsia="맑은 고딕"/>
+          <w:b/>
+          <w:sz w:val="21"/>
+        </w:rPr>
+        <w:t>재등록 우선순위 리포트</w:t>
+      </w:r>
+      <w:r>
+        <w:rPr>
+          <w:rFonts w:ascii="맑은 고딕" w:hAnsi="맑은 고딕" w:eastAsia="맑은 고딕"/>
+          <w:sz w:val="21"/>
+        </w:rPr>
+        <w:t>: 정렬 키가 반복 패턴 위에 등록돼 근본적으로 헷갈리는 Recipe를 순위 매기고, 더 잘 구별되는 대체 위치를 제안하는 도구를 만들었습니다. 평가한 Recipe 중 SEM은 104개 중 84개(81%)가 재등록이 필요한 비변별 키였고(OM은 89개 중 42개), 앞서 "SEM이 구조적으로 어렵다"던 결론과 맞아떨어졌습니다. 실패(E) 이미지로 한 번 더 확인하는 단계도 해 봤지만, 등록 키가 성공 이미지에서조차 매칭 점수가 낮아(약 0.2~0.3) 성공↔실패 점수 차이로 판정하기 어려워 지금은 보류 중입니다. 이 역시 등록 키 자체의 구별력이 약하다는 점을 다시 확인해 줍니다.</w:t>
+      </w:r>
+    </w:p>
+    <w:p>
+      <w:pPr>
         <w:spacing w:before="200" w:after="120"/>
       </w:pPr>
       <w:r>
@@ -5600,19 +6553,49 @@
     </w:p>
     <w:p>
       <w:pPr>
-        <w:spacing w:after="120"/>
-      </w:pPr>
-      <w:r>
-        <w:rPr>
-          <w:rFonts w:ascii="맑은 고딕" w:hAnsi="맑은 고딕" w:eastAsia="맑은 고딕"/>
-          <w:b/>
-          <w:sz w:val="21"/>
-        </w:rPr>
-        <w:t>반영하지 않은 것 (효과 없음/미미):</w:t>
+        <w:spacing w:after="60"/>
+        <w:ind w:left="360"/>
+      </w:pPr>
+      <w:r>
+        <w:rPr>
+          <w:rFonts w:ascii="맑은 고딕" w:hAnsi="맑은 고딕" w:eastAsia="맑은 고딕"/>
+          <w:b/>
+          <w:color w:val="E86A1F"/>
+          <w:sz w:val="21"/>
+        </w:rPr>
+        <w:t xml:space="preserve">• </w:t>
+      </w:r>
+      <w:r>
+        <w:rPr>
+          <w:rFonts w:ascii="맑은 고딕" w:hAnsi="맑은 고딕" w:eastAsia="맑은 고딕"/>
+          <w:b/>
+          <w:sz w:val="21"/>
+        </w:rPr>
+        <w:t>촬영 모드별 재순위(OM/SEM에 서로 다른 심판)</w:t>
+      </w:r>
+      <w:r>
+        <w:rPr>
+          <w:rFonts w:ascii="맑은 고딕" w:hAnsi="맑은 고딕" w:eastAsia="맑은 고딕"/>
+          <w:sz w:val="21"/>
+        </w:rPr>
+        <w:t xml:space="preserve"> — 2026-07 A/B로 검증해 실시간 운영 루프에 반영했습니다. 문제가 생기면 재순위만 꺼서 이전 동작으로 되돌릴 수 있습니다.</w:t>
       </w:r>
     </w:p>
     <w:p>
       <w:pPr>
+        <w:spacing w:after="120"/>
+      </w:pPr>
+      <w:r>
+        <w:rPr>
+          <w:rFonts w:ascii="맑은 고딕" w:hAnsi="맑은 고딕" w:eastAsia="맑은 고딕"/>
+          <w:b/>
+          <w:sz w:val="21"/>
+        </w:rPr>
+        <w:t>반영하지 않은 것 (효과 없음/미미):</w:t>
+      </w:r>
+    </w:p>
+    <w:p>
+      <w:pPr>
         <w:spacing w:after="60"/>
         <w:ind w:left="360"/>
       </w:pPr>
@@ -5747,31 +6730,95 @@
           <w:rFonts w:ascii="맑은 고딕" w:hAnsi="맑은 고딕" w:eastAsia="맑은 고딕"/>
           <w:sz w:val="21"/>
         </w:rPr>
-        <w:t xml:space="preserve">의 실제 권고 리스트 산출 — 성공 이미지가 충분히 쌓여야 평가할 수 있는데 (현재는 200개 중 소수만 종합 평가 가능), 오피스에서 성공 이미지를 적재하며 캘리브레이션을 이어갈 예정입니다. 그다음 과제는 </w:t>
-      </w:r>
-      <w:r>
-        <w:rPr>
-          <w:rFonts w:ascii="맑은 고딕" w:hAnsi="맑은 고딕" w:eastAsia="맑은 고딕"/>
-          <w:b/>
-          <w:sz w:val="21"/>
-        </w:rPr>
-        <w:t>매칭기 자체의 개선</w:t>
-      </w:r>
-      <w:r>
-        <w:rPr>
-          <w:rFonts w:ascii="맑은 고딕" w:hAnsi="맑은 고딕" w:eastAsia="맑은 고딕"/>
-          <w:sz w:val="21"/>
-        </w:rPr>
-        <w:t>입니다.</w:t>
+        <w:t>의 실제 권고 리스트 산출 — 성공 이미지가 충분히 쌓여야 평가할 수 있는데 (현재는 200개 중 소수만 종합 평가 가능), 오피스에서 성공 이미지를 적재하며 캘리브레이션을 이어갈 예정입니다.</w:t>
       </w:r>
     </w:p>
     <w:p>
-      <w:r>
-        <w:br w:type="page"/>
+      <w:pPr>
+        <w:spacing w:after="60"/>
+        <w:ind w:left="360"/>
+      </w:pPr>
+      <w:r>
+        <w:rPr>
+          <w:rFonts w:ascii="맑은 고딕" w:hAnsi="맑은 고딕" w:eastAsia="맑은 고딕"/>
+          <w:b/>
+          <w:color w:val="E86A1F"/>
+          <w:sz w:val="21"/>
+        </w:rPr>
+        <w:t xml:space="preserve">• </w:t>
+      </w:r>
+      <w:r>
+        <w:rPr>
+          <w:rFonts w:ascii="맑은 고딕" w:hAnsi="맑은 고딕" w:eastAsia="맑은 고딕"/>
+          <w:b/>
+          <w:sz w:val="21"/>
+        </w:rPr>
+        <w:t>두 개의 재등록 명단 대조</w:t>
+      </w:r>
+      <w:r>
+        <w:rPr>
+          <w:rFonts w:ascii="맑은 고딕" w:hAnsi="맑은 고딕" w:eastAsia="맑은 고딕"/>
+          <w:sz w:val="21"/>
+        </w:rPr>
+        <w:t xml:space="preserve"> — 등록 이미지 자체의 구별력으로 뽑은 명단과, 실제 운영 방식이 지금 못 잡는 Recipe로 뽑은 명단은 서로 다른 신호입니다. 두 명단의 교집합이 재등록 1순위가 됩니다 (오피스 대조는 보류 중이며, 실시간 루프 안정화 이후 재개 예정입니다).</w:t>
       </w:r>
     </w:p>
     <w:p>
       <w:pPr>
+        <w:spacing w:after="120" w:before="80"/>
+        <w:ind w:left="280"/>
+      </w:pPr>
+      <w:r>
+        <w:rPr>
+          <w:rFonts w:ascii="맑은 고딕" w:hAnsi="맑은 고딕" w:eastAsia="맑은 고딕"/>
+          <w:b/>
+          <w:color w:val="E86A1F"/>
+          <w:sz w:val="21"/>
+        </w:rPr>
+        <w:t xml:space="preserve">▎ </w:t>
+      </w:r>
+      <w:r>
+        <w:rPr>
+          <w:rFonts w:ascii="맑은 고딕" w:hAnsi="맑은 고딕" w:eastAsia="맑은 고딕"/>
+          <w:b/>
+          <w:color w:val="556070"/>
+          <w:sz w:val="20"/>
+        </w:rPr>
+        <w:t>이 축의 현재 판단</w:t>
+      </w:r>
+      <w:r>
+        <w:rPr>
+          <w:rFonts w:ascii="맑은 고딕" w:hAnsi="맑은 고딕" w:eastAsia="맑은 고딕"/>
+          <w:color w:val="556070"/>
+          <w:sz w:val="20"/>
+        </w:rPr>
+        <w:t xml:space="preserve">: 순위 교정(재순위)은 사실상 소진됐고 남은 개선의 대부분은 재등록 몫입니다. 그래서 팀의 무게중심을 </w:t>
+      </w:r>
+      <w:r>
+        <w:rPr>
+          <w:rFonts w:ascii="맑은 고딕" w:hAnsi="맑은 고딕" w:eastAsia="맑은 고딕"/>
+          <w:b/>
+          <w:color w:val="556070"/>
+          <w:sz w:val="20"/>
+        </w:rPr>
+        <w:t>실시간 루프의 실운전 안정화(04 문서)</w:t>
+      </w:r>
+      <w:r>
+        <w:rPr>
+          <w:rFonts w:ascii="맑은 고딕" w:hAnsi="맑은 고딕" w:eastAsia="맑은 고딕"/>
+          <w:color w:val="556070"/>
+          <w:sz w:val="20"/>
+        </w:rPr>
+        <w:t xml:space="preserve"> 로 옮겼습니다. 이 벤치 환경은 그대로 유지합니다. 재등록 명단 확정과 오피스 실데이터 확정에 계속 씁니다.</w:t>
+      </w:r>
+    </w:p>
+    <w:p>
+      <w:r>
+        <w:br w:type="page"/>
+      </w:r>
+    </w:p>
+    <w:p>
+      <w:pPr>
         <w:spacing w:before="280" w:after="120"/>
       </w:pPr>
       <w:r>
@@ -5804,11 +6851,34 @@
           <w:color w:val="556070"/>
           <w:sz w:val="20"/>
         </w:rPr>
-        <w:t>목적: 앞서 검증한 GUI 자동화(workflow 1)와 CV 정렬 보정(workflow 2)을 하나로 묶어, Align Fail을 사람 없이 감지하고 보정하는 실시간 대응 Agent를 구현합니다. 지금 가장 힘을 쏟고 있는 단계입니다.</w:t>
+        <w:t>목적: 앞서 검증한 GUI 자동화(workflow 1)와 CV 정렬 보정(workflow 2)을 하나로 묶어 Align Fail을 사람 없이 감지하고 보정하는 실시간 대응 Agent를 구현합니다. 지금 가장 힘을 쏟고 있는 단계입니다.</w:t>
       </w:r>
     </w:p>
     <w:p>
       <w:pPr>
+        <w:spacing w:after="120" w:before="80"/>
+        <w:ind w:left="280"/>
+      </w:pPr>
+      <w:r>
+        <w:rPr>
+          <w:rFonts w:ascii="맑은 고딕" w:hAnsi="맑은 고딕" w:eastAsia="맑은 고딕"/>
+          <w:b/>
+          <w:color w:val="E86A1F"/>
+          <w:sz w:val="21"/>
+        </w:rPr>
+        <w:t xml:space="preserve">▎ </w:t>
+      </w:r>
+      <w:r>
+        <w:rPr>
+          <w:rFonts w:ascii="맑은 고딕" w:hAnsi="맑은 고딕" w:eastAsia="맑은 고딕"/>
+          <w:color w:val="556070"/>
+          <w:sz w:val="20"/>
+        </w:rPr>
+        <w:t>최종 갱신: 2026-08-16 (직전 갱신 2026-07-07 이후 진행분을 반영했습니다.)</w:t>
+      </w:r>
+    </w:p>
+    <w:p>
+      <w:pPr>
         <w:spacing w:before="200" w:after="120"/>
       </w:pPr>
       <w:r>
@@ -5830,7 +6900,7 @@
           <w:rFonts w:ascii="맑은 고딕" w:hAnsi="맑은 고딕" w:eastAsia="맑은 고딕"/>
           <w:sz w:val="21"/>
         </w:rPr>
-        <w:t>사람이 하던 대응 전체를 아래와 같이 무인 자동 대응으로 바꾸는 것이 이 단계의 목표입니다.</w:t>
+        <w:t>이 단계에서는 사람이 하던 대응 전체를 아래와 같이 무인 자동 대응으로 바꿉니다.</w:t>
       </w:r>
     </w:p>
     <w:tbl>
@@ -6204,7 +7274,7 @@
           <w:b/>
           <w:sz w:val="21"/>
         </w:rPr>
-        <w:t>RCS 실행 → 해당 장비 모니터 접속 → 자동 정렬 보정 → (실패 시) 담당자 알림 → 상시 녹화 → 자동 종료 → 다음 알람 대기</w:t>
+        <w:t>알람 감지 → 담당자 사전 고지(Cube) → RCS 실행·해당 장비 모니터 접속 → 상시 녹화 시작 → 자동 정렬 보정 → 결과 알림(Cube) → 자동 종료 → 다음 알람 대기</w:t>
       </w:r>
     </w:p>
     <w:p>
@@ -6216,11 +7286,23 @@
           <w:rFonts w:ascii="맑은 고딕" w:hAnsi="맑은 고딕" w:eastAsia="맑은 고딕"/>
           <w:sz w:val="21"/>
         </w:rPr>
-        <w:t>알람이 잡히면 이 대응 루프와 동시에, 과거 정렬 성공 이미지를 추적·다운로드하는 작업(consensus gather)이 백그라운드에서 함께 돕니다. 보정에 쓸 최신 성공 이미지를 미리 확보해 두려는 것이며, 대응 루프의 속도를 늦추지 않습니다.</w:t>
+        <w:t>알람이 잡히면 대응 루프와 동시에 과거 정렬 성공 이미지를 추적·다운로드하는 작업(consensus gather)도 백그라운드에서 함께 돕니다. 보정에 쓸 최신 성공 이미지를 미리 확보해 두는 작업입니다. 대응 루프의 속도는 늦추지 않습니다.</w:t>
       </w:r>
     </w:p>
     <w:p>
       <w:pPr>
+        <w:spacing w:after="120"/>
+      </w:pPr>
+      <w:r>
+        <w:rPr>
+          <w:rFonts w:ascii="맑은 고딕" w:hAnsi="맑은 고딕" w:eastAsia="맑은 고딕"/>
+          <w:sz w:val="21"/>
+        </w:rPr>
+        <w:t>알림은 감지 직후에 한 번, 대응이 끝난 뒤에 다시 한 번 보냅니다. "지금 자동화가 이 장비를 잡고 있다"는 사실을 엔지니어가 먼저 알아야 서로 조작이 부딪히지 않습니다. 알람 1건에 알림이 중복 발송되던 문제도 함께 정리했습니다.</w:t>
+      </w:r>
+    </w:p>
+    <w:p>
+      <w:pPr>
         <w:spacing w:before="200" w:after="120"/>
       </w:pPr>
       <w:r>
@@ -6260,7 +7342,7 @@
           <w:rFonts w:ascii="맑은 고딕" w:hAnsi="맑은 고딕" w:eastAsia="맑은 고딕"/>
           <w:sz w:val="21"/>
         </w:rPr>
-        <w:t>: 알람 한 건마다 장비 접속부터 정렬 보정까지 순서대로 처리합니다. 도중에 오류가 나더라도 녹화 종료, 장비 창 닫기, 팝업 정리 같은 뒷정리는 반드시 수행해, 장비를 늘 깨끗한 상태로 되돌립니다.</w:t>
+        <w:t>: 알람 한 건마다 장비 접속부터 정렬 보정까지 순서대로 처리합니다. 도중에 오류가 나더라도 녹화 종료, 장비 창 닫기, 팝업 정리 같은 뒷정리는 반드시 수행합니다. 장비는 늘 깨끗한 상태로 되돌립니다.</w:t>
       </w:r>
     </w:p>
     <w:p>
@@ -6290,7 +7372,7 @@
           <w:rFonts w:ascii="맑은 고딕" w:hAnsi="맑은 고딕" w:eastAsia="맑은 고딕"/>
           <w:sz w:val="21"/>
         </w:rPr>
-        <w:t>: 최근 정렬 성공 이미지를 종합한 기준으로 정렬 위치를 다시 찾아 보정합니다. 성공 이미지가 부족하거나 품질이 떨어지면 처음 등록된 이미지로 자동 전환해, 어떤 경우에도 안전하게 동작합니다.</w:t>
+        <w:t>: 최근 정렬 성공 이미지를 종합한 기준으로 정렬 위치를 다시 찾아 보정합니다. 성공 이미지가 부족하거나 품질이 떨어지면 처음 등록된 이미지로 자동 전환합니다. 어떤 경우에도 안전하게 동작합니다.</w:t>
       </w:r>
     </w:p>
     <w:p>
@@ -6313,14 +7395,14 @@
           <w:b/>
           <w:sz w:val="21"/>
         </w:rPr>
-        <w:t>엔지니어 작업 자동 감지</w:t>
-      </w:r>
-      <w:r>
-        <w:rPr>
-          <w:rFonts w:ascii="맑은 고딕" w:hAnsi="맑은 고딕" w:eastAsia="맑은 고딕"/>
-          <w:sz w:val="21"/>
-        </w:rPr>
-        <w:t>: 엔지니어가 직접 재정렬에 나서면 이를 알아채고 자동 감시를 끝낸 뒤 장비 창을 닫습니다. 사람의 작업을 방해하지 않기 위해서입니다.</w:t>
+        <w:t>촬영 모드 자동 판독</w:t>
+      </w:r>
+      <w:r>
+        <w:rPr>
+          <w:rFonts w:ascii="맑은 고딕" w:hAnsi="맑은 고딕" w:eastAsia="맑은 고딕"/>
+          <w:sz w:val="21"/>
+        </w:rPr>
+        <w:t>: 지금 화면이 저배율(OM)인지 고배율(SEM)인지를 화면에서 직접 읽어 그 모드에 맞는 기준 이미지로 매칭합니다. 모드를 읽지 못하면 추측해서 누르지 않고 보정을 보류합니다.</w:t>
       </w:r>
     </w:p>
     <w:p>
@@ -6343,14 +7425,14 @@
           <w:b/>
           <w:sz w:val="21"/>
         </w:rPr>
-        <w:t>보정 가능 여부 판정과 재등록 권고</w:t>
-      </w:r>
-      <w:r>
-        <w:rPr>
-          <w:rFonts w:ascii="맑은 고딕" w:hAnsi="맑은 고딕" w:eastAsia="맑은 고딕"/>
-          <w:sz w:val="21"/>
-        </w:rPr>
-        <w:t>: 지금 화면에서 정렬 위치를 확실히 찾을 수 있는지 판정합니다. 비슷한 후보가 많아 근본적으로 헷갈리는 Recipe는 "더 뚜렷한 위치로 재등록 권고"를 기록으로 남깁니다.</w:t>
+        <w:t>엔지니어 작업 자동 감지</w:t>
+      </w:r>
+      <w:r>
+        <w:rPr>
+          <w:rFonts w:ascii="맑은 고딕" w:hAnsi="맑은 고딕" w:eastAsia="맑은 고딕"/>
+          <w:sz w:val="21"/>
+        </w:rPr>
+        <w:t>: 엔지니어가 직접 재정렬에 나서면 이를 알아채고 자동 감시를 끝낸 뒤 장비 창을 닫습니다. 그래야 자동화가 사람의 작업을 방해하지 않습니다(§6).</w:t>
       </w:r>
     </w:p>
     <w:p>
@@ -6373,14 +7455,14 @@
           <w:b/>
           <w:sz w:val="21"/>
         </w:rPr>
-        <w:t>여러 배율로 탐색</w:t>
-      </w:r>
-      <w:r>
-        <w:rPr>
-          <w:rFonts w:ascii="맑은 고딕" w:hAnsi="맑은 고딕" w:eastAsia="맑은 고딕"/>
-          <w:sz w:val="21"/>
-        </w:rPr>
-        <w:t>: 정렬 위치가 어느 배율에서 잘 보이는지 애매할 때는 화면 배율을 바꿔 가며 다시 찾습니다. 마우스 휠로 배율이 안 바뀌는 일부 장비는 배율 조절 버튼을 씁니다.</w:t>
+        <w:t>보정 가능 여부 판정과 재등록 권고</w:t>
+      </w:r>
+      <w:r>
+        <w:rPr>
+          <w:rFonts w:ascii="맑은 고딕" w:hAnsi="맑은 고딕" w:eastAsia="맑은 고딕"/>
+          <w:sz w:val="21"/>
+        </w:rPr>
+        <w:t>: 지금 화면에서 정렬 위치를 확실히 찾을 수 있는지 판정합니다. 비슷한 후보가 많아 근본적으로 헷갈리는 Recipe는 "더 뚜렷한 위치로 재등록 권고"를 기록으로 남깁니다.</w:t>
       </w:r>
     </w:p>
     <w:p>
@@ -6403,18 +7485,78 @@
           <w:b/>
           <w:sz w:val="21"/>
         </w:rPr>
-        <w:t>점검 전용 모드</w:t>
-      </w:r>
-      <w:r>
-        <w:rPr>
-          <w:rFonts w:ascii="맑은 고딕" w:hAnsi="맑은 고딕" w:eastAsia="맑은 고딕"/>
-          <w:sz w:val="21"/>
-        </w:rPr>
-        <w:t>: 실제 보정 없이 접속 → 화면 1장 캡처 → 판정 → 종료만 수행하는 진단·점검용 모드도 갖췄습니다.</w:t>
+        <w:t>여러 배율로 탐색</w:t>
+      </w:r>
+      <w:r>
+        <w:rPr>
+          <w:rFonts w:ascii="맑은 고딕" w:hAnsi="맑은 고딕" w:eastAsia="맑은 고딕"/>
+          <w:sz w:val="21"/>
+        </w:rPr>
+        <w:t>: 정렬 위치가 어느 배율에서 잘 보이는지 애매할 때는 화면 배율을 바꿔 가며 다시 찾습니다. 마우스 휠로 배율이 안 바뀌는 일부 장비는 배율 조절 버튼을 씁니다.</w:t>
       </w:r>
     </w:p>
     <w:p>
       <w:pPr>
+        <w:spacing w:after="60"/>
+        <w:ind w:left="360"/>
+      </w:pPr>
+      <w:r>
+        <w:rPr>
+          <w:rFonts w:ascii="맑은 고딕" w:hAnsi="맑은 고딕" w:eastAsia="맑은 고딕"/>
+          <w:b/>
+          <w:color w:val="E86A1F"/>
+          <w:sz w:val="21"/>
+        </w:rPr>
+        <w:t xml:space="preserve">• </w:t>
+      </w:r>
+      <w:r>
+        <w:rPr>
+          <w:rFonts w:ascii="맑은 고딕" w:hAnsi="맑은 고딕" w:eastAsia="맑은 고딕"/>
+          <w:b/>
+          <w:sz w:val="21"/>
+        </w:rPr>
+        <w:t>점검 전용 모드</w:t>
+      </w:r>
+      <w:r>
+        <w:rPr>
+          <w:rFonts w:ascii="맑은 고딕" w:hAnsi="맑은 고딕" w:eastAsia="맑은 고딕"/>
+          <w:sz w:val="21"/>
+        </w:rPr>
+        <w:t>: 실제 보정 없이 접속 → 화면 1장 캡처 → 판정 → 종료만 수행하는 진단·점검용 모드도 갖췄습니다.</w:t>
+      </w:r>
+    </w:p>
+    <w:p>
+      <w:pPr>
+        <w:spacing w:after="60"/>
+        <w:ind w:left="360"/>
+      </w:pPr>
+      <w:r>
+        <w:rPr>
+          <w:rFonts w:ascii="맑은 고딕" w:hAnsi="맑은 고딕" w:eastAsia="맑은 고딕"/>
+          <w:b/>
+          <w:color w:val="E86A1F"/>
+          <w:sz w:val="21"/>
+        </w:rPr>
+        <w:t xml:space="preserve">• </w:t>
+      </w:r>
+      <w:r>
+        <w:rPr>
+          <w:rFonts w:ascii="맑은 고딕" w:hAnsi="맑은 고딕" w:eastAsia="맑은 고딕"/>
+          <w:b/>
+          <w:sz w:val="21"/>
+        </w:rPr>
+        <w:t>대응 1건 = 기록 1줄</w:t>
+      </w:r>
+      <w:r>
+        <w:rPr>
+          <w:rFonts w:ascii="맑은 고딕" w:hAnsi="맑은 고딕" w:eastAsia="맑은 고딕"/>
+          <w:sz w:val="21"/>
+        </w:rPr>
+        <w:t>: 알람마다 어느 단계에서 끝났는지, 결과가 무엇이었는지, 녹화가 어디에 남았는지를 한 줄로 적재합니다. 실패가 어느 단계에 몰려 있는지 집계해 다음 개선 지점을 정하는 근거로 씁니다.</w:t>
+      </w:r>
+    </w:p>
+    <w:p>
+      <w:pPr>
         <w:spacing w:before="200" w:after="120"/>
       </w:pPr>
       <w:r>
@@ -6424,7 +7566,7 @@
           <w:color w:val="142A55"/>
           <w:sz w:val="27"/>
         </w:rPr>
-        <w:t>5. 안전 장치 — 오측 감지 시 사람 개입</w:t>
+        <w:t>5. 실장비 보정 개통 — 반자동(마지막 확정은 사람) · 2026-08</w:t>
       </w:r>
     </w:p>
     <w:p>
@@ -6436,11 +7578,299 @@
           <w:rFonts w:ascii="맑은 고딕" w:hAnsi="맑은 고딕" w:eastAsia="맑은 고딕"/>
           <w:sz w:val="21"/>
         </w:rPr>
-        <w:t>VLM이 실제 보정을 마친 뒤에도 이후 측정 과정을 계속 지켜봅니다. 여기서 잘못된 보정(오측)이 감지되면 즉시 측정을 멈추고, 담당 Engineer에게 Cube로 알람을 보내 사람이 확인·개입하도록 했습니다. 자동 보정이 틀렸을 때 잘못된 상태로 측정이 이어지지 않도록, 사람이 반드시 한 번 확인하는 안전장치를 둔 것입니다.</w:t>
+        <w:t>이번 기간에 실제 장비 화면에서 정렬 위치를 다시 잡는 단계를 열었습니다. 가장 큰 진전입니다.</w:t>
       </w:r>
     </w:p>
     <w:p>
       <w:pPr>
+        <w:spacing w:after="120"/>
+      </w:pPr>
+      <w:r>
+        <w:rPr>
+          <w:rFonts w:ascii="맑은 고딕" w:hAnsi="맑은 고딕" w:eastAsia="맑은 고딕"/>
+          <w:b/>
+          <w:sz w:val="21"/>
+        </w:rPr>
+        <w:t>개통 전에 발견한 사실</w:t>
+      </w:r>
+      <w:r>
+        <w:rPr>
+          <w:rFonts w:ascii="맑은 고딕" w:hAnsi="맑은 고딕" w:eastAsia="맑은 고딕"/>
+          <w:sz w:val="21"/>
+        </w:rPr>
+        <w:t xml:space="preserve">: 접속 → 캡처 → 판정까지는 정상이었습니다. 문제는 보정 단계였습니다. 이 단계는 화면에서 SEM 모니터 영역을 잡는 데 사전 캘리브레이션 자료를 요구했습니다. 그래서 매번 그 자리에서 중단됐고, </w:t>
+      </w:r>
+      <w:r>
+        <w:rPr>
+          <w:rFonts w:ascii="맑은 고딕" w:hAnsi="맑은 고딕" w:eastAsia="맑은 고딕"/>
+          <w:b/>
+          <w:sz w:val="21"/>
+        </w:rPr>
+        <w:t>자동 보정이 한 번도 실제로 실행된 적이 없었습니다.</w:t>
+      </w:r>
+      <w:r>
+        <w:rPr>
+          <w:rFonts w:ascii="맑은 고딕" w:hAnsi="맑은 고딕" w:eastAsia="맑은 고딕"/>
+          <w:sz w:val="21"/>
+        </w:rPr>
+        <w:t xml:space="preserve"> 점검 모드에서 이미 오피스 검증까지 끝난 "라이브 화면 영역 검출"을 보정 경로에서도 쓰도록 바꿔 이 병목을 제거했습니다. 같은 검출에서 촬영 모드(OM/SEM)도 함께 읽어 옵니다. 이전에는 모든 화면을 고배율(SEM)로 가정하는 조용한 오류가 있었습니다. 저배율 실패에서 엉뚱한 기준 이미지로 매칭하던 문제인데, 이것도 함께 없앴습니다.</w:t>
+      </w:r>
+    </w:p>
+    <w:p>
+      <w:pPr>
+        <w:spacing w:after="120"/>
+      </w:pPr>
+      <w:r>
+        <w:rPr>
+          <w:rFonts w:ascii="맑은 고딕" w:hAnsi="맑은 고딕" w:eastAsia="맑은 고딕"/>
+          <w:b/>
+          <w:sz w:val="21"/>
+        </w:rPr>
+        <w:t>개통 범위는 의도적으로 반자동으로 잡았습니다.</w:t>
+      </w:r>
+    </w:p>
+    <w:tbl>
+      <w:tblPr>
+        <w:tblStyle w:val="LightGrid-Accent1"/>
+        <w:tblW w:type="auto" w:w="0"/>
+        <w:jc w:val="center"/>
+        <w:tblLook w:firstColumn="1" w:firstRow="1" w:lastColumn="0" w:lastRow="0" w:noHBand="0" w:noVBand="1" w:val="04A0"/>
+      </w:tblPr>
+      <w:tblGrid>
+        <w:gridCol w:w="2880"/>
+        <w:gridCol w:w="2880"/>
+        <w:gridCol w:w="2880"/>
+      </w:tblGrid>
+      <w:tr>
+        <w:tc>
+          <w:tcPr>
+            <w:tcW w:type="dxa" w:w="2880"/>
+            <w:shd w:val="clear" w:fill="142A55"/>
+          </w:tcPr>
+          <w:p>
+            <w:r/>
+            <w:r>
+              <w:rPr>
+                <w:rFonts w:ascii="맑은 고딕" w:hAnsi="맑은 고딕" w:eastAsia="맑은 고딕"/>
+                <w:b/>
+                <w:color w:val="FFFFFF"/>
+                <w:sz w:val="19"/>
+              </w:rPr>
+              <w:t>단계</w:t>
+            </w:r>
+          </w:p>
+        </w:tc>
+        <w:tc>
+          <w:tcPr>
+            <w:tcW w:type="dxa" w:w="2880"/>
+            <w:shd w:val="clear" w:fill="142A55"/>
+          </w:tcPr>
+          <w:p>
+            <w:r/>
+            <w:r>
+              <w:rPr>
+                <w:rFonts w:ascii="맑은 고딕" w:hAnsi="맑은 고딕" w:eastAsia="맑은 고딕"/>
+                <w:b/>
+                <w:color w:val="FFFFFF"/>
+                <w:sz w:val="19"/>
+              </w:rPr>
+              <w:t>누가</w:t>
+            </w:r>
+          </w:p>
+        </w:tc>
+        <w:tc>
+          <w:tcPr>
+            <w:tcW w:type="dxa" w:w="2880"/>
+            <w:shd w:val="clear" w:fill="142A55"/>
+          </w:tcPr>
+          <w:p>
+            <w:r/>
+            <w:r>
+              <w:rPr>
+                <w:rFonts w:ascii="맑은 고딕" w:hAnsi="맑은 고딕" w:eastAsia="맑은 고딕"/>
+                <w:b/>
+                <w:color w:val="FFFFFF"/>
+                <w:sz w:val="19"/>
+              </w:rPr>
+              <w:t>이유</w:t>
+            </w:r>
+          </w:p>
+        </w:tc>
+      </w:tr>
+      <w:tr>
+        <w:tc>
+          <w:tcPr>
+            <w:tcW w:type="dxa" w:w="2880"/>
+          </w:tcPr>
+          <w:p>
+            <w:r/>
+            <w:r>
+              <w:rPr>
+                <w:rFonts w:ascii="맑은 고딕" w:hAnsi="맑은 고딕" w:eastAsia="맑은 고딕"/>
+                <w:sz w:val="19"/>
+              </w:rPr>
+              <w:t>장비 접속·화면 확보·판정</w:t>
+            </w:r>
+          </w:p>
+        </w:tc>
+        <w:tc>
+          <w:tcPr>
+            <w:tcW w:type="dxa" w:w="2880"/>
+          </w:tcPr>
+          <w:p>
+            <w:r/>
+            <w:r>
+              <w:rPr>
+                <w:rFonts w:ascii="맑은 고딕" w:hAnsi="맑은 고딕" w:eastAsia="맑은 고딕"/>
+                <w:sz w:val="19"/>
+              </w:rPr>
+              <w:t>자동</w:t>
+            </w:r>
+          </w:p>
+        </w:tc>
+        <w:tc>
+          <w:tcPr>
+            <w:tcW w:type="dxa" w:w="2880"/>
+          </w:tcPr>
+          <w:p>
+            <w:r/>
+            <w:r>
+              <w:rPr>
+                <w:rFonts w:ascii="맑은 고딕" w:hAnsi="맑은 고딕" w:eastAsia="맑은 고딕"/>
+                <w:sz w:val="19"/>
+              </w:rPr>
+              <w:t>되돌릴 수 있는 조작입니다</w:t>
+            </w:r>
+          </w:p>
+        </w:tc>
+      </w:tr>
+      <w:tr>
+        <w:tc>
+          <w:tcPr>
+            <w:tcW w:type="dxa" w:w="2880"/>
+          </w:tcPr>
+          <w:p>
+            <w:r/>
+            <w:r>
+              <w:rPr>
+                <w:rFonts w:ascii="맑은 고딕" w:hAnsi="맑은 고딕" w:eastAsia="맑은 고딕"/>
+                <w:sz w:val="19"/>
+              </w:rPr>
+              <w:t>정렬 위치 재조정(reposition)</w:t>
+            </w:r>
+          </w:p>
+        </w:tc>
+        <w:tc>
+          <w:tcPr>
+            <w:tcW w:type="dxa" w:w="2880"/>
+          </w:tcPr>
+          <w:p>
+            <w:r/>
+            <w:r>
+              <w:rPr>
+                <w:rFonts w:ascii="맑은 고딕" w:hAnsi="맑은 고딕" w:eastAsia="맑은 고딕"/>
+                <w:sz w:val="19"/>
+              </w:rPr>
+              <w:t>자동</w:t>
+            </w:r>
+          </w:p>
+        </w:tc>
+        <w:tc>
+          <w:tcPr>
+            <w:tcW w:type="dxa" w:w="2880"/>
+          </w:tcPr>
+          <w:p>
+            <w:r/>
+            <w:r>
+              <w:rPr>
+                <w:rFonts w:ascii="맑은 고딕" w:hAnsi="맑은 고딕" w:eastAsia="맑은 고딕"/>
+                <w:sz w:val="19"/>
+              </w:rPr>
+              <w:t>이번에 개통한 범위입니다</w:t>
+            </w:r>
+          </w:p>
+        </w:tc>
+      </w:tr>
+      <w:tr>
+        <w:tc>
+          <w:tcPr>
+            <w:tcW w:type="dxa" w:w="2880"/>
+          </w:tcPr>
+          <w:p>
+            <w:r/>
+            <w:r>
+              <w:rPr>
+                <w:rFonts w:ascii="맑은 고딕" w:hAnsi="맑은 고딕" w:eastAsia="맑은 고딕"/>
+                <w:sz w:val="19"/>
+              </w:rPr>
+              <w:t>마지막 확정(OK)</w:t>
+            </w:r>
+          </w:p>
+        </w:tc>
+        <w:tc>
+          <w:tcPr>
+            <w:tcW w:type="dxa" w:w="2880"/>
+          </w:tcPr>
+          <w:p>
+            <w:r/>
+            <w:r>
+              <w:rPr>
+                <w:rFonts w:ascii="맑은 고딕" w:hAnsi="맑은 고딕" w:eastAsia="맑은 고딕"/>
+                <w:b/>
+                <w:sz w:val="19"/>
+              </w:rPr>
+              <w:t>엔지니어</w:t>
+            </w:r>
+          </w:p>
+        </w:tc>
+        <w:tc>
+          <w:tcPr>
+            <w:tcW w:type="dxa" w:w="2880"/>
+          </w:tcPr>
+          <w:p>
+            <w:r/>
+            <w:r>
+              <w:rPr>
+                <w:rFonts w:ascii="맑은 고딕" w:hAnsi="맑은 고딕" w:eastAsia="맑은 고딕"/>
+                <w:sz w:val="19"/>
+              </w:rPr>
+              <w:t>잘못된 확정은 측정에 그대로 영향을 주므로 사람이 한 번 봅니다</w:t>
+            </w:r>
+          </w:p>
+        </w:tc>
+      </w:tr>
+    </w:tbl>
+    <w:p>
+      <w:pPr>
+        <w:spacing w:after="80"/>
+      </w:pPr>
+    </w:p>
+    <w:p>
+      <w:pPr>
+        <w:spacing w:after="120"/>
+      </w:pPr>
+      <w:r>
+        <w:rPr>
+          <w:rFonts w:ascii="맑은 고딕" w:hAnsi="맑은 고딕" w:eastAsia="맑은 고딕"/>
+          <w:sz w:val="21"/>
+        </w:rPr>
+        <w:t>보정을 마치면 "확정만 눌러 주십시오"라는 상태로 엔지니어에게 넘기고 알림을 보냅니다. 이 상태는 완료(성공)와 구분해 따로 두었습니다. 완료로 처리하면 알림이 생략되고 "OK를 눌러 달라"는 요청이 조용히 사라집니다. 엔지니어가 확정을 누르는 장면까지 녹화도 계속됩니다.</w:t>
+      </w:r>
+    </w:p>
+    <w:p>
+      <w:pPr>
+        <w:spacing w:after="120"/>
+      </w:pPr>
+      <w:r>
+        <w:rPr>
+          <w:rFonts w:ascii="맑은 고딕" w:hAnsi="맑은 고딕" w:eastAsia="맑은 고딕"/>
+          <w:sz w:val="21"/>
+        </w:rPr>
+        <w:t>운영 진입점은 실운전 기본값으로 뜨고 시작할 때 실운전 배너를 남깁니다. 로그만 봐도 그 세션이 실제 클릭을 한 세션인지 판별됩니다. 점검용 진입점은 안전하게 한 번만 보고 싶다는 요구를 받는 쪽입니다. 그래서 같은 기본값을 일부러 물려받지 않도록 분리했습니다.</w:t>
+      </w:r>
+    </w:p>
+    <w:p>
+      <w:pPr>
         <w:spacing w:before="200" w:after="120"/>
       </w:pPr>
       <w:r>
@@ -6450,7 +7880,7 @@
           <w:color w:val="142A55"/>
           <w:sz w:val="27"/>
         </w:rPr>
-        <w:t>6. 암묵지 지식 자산화 구조</w:t>
+        <w:t>6. 안전 장치 — 사람이 개입하는 지점</w:t>
       </w:r>
     </w:p>
     <w:p>
@@ -6473,14 +7903,14 @@
           <w:b/>
           <w:sz w:val="21"/>
         </w:rPr>
-        <w:t>정렬 성공/실패 이미지 저장</w:t>
-      </w:r>
-      <w:r>
-        <w:rPr>
-          <w:rFonts w:ascii="맑은 고딕" w:hAnsi="맑은 고딕" w:eastAsia="맑은 고딕"/>
-          <w:sz w:val="21"/>
-        </w:rPr>
-        <w:t>: align에 성공한 이미지와 실패한 이미지를 저장하고, 최신 이미지가 계속 자동으로 갱신되도록 했습니다. 다음에 같은 Recipe에서 Align Fail이 나면 VLM이 참고할 최신 자료가 됩니다.</w:t>
+        <w:t>오측 감지 시 중단</w:t>
+      </w:r>
+      <w:r>
+        <w:rPr>
+          <w:rFonts w:ascii="맑은 고딕" w:hAnsi="맑은 고딕" w:eastAsia="맑은 고딕"/>
+          <w:sz w:val="21"/>
+        </w:rPr>
+        <w:t>: 보정을 마친 뒤에도 이후 측정 과정을 계속 지켜봅니다. 잘못된 보정(오측)이 감지되면 즉시 측정을 멈추고 담당 Engineer에게 Cube로 알람을 보냅니다. 사람이 확인하고 개입합니다.</w:t>
       </w:r>
     </w:p>
     <w:p>
@@ -6503,18 +7933,163 @@
           <w:b/>
           <w:sz w:val="21"/>
         </w:rPr>
-        <w:t>녹화를 VLM 학습·분석에 활용</w:t>
-      </w:r>
-      <w:r>
-        <w:rPr>
-          <w:rFonts w:ascii="맑은 고딕" w:hAnsi="맑은 고딕" w:eastAsia="맑은 고딕"/>
-          <w:sz w:val="21"/>
-        </w:rPr>
-        <w:t>: 엔지니어가 장비를 조작하는 과정을 녹화해 두고, 이를 VLM workflow(학습·분석)에 쓸 수 있는 형태로 만듭니다. 사람이 손으로 쌓아 온 암묵지, 즉 작업 노하우를 데이터로 자산화하는 구조입니다.</w:t>
+        <w:t>엔지니어 작업 완료 감지(우선순위 방식)</w:t>
+      </w:r>
+      <w:r>
+        <w:rPr>
+          <w:rFonts w:ascii="맑은 고딕" w:hAnsi="맑은 고딕" w:eastAsia="맑은 고딕"/>
+          <w:sz w:val="21"/>
+        </w:rPr>
+        <w:t>: 엔지니어가 직접 작업에 들어갔을 때 감시를 언제 끝낼지, 신호의 신뢰도 순으로 판단합니다. 이번에 재설계했습니다.</w:t>
       </w:r>
     </w:p>
     <w:p>
       <w:pPr>
+        <w:spacing w:after="60"/>
+        <w:ind w:left="680"/>
+      </w:pPr>
+      <w:r>
+        <w:rPr>
+          <w:rFonts w:ascii="맑은 고딕" w:hAnsi="맑은 고딕" w:eastAsia="맑은 고딕"/>
+          <w:b/>
+          <w:color w:val="E86A1F"/>
+          <w:sz w:val="21"/>
+        </w:rPr>
+        <w:t xml:space="preserve">◦ </w:t>
+      </w:r>
+      <w:r>
+        <w:rPr>
+          <w:rFonts w:ascii="맑은 고딕" w:hAnsi="맑은 고딕" w:eastAsia="맑은 고딕"/>
+          <w:sz w:val="21"/>
+        </w:rPr>
+        <w:t>엔지니어가 장비 창을 직접 닫음 → 즉시 완료(가장 명시적인 신호).</w:t>
+      </w:r>
+    </w:p>
+    <w:p>
+      <w:pPr>
+        <w:spacing w:after="60"/>
+        <w:ind w:left="680"/>
+      </w:pPr>
+      <w:r>
+        <w:rPr>
+          <w:rFonts w:ascii="맑은 고딕" w:hAnsi="맑은 고딕" w:eastAsia="맑은 고딕"/>
+          <w:b/>
+          <w:color w:val="E86A1F"/>
+          <w:sz w:val="21"/>
+        </w:rPr>
+        <w:t xml:space="preserve">◦ </w:t>
+      </w:r>
+      <w:r>
+        <w:rPr>
+          <w:rFonts w:ascii="맑은 고딕" w:hAnsi="맑은 고딕" w:eastAsia="맑은 고딕"/>
+          <w:sz w:val="21"/>
+        </w:rPr>
+        <w:t>측정 품질 표를 읽을 수 있으면 그 판정을 따름 → 실패 표시(빨강)가 하나라도 있으면 완료로 보지 않음.</w:t>
+      </w:r>
+    </w:p>
+    <w:p>
+      <w:pPr>
+        <w:spacing w:after="60"/>
+        <w:ind w:left="680"/>
+      </w:pPr>
+      <w:r>
+        <w:rPr>
+          <w:rFonts w:ascii="맑은 고딕" w:hAnsi="맑은 고딕" w:eastAsia="맑은 고딕"/>
+          <w:b/>
+          <w:color w:val="E86A1F"/>
+          <w:sz w:val="21"/>
+        </w:rPr>
+        <w:t xml:space="preserve">◦ </w:t>
+      </w:r>
+      <w:r>
+        <w:rPr>
+          <w:rFonts w:ascii="맑은 고딕" w:hAnsi="맑은 고딕" w:eastAsia="맑은 고딕"/>
+          <w:sz w:val="21"/>
+        </w:rPr>
+        <w:t>표를 반복해서 읽지 못하면 측정 진행 카운터로 대체 판단.</w:t>
+      </w:r>
+    </w:p>
+    <w:p>
+      <w:pPr>
+        <w:spacing w:after="60"/>
+        <w:ind w:left="680"/>
+      </w:pPr>
+      <w:r>
+        <w:rPr>
+          <w:rFonts w:ascii="맑은 고딕" w:hAnsi="맑은 고딕" w:eastAsia="맑은 고딕"/>
+          <w:b/>
+          <w:color w:val="E86A1F"/>
+          <w:sz w:val="21"/>
+        </w:rPr>
+        <w:t xml:space="preserve">◦ </w:t>
+      </w:r>
+      <w:r>
+        <w:rPr>
+          <w:rFonts w:ascii="맑은 고딕" w:hAnsi="맑은 고딕" w:eastAsia="맑은 고딕"/>
+          <w:sz w:val="21"/>
+        </w:rPr>
+        <w:t>어느 신호도 확정되지 않으면 정해진 시간까지 기다린 뒤 종료.</w:t>
+      </w:r>
+    </w:p>
+    <w:p>
+      <w:pPr>
+        <w:spacing w:after="120"/>
+      </w:pPr>
+      <w:r>
+        <w:rPr>
+          <w:rFonts w:ascii="맑은 고딕" w:hAnsi="맑은 고딕" w:eastAsia="맑은 고딕"/>
+          <w:sz w:val="21"/>
+        </w:rPr>
+        <w:t xml:space="preserve">오피스에서 확인해 보니 </w:t>
+      </w:r>
+      <w:r>
+        <w:rPr>
+          <w:rFonts w:ascii="맑은 고딕" w:hAnsi="맑은 고딕" w:eastAsia="맑은 고딕"/>
+          <w:b/>
+          <w:sz w:val="21"/>
+        </w:rPr>
+        <w:t>측정 카운터가 측정이 실패하는 중에도 계속 증가</w:t>
+      </w:r>
+      <w:r>
+        <w:rPr>
+          <w:rFonts w:ascii="맑은 고딕" w:hAnsi="맑은 고딕" w:eastAsia="맑은 고딕"/>
+          <w:sz w:val="21"/>
+        </w:rPr>
+        <w:t>했습니다. 품질 신호로는 쓸 수 없었습니다. 그래서 판단 순서를 이렇게 바꿨습니다. 카운터를 동급 조건으로 쓰면 실패 측정을 정상 완료로 오인할 수 있습니다. 이 판정에서 문자 인식(OCR) 의존도 걷어냈습니다. 색과 행 개수만 보는 방식으로 낮춰 매 폴링마다 부담 없이 판정합니다.</w:t>
+      </w:r>
+    </w:p>
+    <w:p>
+      <w:pPr>
+        <w:spacing w:after="60"/>
+        <w:ind w:left="360"/>
+      </w:pPr>
+      <w:r>
+        <w:rPr>
+          <w:rFonts w:ascii="맑은 고딕" w:hAnsi="맑은 고딕" w:eastAsia="맑은 고딕"/>
+          <w:b/>
+          <w:color w:val="E86A1F"/>
+          <w:sz w:val="21"/>
+        </w:rPr>
+        <w:t xml:space="preserve">• </w:t>
+      </w:r>
+      <w:r>
+        <w:rPr>
+          <w:rFonts w:ascii="맑은 고딕" w:hAnsi="맑은 고딕" w:eastAsia="맑은 고딕"/>
+          <w:b/>
+          <w:sz w:val="21"/>
+        </w:rPr>
+        <w:t>모드 불명 시 보류</w:t>
+      </w:r>
+      <w:r>
+        <w:rPr>
+          <w:rFonts w:ascii="맑은 고딕" w:hAnsi="맑은 고딕" w:eastAsia="맑은 고딕"/>
+          <w:sz w:val="21"/>
+        </w:rPr>
+        <w:t>: 촬영 모드를 읽지 못하면 보정을 시도하지 않고 엔지니어에게 넘깁니다. 틀린 모드는 틀린 기준 이미지입니다. 그 좌표로 화면을 옮기면 엉뚱한 곳으로 갑니다.</w:t>
+      </w:r>
+    </w:p>
+    <w:p>
+      <w:pPr>
         <w:spacing w:before="200" w:after="120"/>
       </w:pPr>
       <w:r>
@@ -6524,7 +8099,7 @@
           <w:color w:val="142A55"/>
           <w:sz w:val="27"/>
         </w:rPr>
-        <w:t>7. 진행 현황</w:t>
+        <w:t>7. 루프 안정화 — 실패 경로 하드닝</w:t>
       </w:r>
     </w:p>
     <w:p>
@@ -6536,7 +8111,389 @@
           <w:rFonts w:ascii="맑은 고딕" w:hAnsi="맑은 고딕" w:eastAsia="맑은 고딕"/>
           <w:sz w:val="21"/>
         </w:rPr>
-        <w:t>핵심 기능은 구현을 마쳤습니다. 지금은 각 단계의 안정성을 끌어올리며 현장 적용을 준비하고 있습니다.</w:t>
+        <w:t>실제 운전에서 문제가 되는 자리는 예외 경로였습니다. 이번 기간에 다음을 보강했습니다.</w:t>
+      </w:r>
+    </w:p>
+    <w:p>
+      <w:pPr>
+        <w:spacing w:after="60"/>
+        <w:ind w:left="360"/>
+      </w:pPr>
+      <w:r>
+        <w:rPr>
+          <w:rFonts w:ascii="맑은 고딕" w:hAnsi="맑은 고딕" w:eastAsia="맑은 고딕"/>
+          <w:b/>
+          <w:color w:val="E86A1F"/>
+          <w:sz w:val="21"/>
+        </w:rPr>
+        <w:t xml:space="preserve">• </w:t>
+      </w:r>
+      <w:r>
+        <w:rPr>
+          <w:rFonts w:ascii="맑은 고딕" w:hAnsi="맑은 고딕" w:eastAsia="맑은 고딕"/>
+          <w:b/>
+          <w:sz w:val="21"/>
+        </w:rPr>
+        <w:t>뒷정리 보장</w:t>
+      </w:r>
+      <w:r>
+        <w:rPr>
+          <w:rFonts w:ascii="맑은 고딕" w:hAnsi="맑은 고딕" w:eastAsia="맑은 고딕"/>
+          <w:sz w:val="21"/>
+        </w:rPr>
+        <w:t>: 어느 단계에서 예외가 나도 녹화 중지 → 장비 창 닫기 → 팝업 정리가 순서대로 수행됩니다. 앞 단계가 실패해도 뒷 단계는 막히지 않습니다.</w:t>
+      </w:r>
+    </w:p>
+    <w:p>
+      <w:pPr>
+        <w:spacing w:after="60"/>
+        <w:ind w:left="360"/>
+      </w:pPr>
+      <w:r>
+        <w:rPr>
+          <w:rFonts w:ascii="맑은 고딕" w:hAnsi="맑은 고딕" w:eastAsia="맑은 고딕"/>
+          <w:b/>
+          <w:color w:val="E86A1F"/>
+          <w:sz w:val="21"/>
+        </w:rPr>
+        <w:t xml:space="preserve">• </w:t>
+      </w:r>
+      <w:r>
+        <w:rPr>
+          <w:rFonts w:ascii="맑은 고딕" w:hAnsi="맑은 고딕" w:eastAsia="맑은 고딕"/>
+          <w:b/>
+          <w:sz w:val="21"/>
+        </w:rPr>
+        <w:t>잘못된 장비를 여는 오클릭 차단</w:t>
+      </w:r>
+      <w:r>
+        <w:rPr>
+          <w:rFonts w:ascii="맑은 고딕" w:hAnsi="맑은 고딕" w:eastAsia="맑은 고딕"/>
+          <w:sz w:val="21"/>
+        </w:rPr>
+        <w:t>: 장비 목록에서 행을 잘못 짚어도 이전에는 "다른 사람이 장비를 쓰는 중"과 구분되지 않았습니다. 클릭 지점의 행만 잘라 문자 인식으로 대상 장비 ID가 맞는지 확인하는 게이트를 넣었습니다. 확인이 어긋나면 잘못 열린 창을 닫고 재시도합니다.</w:t>
+      </w:r>
+    </w:p>
+    <w:p>
+      <w:pPr>
+        <w:spacing w:after="60"/>
+        <w:ind w:left="360"/>
+      </w:pPr>
+      <w:r>
+        <w:rPr>
+          <w:rFonts w:ascii="맑은 고딕" w:hAnsi="맑은 고딕" w:eastAsia="맑은 고딕"/>
+          <w:b/>
+          <w:color w:val="E86A1F"/>
+          <w:sz w:val="21"/>
+        </w:rPr>
+        <w:t xml:space="preserve">• </w:t>
+      </w:r>
+      <w:r>
+        <w:rPr>
+          <w:rFonts w:ascii="맑은 고딕" w:hAnsi="맑은 고딕" w:eastAsia="맑은 고딕"/>
+          <w:b/>
+          <w:sz w:val="21"/>
+        </w:rPr>
+        <w:t>실패 장비 쿨다운</w:t>
+      </w:r>
+      <w:r>
+        <w:rPr>
+          <w:rFonts w:ascii="맑은 고딕" w:hAnsi="맑은 고딕" w:eastAsia="맑은 고딕"/>
+          <w:sz w:val="21"/>
+        </w:rPr>
+        <w:t>: 같은 장비에서 연속 실패하면 일정 시간 건너뜁니다. 한 장비의 문제로 루프 전체가 묶이지 않습니다.</w:t>
+      </w:r>
+    </w:p>
+    <w:p>
+      <w:pPr>
+        <w:spacing w:after="60"/>
+        <w:ind w:left="360"/>
+      </w:pPr>
+      <w:r>
+        <w:rPr>
+          <w:rFonts w:ascii="맑은 고딕" w:hAnsi="맑은 고딕" w:eastAsia="맑은 고딕"/>
+          <w:b/>
+          <w:color w:val="E86A1F"/>
+          <w:sz w:val="21"/>
+        </w:rPr>
+        <w:t xml:space="preserve">• </w:t>
+      </w:r>
+      <w:r>
+        <w:rPr>
+          <w:rFonts w:ascii="맑은 고딕" w:hAnsi="맑은 고딕" w:eastAsia="맑은 고딕"/>
+          <w:b/>
+          <w:sz w:val="21"/>
+        </w:rPr>
+        <w:t>실패 분포 집계</w:t>
+      </w:r>
+      <w:r>
+        <w:rPr>
+          <w:rFonts w:ascii="맑은 고딕" w:hAnsi="맑은 고딕" w:eastAsia="맑은 고딕"/>
+          <w:sz w:val="21"/>
+        </w:rPr>
+        <w:t>: 대응 기록을 모아 어느 단계에서 얼마나 실패하는지 자동 집계합니다. 개선 순서는 이 분포로 정합니다.</w:t>
+      </w:r>
+    </w:p>
+    <w:p>
+      <w:pPr>
+        <w:spacing w:after="60"/>
+        <w:ind w:left="360"/>
+      </w:pPr>
+      <w:r>
+        <w:rPr>
+          <w:rFonts w:ascii="맑은 고딕" w:hAnsi="맑은 고딕" w:eastAsia="맑은 고딕"/>
+          <w:b/>
+          <w:color w:val="E86A1F"/>
+          <w:sz w:val="21"/>
+        </w:rPr>
+        <w:t xml:space="preserve">• </w:t>
+      </w:r>
+      <w:r>
+        <w:rPr>
+          <w:rFonts w:ascii="맑은 고딕" w:hAnsi="맑은 고딕" w:eastAsia="맑은 고딕"/>
+          <w:b/>
+          <w:sz w:val="21"/>
+        </w:rPr>
+        <w:t>모델 교체 판단용 벤치 2종</w:t>
+      </w:r>
+      <w:r>
+        <w:rPr>
+          <w:rFonts w:ascii="맑은 고딕" w:hAnsi="맑은 고딕" w:eastAsia="맑은 고딕"/>
+          <w:sz w:val="21"/>
+        </w:rPr>
+        <w:t>: 장비 목록에서 행을 고르는 정확도와 장비 창 안 버튼·커서를 읽는 정확도를 알람 없이 측정하는 도구를 만들었습니다. 이 벤치 결과로 화면 인식 모델을 단일 모델로 통일했습니다(01 문서 참조).</w:t>
+      </w:r>
+    </w:p>
+    <w:p>
+      <w:pPr>
+        <w:spacing w:before="200" w:after="120"/>
+      </w:pPr>
+      <w:r>
+        <w:rPr>
+          <w:rFonts w:ascii="맑은 고딕" w:hAnsi="맑은 고딕" w:eastAsia="맑은 고딕"/>
+          <w:b/>
+          <w:color w:val="142A55"/>
+          <w:sz w:val="27"/>
+        </w:rPr>
+        <w:t>8. 암묵지 지식 자산화 구조</w:t>
+      </w:r>
+    </w:p>
+    <w:p>
+      <w:pPr>
+        <w:spacing w:after="60"/>
+        <w:ind w:left="360"/>
+      </w:pPr>
+      <w:r>
+        <w:rPr>
+          <w:rFonts w:ascii="맑은 고딕" w:hAnsi="맑은 고딕" w:eastAsia="맑은 고딕"/>
+          <w:b/>
+          <w:color w:val="E86A1F"/>
+          <w:sz w:val="21"/>
+        </w:rPr>
+        <w:t xml:space="preserve">• </w:t>
+      </w:r>
+      <w:r>
+        <w:rPr>
+          <w:rFonts w:ascii="맑은 고딕" w:hAnsi="맑은 고딕" w:eastAsia="맑은 고딕"/>
+          <w:b/>
+          <w:sz w:val="21"/>
+        </w:rPr>
+        <w:t>정렬 성공/실패 이미지 저장</w:t>
+      </w:r>
+      <w:r>
+        <w:rPr>
+          <w:rFonts w:ascii="맑은 고딕" w:hAnsi="맑은 고딕" w:eastAsia="맑은 고딕"/>
+          <w:sz w:val="21"/>
+        </w:rPr>
+        <w:t>: align에 성공한 이미지와 실패한 이미지를 저장합니다. 최신 이미지는 계속 자동으로 갱신됩니다. 다음에 같은 Recipe에서 Align Fail이 나면 VLM이 참고할 최신 자료가 됩니다.</w:t>
+      </w:r>
+    </w:p>
+    <w:p>
+      <w:pPr>
+        <w:spacing w:after="60"/>
+        <w:ind w:left="360"/>
+      </w:pPr>
+      <w:r>
+        <w:rPr>
+          <w:rFonts w:ascii="맑은 고딕" w:hAnsi="맑은 고딕" w:eastAsia="맑은 고딕"/>
+          <w:b/>
+          <w:color w:val="E86A1F"/>
+          <w:sz w:val="21"/>
+        </w:rPr>
+        <w:t xml:space="preserve">• </w:t>
+      </w:r>
+      <w:r>
+        <w:rPr>
+          <w:rFonts w:ascii="맑은 고딕" w:hAnsi="맑은 고딕" w:eastAsia="맑은 고딕"/>
+          <w:b/>
+          <w:sz w:val="21"/>
+        </w:rPr>
+        <w:t>엔지니어 조작 녹화(알람 없이도 가능)</w:t>
+      </w:r>
+      <w:r>
+        <w:rPr>
+          <w:rFonts w:ascii="맑은 고딕" w:hAnsi="맑은 고딕" w:eastAsia="맑은 고딕"/>
+          <w:sz w:val="21"/>
+        </w:rPr>
+        <w:t>: 기존 녹화는 Align Fail 알람이 떠야만 돌았습니다. 이번에 별도 경로를 만들었습니다(기본 10분 상한). 엔지니어와 "지금부터 녹화하겠습니다"라고 약속한 뒤 이미 열려 있는 장비 창에 붙어 녹화하는 방식입니다. 실패해도 엔지니어의 시간을 10분만 쓰도록 상한부터 잡았습니다.</w:t>
+      </w:r>
+    </w:p>
+    <w:p>
+      <w:pPr>
+        <w:spacing w:after="60"/>
+        <w:ind w:left="360"/>
+      </w:pPr>
+      <w:r>
+        <w:rPr>
+          <w:rFonts w:ascii="맑은 고딕" w:hAnsi="맑은 고딕" w:eastAsia="맑은 고딕"/>
+          <w:b/>
+          <w:color w:val="E86A1F"/>
+          <w:sz w:val="21"/>
+        </w:rPr>
+        <w:t xml:space="preserve">• </w:t>
+      </w:r>
+      <w:r>
+        <w:rPr>
+          <w:rFonts w:ascii="맑은 고딕" w:hAnsi="맑은 고딕" w:eastAsia="맑은 고딕"/>
+          <w:b/>
+          <w:sz w:val="21"/>
+        </w:rPr>
+        <w:t>동의 범위를 코드로 고정</w:t>
+      </w:r>
+      <w:r>
+        <w:rPr>
+          <w:rFonts w:ascii="맑은 고딕" w:hAnsi="맑은 고딕" w:eastAsia="맑은 고딕"/>
+          <w:sz w:val="21"/>
+        </w:rPr>
+        <w:t>: 키보드·마우스 입력을 후킹하지 않습니다. 화면에 그려진 커서 위치만 관측합니다. 키 입력은 일절 기록하지 않습니다. 대신 프레임마다 창 위치·다른 앱이 화면을 가렸는지 여부를 함께 남깁니다. 가려진 프레임은 분석에서 걸러 냅니다.</w:t>
+      </w:r>
+    </w:p>
+    <w:p>
+      <w:pPr>
+        <w:spacing w:after="60"/>
+        <w:ind w:left="360"/>
+      </w:pPr>
+      <w:r>
+        <w:rPr>
+          <w:rFonts w:ascii="맑은 고딕" w:hAnsi="맑은 고딕" w:eastAsia="맑은 고딕"/>
+          <w:b/>
+          <w:color w:val="E86A1F"/>
+          <w:sz w:val="21"/>
+        </w:rPr>
+        <w:t xml:space="preserve">• </w:t>
+      </w:r>
+      <w:r>
+        <w:rPr>
+          <w:rFonts w:ascii="맑은 고딕" w:hAnsi="맑은 고딕" w:eastAsia="맑은 고딕"/>
+          <w:b/>
+          <w:sz w:val="21"/>
+        </w:rPr>
+        <w:t>녹화 → 조작 타임라인 → 절차서</w:t>
+      </w:r>
+      <w:r>
+        <w:rPr>
+          <w:rFonts w:ascii="맑은 고딕" w:hAnsi="맑은 고딕" w:eastAsia="맑은 고딕"/>
+          <w:sz w:val="21"/>
+        </w:rPr>
+        <w:t>: 녹화 프레임을 오프라인으로 걸러 "언제 어디를 클릭했고 무엇을 입력했는지"의 타임라인을 만듭니다. 이 타임라인을 다시 기계가 읽는 절차 데이터와 사람이 읽는 한국어 절차서로 변환하는 경로도 구축했습니다. 묶음 단위는 "드롭다운을 열어 배율을 골랐다" 같은 의미 단위입니다. 클릭 하나하나를 그대로 나열하지 않고 절차로 읽히게 묶습니다. 묶음이 틀렸을 때 되돌릴 수 있도록 원본 이벤트 번호도 함께 보존합니다.</w:t>
+      </w:r>
+    </w:p>
+    <w:p>
+      <w:pPr>
+        <w:spacing w:after="60"/>
+        <w:ind w:left="360"/>
+      </w:pPr>
+      <w:r>
+        <w:rPr>
+          <w:rFonts w:ascii="맑은 고딕" w:hAnsi="맑은 고딕" w:eastAsia="맑은 고딕"/>
+          <w:b/>
+          <w:color w:val="E86A1F"/>
+          <w:sz w:val="21"/>
+        </w:rPr>
+        <w:t xml:space="preserve">• </w:t>
+      </w:r>
+      <w:r>
+        <w:rPr>
+          <w:rFonts w:ascii="맑은 고딕" w:hAnsi="맑은 고딕" w:eastAsia="맑은 고딕"/>
+          <w:b/>
+          <w:sz w:val="21"/>
+        </w:rPr>
+        <w:t>이식 가능성 표시</w:t>
+      </w:r>
+      <w:r>
+        <w:rPr>
+          <w:rFonts w:ascii="맑은 고딕" w:hAnsi="맑은 고딕" w:eastAsia="맑은 고딕"/>
+          <w:sz w:val="21"/>
+        </w:rPr>
+        <w:t>: 각 조작이 화면의 UI 요소를 누른 것인지, 라이브 영상 위를 누른 것인지 구분해 기록합니다. 그래야 장비가 달라도 재현할 수 있는 조작과 영상 해석이 다시 필요한 조작을 나눌 수 있습니다.</w:t>
+      </w:r>
+    </w:p>
+    <w:p>
+      <w:pPr>
+        <w:spacing w:after="120"/>
+      </w:pPr>
+      <w:r>
+        <w:rPr>
+          <w:rFonts w:ascii="맑은 고딕" w:hAnsi="맑은 고딕" w:eastAsia="맑은 고딕"/>
+          <w:sz w:val="21"/>
+        </w:rPr>
+        <w:t xml:space="preserve">이 경로의 현재 목적은 자동화가 아니라 </w:t>
+      </w:r>
+      <w:r>
+        <w:rPr>
+          <w:rFonts w:ascii="맑은 고딕" w:hAnsi="맑은 고딕" w:eastAsia="맑은 고딕"/>
+          <w:b/>
+          <w:sz w:val="21"/>
+        </w:rPr>
+        <w:t>"모방 학습·절차 분석에 쓸 만한 데이터가 실제로 나오는가"를 판단할 근거를 만드는 것</w:t>
+      </w:r>
+      <w:r>
+        <w:rPr>
+          <w:rFonts w:ascii="맑은 고딕" w:hAnsi="맑은 고딕" w:eastAsia="맑은 고딕"/>
+          <w:sz w:val="21"/>
+        </w:rPr>
+        <w:t>입니다. 녹화 세션은 확보했고, 절차 추출은 오피스에서 아직 실행하지 않았습니다(§10).</w:t>
+      </w:r>
+    </w:p>
+    <w:p>
+      <w:pPr>
+        <w:spacing w:before="200" w:after="120"/>
+      </w:pPr>
+      <w:r>
+        <w:rPr>
+          <w:rFonts w:ascii="맑은 고딕" w:hAnsi="맑은 고딕" w:eastAsia="맑은 고딕"/>
+          <w:b/>
+          <w:color w:val="142A55"/>
+          <w:sz w:val="27"/>
+        </w:rPr>
+        <w:t>9. 진행 현황</w:t>
+      </w:r>
+    </w:p>
+    <w:p>
+      <w:pPr>
+        <w:spacing w:after="120"/>
+      </w:pPr>
+      <w:r>
+        <w:rPr>
+          <w:rFonts w:ascii="맑은 고딕" w:hAnsi="맑은 고딕" w:eastAsia="맑은 고딕"/>
+          <w:sz w:val="21"/>
+        </w:rPr>
+        <w:t xml:space="preserve">핵심 기능은 구현을 마쳤습니다. 이번 기간에 실장비 보정을 반자동으로 개통했습니다. 지금은 실알람에서 완주하는지 확인하는 일과 현장 적용 준비가 남았습니다. 아래 표는 </w:t>
+      </w:r>
+      <w:r>
+        <w:rPr>
+          <w:rFonts w:ascii="맑은 고딕" w:hAnsi="맑은 고딕" w:eastAsia="맑은 고딕"/>
+          <w:b/>
+          <w:sz w:val="21"/>
+        </w:rPr>
+        <w:t>구현 / 오피스 검증 / 실알람 경험</w:t>
+      </w:r>
+      <w:r>
+        <w:rPr>
+          <w:rFonts w:ascii="맑은 고딕" w:hAnsi="맑은 고딕" w:eastAsia="맑은 고딕"/>
+          <w:sz w:val="21"/>
+        </w:rPr>
+        <w:t>을 구분해 표기했습니다.</w:t>
       </w:r>
     </w:p>
     <w:tbl>
@@ -6681,7 +8638,7 @@
                 <w:rFonts w:ascii="맑은 고딕" w:hAnsi="맑은 고딕" w:eastAsia="맑은 고딕"/>
                 <w:sz w:val="19"/>
               </w:rPr>
-              <w:t>RCS 접속 → 자동 정렬 보정 → 종료 루프</w:t>
+              <w:t>RCS 접속 → 화면 확보 → 판정 → 종료 루프</w:t>
             </w:r>
           </w:p>
         </w:tc>
@@ -6696,7 +8653,54 @@
                 <w:rFonts w:ascii="맑은 고딕" w:hAnsi="맑은 고딕" w:eastAsia="맑은 고딕"/>
                 <w:sz w:val="19"/>
               </w:rPr>
-              <w:t>✅ 구현 완료</w:t>
+              <w:t>✅ 오피스 실행 확인</w:t>
+            </w:r>
+          </w:p>
+        </w:tc>
+      </w:tr>
+      <w:tr>
+        <w:tc>
+          <w:tcPr>
+            <w:tcW w:type="dxa" w:w="2880"/>
+          </w:tcPr>
+          <w:p>
+            <w:r/>
+            <w:r>
+              <w:rPr>
+                <w:rFonts w:ascii="맑은 고딕" w:hAnsi="맑은 고딕" w:eastAsia="맑은 고딕"/>
+                <w:sz w:val="19"/>
+              </w:rPr>
+              <w:t>실보정</w:t>
+            </w:r>
+          </w:p>
+        </w:tc>
+        <w:tc>
+          <w:tcPr>
+            <w:tcW w:type="dxa" w:w="2880"/>
+          </w:tcPr>
+          <w:p>
+            <w:r/>
+            <w:r>
+              <w:rPr>
+                <w:rFonts w:ascii="맑은 고딕" w:hAnsi="맑은 고딕" w:eastAsia="맑은 고딕"/>
+                <w:sz w:val="19"/>
+              </w:rPr>
+              <w:t>정렬 위치 재조정 자동 개통(반자동, 확정은 사람)</w:t>
+            </w:r>
+          </w:p>
+        </w:tc>
+        <w:tc>
+          <w:tcPr>
+            <w:tcW w:type="dxa" w:w="2880"/>
+          </w:tcPr>
+          <w:p>
+            <w:r/>
+            <w:r>
+              <w:rPr>
+                <w:rFonts w:ascii="맑은 고딕" w:hAnsi="맑은 고딕" w:eastAsia="맑은 고딕"/>
+                <w:sz w:val="19"/>
+              </w:rPr>
+              <w:t>✅ 개통(2026-08-12) · 🟡 실알람 완주 대기</w:t>
             </w:r>
           </w:p>
         </w:tc>
@@ -6743,6 +8747,100 @@
                 <w:rFonts w:ascii="맑은 고딕" w:hAnsi="맑은 고딕" w:eastAsia="맑은 고딕"/>
                 <w:sz w:val="19"/>
               </w:rPr>
+              <w:t>✅ 구현 완료 · 🟡 성공 이미지 적재가 선행 조건</w:t>
+            </w:r>
+          </w:p>
+        </w:tc>
+      </w:tr>
+      <w:tr>
+        <w:tc>
+          <w:tcPr>
+            <w:tcW w:type="dxa" w:w="2880"/>
+          </w:tcPr>
+          <w:p>
+            <w:r/>
+            <w:r>
+              <w:rPr>
+                <w:rFonts w:ascii="맑은 고딕" w:hAnsi="맑은 고딕" w:eastAsia="맑은 고딕"/>
+                <w:sz w:val="19"/>
+              </w:rPr>
+              <w:t>정확도</w:t>
+            </w:r>
+          </w:p>
+        </w:tc>
+        <w:tc>
+          <w:tcPr>
+            <w:tcW w:type="dxa" w:w="2880"/>
+          </w:tcPr>
+          <w:p>
+            <w:r/>
+            <w:r>
+              <w:rPr>
+                <w:rFonts w:ascii="맑은 고딕" w:hAnsi="맑은 고딕" w:eastAsia="맑은 고딕"/>
+                <w:sz w:val="19"/>
+              </w:rPr>
+              <w:t>촬영 모드별 재순위(OM/SEM 분리) 운영 반영</w:t>
+            </w:r>
+          </w:p>
+        </w:tc>
+        <w:tc>
+          <w:tcPr>
+            <w:tcW w:type="dxa" w:w="2880"/>
+          </w:tcPr>
+          <w:p>
+            <w:r/>
+            <w:r>
+              <w:rPr>
+                <w:rFonts w:ascii="맑은 고딕" w:hAnsi="맑은 고딕" w:eastAsia="맑은 고딕"/>
+                <w:sz w:val="19"/>
+              </w:rPr>
+              <w:t>✅ 반영 완료(03 문서)</w:t>
+            </w:r>
+          </w:p>
+        </w:tc>
+      </w:tr>
+      <w:tr>
+        <w:tc>
+          <w:tcPr>
+            <w:tcW w:type="dxa" w:w="2880"/>
+          </w:tcPr>
+          <w:p>
+            <w:r/>
+            <w:r>
+              <w:rPr>
+                <w:rFonts w:ascii="맑은 고딕" w:hAnsi="맑은 고딕" w:eastAsia="맑은 고딕"/>
+                <w:sz w:val="19"/>
+              </w:rPr>
+              <w:t>안전 장치</w:t>
+            </w:r>
+          </w:p>
+        </w:tc>
+        <w:tc>
+          <w:tcPr>
+            <w:tcW w:type="dxa" w:w="2880"/>
+          </w:tcPr>
+          <w:p>
+            <w:r/>
+            <w:r>
+              <w:rPr>
+                <w:rFonts w:ascii="맑은 고딕" w:hAnsi="맑은 고딕" w:eastAsia="맑은 고딕"/>
+                <w:sz w:val="19"/>
+              </w:rPr>
+              <w:t>오측 시 중단·Cube 알람 · 모드 불명 시 보류</w:t>
+            </w:r>
+          </w:p>
+        </w:tc>
+        <w:tc>
+          <w:tcPr>
+            <w:tcW w:type="dxa" w:w="2880"/>
+          </w:tcPr>
+          <w:p>
+            <w:r/>
+            <w:r>
+              <w:rPr>
+                <w:rFonts w:ascii="맑은 고딕" w:hAnsi="맑은 고딕" w:eastAsia="맑은 고딕"/>
+                <w:sz w:val="19"/>
+              </w:rPr>
               <w:t>✅ 구현 완료</w:t>
             </w:r>
           </w:p>
@@ -6775,7 +8873,148 @@
                 <w:rFonts w:ascii="맑은 고딕" w:hAnsi="맑은 고딕" w:eastAsia="맑은 고딕"/>
                 <w:sz w:val="19"/>
               </w:rPr>
-              <w:t>보정 후 측정 모니터링 · 오측 시 중단·Cube 알람</w:t>
+              <w:t>엔지니어 작업 완료 감지(우선순위 방식)</w:t>
+            </w:r>
+          </w:p>
+        </w:tc>
+        <w:tc>
+          <w:tcPr>
+            <w:tcW w:type="dxa" w:w="2880"/>
+          </w:tcPr>
+          <w:p>
+            <w:r/>
+            <w:r>
+              <w:rPr>
+                <w:rFonts w:ascii="맑은 고딕" w:hAnsi="맑은 고딕" w:eastAsia="맑은 고딕"/>
+                <w:sz w:val="19"/>
+              </w:rPr>
+              <w:t>✅ 구현 완료 · 🟡 오피스 판독 확인</w:t>
+            </w:r>
+          </w:p>
+        </w:tc>
+      </w:tr>
+      <w:tr>
+        <w:tc>
+          <w:tcPr>
+            <w:tcW w:type="dxa" w:w="2880"/>
+          </w:tcPr>
+          <w:p>
+            <w:r/>
+            <w:r>
+              <w:rPr>
+                <w:rFonts w:ascii="맑은 고딕" w:hAnsi="맑은 고딕" w:eastAsia="맑은 고딕"/>
+                <w:sz w:val="19"/>
+              </w:rPr>
+              <w:t>안정화</w:t>
+            </w:r>
+          </w:p>
+        </w:tc>
+        <w:tc>
+          <w:tcPr>
+            <w:tcW w:type="dxa" w:w="2880"/>
+          </w:tcPr>
+          <w:p>
+            <w:r/>
+            <w:r>
+              <w:rPr>
+                <w:rFonts w:ascii="맑은 고딕" w:hAnsi="맑은 고딕" w:eastAsia="맑은 고딕"/>
+                <w:sz w:val="19"/>
+              </w:rPr>
+              <w:t>실패 경로 하드닝(뒷정리 보장·오클릭 차단·쿨다운·실패 집계)</w:t>
+            </w:r>
+          </w:p>
+        </w:tc>
+        <w:tc>
+          <w:tcPr>
+            <w:tcW w:type="dxa" w:w="2880"/>
+          </w:tcPr>
+          <w:p>
+            <w:r/>
+            <w:r>
+              <w:rPr>
+                <w:rFonts w:ascii="맑은 고딕" w:hAnsi="맑은 고딕" w:eastAsia="맑은 고딕"/>
+                <w:sz w:val="19"/>
+              </w:rPr>
+              <w:t>✅ 구현 완료</w:t>
+            </w:r>
+          </w:p>
+        </w:tc>
+      </w:tr>
+      <w:tr>
+        <w:tc>
+          <w:tcPr>
+            <w:tcW w:type="dxa" w:w="2880"/>
+          </w:tcPr>
+          <w:p>
+            <w:r/>
+            <w:r>
+              <w:rPr>
+                <w:rFonts w:ascii="맑은 고딕" w:hAnsi="맑은 고딕" w:eastAsia="맑은 고딕"/>
+                <w:sz w:val="19"/>
+              </w:rPr>
+              <w:t>화면 인식</w:t>
+            </w:r>
+          </w:p>
+        </w:tc>
+        <w:tc>
+          <w:tcPr>
+            <w:tcW w:type="dxa" w:w="2880"/>
+          </w:tcPr>
+          <w:p>
+            <w:r/>
+            <w:r>
+              <w:rPr>
+                <w:rFonts w:ascii="맑은 고딕" w:hAnsi="맑은 고딕" w:eastAsia="맑은 고딕"/>
+                <w:sz w:val="19"/>
+              </w:rPr>
+              <w:t>단일 모델 통일 + 벤치 기반 검증</w:t>
+            </w:r>
+          </w:p>
+        </w:tc>
+        <w:tc>
+          <w:tcPr>
+            <w:tcW w:type="dxa" w:w="2880"/>
+          </w:tcPr>
+          <w:p>
+            <w:r/>
+            <w:r>
+              <w:rPr>
+                <w:rFonts w:ascii="맑은 고딕" w:hAnsi="맑은 고딕" w:eastAsia="맑은 고딕"/>
+                <w:sz w:val="19"/>
+              </w:rPr>
+              <w:t>✅ 오피스 검증 완료</w:t>
+            </w:r>
+          </w:p>
+        </w:tc>
+      </w:tr>
+      <w:tr>
+        <w:tc>
+          <w:tcPr>
+            <w:tcW w:type="dxa" w:w="2880"/>
+          </w:tcPr>
+          <w:p>
+            <w:r/>
+            <w:r>
+              <w:rPr>
+                <w:rFonts w:ascii="맑은 고딕" w:hAnsi="맑은 고딕" w:eastAsia="맑은 고딕"/>
+                <w:sz w:val="19"/>
+              </w:rPr>
+              <w:t>지식 자산화</w:t>
+            </w:r>
+          </w:p>
+        </w:tc>
+        <w:tc>
+          <w:tcPr>
+            <w:tcW w:type="dxa" w:w="2880"/>
+          </w:tcPr>
+          <w:p>
+            <w:r/>
+            <w:r>
+              <w:rPr>
+                <w:rFonts w:ascii="맑은 고딕" w:hAnsi="맑은 고딕" w:eastAsia="맑은 고딕"/>
+                <w:sz w:val="19"/>
+              </w:rPr>
+              <w:t>상시 녹화 · 성공/실패 이미지 저장</w:t>
             </w:r>
           </w:p>
         </w:tc>
@@ -6822,7 +9061,7 @@
                 <w:rFonts w:ascii="맑은 고딕" w:hAnsi="맑은 고딕" w:eastAsia="맑은 고딕"/>
                 <w:sz w:val="19"/>
               </w:rPr>
-              <w:t>성공/실패 이미지 저장(최신 자동 갱신) · 녹화</w:t>
+              <w:t>알람 없는 엔지니어 조작 녹화</w:t>
             </w:r>
           </w:p>
         </w:tc>
@@ -6837,7 +9076,7 @@
                 <w:rFonts w:ascii="맑은 고딕" w:hAnsi="맑은 고딕" w:eastAsia="맑은 고딕"/>
                 <w:sz w:val="19"/>
               </w:rPr>
-              <w:t>✅ 구현 완료</w:t>
+              <w:t>✅ 세션 확보</w:t>
             </w:r>
           </w:p>
         </w:tc>
@@ -6854,7 +9093,7 @@
                 <w:rFonts w:ascii="맑은 고딕" w:hAnsi="맑은 고딕" w:eastAsia="맑은 고딕"/>
                 <w:sz w:val="19"/>
               </w:rPr>
-              <w:t>안정화</w:t>
+              <w:t>지식 자산화</w:t>
             </w:r>
           </w:p>
         </w:tc>
@@ -6869,7 +9108,7 @@
                 <w:rFonts w:ascii="맑은 고딕" w:hAnsi="맑은 고딕" w:eastAsia="맑은 고딕"/>
                 <w:sz w:val="19"/>
               </w:rPr>
-              <w:t>각 루프 단계 안정성 향상·고도화</w:t>
+              <w:t>조작 타임라인 → 절차서 추출</w:t>
             </w:r>
           </w:p>
         </w:tc>
@@ -6884,7 +9123,54 @@
                 <w:rFonts w:ascii="맑은 고딕" w:hAnsi="맑은 고딕" w:eastAsia="맑은 고딕"/>
                 <w:sz w:val="19"/>
               </w:rPr>
-              <w:t>🟡 진행 중</w:t>
+              <w:t>🟡 구현 완료 · 오피스 미실행</w:t>
+            </w:r>
+          </w:p>
+        </w:tc>
+      </w:tr>
+      <w:tr>
+        <w:tc>
+          <w:tcPr>
+            <w:tcW w:type="dxa" w:w="2880"/>
+          </w:tcPr>
+          <w:p>
+            <w:r/>
+            <w:r>
+              <w:rPr>
+                <w:rFonts w:ascii="맑은 고딕" w:hAnsi="맑은 고딕" w:eastAsia="맑은 고딕"/>
+                <w:sz w:val="19"/>
+              </w:rPr>
+              <w:t>배포</w:t>
+            </w:r>
+          </w:p>
+        </w:tc>
+        <w:tc>
+          <w:tcPr>
+            <w:tcW w:type="dxa" w:w="2880"/>
+          </w:tcPr>
+          <w:p>
+            <w:r/>
+            <w:r>
+              <w:rPr>
+                <w:rFonts w:ascii="맑은 고딕" w:hAnsi="맑은 고딕" w:eastAsia="맑은 고딕"/>
+                <w:sz w:val="19"/>
+              </w:rPr>
+              <w:t>엔지니어 PC 배포 방식(더블클릭 실행)</w:t>
+            </w:r>
+          </w:p>
+        </w:tc>
+        <w:tc>
+          <w:tcPr>
+            <w:tcW w:type="dxa" w:w="2880"/>
+          </w:tcPr>
+          <w:p>
+            <w:r/>
+            <w:r>
+              <w:rPr>
+                <w:rFonts w:ascii="맑은 고딕" w:hAnsi="맑은 고딕" w:eastAsia="맑은 고딕"/>
+                <w:sz w:val="19"/>
+              </w:rPr>
+              <w:t>🟡 타당성 검토 완료 · 방식 결정 대기</w:t>
             </w:r>
           </w:p>
         </w:tc>
@@ -7000,7 +9286,7 @@
           <w:color w:val="142A55"/>
           <w:sz w:val="27"/>
         </w:rPr>
-        <w:t>8. 예상 허들과 대응</w:t>
+        <w:t>10. 예상 허들과 대응</w:t>
       </w:r>
     </w:p>
     <w:p>
@@ -7035,14 +9321,14 @@
           <w:b/>
           <w:sz w:val="21"/>
         </w:rPr>
-        <w:t>정확도 수치의 현장 검증 갭</w:t>
-      </w:r>
-      <w:r>
-        <w:rPr>
-          <w:rFonts w:ascii="맑은 고딕" w:hAnsi="맑은 고딕" w:eastAsia="맑은 고딕"/>
-          <w:sz w:val="21"/>
-        </w:rPr>
-        <w:t>: 지금까지의 정렬 정확도는 오프라인 벤치 기준이라, 오피스 실데이터 에서는 수치가 달라질 수 있습니다. → 현장 검증(진행 중)으로 확정하고, 확정 전에는 성공 사례를 더 많이 요구하는 보수적 기준으로 운영합니다.</w:t>
+        <w:t>개통과 완주는 다릅니다(가장 가까운 관문)</w:t>
+      </w:r>
+      <w:r>
+        <w:rPr>
+          <w:rFonts w:ascii="맑은 고딕" w:hAnsi="맑은 고딕" w:eastAsia="맑은 고딕"/>
+          <w:sz w:val="21"/>
+        </w:rPr>
+        <w:t>: 실보정은 코드상 개통했지만 아직 실제 Align Fail 알람에서 접속부터 보정까지 완주한 사례가 없습니다. → 알람이 뜨기를 기다리지 않습니다. 재생(replay) 절차와 점검 모드로 각 단계를 미리 확인합니다. replay는 실제 알람 없이 사이클을 1회 강제 실행하는 절차입니다. 첫 실알람은 엔지니어 입회하에 관찰합니다.</w:t>
       </w:r>
     </w:p>
     <w:p>
@@ -7065,14 +9351,14 @@
           <w:b/>
           <w:sz w:val="21"/>
         </w:rPr>
-        <w:t>성공 이미지 적재가 선행 조건</w:t>
-      </w:r>
-      <w:r>
-        <w:rPr>
-          <w:rFonts w:ascii="맑은 고딕" w:hAnsi="맑은 고딕" w:eastAsia="맑은 고딕"/>
-          <w:sz w:val="21"/>
-        </w:rPr>
-        <w:t>: 성공 사례 기반 보정은 Recipe별 최근 성공 이미지가 충분히 쌓여야 효과를 냅니다. 적재 전에는 등록 이미지 폴백으로만 동작해 개선 폭이 제한됩니다. → 성공 이미지 수집·적재 기능 구현을 최우선 활성화 조건으로 진행합니다.</w:t>
+        <w:t>정확도 수치의 현장 검증 갭</w:t>
+      </w:r>
+      <w:r>
+        <w:rPr>
+          <w:rFonts w:ascii="맑은 고딕" w:hAnsi="맑은 고딕" w:eastAsia="맑은 고딕"/>
+          <w:sz w:val="21"/>
+        </w:rPr>
+        <w:t>: 지금까지의 정렬 정확도는 오프라인 벤치 기준입니다. 오피스 실데이터에서는 수치가 달라질 수 있습니다. → 현장 검증(진행 중)으로 확정합니다. 확정 전에는 성공 사례를 더 많이 요구하는 보수적 기준으로 운영합니다.</w:t>
       </w:r>
     </w:p>
     <w:p>
@@ -7095,14 +9381,14 @@
           <w:b/>
           <w:sz w:val="21"/>
         </w:rPr>
-        <w:t>재등록이 필요한 Recipe</w:t>
-      </w:r>
-      <w:r>
-        <w:rPr>
-          <w:rFonts w:ascii="맑은 고딕" w:hAnsi="맑은 고딕" w:eastAsia="맑은 고딕"/>
-          <w:sz w:val="21"/>
-        </w:rPr>
-        <w:t>: 헷갈리기 쉬운 위치에 등록된 정렬 키(특히 고배율 SEM)는 매칭 알고리즘 개선만으로 풀리지 않습니다. → 재등록 우선순위 리포트로 대상 Recipe를 순위화해, 엔지니어와 협의해 더 뚜렷한 위치로 재등록을 추진합니다(자동화만으로는 해결되지 않는 협업 과제).</w:t>
+        <w:t>성공 이미지 적재가 선행 조건</w:t>
+      </w:r>
+      <w:r>
+        <w:rPr>
+          <w:rFonts w:ascii="맑은 고딕" w:hAnsi="맑은 고딕" w:eastAsia="맑은 고딕"/>
+          <w:sz w:val="21"/>
+        </w:rPr>
+        <w:t>: 성공 사례 기반 보정은 Recipe별 최근 성공 이미지가 충분히 쌓여야 효과를 냅니다. 적재 전에는 등록 이미지 폴백으로만 동작해 개선 폭이 제한됩니다. → 성공 이미지 수집·적재 기능을 최우선 활성화 조건으로 진행합니다.</w:t>
       </w:r>
     </w:p>
     <w:p>
@@ -7125,14 +9411,14 @@
           <w:b/>
           <w:sz w:val="21"/>
         </w:rPr>
-        <w:t>장비·PC 환경 편차</w:t>
-      </w:r>
-      <w:r>
-        <w:rPr>
-          <w:rFonts w:ascii="맑은 고딕" w:hAnsi="맑은 고딕" w:eastAsia="맑은 고딕"/>
-          <w:sz w:val="21"/>
-        </w:rPr>
-        <w:t>: 장비마다 배율 조작 방식이 다르고(휠/버튼), 다른 엔지니어가 장비를 점유 중일 수 있으며, PC 권한·화면 배율 차이도 있습니다. → 장비별 캘리브레이션(완료)과 예외 처리(점유 시 양보 후 재시도 등)로 흡수했으며, 현업 엔지니어와의 합동 평가에서 최종 확인합니다.</w:t>
+        <w:t>재등록이 필요한 Recipe</w:t>
+      </w:r>
+      <w:r>
+        <w:rPr>
+          <w:rFonts w:ascii="맑은 고딕" w:hAnsi="맑은 고딕" w:eastAsia="맑은 고딕"/>
+          <w:sz w:val="21"/>
+        </w:rPr>
+        <w:t>: 헷갈리기 쉬운 위치에 등록된 정렬 키(특히 고배율 SEM)는 매칭 알고리즘 개선만으로 풀리지 않습니다(03 문서에서 결론). → 재등록 우선순위 리스트로 대상 Recipe를 순위화합니다. 그다음 엔지니어와 협의해 더 뚜렷한 위치로 재등록을 추진합니다(자동화만으로는 해결되지 않는 협업 과제).</w:t>
       </w:r>
     </w:p>
     <w:p>
@@ -7155,14 +9441,14 @@
           <w:b/>
           <w:sz w:val="21"/>
         </w:rPr>
-        <w:t>VLM 서버 가용성</w:t>
-      </w:r>
-      <w:r>
-        <w:rPr>
-          <w:rFonts w:ascii="맑은 고딕" w:hAnsi="맑은 고딕" w:eastAsia="맑은 고딕"/>
-          <w:sz w:val="21"/>
-        </w:rPr>
-        <w:t>: 서버 메모리 제약으로 다중 이미지 일괄 처리가 어렵고, 서버 재시작 시 구동 환경 재설치에 약 3~4시간이 걸려 그동안 자동 대응이 중단됩니다. → 운영상 제약으로 관리하며, 재설치 절차 표준화가 필요합니다.</w:t>
+        <w:t>장비·PC 환경 편차</w:t>
+      </w:r>
+      <w:r>
+        <w:rPr>
+          <w:rFonts w:ascii="맑은 고딕" w:hAnsi="맑은 고딕" w:eastAsia="맑은 고딕"/>
+          <w:sz w:val="21"/>
+        </w:rPr>
+        <w:t>: 장비마다 배율 조작 방식이 다릅니다(휠/버튼). 다른 엔지니어가 장비를 점유 중일 수 있고, PC 권한·화면 배율 차이도 있습니다. → 장비별 캘리브레이션(완료)과 예외 처리(점유 시 양보 후 재시도, 잘못 열린 창 닫기, 실패 장비 쿨다운)로 흡수했습니다. 최종 확인은 현업 엔지니어와 함께하는 합동 평가에서 합니다.</w:t>
       </w:r>
     </w:p>
     <w:p>
@@ -7185,18 +9471,93 @@
           <w:b/>
           <w:sz w:val="21"/>
         </w:rPr>
-        <w:t>실보정 전환 리스크</w:t>
-      </w:r>
-      <w:r>
-        <w:rPr>
-          <w:rFonts w:ascii="맑은 고딕" w:hAnsi="맑은 고딕" w:eastAsia="맑은 고딕"/>
-          <w:sz w:val="21"/>
-        </w:rPr>
-        <w:t>: 실제 장비 클릭은 오동작 시 측정에 영향을 줄 수 있습니다. → 관찰 전용(점검 모드) → 단일 장비 pilot → 확대 순서의 단계적 활성화로 리스크를 관리합니다.</w:t>
+        <w:t>VLM 서버 가용성과 호출 예산</w:t>
+      </w:r>
+      <w:r>
+        <w:rPr>
+          <w:rFonts w:ascii="맑은 고딕" w:hAnsi="맑은 고딕" w:eastAsia="맑은 고딕"/>
+          <w:sz w:val="21"/>
+        </w:rPr>
+        <w:t>: 서버의 시스템 메모리 제약으로 상시 구동 가능한 모델 수가 제한됩니다. 서버를 재시작하면 구동 환경 재설치에 약 3~4시간이 걸립니다. 그동안 자동 대응이 중단됩니다. 10분짜리 녹화 1건을 분석하면 화면 인식 호출이 수백~수천 회에 이를 수 있습니다. → 실시간 루프는 호출 수가 적은 경로로 설계했습니다(대부분의 판정을 CV로 대체). 녹화 분석은 실시간 루프 밖에서 호출 상한을 걸고 돌립니다. 잘라 낸 분량은 결과에 그대로 보고해 "다 봤다"고 오인할 여지를 없앴습니다.</w:t>
       </w:r>
     </w:p>
     <w:p>
       <w:pPr>
+        <w:spacing w:after="60"/>
+        <w:ind w:left="360"/>
+      </w:pPr>
+      <w:r>
+        <w:rPr>
+          <w:rFonts w:ascii="맑은 고딕" w:hAnsi="맑은 고딕" w:eastAsia="맑은 고딕"/>
+          <w:b/>
+          <w:color w:val="E86A1F"/>
+          <w:sz w:val="21"/>
+        </w:rPr>
+        <w:t xml:space="preserve">• </w:t>
+      </w:r>
+      <w:r>
+        <w:rPr>
+          <w:rFonts w:ascii="맑은 고딕" w:hAnsi="맑은 고딕" w:eastAsia="맑은 고딕"/>
+          <w:b/>
+          <w:sz w:val="21"/>
+        </w:rPr>
+        <w:t>엔지니어 PC 배포 마찰</w:t>
+      </w:r>
+      <w:r>
+        <w:rPr>
+          <w:rFonts w:ascii="맑은 고딕" w:hAnsi="맑은 고딕" w:eastAsia="맑은 고딕"/>
+          <w:sz w:val="21"/>
+        </w:rPr>
+        <w:t>: 대상 PC에는 개발 도구가 설치돼 있지 않습니다. 저장소 pull·환경 설정 같은 절차 자체가 비개발자 엔지니어에게는 마찰입니다. → 더블클릭 실행이 가능한 포터블 폴더 방식을 1순위로 검토했습니다. 다만 부트스트랩 소스가 3개(실행기·인터프리터·패키지)이고 그중 하나만 사내 미러로 덮입니다. 한 곳만 어긋나도 "내 PC는 되는데 다른 PC는 안 되는" 문제가 납니다. 배포 방식을 확정할 때 이 세 경로를 모두 사내 자원으로 고정할 계획입니다.</w:t>
+      </w:r>
+    </w:p>
+    <w:p>
+      <w:pPr>
+        <w:spacing w:after="60"/>
+        <w:ind w:left="360"/>
+      </w:pPr>
+      <w:r>
+        <w:rPr>
+          <w:rFonts w:ascii="맑은 고딕" w:hAnsi="맑은 고딕" w:eastAsia="맑은 고딕"/>
+          <w:b/>
+          <w:color w:val="E86A1F"/>
+          <w:sz w:val="21"/>
+        </w:rPr>
+        <w:t xml:space="preserve">• </w:t>
+      </w:r>
+      <w:r>
+        <w:rPr>
+          <w:rFonts w:ascii="맑은 고딕" w:hAnsi="맑은 고딕" w:eastAsia="맑은 고딕"/>
+          <w:b/>
+          <w:sz w:val="21"/>
+        </w:rPr>
+        <w:t>실보정 전환 리스크</w:t>
+      </w:r>
+      <w:r>
+        <w:rPr>
+          <w:rFonts w:ascii="맑은 고딕" w:hAnsi="맑은 고딕" w:eastAsia="맑은 고딕"/>
+          <w:sz w:val="21"/>
+        </w:rPr>
+        <w:t xml:space="preserve">: 실제 장비 클릭은 오동작 시 측정에 영향을 줄 수 있습니다. → 관찰 전용(점검 모드) → 반자동(확정은 사람, </w:t>
+      </w:r>
+      <w:r>
+        <w:rPr>
+          <w:rFonts w:ascii="맑은 고딕" w:hAnsi="맑은 고딕" w:eastAsia="맑은 고딕"/>
+          <w:b/>
+          <w:sz w:val="21"/>
+        </w:rPr>
+        <w:t>현재 단계</w:t>
+      </w:r>
+      <w:r>
+        <w:rPr>
+          <w:rFonts w:ascii="맑은 고딕" w:hAnsi="맑은 고딕" w:eastAsia="맑은 고딕"/>
+          <w:sz w:val="21"/>
+        </w:rPr>
+        <w:t>) → 단일 장비 pilot → 확대 순서의 단계적 활성화로 리스크를 관리합니다.</w:t>
+      </w:r>
+    </w:p>
+    <w:p>
+      <w:pPr>
         <w:spacing w:before="200" w:after="120"/>
       </w:pPr>
       <w:r>
@@ -7206,7 +9567,7 @@
           <w:color w:val="142A55"/>
           <w:sz w:val="27"/>
         </w:rPr>
-        <w:t>9. 향후 일정</w:t>
+        <w:t>11. 향후 일정</w:t>
       </w:r>
     </w:p>
     <w:p>
@@ -7229,14 +9590,14 @@
           <w:b/>
           <w:sz w:val="21"/>
         </w:rPr>
-        <w:t>7~8월</w:t>
-      </w:r>
-      <w:r>
-        <w:rPr>
-          <w:rFonts w:ascii="맑은 고딕" w:hAnsi="맑은 고딕" w:eastAsia="맑은 고딕"/>
-          <w:sz w:val="21"/>
-        </w:rPr>
-        <w:t>: MI 현업 엔지니어와 함께 실전 테스트를 진행합니다.</w:t>
+        <w:t>8월 후반</w:t>
+      </w:r>
+      <w:r>
+        <w:rPr>
+          <w:rFonts w:ascii="맑은 고딕" w:hAnsi="맑은 고딕" w:eastAsia="맑은 고딕"/>
+          <w:sz w:val="21"/>
+        </w:rPr>
+        <w:t>: 첫 실알람 완주 확인(엔지니어 입회), 엔지니어 작업 완료 감지의 오피스 판독 확인, 녹화 1건의 절차 추출 실행과 "쓸 만한 데이터인가" 판정.</w:t>
       </w:r>
     </w:p>
     <w:p>
@@ -7266,7 +9627,7 @@
           <w:rFonts w:ascii="맑은 고딕" w:hAnsi="맑은 고딕" w:eastAsia="맑은 고딕"/>
           <w:sz w:val="21"/>
         </w:rPr>
-        <w:t>: 실전 배치를 목표로 합니다.</w:t>
+        <w:t>: MI 현업 엔지니어와 합동 실전 테스트 및 단일 장비 pilot, 배포 방식 확정.</w:t>
       </w:r>
     </w:p>
     <w:p>
@@ -7289,6 +9650,36 @@
           <w:b/>
           <w:sz w:val="21"/>
         </w:rPr>
+        <w:t>이후</w:t>
+      </w:r>
+      <w:r>
+        <w:rPr>
+          <w:rFonts w:ascii="맑은 고딕" w:hAnsi="맑은 고딕" w:eastAsia="맑은 고딕"/>
+          <w:sz w:val="21"/>
+        </w:rPr>
+        <w:t>: pilot 결과를 반영해 대상 장비를 확대합니다.</w:t>
+      </w:r>
+    </w:p>
+    <w:p>
+      <w:pPr>
+        <w:spacing w:after="60"/>
+        <w:ind w:left="360"/>
+      </w:pPr>
+      <w:r>
+        <w:rPr>
+          <w:rFonts w:ascii="맑은 고딕" w:hAnsi="맑은 고딕" w:eastAsia="맑은 고딕"/>
+          <w:b/>
+          <w:color w:val="E86A1F"/>
+          <w:sz w:val="21"/>
+        </w:rPr>
+        <w:t xml:space="preserve">• </w:t>
+      </w:r>
+      <w:r>
+        <w:rPr>
+          <w:rFonts w:ascii="맑은 고딕" w:hAnsi="맑은 고딕" w:eastAsia="맑은 고딕"/>
+          <w:b/>
+          <w:sz w:val="21"/>
+        </w:rPr>
         <w:t>2027년</w:t>
       </w:r>
       <w:r>
@@ -7296,7 +9687,7 @@
           <w:rFonts w:ascii="맑은 고딕" w:hAnsi="맑은 고딕" w:eastAsia="맑은 고딕"/>
           <w:sz w:val="21"/>
         </w:rPr>
-        <w:t>: 이번 PoC를 발판 삼아, VLM이 Recipe Tuning을 실제로 수행하도록 workflow 구조를 다듬을 예정입니다.</w:t>
+        <w:t>: 이번 PoC를 발판 삼아 VLM이 Recipe Tuning을 실제로 수행하도록 workflow 구조를 다듬을 예정입니다.</w:t>
       </w:r>
     </w:p>
     <w:sectPr>

</xml_diff>

<commit_message>
docs(progress): workflow_3/4 최신 진행 반영 + 동료 공유용 bento v2 슬라이드 신설
00~04 문서에 Recovery Episode 수집, search-around 탐색 재설계, 보정 불가
알림 고도화·엔지니어 접속 감지, env 리팩터를 반영하고, workflow_4 상태
머신 프레임워크를 다루는 05 문서를 신설했다(README/_md_report.py 배선,
docx 재생성 포함).

Align_Tuning_Agent.bento.html 은 흰 배경으로 갱신하고, 더 상세한 동료
공유판 Align_Tuning_Agent_v2.bento.html(워크플로3 최신 하드닝 + workflow_4
섹션 추가)을 build_slides_bento_v2.py 로 신설했다.

Co-Authored-By: Claude Sonnet 5 <noreply@anthropic.com>
</commit_message>
<xml_diff>
--- a/docs/project_progress/project_progress_report.docx
+++ b/docs/project_progress/project_progress_report.docx
@@ -166,11 +166,24 @@
       </w:r>
     </w:p>
     <w:p>
-      <w:r>
-        <w:br w:type="page"/>
+      <w:pPr>
+        <w:spacing w:after="80" w:before="0"/>
+      </w:pPr>
+      <w:r>
+        <w:rPr>
+          <w:rFonts w:ascii="맑은 고딕" w:hAnsi="맑은 고딕" w:eastAsia="맑은 고딕"/>
+          <w:b w:val="0"/>
+          <w:sz w:val="22"/>
+        </w:rPr>
+        <w:t>05. 실패 회복 과정을 눈에 보이게 — 상태 머신 프레임워크 (workflow_4)</w:t>
       </w:r>
     </w:p>
     <w:p>
+      <w:r>
+        <w:br w:type="page"/>
+      </w:r>
+    </w:p>
+    <w:p>
       <w:pPr>
         <w:spacing w:before="280" w:after="120"/>
       </w:pPr>
@@ -204,7 +217,7 @@
           <w:color w:val="556070"/>
           <w:sz w:val="20"/>
         </w:rPr>
-        <w:t>최종 갱신: 2026-08-16 (2026-07-07 이후 진행분 반영 — 실장비 보정 반자동 개통, 촬영 모드별 재순위 채택, VLM 운영 구성 정리, 지식 자산화 경로 구축.)</w:t>
+        <w:t>최종 갱신: 2026-09-02 (2026-08-16 이후 진행분 반영 — 실패 회복 과정의 관측 계층 신설(Recovery Episode), 정렬 탐색 엔진 재설계, 보정 불가 알림 고도화·엔지니어 접속 감지, 이 관측·시각화를 담당하는 별도 계층(workflow_4) 착수.)</w:t>
       </w:r>
     </w:p>
     <w:p>
@@ -1221,6 +1234,36 @@
           <w:sz w:val="21"/>
         </w:rPr>
         <w:t>로 바꾸는 경로를 만들었습니다. 입력은 후킹하지 않고 화면만 관측합니다. 동의 범위를 코드에 고정한 것입니다.</w:t>
+      </w:r>
+    </w:p>
+    <w:p>
+      <w:pPr>
+        <w:spacing w:after="60"/>
+        <w:ind w:left="360"/>
+      </w:pPr>
+      <w:r>
+        <w:rPr>
+          <w:rFonts w:ascii="맑은 고딕" w:hAnsi="맑은 고딕" w:eastAsia="맑은 고딕"/>
+          <w:b/>
+          <w:color w:val="E86A1F"/>
+          <w:sz w:val="21"/>
+        </w:rPr>
+        <w:t xml:space="preserve">• </w:t>
+      </w:r>
+      <w:r>
+        <w:rPr>
+          <w:rFonts w:ascii="맑은 고딕" w:hAnsi="맑은 고딕" w:eastAsia="맑은 고딕"/>
+          <w:b/>
+          <w:sz w:val="21"/>
+        </w:rPr>
+        <w:t>실패 회복 과정의 관측 계층 신설(2026-08~09)</w:t>
+      </w:r>
+      <w:r>
+        <w:rPr>
+          <w:rFonts w:ascii="맑은 고딕" w:hAnsi="맑은 고딕" w:eastAsia="맑은 고딕"/>
+          <w:sz w:val="21"/>
+        </w:rPr>
+        <w:t>: 알람 1건이 몇 번 시도됐고 왜 회복됐다고 또는 못 했다고 판단했는지를 텍스트 한 줄로 남기는 기록 계층(Recovery Episode)을 만들었습니다. 이 판정 로직은 workflow_3 실행 루프와 분리된 별도 계층(workflow_4)에 두어, 장비 없이도 판정 규칙만 독립적으로 검증할 수 있게 했습니다. 같은 계층이 대응 루프의 진행 상황을 그림+표로 실시간에 가깝게 보여주는 기능도 함께 제공합니다(05 문서).</w:t>
       </w:r>
     </w:p>
     <w:p>
@@ -2070,6 +2113,102 @@
                 <w:rFonts w:ascii="맑은 고딕" w:hAnsi="맑은 고딕" w:eastAsia="맑은 고딕"/>
                 <w:sz w:val="19"/>
               </w:rPr>
+              <w:t>실패 회복 관측 계층(Recovery Episode)</w:t>
+            </w:r>
+          </w:p>
+        </w:tc>
+        <w:tc>
+          <w:tcPr>
+            <w:tcW w:type="dxa" w:w="4320"/>
+          </w:tcPr>
+          <w:p>
+            <w:r/>
+            <w:r>
+              <w:rPr>
+                <w:rFonts w:ascii="맑은 고딕" w:hAnsi="맑은 고딕" w:eastAsia="맑은 고딕"/>
+                <w:sz w:val="19"/>
+              </w:rPr>
+              <w:t>✅ 구현 완료 · 🟡 첫 오피스 기록 대기</w:t>
+            </w:r>
+          </w:p>
+        </w:tc>
+      </w:tr>
+      <w:tr>
+        <w:tc>
+          <w:tcPr>
+            <w:tcW w:type="dxa" w:w="4320"/>
+          </w:tcPr>
+          <w:p>
+            <w:r/>
+            <w:r>
+              <w:rPr>
+                <w:rFonts w:ascii="맑은 고딕" w:hAnsi="맑은 고딕" w:eastAsia="맑은 고딕"/>
+                <w:sz w:val="19"/>
+              </w:rPr>
+              <w:t>정렬 탐색 엔진 재설계(search-around)</w:t>
+            </w:r>
+          </w:p>
+        </w:tc>
+        <w:tc>
+          <w:tcPr>
+            <w:tcW w:type="dxa" w:w="4320"/>
+          </w:tcPr>
+          <w:p>
+            <w:r/>
+            <w:r>
+              <w:rPr>
+                <w:rFonts w:ascii="맑은 고딕" w:hAnsi="맑은 고딕" w:eastAsia="맑은 고딕"/>
+                <w:sz w:val="19"/>
+              </w:rPr>
+              <w:t>✅ 구현 완료 · 🟡 오피스 실장비 미검증</w:t>
+            </w:r>
+          </w:p>
+        </w:tc>
+      </w:tr>
+      <w:tr>
+        <w:tc>
+          <w:tcPr>
+            <w:tcW w:type="dxa" w:w="4320"/>
+          </w:tcPr>
+          <w:p>
+            <w:r/>
+            <w:r>
+              <w:rPr>
+                <w:rFonts w:ascii="맑은 고딕" w:hAnsi="맑은 고딕" w:eastAsia="맑은 고딕"/>
+                <w:sz w:val="19"/>
+              </w:rPr>
+              <w:t>상태 머신 프레임워크(workflow_4, §05)</w:t>
+            </w:r>
+          </w:p>
+        </w:tc>
+        <w:tc>
+          <w:tcPr>
+            <w:tcW w:type="dxa" w:w="4320"/>
+          </w:tcPr>
+          <w:p>
+            <w:r/>
+            <w:r>
+              <w:rPr>
+                <w:rFonts w:ascii="맑은 고딕" w:hAnsi="맑은 고딕" w:eastAsia="맑은 고딕"/>
+                <w:sz w:val="19"/>
+              </w:rPr>
+              <w:t>✅ 미러·판정 계층 구현 완료 · 🔵 실행 엔진은 데모 전용</w:t>
+            </w:r>
+          </w:p>
+        </w:tc>
+      </w:tr>
+      <w:tr>
+        <w:tc>
+          <w:tcPr>
+            <w:tcW w:type="dxa" w:w="4320"/>
+          </w:tcPr>
+          <w:p>
+            <w:r/>
+            <w:r>
+              <w:rPr>
+                <w:rFonts w:ascii="맑은 고딕" w:hAnsi="맑은 고딕" w:eastAsia="맑은 고딕"/>
+                <w:sz w:val="19"/>
+              </w:rPr>
               <w:t>엔지니어 PC 배포 방식</w:t>
             </w:r>
           </w:p>
@@ -2371,6 +2510,20 @@
           <w:sz w:val="21"/>
         </w:rPr>
         <w:t>04_workflow_3.md</w:t>
+      </w:r>
+      <w:r>
+        <w:rPr>
+          <w:rFonts w:ascii="맑은 고딕" w:hAnsi="맑은 고딕" w:eastAsia="맑은 고딕"/>
+          <w:sz w:val="21"/>
+        </w:rPr>
+        <w:t xml:space="preserve">를, 관측·시각화 계층(workflow_4)의 상세는 </w:t>
+      </w:r>
+      <w:r>
+        <w:rPr>
+          <w:rFonts w:ascii="맑은 고딕" w:hAnsi="맑은 고딕" w:eastAsia="맑은 고딕"/>
+          <w:sz w:val="21"/>
+        </w:rPr>
+        <w:t>05_workflow_4.md</w:t>
       </w:r>
       <w:r>
         <w:rPr>
@@ -6874,7 +7027,7 @@
           <w:color w:val="556070"/>
           <w:sz w:val="20"/>
         </w:rPr>
-        <w:t>최종 갱신: 2026-08-16 (직전 갱신 2026-07-07 이후 진행분을 반영했습니다.)</w:t>
+        <w:t>최종 갱신: 2026-09-02 (직전 갱신 2026-08-16 이후 진행분을 반영했습니다. 이번 갱신 범위: 실패 회복 과정의 관측 계층 신설(Recovery Episode), 탐색 엔진 재설계(search-around), 보정 불가 알림 고도화·엔지니어 접속 감지, 설정 체계 정리.)</w:t>
       </w:r>
     </w:p>
     <w:p>
@@ -8466,7 +8619,298 @@
           <w:color w:val="142A55"/>
           <w:sz w:val="27"/>
         </w:rPr>
-        <w:t>9. 진행 현황</w:t>
+        <w:t>9. 실패 회복 과정의 관측 계층 — Recovery Episode 수집 (2026-08~09)</w:t>
+      </w:r>
+    </w:p>
+    <w:p>
+      <w:pPr>
+        <w:spacing w:after="120"/>
+      </w:pPr>
+      <w:r>
+        <w:rPr>
+          <w:rFonts w:ascii="맑은 고딕" w:hAnsi="맑은 고딕" w:eastAsia="맑은 고딕"/>
+          <w:sz w:val="21"/>
+        </w:rPr>
+        <w:t>지금까지는 알람 1건이 "보정됐다/안됐다"만 기록으로 남았습니다. 왜 안 됐는지, 몇 번을 다시 시도했는지, 엔지니어가 무엇을 봐야 하는지는 로그를 일일이 뒤져야 알 수 있었습니다.</w:t>
+      </w:r>
+    </w:p>
+    <w:p>
+      <w:pPr>
+        <w:spacing w:after="120"/>
+      </w:pPr>
+      <w:r>
+        <w:rPr>
+          <w:rFonts w:ascii="맑은 고딕" w:hAnsi="맑은 고딕" w:eastAsia="맑은 고딕"/>
+          <w:sz w:val="21"/>
+        </w:rPr>
+        <w:t xml:space="preserve">이번에 Align Fail 알람 하나(발생부터 해제까지)를 </w:t>
+      </w:r>
+      <w:r>
+        <w:rPr>
+          <w:rFonts w:ascii="맑은 고딕" w:hAnsi="맑은 고딕" w:eastAsia="맑은 고딕"/>
+          <w:b/>
+          <w:sz w:val="21"/>
+        </w:rPr>
+        <w:t>Recovery Episode</w:t>
+      </w:r>
+      <w:r>
+        <w:rPr>
+          <w:rFonts w:ascii="맑은 고딕" w:hAnsi="맑은 고딕" w:eastAsia="맑은 고딕"/>
+          <w:sz w:val="21"/>
+        </w:rPr>
+        <w:t>라는 단위로 묶어 그 안에서 벌어진 일을 텍스트 한 줄로 요약하는 관측 계층을 만들었습니다.</w:t>
+      </w:r>
+    </w:p>
+    <w:p>
+      <w:pPr>
+        <w:spacing w:after="60"/>
+        <w:ind w:left="360"/>
+      </w:pPr>
+      <w:r>
+        <w:rPr>
+          <w:rFonts w:ascii="맑은 고딕" w:hAnsi="맑은 고딕" w:eastAsia="맑은 고딕"/>
+          <w:b/>
+          <w:color w:val="E86A1F"/>
+          <w:sz w:val="21"/>
+        </w:rPr>
+        <w:t xml:space="preserve">• </w:t>
+      </w:r>
+      <w:r>
+        <w:rPr>
+          <w:rFonts w:ascii="맑은 고딕" w:hAnsi="맑은 고딕" w:eastAsia="맑은 고딕"/>
+          <w:b/>
+          <w:sz w:val="21"/>
+        </w:rPr>
+        <w:t>시도(attempt) 단위 기록</w:t>
+      </w:r>
+      <w:r>
+        <w:rPr>
+          <w:rFonts w:ascii="맑은 고딕" w:hAnsi="맑은 고딕" w:eastAsia="맑은 고딕"/>
+          <w:sz w:val="21"/>
+        </w:rPr>
+        <w:t>: 같은 알람이 쿨다운 후 재시도되면 새 Episode가 아니라 같은 Episode의 두 번째, 세 번째 시도로 이어붙습니다. 이전에는 재시도가 같은 녹화 폴더에 서로 다른 시도의 화면을 섞어 담는 결함이 있었는데, 시도별 폴더 분리로 구조적으로 없앴습니다.</w:t>
+      </w:r>
+    </w:p>
+    <w:p>
+      <w:pPr>
+        <w:spacing w:after="60"/>
+        <w:ind w:left="360"/>
+      </w:pPr>
+      <w:r>
+        <w:rPr>
+          <w:rFonts w:ascii="맑은 고딕" w:hAnsi="맑은 고딕" w:eastAsia="맑은 고딕"/>
+          <w:b/>
+          <w:color w:val="E86A1F"/>
+          <w:sz w:val="21"/>
+        </w:rPr>
+        <w:t xml:space="preserve">• </w:t>
+      </w:r>
+      <w:r>
+        <w:rPr>
+          <w:rFonts w:ascii="맑은 고딕" w:hAnsi="맑은 고딕" w:eastAsia="맑은 고딕"/>
+          <w:b/>
+          <w:sz w:val="21"/>
+        </w:rPr>
+        <w:t>판정 3요소</w:t>
+      </w:r>
+      <w:r>
+        <w:rPr>
+          <w:rFonts w:ascii="맑은 고딕" w:hAnsi="맑은 고딕" w:eastAsia="맑은 고딕"/>
+          <w:sz w:val="21"/>
+        </w:rPr>
+        <w:t>: 화면을 볼 수 있었는지·장비가 다른 사람 점유 상태였는지·정렬 위치를 유일하게 특정할 수 있었는지(Guard), 측정이 실제로 성공했는지(Verification — 측정 판독을 최우선으로 보고, 판독이 안 될 때만 측정 진행 수치의 연속 증가로 보조 판단), 최종적으로 회복됐는지·에스컬레이션됐는지(Outcome)를 각각 남깁니다. 화면을 못 본 경우는 실패로 단정하지 않고 전부 "판정 불명"으로 남겨, 관측 실패가 불필요한 에스컬레이션으로 새지 않게 했습니다.</w:t>
+      </w:r>
+    </w:p>
+    <w:p>
+      <w:pPr>
+        <w:spacing w:after="60"/>
+        <w:ind w:left="360"/>
+      </w:pPr>
+      <w:r>
+        <w:rPr>
+          <w:rFonts w:ascii="맑은 고딕" w:hAnsi="맑은 고딕" w:eastAsia="맑은 고딕"/>
+          <w:b/>
+          <w:color w:val="E86A1F"/>
+          <w:sz w:val="21"/>
+        </w:rPr>
+        <w:t xml:space="preserve">• </w:t>
+      </w:r>
+      <w:r>
+        <w:rPr>
+          <w:rFonts w:ascii="맑은 고딕" w:hAnsi="맑은 고딕" w:eastAsia="맑은 고딕"/>
+          <w:b/>
+          <w:sz w:val="21"/>
+        </w:rPr>
+        <w:t>판정 로직은 별도 계층에 분리</w:t>
+      </w:r>
+      <w:r>
+        <w:rPr>
+          <w:rFonts w:ascii="맑은 고딕" w:hAnsi="맑은 고딕" w:eastAsia="맑은 고딕"/>
+          <w:sz w:val="21"/>
+        </w:rPr>
+        <w:t xml:space="preserve">: 이 Outcome 판정 로직은 workflow_3 안이 아니라 </w:t>
+      </w:r>
+      <w:r>
+        <w:rPr>
+          <w:rFonts w:ascii="맑은 고딕" w:hAnsi="맑은 고딕" w:eastAsia="맑은 고딕"/>
+          <w:b/>
+          <w:sz w:val="21"/>
+        </w:rPr>
+        <w:t>workflow_4</w:t>
+      </w:r>
+      <w:r>
+        <w:rPr>
+          <w:rFonts w:ascii="맑은 고딕" w:hAnsi="맑은 고딕" w:eastAsia="맑은 고딕"/>
+          <w:sz w:val="21"/>
+        </w:rPr>
+        <w:t>라는 별도의 순수 판정 계층에 둡니다(§13). workflow_3의 실제 파일을 파싱하지 않는 순수 데이터 계약이라, 실제 장비 없이도 판정 로직만 따로 검증할 수 있습니다.</w:t>
+      </w:r>
+    </w:p>
+    <w:p>
+      <w:pPr>
+        <w:spacing w:after="60"/>
+        <w:ind w:left="360"/>
+      </w:pPr>
+      <w:r>
+        <w:rPr>
+          <w:rFonts w:ascii="맑은 고딕" w:hAnsi="맑은 고딕" w:eastAsia="맑은 고딕"/>
+          <w:b/>
+          <w:color w:val="E86A1F"/>
+          <w:sz w:val="21"/>
+        </w:rPr>
+        <w:t xml:space="preserve">• </w:t>
+      </w:r>
+      <w:r>
+        <w:rPr>
+          <w:rFonts w:ascii="맑은 고딕" w:hAnsi="맑은 고딕" w:eastAsia="맑은 고딕"/>
+          <w:b/>
+          <w:sz w:val="21"/>
+        </w:rPr>
+        <w:t>기본은 꺼짐</w:t>
+      </w:r>
+      <w:r>
+        <w:rPr>
+          <w:rFonts w:ascii="맑은 고딕" w:hAnsi="맑은 고딕" w:eastAsia="맑은 고딕"/>
+          <w:sz w:val="21"/>
+        </w:rPr>
+        <w:t>: 이 기록 기능은 기본값이 꺼짐이며, 켜도 보정 동작 자체는 바뀌지 않고 기록만 추가됩니다. "관측이 대응 속도에 영향을 주지 않는다"는 원칙을 지켰습니다.</w:t>
+      </w:r>
+    </w:p>
+    <w:p>
+      <w:pPr>
+        <w:spacing w:after="120"/>
+      </w:pPr>
+      <w:r>
+        <w:rPr>
+          <w:rFonts w:ascii="맑은 고딕" w:hAnsi="맑은 고딕" w:eastAsia="맑은 고딕"/>
+          <w:sz w:val="21"/>
+        </w:rPr>
+        <w:t>구현과 자체 테스트는 마쳤습니다. 남은 관문은 실제 알람 1건을 이 기록 기능을 켠 채 흘려보내 폴더·기록이 설계대로 나오는지 오피스에서 확인하는 일입니다(결과 자체는 무관하며, 기록이 남기만 하면 통과). 아직 실행 전입니다.</w:t>
+      </w:r>
+    </w:p>
+    <w:p>
+      <w:pPr>
+        <w:spacing w:before="200" w:after="120"/>
+      </w:pPr>
+      <w:r>
+        <w:rPr>
+          <w:rFonts w:ascii="맑은 고딕" w:hAnsi="맑은 고딕" w:eastAsia="맑은 고딕"/>
+          <w:b/>
+          <w:color w:val="142A55"/>
+          <w:sz w:val="27"/>
+        </w:rPr>
+        <w:t>10. 탐색 엔진 재설계 — search-around (zoom-out + 격자 sweep)</w:t>
+      </w:r>
+    </w:p>
+    <w:p>
+      <w:pPr>
+        <w:spacing w:after="120"/>
+      </w:pPr>
+      <w:r>
+        <w:rPr>
+          <w:rFonts w:ascii="맑은 고딕" w:hAnsi="맑은 고딕" w:eastAsia="맑은 고딕"/>
+          <w:sz w:val="21"/>
+        </w:rPr>
+        <w:t>정렬 위치가 화면에 안 보일 때 찾아 나서는 탐색 방식을 새로 설계했습니다. 기존에는 나선형으로 화면을 훑었다면, 이번에는 배율을 낮춰 시야를 먼저 넓힌 뒤 그 시야를 격자로 나눠 훑고(먼저 후보를 다 모은 뒤 가장 유력한 곳으로 이동), 화면이 얼마나 움직였는지를 스스로 추적(영상 간 이동량 자동 계산)합니다. 마우스 휠로 배율이 안 바뀌는 장비는 배율 조절 버튼으로 대체합니다. 판독에 실패하거나 등록된 배율 정보가 없으면 기존 방식으로 자동 전환되어 항상 안전하게 동작합니다.</w:t>
+      </w:r>
+    </w:p>
+    <w:p>
+      <w:pPr>
+        <w:spacing w:after="120"/>
+      </w:pPr>
+      <w:r>
+        <w:rPr>
+          <w:rFonts w:ascii="맑은 고딕" w:hAnsi="맑은 고딕" w:eastAsia="맑은 고딕"/>
+          <w:sz w:val="21"/>
+        </w:rPr>
+        <w:t xml:space="preserve">이 방식을 새 기본값으로 채택했습니다. </w:t>
+      </w:r>
+      <w:r>
+        <w:rPr>
+          <w:rFonts w:ascii="맑은 고딕" w:hAnsi="맑은 고딕" w:eastAsia="맑은 고딕"/>
+          <w:b/>
+          <w:sz w:val="21"/>
+        </w:rPr>
+        <w:t>다만 오피스 실장비에서는 아직 검증 전입니다</w:t>
+      </w:r>
+      <w:r>
+        <w:rPr>
+          <w:rFonts w:ascii="맑은 고딕" w:hAnsi="맑은 고딕" w:eastAsia="맑은 고딕"/>
+          <w:sz w:val="21"/>
+        </w:rPr>
+        <w:t xml:space="preserve"> — 이번 기간의 다음 확인 대상입니다.</w:t>
+      </w:r>
+    </w:p>
+    <w:p>
+      <w:pPr>
+        <w:spacing w:before="200" w:after="120"/>
+      </w:pPr>
+      <w:r>
+        <w:rPr>
+          <w:rFonts w:ascii="맑은 고딕" w:hAnsi="맑은 고딕" w:eastAsia="맑은 고딕"/>
+          <w:b/>
+          <w:color w:val="142A55"/>
+          <w:sz w:val="27"/>
+        </w:rPr>
+        <w:t>11. 실패 원인 설명과 엔지니어 대기 개선 (2026-09-01)</w:t>
+      </w:r>
+    </w:p>
+    <w:p>
+      <w:pPr>
+        <w:spacing w:after="120"/>
+      </w:pPr>
+      <w:r>
+        <w:rPr>
+          <w:rFonts w:ascii="맑은 고딕" w:hAnsi="맑은 고딕" w:eastAsia="맑은 고딕"/>
+          <w:sz w:val="21"/>
+        </w:rPr>
+        <w:t>보정이 안 되는 알람에서 지금까지는 담당자에게 상태 코드 한 줄만 보냈습니다. 코드만 봐서는 엔지니어가 "장비 위치(경로)를 다시 잡아야 하는지, Recipe를 재등록해야 하는지, 그냥 기다리면 되는지"를 알 수 없었습니다. 이번에 보정 불가 상태마다 원인과 요구 행동, 참고용 매칭 점수를 함께 담아 알림을 보내도록 고쳤습니다. 등록 이미지를 못 찾은 경우도 "이미지 폴더 자체가 없다"와 "폴더는 있는데 등록 이미지가 없다"를 구분해, 엔지니어가 손댈 곳이 경로 설정인지 Recipe 재등록인지 알림만 보고 판단할 수 있게 했습니다.</w:t>
+      </w:r>
+    </w:p>
+    <w:p>
+      <w:pPr>
+        <w:spacing w:after="120"/>
+      </w:pPr>
+      <w:r>
+        <w:rPr>
+          <w:rFonts w:ascii="맑은 고딕" w:hAnsi="맑은 고딕" w:eastAsia="맑은 고딕"/>
+          <w:sz w:val="21"/>
+        </w:rPr>
+        <w:t>또한 엔지니어가 화면 공유 요청에 응해 실제로 접속한 시점을 감지해 그 시점부터 대기 시간을 다시 세도록 고쳤습니다. 이전에는 알림을 보낸 직후부터 대기 시간이 흘러, 엔지니어가 도착할 즈음에는 이미 장비 창을 닫고 나간 뒤인 경우가 있었습니다. 접속 요청 팝업이 장비 화면 안에 그려지는 원격 화면이라 로컬 최상위 창으로 뜨지 않는다는 사실을 오피스에서 확인해, 검출 방식을 창 제목 검색에서 장비 창 화면 안 관찰로 바꿨습니다 — 이전 방식은 원리상 한 번도 작동한 적이 없었습니다.</w:t>
+      </w:r>
+    </w:p>
+    <w:p>
+      <w:pPr>
+        <w:spacing w:before="200" w:after="120"/>
+      </w:pPr>
+      <w:r>
+        <w:rPr>
+          <w:rFonts w:ascii="맑은 고딕" w:hAnsi="맑은 고딕" w:eastAsia="맑은 고딕"/>
+          <w:b/>
+          <w:color w:val="142A55"/>
+          <w:sz w:val="27"/>
+        </w:rPr>
+        <w:t>12. 진행 현황</w:t>
       </w:r>
     </w:p>
     <w:p>
@@ -9269,6 +9713,194 @@
           </w:p>
         </w:tc>
       </w:tr>
+      <w:tr>
+        <w:tc>
+          <w:tcPr>
+            <w:tcW w:type="dxa" w:w="2880"/>
+          </w:tcPr>
+          <w:p>
+            <w:r/>
+            <w:r>
+              <w:rPr>
+                <w:rFonts w:ascii="맑은 고딕" w:hAnsi="맑은 고딕" w:eastAsia="맑은 고딕"/>
+                <w:sz w:val="19"/>
+              </w:rPr>
+              <w:t>관측 계층</w:t>
+            </w:r>
+          </w:p>
+        </w:tc>
+        <w:tc>
+          <w:tcPr>
+            <w:tcW w:type="dxa" w:w="2880"/>
+          </w:tcPr>
+          <w:p>
+            <w:r/>
+            <w:r>
+              <w:rPr>
+                <w:rFonts w:ascii="맑은 고딕" w:hAnsi="맑은 고딕" w:eastAsia="맑은 고딕"/>
+                <w:sz w:val="19"/>
+              </w:rPr>
+              <w:t>Recovery Episode 수집(시도별 기록·판정 3요소·Outcome)</w:t>
+            </w:r>
+          </w:p>
+        </w:tc>
+        <w:tc>
+          <w:tcPr>
+            <w:tcW w:type="dxa" w:w="2880"/>
+          </w:tcPr>
+          <w:p>
+            <w:r/>
+            <w:r>
+              <w:rPr>
+                <w:rFonts w:ascii="맑은 고딕" w:hAnsi="맑은 고딕" w:eastAsia="맑은 고딕"/>
+                <w:sz w:val="19"/>
+              </w:rPr>
+              <w:t>✅ 구현 완료 · 🟡 첫 오피스 기록 대기</w:t>
+            </w:r>
+          </w:p>
+        </w:tc>
+      </w:tr>
+      <w:tr>
+        <w:tc>
+          <w:tcPr>
+            <w:tcW w:type="dxa" w:w="2880"/>
+          </w:tcPr>
+          <w:p>
+            <w:r/>
+            <w:r>
+              <w:rPr>
+                <w:rFonts w:ascii="맑은 고딕" w:hAnsi="맑은 고딕" w:eastAsia="맑은 고딕"/>
+                <w:sz w:val="19"/>
+              </w:rPr>
+              <w:t>탐색 엔진</w:t>
+            </w:r>
+          </w:p>
+        </w:tc>
+        <w:tc>
+          <w:tcPr>
+            <w:tcW w:type="dxa" w:w="2880"/>
+          </w:tcPr>
+          <w:p>
+            <w:r/>
+            <w:r>
+              <w:rPr>
+                <w:rFonts w:ascii="맑은 고딕" w:hAnsi="맑은 고딕" w:eastAsia="맑은 고딕"/>
+                <w:sz w:val="19"/>
+              </w:rPr>
+              <w:t>search-around(배율 축소+격자 탐색) 재설계, 기본값 채택</w:t>
+            </w:r>
+          </w:p>
+        </w:tc>
+        <w:tc>
+          <w:tcPr>
+            <w:tcW w:type="dxa" w:w="2880"/>
+          </w:tcPr>
+          <w:p>
+            <w:r/>
+            <w:r>
+              <w:rPr>
+                <w:rFonts w:ascii="맑은 고딕" w:hAnsi="맑은 고딕" w:eastAsia="맑은 고딕"/>
+                <w:sz w:val="19"/>
+              </w:rPr>
+              <w:t>✅ 구현 완료 · 🟡 오피스 실장비 미검증</w:t>
+            </w:r>
+          </w:p>
+        </w:tc>
+      </w:tr>
+      <w:tr>
+        <w:tc>
+          <w:tcPr>
+            <w:tcW w:type="dxa" w:w="2880"/>
+          </w:tcPr>
+          <w:p>
+            <w:r/>
+            <w:r>
+              <w:rPr>
+                <w:rFonts w:ascii="맑은 고딕" w:hAnsi="맑은 고딕" w:eastAsia="맑은 고딕"/>
+                <w:sz w:val="19"/>
+              </w:rPr>
+              <w:t>보정 불가 알림</w:t>
+            </w:r>
+          </w:p>
+        </w:tc>
+        <w:tc>
+          <w:tcPr>
+            <w:tcW w:type="dxa" w:w="2880"/>
+          </w:tcPr>
+          <w:p>
+            <w:r/>
+            <w:r>
+              <w:rPr>
+                <w:rFonts w:ascii="맑은 고딕" w:hAnsi="맑은 고딕" w:eastAsia="맑은 고딕"/>
+                <w:sz w:val="19"/>
+              </w:rPr>
+              <w:t>원인·요구 행동 안내 + 엔지니어 접속 감지 기반 대기 재설정</w:t>
+            </w:r>
+          </w:p>
+        </w:tc>
+        <w:tc>
+          <w:tcPr>
+            <w:tcW w:type="dxa" w:w="2880"/>
+          </w:tcPr>
+          <w:p>
+            <w:r/>
+            <w:r>
+              <w:rPr>
+                <w:rFonts w:ascii="맑은 고딕" w:hAnsi="맑은 고딕" w:eastAsia="맑은 고딕"/>
+                <w:sz w:val="19"/>
+              </w:rPr>
+              <w:t>✅ 구현 완료(2026-09-01) · 🟡 오피스 판독 확인 대기</w:t>
+            </w:r>
+          </w:p>
+        </w:tc>
+      </w:tr>
+      <w:tr>
+        <w:tc>
+          <w:tcPr>
+            <w:tcW w:type="dxa" w:w="2880"/>
+          </w:tcPr>
+          <w:p>
+            <w:r/>
+            <w:r>
+              <w:rPr>
+                <w:rFonts w:ascii="맑은 고딕" w:hAnsi="맑은 고딕" w:eastAsia="맑은 고딕"/>
+                <w:sz w:val="19"/>
+              </w:rPr>
+              <w:t>설정 체계</w:t>
+            </w:r>
+          </w:p>
+        </w:tc>
+        <w:tc>
+          <w:tcPr>
+            <w:tcW w:type="dxa" w:w="2880"/>
+          </w:tcPr>
+          <w:p>
+            <w:r/>
+            <w:r>
+              <w:rPr>
+                <w:rFonts w:ascii="맑은 고딕" w:hAnsi="맑은 고딕" w:eastAsia="맑은 고딕"/>
+                <w:sz w:val="19"/>
+              </w:rPr>
+              <w:t>실행 인자를 진입점 상수 블록으로 통합(정리 전 대비 대폭 축소)</w:t>
+            </w:r>
+          </w:p>
+        </w:tc>
+        <w:tc>
+          <w:tcPr>
+            <w:tcW w:type="dxa" w:w="2880"/>
+          </w:tcPr>
+          <w:p>
+            <w:r/>
+            <w:r>
+              <w:rPr>
+                <w:rFonts w:ascii="맑은 고딕" w:hAnsi="맑은 고딕" w:eastAsia="맑은 고딕"/>
+                <w:sz w:val="19"/>
+              </w:rPr>
+              <w:t>✅ 완료</w:t>
+            </w:r>
+          </w:p>
+        </w:tc>
+      </w:tr>
     </w:tbl>
     <w:p>
       <w:pPr>
@@ -9286,7 +9918,7 @@
           <w:color w:val="142A55"/>
           <w:sz w:val="27"/>
         </w:rPr>
-        <w:t>10. 예상 허들과 대응</w:t>
+        <w:t>13. 예상 허들과 대응</w:t>
       </w:r>
     </w:p>
     <w:p>
@@ -9558,6 +10190,66 @@
     </w:p>
     <w:p>
       <w:pPr>
+        <w:spacing w:after="60"/>
+        <w:ind w:left="360"/>
+      </w:pPr>
+      <w:r>
+        <w:rPr>
+          <w:rFonts w:ascii="맑은 고딕" w:hAnsi="맑은 고딕" w:eastAsia="맑은 고딕"/>
+          <w:b/>
+          <w:color w:val="E86A1F"/>
+          <w:sz w:val="21"/>
+        </w:rPr>
+        <w:t xml:space="preserve">• </w:t>
+      </w:r>
+      <w:r>
+        <w:rPr>
+          <w:rFonts w:ascii="맑은 고딕" w:hAnsi="맑은 고딕" w:eastAsia="맑은 고딕"/>
+          <w:b/>
+          <w:sz w:val="21"/>
+        </w:rPr>
+        <w:t>관측 계층의 첫 실증이 아직입니다</w:t>
+      </w:r>
+      <w:r>
+        <w:rPr>
+          <w:rFonts w:ascii="맑은 고딕" w:hAnsi="맑은 고딕" w:eastAsia="맑은 고딕"/>
+          <w:sz w:val="21"/>
+        </w:rPr>
+        <w:t>: Recovery Episode 수집은 구현·자체 테스트를 마쳤지만, 실제 알람에서 기록이 설계대로 남는지는 아직 확인 전입니다. → 결과 자체는 무관하게(기록만 남으면 통과) 첫 알람 1건을 수집 켠 채로 흘려보내 확인하는 것을 다음 확인 대상으로 잡았습니다.</w:t>
+      </w:r>
+    </w:p>
+    <w:p>
+      <w:pPr>
+        <w:spacing w:after="60"/>
+        <w:ind w:left="360"/>
+      </w:pPr>
+      <w:r>
+        <w:rPr>
+          <w:rFonts w:ascii="맑은 고딕" w:hAnsi="맑은 고딕" w:eastAsia="맑은 고딕"/>
+          <w:b/>
+          <w:color w:val="E86A1F"/>
+          <w:sz w:val="21"/>
+        </w:rPr>
+        <w:t xml:space="preserve">• </w:t>
+      </w:r>
+      <w:r>
+        <w:rPr>
+          <w:rFonts w:ascii="맑은 고딕" w:hAnsi="맑은 고딕" w:eastAsia="맑은 고딕"/>
+          <w:b/>
+          <w:sz w:val="21"/>
+        </w:rPr>
+        <w:t>탐색 엔진 재설계의 실장비 검증 갭</w:t>
+      </w:r>
+      <w:r>
+        <w:rPr>
+          <w:rFonts w:ascii="맑은 고딕" w:hAnsi="맑은 고딕" w:eastAsia="맑은 고딕"/>
+          <w:sz w:val="21"/>
+        </w:rPr>
+        <w:t>: search-around 방식은 오프라인·모의 데이터로만 검증됐습니다. → 실장비에서 배율 조작 방식(휠/버튼)이 예상과 다르면 기존 방식으로 자동 강등되므로 급격한 회귀 위험은 낮지만, 정식 확인은 오피스에서 진행합니다.</w:t>
+      </w:r>
+    </w:p>
+    <w:p>
+      <w:pPr>
         <w:spacing w:before="200" w:after="120"/>
       </w:pPr>
       <w:r>
@@ -9567,7 +10259,7 @@
           <w:color w:val="142A55"/>
           <w:sz w:val="27"/>
         </w:rPr>
-        <w:t>11. 향후 일정</w:t>
+        <w:t>14. 향후 일정</w:t>
       </w:r>
     </w:p>
     <w:p>
@@ -9590,14 +10282,14 @@
           <w:b/>
           <w:sz w:val="21"/>
         </w:rPr>
-        <w:t>8월 후반</w:t>
-      </w:r>
-      <w:r>
-        <w:rPr>
-          <w:rFonts w:ascii="맑은 고딕" w:hAnsi="맑은 고딕" w:eastAsia="맑은 고딕"/>
-          <w:sz w:val="21"/>
-        </w:rPr>
-        <w:t>: 첫 실알람 완주 확인(엔지니어 입회), 엔지니어 작업 완료 감지의 오피스 판독 확인, 녹화 1건의 절차 추출 실행과 "쓸 만한 데이터인가" 판정.</w:t>
+        <w:t>9월 초</w:t>
+      </w:r>
+      <w:r>
+        <w:rPr>
+          <w:rFonts w:ascii="맑은 고딕" w:hAnsi="맑은 고딕" w:eastAsia="맑은 고딕"/>
+          <w:sz w:val="21"/>
+        </w:rPr>
+        <w:t>: 첫 실알람에서 Recovery Episode 기록 확인, search-around 탐색 엔진 오피스 검증, 엔지니어 접속 감지의 오피스 판독 확인, 녹화 1건의 절차 추출 실행과 "쓸 만한 데이터인가" 판정.</w:t>
       </w:r>
     </w:p>
     <w:p>
@@ -9688,6 +10380,1169 @@
           <w:sz w:val="21"/>
         </w:rPr>
         <w:t>: 이번 PoC를 발판 삼아 VLM이 Recipe Tuning을 실제로 수행하도록 workflow 구조를 다듬을 예정입니다.</w:t>
+      </w:r>
+    </w:p>
+    <w:p>
+      <w:r>
+        <w:br w:type="page"/>
+      </w:r>
+    </w:p>
+    <w:p>
+      <w:pPr>
+        <w:spacing w:before="280" w:after="120"/>
+      </w:pPr>
+      <w:r>
+        <w:rPr>
+          <w:rFonts w:ascii="맑은 고딕" w:hAnsi="맑은 고딕" w:eastAsia="맑은 고딕"/>
+          <w:b/>
+          <w:color w:val="142A55"/>
+          <w:sz w:val="34"/>
+        </w:rPr>
+        <w:t>05. 실패 회복 과정을 눈에 보이게 — 상태 머신 프레임워크 (workflow_4)</w:t>
+      </w:r>
+    </w:p>
+    <w:p>
+      <w:pPr>
+        <w:spacing w:after="120" w:before="80"/>
+        <w:ind w:left="280"/>
+      </w:pPr>
+      <w:r>
+        <w:rPr>
+          <w:rFonts w:ascii="맑은 고딕" w:hAnsi="맑은 고딕" w:eastAsia="맑은 고딕"/>
+          <w:b/>
+          <w:color w:val="E86A1F"/>
+          <w:sz w:val="21"/>
+        </w:rPr>
+        <w:t xml:space="preserve">▎ </w:t>
+      </w:r>
+      <w:r>
+        <w:rPr>
+          <w:rFonts w:ascii="맑은 고딕" w:hAnsi="맑은 고딕" w:eastAsia="맑은 고딕"/>
+          <w:color w:val="556070"/>
+          <w:sz w:val="20"/>
+        </w:rPr>
+        <w:t>목적: workflow_3의 실시간 루프가 커지면서 "지금 어느 단계에 있는지, 실패하면 어디로 다시 시도하는지, 왜 결국 회복됐다고 또는 못 했다고 판단했는지"를 코드를 읽지 않고도 확인할 수 있는 별도 계층이 필요해졌습니다. 그 계층이 workflow_4입니다.</w:t>
+      </w:r>
+    </w:p>
+    <w:p>
+      <w:pPr>
+        <w:spacing w:after="120" w:before="80"/>
+        <w:ind w:left="280"/>
+      </w:pPr>
+      <w:r>
+        <w:rPr>
+          <w:rFonts w:ascii="맑은 고딕" w:hAnsi="맑은 고딕" w:eastAsia="맑은 고딕"/>
+          <w:b/>
+          <w:color w:val="E86A1F"/>
+          <w:sz w:val="21"/>
+        </w:rPr>
+        <w:t xml:space="preserve">▎ </w:t>
+      </w:r>
+      <w:r>
+        <w:rPr>
+          <w:rFonts w:ascii="맑은 고딕" w:hAnsi="맑은 고딕" w:eastAsia="맑은 고딕"/>
+          <w:color w:val="556070"/>
+          <w:sz w:val="20"/>
+        </w:rPr>
+        <w:t>최종 갱신: 2026-09-02 (신설, 2026-08-28 착수)</w:t>
+      </w:r>
+    </w:p>
+    <w:p>
+      <w:pPr>
+        <w:spacing w:before="200" w:after="120"/>
+      </w:pPr>
+      <w:r>
+        <w:rPr>
+          <w:rFonts w:ascii="맑은 고딕" w:hAnsi="맑은 고딕" w:eastAsia="맑은 고딕"/>
+          <w:b/>
+          <w:color w:val="142A55"/>
+          <w:sz w:val="27"/>
+        </w:rPr>
+        <w:t>1. 왜 만들었나</w:t>
+      </w:r>
+    </w:p>
+    <w:p>
+      <w:pPr>
+        <w:spacing w:after="120"/>
+      </w:pPr>
+      <w:r>
+        <w:rPr>
+          <w:rFonts w:ascii="맑은 고딕" w:hAnsi="맑은 고딕" w:eastAsia="맑은 고딕"/>
+          <w:sz w:val="21"/>
+        </w:rPr>
+        <w:t xml:space="preserve">workflow_3의 대응 루프는 알람 1건마다 여러 단계를 순서대로 밟고, 실패하면 재시도하거나 다른 방법으로 넘어갑니다(§04-7 루프 하드닝, §04-9 관측 계층). 이 흐름이 복잡해질수록 "지금 어디에 있는지"와 "실패했을 때 무엇으로 대체됐는지"를 로그 텍스트만으로 따라가기 어려워졌습니다. workflow_4는 이 흐름을 </w:t>
+      </w:r>
+      <w:r>
+        <w:rPr>
+          <w:rFonts w:ascii="맑은 고딕" w:hAnsi="맑은 고딕" w:eastAsia="맑은 고딕"/>
+          <w:b/>
+          <w:sz w:val="21"/>
+        </w:rPr>
+        <w:t>상태 머신(정해진 노드와 노드 사이 이동 규칙)</w:t>
+      </w:r>
+      <w:r>
+        <w:rPr>
+          <w:rFonts w:ascii="맑은 고딕" w:hAnsi="맑은 고딕" w:eastAsia="맑은 고딕"/>
+          <w:sz w:val="21"/>
+        </w:rPr>
+        <w:t xml:space="preserve"> 으로 표현하고, 그 진행 상황을 사람이 읽는 그림(mermaid 다이어그램)과 표로 실시간에 가깝게 보여주는 별도 패키지입니다. 화면 조작이나 VLM 호출은 전혀 하지 않는, workflow_3과 독립된 순수 로직 계층입니다.</w:t>
+      </w:r>
+    </w:p>
+    <w:p>
+      <w:pPr>
+        <w:spacing w:before="200" w:after="120"/>
+      </w:pPr>
+      <w:r>
+        <w:rPr>
+          <w:rFonts w:ascii="맑은 고딕" w:hAnsi="맑은 고딕" w:eastAsia="맑은 고딕"/>
+          <w:b/>
+          <w:color w:val="142A55"/>
+          <w:sz w:val="27"/>
+        </w:rPr>
+        <w:t>2. 지금 무엇을 하고 있나 (2026-08-28 착수)</w:t>
+      </w:r>
+    </w:p>
+    <w:p>
+      <w:pPr>
+        <w:spacing w:after="120"/>
+      </w:pPr>
+      <w:r>
+        <w:rPr>
+          <w:rFonts w:ascii="맑은 고딕" w:hAnsi="맑은 고딕" w:eastAsia="맑은 고딕"/>
+          <w:b/>
+          <w:sz w:val="21"/>
+        </w:rPr>
+        <w:t>두 가지를 분리해서 이해해야 합니다.</w:t>
+      </w:r>
+      <w:r>
+        <w:rPr>
+          <w:rFonts w:ascii="맑은 고딕" w:hAnsi="맑은 고딕" w:eastAsia="맑은 고딕"/>
+          <w:sz w:val="21"/>
+        </w:rPr>
+        <w:t xml:space="preserve"> ① 실제 대응 루프를 보여주는 "미러" 기능은 지금 실제로 켤 수 있고, ② 그 흐름 자체를 판단해 실행하는 "엔진"은 아직 데모에서만 돕니다. 루프를 실제로 실행하는 주체는 여전히 기존 workflow_3 실행기이며, 이번 착수분이 그 실행기를 대체하지 않습니다.</w:t>
+      </w:r>
+    </w:p>
+    <w:tbl>
+      <w:tblPr>
+        <w:tblStyle w:val="LightGrid-Accent1"/>
+        <w:tblW w:type="auto" w:w="0"/>
+        <w:jc w:val="center"/>
+        <w:tblLook w:firstColumn="1" w:firstRow="1" w:lastColumn="0" w:lastRow="0" w:noHBand="0" w:noVBand="1" w:val="04A0"/>
+      </w:tblPr>
+      <w:tblGrid>
+        <w:gridCol w:w="2880"/>
+        <w:gridCol w:w="2880"/>
+        <w:gridCol w:w="2880"/>
+      </w:tblGrid>
+      <w:tr>
+        <w:tc>
+          <w:tcPr>
+            <w:tcW w:type="dxa" w:w="2880"/>
+            <w:shd w:val="clear" w:fill="142A55"/>
+          </w:tcPr>
+          <w:p>
+            <w:r/>
+            <w:r>
+              <w:rPr>
+                <w:rFonts w:ascii="맑은 고딕" w:hAnsi="맑은 고딕" w:eastAsia="맑은 고딕"/>
+                <w:b/>
+                <w:color w:val="FFFFFF"/>
+                <w:sz w:val="19"/>
+              </w:rPr>
+              <w:t>구분</w:t>
+            </w:r>
+          </w:p>
+        </w:tc>
+        <w:tc>
+          <w:tcPr>
+            <w:tcW w:type="dxa" w:w="2880"/>
+            <w:shd w:val="clear" w:fill="142A55"/>
+          </w:tcPr>
+          <w:p>
+            <w:r/>
+            <w:r>
+              <w:rPr>
+                <w:rFonts w:ascii="맑은 고딕" w:hAnsi="맑은 고딕" w:eastAsia="맑은 고딕"/>
+                <w:b/>
+                <w:color w:val="FFFFFF"/>
+                <w:sz w:val="19"/>
+              </w:rPr>
+              <w:t>무엇을 하나</w:t>
+            </w:r>
+          </w:p>
+        </w:tc>
+        <w:tc>
+          <w:tcPr>
+            <w:tcW w:type="dxa" w:w="2880"/>
+            <w:shd w:val="clear" w:fill="142A55"/>
+          </w:tcPr>
+          <w:p>
+            <w:r/>
+            <w:r>
+              <w:rPr>
+                <w:rFonts w:ascii="맑은 고딕" w:hAnsi="맑은 고딕" w:eastAsia="맑은 고딕"/>
+                <w:b/>
+                <w:color w:val="FFFFFF"/>
+                <w:sz w:val="19"/>
+              </w:rPr>
+              <w:t>지금 production에 닿는가</w:t>
+            </w:r>
+          </w:p>
+        </w:tc>
+      </w:tr>
+      <w:tr>
+        <w:tc>
+          <w:tcPr>
+            <w:tcW w:type="dxa" w:w="2880"/>
+          </w:tcPr>
+          <w:p>
+            <w:r/>
+            <w:r>
+              <w:rPr>
+                <w:rFonts w:ascii="맑은 고딕" w:hAnsi="맑은 고딕" w:eastAsia="맑은 고딕"/>
+                <w:b/>
+                <w:sz w:val="19"/>
+              </w:rPr>
+              <w:t>미러(mirror)</w:t>
+            </w:r>
+          </w:p>
+        </w:tc>
+        <w:tc>
+          <w:tcPr>
+            <w:tcW w:type="dxa" w:w="2880"/>
+          </w:tcPr>
+          <w:p>
+            <w:r/>
+            <w:r>
+              <w:rPr>
+                <w:rFonts w:ascii="맑은 고딕" w:hAnsi="맑은 고딕" w:eastAsia="맑은 고딕"/>
+                <w:sz w:val="19"/>
+              </w:rPr>
+              <w:t>workflow_3 실행 기록을 읽기 전용으로 따라가며 진행 상황을 그림+표로 남긴다</w:t>
+            </w:r>
+          </w:p>
+        </w:tc>
+        <w:tc>
+          <w:tcPr>
+            <w:tcW w:type="dxa" w:w="2880"/>
+          </w:tcPr>
+          <w:p>
+            <w:r/>
+            <w:r>
+              <w:rPr>
+                <w:rFonts w:ascii="맑은 고딕" w:hAnsi="맑은 고딕" w:eastAsia="맑은 고딕"/>
+                <w:sz w:val="19"/>
+              </w:rPr>
+              <w:t>✅ 켤 수 있음(기본은 꺼짐, 켜도 기존 동작은 그대로)</w:t>
+            </w:r>
+          </w:p>
+        </w:tc>
+      </w:tr>
+      <w:tr>
+        <w:tc>
+          <w:tcPr>
+            <w:tcW w:type="dxa" w:w="2880"/>
+          </w:tcPr>
+          <w:p>
+            <w:r/>
+            <w:r>
+              <w:rPr>
+                <w:rFonts w:ascii="맑은 고딕" w:hAnsi="맑은 고딕" w:eastAsia="맑은 고딕"/>
+                <w:b/>
+                <w:sz w:val="19"/>
+              </w:rPr>
+              <w:t>판정 계층(Outcome)</w:t>
+            </w:r>
+          </w:p>
+        </w:tc>
+        <w:tc>
+          <w:tcPr>
+            <w:tcW w:type="dxa" w:w="2880"/>
+          </w:tcPr>
+          <w:p>
+            <w:r/>
+            <w:r>
+              <w:rPr>
+                <w:rFonts w:ascii="맑은 고딕" w:hAnsi="맑은 고딕" w:eastAsia="맑은 고딕"/>
+                <w:sz w:val="19"/>
+              </w:rPr>
+              <w:t>실패 회복 기록(§04-9 Recovery Episode)의 최종 판정(회복/에스컬레이션 등)을 결정하는 로직</w:t>
+            </w:r>
+          </w:p>
+        </w:tc>
+        <w:tc>
+          <w:tcPr>
+            <w:tcW w:type="dxa" w:w="2880"/>
+          </w:tcPr>
+          <w:p>
+            <w:r/>
+            <w:r>
+              <w:rPr>
+                <w:rFonts w:ascii="맑은 고딕" w:hAnsi="맑은 고딕" w:eastAsia="맑은 고딕"/>
+                <w:sz w:val="19"/>
+              </w:rPr>
+              <w:t>✅ 실제로 쓰임(Recovery Episode 판정의 유일한 소유자)</w:t>
+            </w:r>
+          </w:p>
+        </w:tc>
+      </w:tr>
+      <w:tr>
+        <w:tc>
+          <w:tcPr>
+            <w:tcW w:type="dxa" w:w="2880"/>
+          </w:tcPr>
+          <w:p>
+            <w:r/>
+            <w:r>
+              <w:rPr>
+                <w:rFonts w:ascii="맑은 고딕" w:hAnsi="맑은 고딕" w:eastAsia="맑은 고딕"/>
+                <w:b/>
+                <w:sz w:val="19"/>
+              </w:rPr>
+              <w:t>엔진(engine)</w:t>
+            </w:r>
+          </w:p>
+        </w:tc>
+        <w:tc>
+          <w:tcPr>
+            <w:tcW w:type="dxa" w:w="2880"/>
+          </w:tcPr>
+          <w:p>
+            <w:r/>
+            <w:r>
+              <w:rPr>
+                <w:rFonts w:ascii="맑은 고딕" w:hAnsi="맑은 고딕" w:eastAsia="맑은 고딕"/>
+                <w:sz w:val="19"/>
+              </w:rPr>
+              <w:t>흐름 자체를 상태 머신으로 실행하는 실행기</w:t>
+            </w:r>
+          </w:p>
+        </w:tc>
+        <w:tc>
+          <w:tcPr>
+            <w:tcW w:type="dxa" w:w="2880"/>
+          </w:tcPr>
+          <w:p>
+            <w:r/>
+            <w:r>
+              <w:rPr>
+                <w:rFonts w:ascii="맑은 고딕" w:hAnsi="맑은 고딕" w:eastAsia="맑은 고딕"/>
+                <w:sz w:val="19"/>
+              </w:rPr>
+              <w:t>🔵 데모 전용(가짜 시나리오 3종으로만 검증)</w:t>
+            </w:r>
+          </w:p>
+        </w:tc>
+      </w:tr>
+    </w:tbl>
+    <w:p>
+      <w:pPr>
+        <w:spacing w:after="80"/>
+      </w:pPr>
+    </w:p>
+    <w:p>
+      <w:pPr>
+        <w:spacing w:after="120"/>
+      </w:pPr>
+      <w:r>
+        <w:rPr>
+          <w:rFonts w:ascii="맑은 고딕" w:hAnsi="맑은 고딕" w:eastAsia="맑은 고딕"/>
+          <w:b/>
+          <w:sz w:val="21"/>
+        </w:rPr>
+        <w:t>미러</w:t>
+      </w:r>
+      <w:r>
+        <w:rPr>
+          <w:rFonts w:ascii="맑은 고딕" w:hAnsi="맑은 고딕" w:eastAsia="맑은 고딕"/>
+          <w:sz w:val="21"/>
+        </w:rPr>
+        <w:t>는 실행 중인 대응 루프의 기록을 옆에서 읽어 그림으로 옮겨 그리는 것뿐이라, 꺼도 켜도 대응 루프의 동작은 완전히 동일합니다(byte-identical). 켜면 대응 기록이 쌓이는 자리 옆에 웹브라우저로 바로 열리는 그림 파일이 하나 더 생겨, 지금 알람이 어느 단계에 있고 실패해서 어디로 넘어갔는지를 코드 없이 확인할 수 있습니다.</w:t>
+      </w:r>
+    </w:p>
+    <w:p>
+      <w:pPr>
+        <w:spacing w:after="120"/>
+      </w:pPr>
+      <w:r>
+        <w:rPr>
+          <w:rFonts w:ascii="맑은 고딕" w:hAnsi="맑은 고딕" w:eastAsia="맑은 고딕"/>
+          <w:b/>
+          <w:sz w:val="21"/>
+        </w:rPr>
+        <w:t>판정 계층</w:t>
+      </w:r>
+      <w:r>
+        <w:rPr>
+          <w:rFonts w:ascii="맑은 고딕" w:hAnsi="맑은 고딕" w:eastAsia="맑은 고딕"/>
+          <w:sz w:val="21"/>
+        </w:rPr>
+        <w:t>은 §04-9에서 설명한 Recovery Episode의 "결국 회복됐는가"를 결정하는 로직이 실제로 이 패키지에 있다는 뜻입니다. workflow_3의 실제 파일이나 화면을 전혀 알지 못하는 순수 판정 함수라, 장비 없이도 판정 규칙만 독립적으로 검증할 수 있습니다 (예: 측정이 실패로 읽혔는데 진행 수치가 올라갔다고 회복으로 뒤집지 않는다, 관측 자체가 안 됐으면 실패로 단정하지 않고 판정 불명으로 남긴다).</w:t>
+      </w:r>
+    </w:p>
+    <w:p>
+      <w:pPr>
+        <w:spacing w:after="120"/>
+      </w:pPr>
+      <w:r>
+        <w:rPr>
+          <w:rFonts w:ascii="맑은 고딕" w:hAnsi="맑은 고딕" w:eastAsia="맑은 고딕"/>
+          <w:b/>
+          <w:sz w:val="21"/>
+        </w:rPr>
+        <w:t>엔진</w:t>
+      </w:r>
+      <w:r>
+        <w:rPr>
+          <w:rFonts w:ascii="맑은 고딕" w:hAnsi="맑은 고딕" w:eastAsia="맑은 고딕"/>
+          <w:sz w:val="21"/>
+        </w:rPr>
+        <w:t>은 아직 가짜 시나리오(전부 성공 / 1회 실패 후 대체 경로로 성공 / 예산 소진으로 에스컬레이션)로만 돌려 본 상태입니다. 다음 실제 활용처는 정렬 보정 하위 흐름(재조정 → 실패 시 탐색 → 배율 바꿔 재탐색)을 이 엔진으로 옮기는 것이지만, 별도 설계 문서로 전제 조건 3가지를 먼저 정리해 뒀습니다(§5).</w:t>
+      </w:r>
+    </w:p>
+    <w:p>
+      <w:pPr>
+        <w:spacing w:before="200" w:after="120"/>
+      </w:pPr>
+      <w:r>
+        <w:rPr>
+          <w:rFonts w:ascii="맑은 고딕" w:hAnsi="맑은 고딕" w:eastAsia="맑은 고딕"/>
+          <w:b/>
+          <w:color w:val="142A55"/>
+          <w:sz w:val="27"/>
+        </w:rPr>
+        <w:t>3. 핵심 개념</w:t>
+      </w:r>
+    </w:p>
+    <w:p>
+      <w:pPr>
+        <w:spacing w:after="60"/>
+        <w:ind w:left="360"/>
+      </w:pPr>
+      <w:r>
+        <w:rPr>
+          <w:rFonts w:ascii="맑은 고딕" w:hAnsi="맑은 고딕" w:eastAsia="맑은 고딕"/>
+          <w:b/>
+          <w:color w:val="E86A1F"/>
+          <w:sz w:val="21"/>
+        </w:rPr>
+        <w:t xml:space="preserve">• </w:t>
+      </w:r>
+      <w:r>
+        <w:rPr>
+          <w:rFonts w:ascii="맑은 고딕" w:hAnsi="맑은 고딕" w:eastAsia="맑은 고딕"/>
+          <w:b/>
+          <w:sz w:val="21"/>
+        </w:rPr>
+        <w:t>노드와 전이</w:t>
+      </w:r>
+      <w:r>
+        <w:rPr>
+          <w:rFonts w:ascii="맑은 고딕" w:hAnsi="맑은 고딕" w:eastAsia="맑은 고딕"/>
+          <w:sz w:val="21"/>
+        </w:rPr>
+        <w:t>: 각 단계(노드)는 성공하면 다음 어디로, 실패하면 실패 종류별로 어디로 대체 이동할지, 몇 번까지 그 자리에서 재시도할지를 미리 정의합니다.</w:t>
+      </w:r>
+    </w:p>
+    <w:p>
+      <w:pPr>
+        <w:spacing w:after="60"/>
+        <w:ind w:left="360"/>
+      </w:pPr>
+      <w:r>
+        <w:rPr>
+          <w:rFonts w:ascii="맑은 고딕" w:hAnsi="맑은 고딕" w:eastAsia="맑은 고딕"/>
+          <w:b/>
+          <w:color w:val="E86A1F"/>
+          <w:sz w:val="21"/>
+        </w:rPr>
+        <w:t xml:space="preserve">• </w:t>
+      </w:r>
+      <w:r>
+        <w:rPr>
+          <w:rFonts w:ascii="맑은 고딕" w:hAnsi="맑은 고딕" w:eastAsia="맑은 고딕"/>
+          <w:b/>
+          <w:sz w:val="21"/>
+        </w:rPr>
+        <w:t>끝나는 것이 항상 보장됩니다</w:t>
+      </w:r>
+      <w:r>
+        <w:rPr>
+          <w:rFonts w:ascii="맑은 고딕" w:hAnsi="맑은 고딕" w:eastAsia="맑은 고딕"/>
+          <w:sz w:val="21"/>
+        </w:rPr>
+        <w:t>: 전체 재시도 예산, 노드별 재시도 예산, 대체 경로 재방문 상한, 절대 전이 횟수 상한, 중단 신호 폴링까지 겹겹이 걸려 있어 무한히 도는 상황이 구조적으로 불가능합니다.</w:t>
+      </w:r>
+    </w:p>
+    <w:p>
+      <w:pPr>
+        <w:spacing w:after="60"/>
+        <w:ind w:left="360"/>
+      </w:pPr>
+      <w:r>
+        <w:rPr>
+          <w:rFonts w:ascii="맑은 고딕" w:hAnsi="맑은 고딕" w:eastAsia="맑은 고딕"/>
+          <w:b/>
+          <w:color w:val="E86A1F"/>
+          <w:sz w:val="21"/>
+        </w:rPr>
+        <w:t xml:space="preserve">• </w:t>
+      </w:r>
+      <w:r>
+        <w:rPr>
+          <w:rFonts w:ascii="맑은 고딕" w:hAnsi="맑은 고딕" w:eastAsia="맑은 고딕"/>
+          <w:b/>
+          <w:sz w:val="21"/>
+        </w:rPr>
+        <w:t>중단은 두 군데에서 봅니다</w:t>
+      </w:r>
+      <w:r>
+        <w:rPr>
+          <w:rFonts w:ascii="맑은 고딕" w:hAnsi="맑은 고딕" w:eastAsia="맑은 고딕"/>
+          <w:sz w:val="21"/>
+        </w:rPr>
+        <w:t>: 노드와 노드 사이는 엔진이 직접 확인하고, 오래 걸리는 노드(예: 화면을 훑는 탐색 동작) 안에서는 같은 확인 창구를 노드 쪽 코드에 넘겨줘서 노드 스스로 확인하게 합니다. 엔진이 노드 내부까지 강제로 끊을 수는 없기 때문입니다.</w:t>
+      </w:r>
+    </w:p>
+    <w:p>
+      <w:pPr>
+        <w:spacing w:after="60"/>
+        <w:ind w:left="360"/>
+      </w:pPr>
+      <w:r>
+        <w:rPr>
+          <w:rFonts w:ascii="맑은 고딕" w:hAnsi="맑은 고딕" w:eastAsia="맑은 고딕"/>
+          <w:b/>
+          <w:color w:val="E86A1F"/>
+          <w:sz w:val="21"/>
+        </w:rPr>
+        <w:t xml:space="preserve">• </w:t>
+      </w:r>
+      <w:r>
+        <w:rPr>
+          <w:rFonts w:ascii="맑은 고딕" w:hAnsi="맑은 고딕" w:eastAsia="맑은 고딕"/>
+          <w:b/>
+          <w:sz w:val="21"/>
+        </w:rPr>
+        <w:t>진행 상황은 매 전이마다 통째로 다시 저장</w:t>
+      </w:r>
+      <w:r>
+        <w:rPr>
+          <w:rFonts w:ascii="맑은 고딕" w:hAnsi="맑은 고딕" w:eastAsia="맑은 고딕"/>
+          <w:sz w:val="21"/>
+        </w:rPr>
+        <w:t>됩니다. 기록 파일과 그림 파일 모두 덮어쓰기 방식이라 중간에 열어도 항상 최신 상태를 봅니다.</w:t>
+      </w:r>
+    </w:p>
+    <w:p>
+      <w:pPr>
+        <w:spacing w:before="200" w:after="120"/>
+      </w:pPr>
+      <w:r>
+        <w:rPr>
+          <w:rFonts w:ascii="맑은 고딕" w:hAnsi="맑은 고딕" w:eastAsia="맑은 고딕"/>
+          <w:b/>
+          <w:color w:val="142A55"/>
+          <w:sz w:val="27"/>
+        </w:rPr>
+        <w:t>4. 설계 결정 — 왜 만들어 쓰지 않고 새로 짰나</w:t>
+      </w:r>
+    </w:p>
+    <w:p>
+      <w:pPr>
+        <w:spacing w:after="120"/>
+      </w:pPr>
+      <w:r>
+        <w:rPr>
+          <w:rFonts w:ascii="맑은 고딕" w:hAnsi="맑은 고딕" w:eastAsia="맑은 고딕"/>
+          <w:sz w:val="21"/>
+        </w:rPr>
+        <w:t>바깥 상태 머신 라이브러리를 쓰는 대신 외부 의존성 없이 직접 짰습니다(신규 의존성 0개). 검토 근거는 별도 설계 결정 문서(ADR)로 남겼습니다 — 표준 라이브러리 도구들은 이번 요구사항(실패 종류별 대체 경로, 노드별/전체 재시도 예산, 중단 신호 폴링, 그림+표 동시 출력)에 비해 무겁거나 이 프로젝트의 "외부 프레임워크보다 필요한 만큼만 직접 짠다"는 기존 방향과 맞지 않았습니다.</w:t>
+      </w:r>
+    </w:p>
+    <w:p>
+      <w:pPr>
+        <w:spacing w:after="120"/>
+      </w:pPr>
+      <w:r>
+        <w:rPr>
+          <w:rFonts w:ascii="맑은 고딕" w:hAnsi="맑은 고딕" w:eastAsia="맑은 고딕"/>
+          <w:sz w:val="21"/>
+        </w:rPr>
+        <w:t>기존 실행기(workflow_3의 대응 루프 실행기)를 이 엔진으로 바로 갈아타는 안도 검토했지만 채택하지 않았습니다. 이유는 세 가지입니다.</w:t>
+      </w:r>
+    </w:p>
+    <w:p>
+      <w:pPr>
+        <w:spacing w:after="60"/>
+        <w:ind w:left="360"/>
+      </w:pPr>
+      <w:r>
+        <w:rPr>
+          <w:rFonts w:ascii="맑은 고딕" w:hAnsi="맑은 고딕" w:eastAsia="맑은 고딕"/>
+          <w:b/>
+          <w:color w:val="142A55"/>
+          <w:sz w:val="21"/>
+        </w:rPr>
+        <w:t xml:space="preserve">1. </w:t>
+      </w:r>
+      <w:r>
+        <w:rPr>
+          <w:rFonts w:ascii="맑은 고딕" w:hAnsi="맑은 고딕" w:eastAsia="맑은 고딕"/>
+          <w:b/>
+          <w:sz w:val="21"/>
+        </w:rPr>
+        <w:t>위험의 시점이 다릅니다.</w:t>
+      </w:r>
+      <w:r>
+        <w:rPr>
+          <w:rFonts w:ascii="맑은 고딕" w:hAnsi="맑은 고딕" w:eastAsia="맑은 고딕"/>
+          <w:sz w:val="21"/>
+        </w:rPr>
+        <w:t xml:space="preserve"> 실행기를 지금 건드리면 회귀가 오피스에서, 며칠 뒤에야 드러납니다. 반대로 엔진을 당분간 데모 전용으로 묶어 두는 비용은 0에 가깝습니다.</w:t>
+      </w:r>
+    </w:p>
+    <w:p>
+      <w:pPr>
+        <w:spacing w:after="60"/>
+        <w:ind w:left="360"/>
+      </w:pPr>
+      <w:r>
+        <w:rPr>
+          <w:rFonts w:ascii="맑은 고딕" w:hAnsi="맑은 고딕" w:eastAsia="맑은 고딕"/>
+          <w:b/>
+          <w:color w:val="142A55"/>
+          <w:sz w:val="21"/>
+        </w:rPr>
+        <w:t xml:space="preserve">2. </w:t>
+      </w:r>
+      <w:r>
+        <w:rPr>
+          <w:rFonts w:ascii="맑은 고딕" w:hAnsi="맑은 고딕" w:eastAsia="맑은 고딕"/>
+          <w:b/>
+          <w:sz w:val="21"/>
+        </w:rPr>
+        <w:t>기존 실행 기록 형식이 같은 단계의 재방문을 표현하지 못합니다.</w:t>
+      </w:r>
+      <w:r>
+        <w:rPr>
+          <w:rFonts w:ascii="맑은 고딕" w:hAnsi="맑은 고딕" w:eastAsia="맑은 고딕"/>
+          <w:sz w:val="21"/>
+        </w:rPr>
+        <w:t xml:space="preserve"> 억지로 끼워 넣으면 기록 형식이 바뀌고, 그 형식을 읽는 다른 도구(미러, 시연 영상, 오피스 엔지니어가 보는 화면)가 전부 함께 깨집니다.</w:t>
+      </w:r>
+    </w:p>
+    <w:p>
+      <w:pPr>
+        <w:spacing w:after="60"/>
+        <w:ind w:left="360"/>
+      </w:pPr>
+      <w:r>
+        <w:rPr>
+          <w:rFonts w:ascii="맑은 고딕" w:hAnsi="맑은 고딕" w:eastAsia="맑은 고딕"/>
+          <w:b/>
+          <w:color w:val="142A55"/>
+          <w:sz w:val="21"/>
+        </w:rPr>
+        <w:t xml:space="preserve">3. </w:t>
+      </w:r>
+      <w:r>
+        <w:rPr>
+          <w:rFonts w:ascii="맑은 고딕" w:hAnsi="맑은 고딕" w:eastAsia="맑은 고딕"/>
+          <w:b/>
+          <w:sz w:val="21"/>
+        </w:rPr>
+        <w:t>뒷정리(장비 창 닫기, 알림, 녹화 종료)는 실행기 소관이 아닙니다.</w:t>
+      </w:r>
+      <w:r>
+        <w:rPr>
+          <w:rFonts w:ascii="맑은 고딕" w:hAnsi="맑은 고딕" w:eastAsia="맑은 고딕"/>
+          <w:sz w:val="21"/>
+        </w:rPr>
+        <w:t xml:space="preserve"> 이 계약은 실행기를 감싸는 바깥 코드가 갖고 있어, 어떤 실행기가 안쪽 단계를 돌리든 그대로 유지됩니다.</w:t>
+      </w:r>
+    </w:p>
+    <w:p>
+      <w:pPr>
+        <w:spacing w:before="200" w:after="120"/>
+      </w:pPr>
+      <w:r>
+        <w:rPr>
+          <w:rFonts w:ascii="맑은 고딕" w:hAnsi="맑은 고딕" w:eastAsia="맑은 고딕"/>
+          <w:b/>
+          <w:color w:val="142A55"/>
+          <w:sz w:val="27"/>
+        </w:rPr>
+        <w:t>5. 다음 실제 활용처와 전제 조건</w:t>
+      </w:r>
+    </w:p>
+    <w:p>
+      <w:pPr>
+        <w:spacing w:after="120"/>
+      </w:pPr>
+      <w:r>
+        <w:rPr>
+          <w:rFonts w:ascii="맑은 고딕" w:hAnsi="맑은 고딕" w:eastAsia="맑은 고딕"/>
+          <w:sz w:val="21"/>
+        </w:rPr>
+        <w:t>엔진의 첫 실제 활용처는 정렬 보정 하위 흐름(§04-10 탐색 엔진 포함)을 이 상태 머신으로 옮기는 것으로 계획했습니다. 다만 별도 설계로 다루기로 하고, 착수 전 전제 조건 3가지를 정해 뒀습니다.</w:t>
+      </w:r>
+    </w:p>
+    <w:p>
+      <w:pPr>
+        <w:spacing w:after="60"/>
+        <w:ind w:left="360"/>
+      </w:pPr>
+      <w:r>
+        <w:rPr>
+          <w:rFonts w:ascii="맑은 고딕" w:hAnsi="맑은 고딕" w:eastAsia="맑은 고딕"/>
+          <w:b/>
+          <w:color w:val="142A55"/>
+          <w:sz w:val="21"/>
+        </w:rPr>
+        <w:t xml:space="preserve">1. </w:t>
+      </w:r>
+      <w:r>
+        <w:rPr>
+          <w:rFonts w:ascii="맑은 고딕" w:hAnsi="맑은 고딕" w:eastAsia="맑은 고딕"/>
+          <w:b/>
+          <w:sz w:val="21"/>
+        </w:rPr>
+        <w:t>중단 신호가 끝까지 관통해야 합니다.</w:t>
+      </w:r>
+      <w:r>
+        <w:rPr>
+          <w:rFonts w:ascii="맑은 고딕" w:hAnsi="맑은 고딕" w:eastAsia="맑은 고딕"/>
+          <w:sz w:val="21"/>
+        </w:rPr>
+        <w:t xml:space="preserve"> 이번 착수 중 "오래 걸리는 노드 안에서 중단 신호를 놓친다"는 결함을 실제로 잡아 고쳤습니다 — 냉각 대기 같은 구간을 잘게 쪼개 계속 확인하도록 바꿨습니다.</w:t>
+      </w:r>
+    </w:p>
+    <w:p>
+      <w:pPr>
+        <w:spacing w:after="60"/>
+        <w:ind w:left="360"/>
+      </w:pPr>
+      <w:r>
+        <w:rPr>
+          <w:rFonts w:ascii="맑은 고딕" w:hAnsi="맑은 고딕" w:eastAsia="맑은 고딕"/>
+          <w:b/>
+          <w:color w:val="142A55"/>
+          <w:sz w:val="21"/>
+        </w:rPr>
+        <w:t xml:space="preserve">2. </w:t>
+      </w:r>
+      <w:r>
+        <w:rPr>
+          <w:rFonts w:ascii="맑은 고딕" w:hAnsi="맑은 고딕" w:eastAsia="맑은 고딕"/>
+          <w:b/>
+          <w:sz w:val="21"/>
+        </w:rPr>
+        <w:t>예산은 시도 횟수가 아니라 실제 걸리는 시간 기준으로 설계해야 합니다.</w:t>
+      </w:r>
+      <w:r>
+        <w:rPr>
+          <w:rFonts w:ascii="맑은 고딕" w:hAnsi="맑은 고딕" w:eastAsia="맑은 고딕"/>
+          <w:sz w:val="21"/>
+        </w:rPr>
+        <w:t xml:space="preserve"> 시도 횟수만으로 예산을 잡으면 한 단계가 수 분씩 걸려 녹화 세션·장비 점유 가정이 깨질 수 있습니다.</w:t>
+      </w:r>
+    </w:p>
+    <w:p>
+      <w:pPr>
+        <w:spacing w:after="60"/>
+        <w:ind w:left="360"/>
+      </w:pPr>
+      <w:r>
+        <w:rPr>
+          <w:rFonts w:ascii="맑은 고딕" w:hAnsi="맑은 고딕" w:eastAsia="맑은 고딕"/>
+          <w:b/>
+          <w:color w:val="142A55"/>
+          <w:sz w:val="21"/>
+        </w:rPr>
+        <w:t xml:space="preserve">3. </w:t>
+      </w:r>
+      <w:r>
+        <w:rPr>
+          <w:rFonts w:ascii="맑은 고딕" w:hAnsi="맑은 고딕" w:eastAsia="맑은 고딕"/>
+          <w:b/>
+          <w:sz w:val="21"/>
+        </w:rPr>
+        <w:t>그림 파일이 겹치지 않아야 합니다.</w:t>
+      </w:r>
+      <w:r>
+        <w:rPr>
+          <w:rFonts w:ascii="맑은 고딕" w:hAnsi="맑은 고딕" w:eastAsia="맑은 고딕"/>
+          <w:sz w:val="21"/>
+        </w:rPr>
+        <w:t xml:space="preserve"> 바깥 미러가 자동으로 여는 그림과, 안쪽 보정 흐름의 그림이 같은 폴더에 같이 있을 수 있어 서로 다른 이름 + 링크로 구분해야 합니다.</w:t>
+      </w:r>
+    </w:p>
+    <w:p>
+      <w:pPr>
+        <w:spacing w:before="200" w:after="120"/>
+      </w:pPr>
+      <w:r>
+        <w:rPr>
+          <w:rFonts w:ascii="맑은 고딕" w:hAnsi="맑은 고딕" w:eastAsia="맑은 고딕"/>
+          <w:b/>
+          <w:color w:val="142A55"/>
+          <w:sz w:val="27"/>
+        </w:rPr>
+        <w:t>6. 진행 현황</w:t>
+      </w:r>
+    </w:p>
+    <w:tbl>
+      <w:tblPr>
+        <w:tblStyle w:val="LightGrid-Accent1"/>
+        <w:tblW w:type="auto" w:w="0"/>
+        <w:jc w:val="center"/>
+        <w:tblLook w:firstColumn="1" w:firstRow="1" w:lastColumn="0" w:lastRow="0" w:noHBand="0" w:noVBand="1" w:val="04A0"/>
+      </w:tblPr>
+      <w:tblGrid>
+        <w:gridCol w:w="4320"/>
+        <w:gridCol w:w="4320"/>
+      </w:tblGrid>
+      <w:tr>
+        <w:tc>
+          <w:tcPr>
+            <w:tcW w:type="dxa" w:w="4320"/>
+            <w:shd w:val="clear" w:fill="142A55"/>
+          </w:tcPr>
+          <w:p>
+            <w:r/>
+            <w:r>
+              <w:rPr>
+                <w:rFonts w:ascii="맑은 고딕" w:hAnsi="맑은 고딕" w:eastAsia="맑은 고딕"/>
+                <w:b/>
+                <w:color w:val="FFFFFF"/>
+                <w:sz w:val="19"/>
+              </w:rPr>
+              <w:t>항목</w:t>
+            </w:r>
+          </w:p>
+        </w:tc>
+        <w:tc>
+          <w:tcPr>
+            <w:tcW w:type="dxa" w:w="4320"/>
+            <w:shd w:val="clear" w:fill="142A55"/>
+          </w:tcPr>
+          <w:p>
+            <w:r/>
+            <w:r>
+              <w:rPr>
+                <w:rFonts w:ascii="맑은 고딕" w:hAnsi="맑은 고딕" w:eastAsia="맑은 고딕"/>
+                <w:b/>
+                <w:color w:val="FFFFFF"/>
+                <w:sz w:val="19"/>
+              </w:rPr>
+              <w:t>상태</w:t>
+            </w:r>
+          </w:p>
+        </w:tc>
+      </w:tr>
+      <w:tr>
+        <w:tc>
+          <w:tcPr>
+            <w:tcW w:type="dxa" w:w="4320"/>
+          </w:tcPr>
+          <w:p>
+            <w:r/>
+            <w:r>
+              <w:rPr>
+                <w:rFonts w:ascii="맑은 고딕" w:hAnsi="맑은 고딕" w:eastAsia="맑은 고딕"/>
+                <w:sz w:val="19"/>
+              </w:rPr>
+              <w:t>상태 머신 프레임워크(그래프 정의·검증·유계 실행 루프)</w:t>
+            </w:r>
+          </w:p>
+        </w:tc>
+        <w:tc>
+          <w:tcPr>
+            <w:tcW w:type="dxa" w:w="4320"/>
+          </w:tcPr>
+          <w:p>
+            <w:r/>
+            <w:r>
+              <w:rPr>
+                <w:rFonts w:ascii="맑은 고딕" w:hAnsi="맑은 고딕" w:eastAsia="맑은 고딕"/>
+                <w:sz w:val="19"/>
+              </w:rPr>
+              <w:t>✅ 구현 완료</w:t>
+            </w:r>
+          </w:p>
+        </w:tc>
+      </w:tr>
+      <w:tr>
+        <w:tc>
+          <w:tcPr>
+            <w:tcW w:type="dxa" w:w="4320"/>
+          </w:tcPr>
+          <w:p>
+            <w:r/>
+            <w:r>
+              <w:rPr>
+                <w:rFonts w:ascii="맑은 고딕" w:hAnsi="맑은 고딕" w:eastAsia="맑은 고딕"/>
+                <w:sz w:val="19"/>
+              </w:rPr>
+              <w:t>진행 상황 그림+표 실시간 뷰(오프라인, 아무 브라우저)</w:t>
+            </w:r>
+          </w:p>
+        </w:tc>
+        <w:tc>
+          <w:tcPr>
+            <w:tcW w:type="dxa" w:w="4320"/>
+          </w:tcPr>
+          <w:p>
+            <w:r/>
+            <w:r>
+              <w:rPr>
+                <w:rFonts w:ascii="맑은 고딕" w:hAnsi="맑은 고딕" w:eastAsia="맑은 고딕"/>
+                <w:sz w:val="19"/>
+              </w:rPr>
+              <w:t>✅ 구현 완료</w:t>
+            </w:r>
+          </w:p>
+        </w:tc>
+      </w:tr>
+      <w:tr>
+        <w:tc>
+          <w:tcPr>
+            <w:tcW w:type="dxa" w:w="4320"/>
+          </w:tcPr>
+          <w:p>
+            <w:r/>
+            <w:r>
+              <w:rPr>
+                <w:rFonts w:ascii="맑은 고딕" w:hAnsi="맑은 고딕" w:eastAsia="맑은 고딕"/>
+                <w:sz w:val="19"/>
+              </w:rPr>
+              <w:t>workflow_3 대응 루프 읽기 전용 미러</w:t>
+            </w:r>
+          </w:p>
+        </w:tc>
+        <w:tc>
+          <w:tcPr>
+            <w:tcW w:type="dxa" w:w="4320"/>
+          </w:tcPr>
+          <w:p>
+            <w:r/>
+            <w:r>
+              <w:rPr>
+                <w:rFonts w:ascii="맑은 고딕" w:hAnsi="맑은 고딕" w:eastAsia="맑은 고딕"/>
+                <w:sz w:val="19"/>
+              </w:rPr>
+              <w:t>✅ 구현 완료 · 기본 꺼짐(옵트인)</w:t>
+            </w:r>
+          </w:p>
+        </w:tc>
+      </w:tr>
+      <w:tr>
+        <w:tc>
+          <w:tcPr>
+            <w:tcW w:type="dxa" w:w="4320"/>
+          </w:tcPr>
+          <w:p>
+            <w:r/>
+            <w:r>
+              <w:rPr>
+                <w:rFonts w:ascii="맑은 고딕" w:hAnsi="맑은 고딕" w:eastAsia="맑은 고딕"/>
+                <w:sz w:val="19"/>
+              </w:rPr>
+              <w:t>Recovery Episode Outcome 판정 로직</w:t>
+            </w:r>
+          </w:p>
+        </w:tc>
+        <w:tc>
+          <w:tcPr>
+            <w:tcW w:type="dxa" w:w="4320"/>
+          </w:tcPr>
+          <w:p>
+            <w:r/>
+            <w:r>
+              <w:rPr>
+                <w:rFonts w:ascii="맑은 고딕" w:hAnsi="맑은 고딕" w:eastAsia="맑은 고딕"/>
+                <w:sz w:val="19"/>
+              </w:rPr>
+              <w:t>✅ 구현 완료 · 실제로 쓰이는 중(§04-9)</w:t>
+            </w:r>
+          </w:p>
+        </w:tc>
+      </w:tr>
+      <w:tr>
+        <w:tc>
+          <w:tcPr>
+            <w:tcW w:type="dxa" w:w="4320"/>
+          </w:tcPr>
+          <w:p>
+            <w:r/>
+            <w:r>
+              <w:rPr>
+                <w:rFonts w:ascii="맑은 고딕" w:hAnsi="맑은 고딕" w:eastAsia="맑은 고딕"/>
+                <w:sz w:val="19"/>
+              </w:rPr>
+              <w:t>데모 시나리오(전 성공/대체 경로/에스컬레이션)</w:t>
+            </w:r>
+          </w:p>
+        </w:tc>
+        <w:tc>
+          <w:tcPr>
+            <w:tcW w:type="dxa" w:w="4320"/>
+          </w:tcPr>
+          <w:p>
+            <w:r/>
+            <w:r>
+              <w:rPr>
+                <w:rFonts w:ascii="맑은 고딕" w:hAnsi="맑은 고딕" w:eastAsia="맑은 고딕"/>
+                <w:sz w:val="19"/>
+              </w:rPr>
+              <w:t>✅ 검증 완료(모의 데이터)</w:t>
+            </w:r>
+          </w:p>
+        </w:tc>
+      </w:tr>
+      <w:tr>
+        <w:tc>
+          <w:tcPr>
+            <w:tcW w:type="dxa" w:w="4320"/>
+          </w:tcPr>
+          <w:p>
+            <w:r/>
+            <w:r>
+              <w:rPr>
+                <w:rFonts w:ascii="맑은 고딕" w:hAnsi="맑은 고딕" w:eastAsia="맑은 고딕"/>
+                <w:sz w:val="19"/>
+              </w:rPr>
+              <w:t>정렬 보정 하위 흐름을 엔진으로 이전</w:t>
+            </w:r>
+          </w:p>
+        </w:tc>
+        <w:tc>
+          <w:tcPr>
+            <w:tcW w:type="dxa" w:w="4320"/>
+          </w:tcPr>
+          <w:p>
+            <w:r/>
+            <w:r>
+              <w:rPr>
+                <w:rFonts w:ascii="맑은 고딕" w:hAnsi="맑은 고딕" w:eastAsia="맑은 고딕"/>
+                <w:sz w:val="19"/>
+              </w:rPr>
+              <w:t>🔵 계획 단계 · 전제 조건 3가지 정리 완료, 별도 설계 예정</w:t>
+            </w:r>
+          </w:p>
+        </w:tc>
+      </w:tr>
+      <w:tr>
+        <w:tc>
+          <w:tcPr>
+            <w:tcW w:type="dxa" w:w="4320"/>
+          </w:tcPr>
+          <w:p>
+            <w:r/>
+            <w:r>
+              <w:rPr>
+                <w:rFonts w:ascii="맑은 고딕" w:hAnsi="맑은 고딕" w:eastAsia="맑은 고딕"/>
+                <w:sz w:val="19"/>
+              </w:rPr>
+              <w:t>오피스 실장비에서의 미러 확인</w:t>
+            </w:r>
+          </w:p>
+        </w:tc>
+        <w:tc>
+          <w:tcPr>
+            <w:tcW w:type="dxa" w:w="4320"/>
+          </w:tcPr>
+          <w:p>
+            <w:r/>
+            <w:r>
+              <w:rPr>
+                <w:rFonts w:ascii="맑은 고딕" w:hAnsi="맑은 고딕" w:eastAsia="맑은 고딕"/>
+                <w:sz w:val="19"/>
+              </w:rPr>
+              <w:t>🟡 예정</w:t>
+            </w:r>
+          </w:p>
+        </w:tc>
+      </w:tr>
+    </w:tbl>
+    <w:p>
+      <w:pPr>
+        <w:spacing w:after="80"/>
+      </w:pPr>
+    </w:p>
+    <w:p>
+      <w:pPr>
+        <w:spacing w:before="200" w:after="120"/>
+      </w:pPr>
+      <w:r>
+        <w:rPr>
+          <w:rFonts w:ascii="맑은 고딕" w:hAnsi="맑은 고딕" w:eastAsia="맑은 고딕"/>
+          <w:b/>
+          <w:color w:val="142A55"/>
+          <w:sz w:val="27"/>
+        </w:rPr>
+        <w:t>7. 향후 일정</w:t>
+      </w:r>
+    </w:p>
+    <w:p>
+      <w:pPr>
+        <w:spacing w:after="60"/>
+        <w:ind w:left="360"/>
+      </w:pPr>
+      <w:r>
+        <w:rPr>
+          <w:rFonts w:ascii="맑은 고딕" w:hAnsi="맑은 고딕" w:eastAsia="맑은 고딕"/>
+          <w:b/>
+          <w:color w:val="E86A1F"/>
+          <w:sz w:val="21"/>
+        </w:rPr>
+        <w:t xml:space="preserve">• </w:t>
+      </w:r>
+      <w:r>
+        <w:rPr>
+          <w:rFonts w:ascii="맑은 고딕" w:hAnsi="맑은 고딕" w:eastAsia="맑은 고딕"/>
+          <w:b/>
+          <w:sz w:val="21"/>
+        </w:rPr>
+        <w:t>9월 초</w:t>
+      </w:r>
+      <w:r>
+        <w:rPr>
+          <w:rFonts w:ascii="맑은 고딕" w:hAnsi="맑은 고딕" w:eastAsia="맑은 고딕"/>
+          <w:sz w:val="21"/>
+        </w:rPr>
+        <w:t>: workflow_3 대응 루프 미러를 오피스에서 한 번 켜서 실제 그림이 정상적으로 나오는지 확인합니다(대응 루프 자체 동작에는 영향이 없음을 함께 확인).</w:t>
+      </w:r>
+    </w:p>
+    <w:p>
+      <w:pPr>
+        <w:spacing w:after="60"/>
+        <w:ind w:left="360"/>
+      </w:pPr>
+      <w:r>
+        <w:rPr>
+          <w:rFonts w:ascii="맑은 고딕" w:hAnsi="맑은 고딕" w:eastAsia="맑은 고딕"/>
+          <w:b/>
+          <w:color w:val="E86A1F"/>
+          <w:sz w:val="21"/>
+        </w:rPr>
+        <w:t xml:space="preserve">• </w:t>
+      </w:r>
+      <w:r>
+        <w:rPr>
+          <w:rFonts w:ascii="맑은 고딕" w:hAnsi="맑은 고딕" w:eastAsia="맑은 고딕"/>
+          <w:b/>
+          <w:sz w:val="21"/>
+        </w:rPr>
+        <w:t>9월 이후</w:t>
+      </w:r>
+      <w:r>
+        <w:rPr>
+          <w:rFonts w:ascii="맑은 고딕" w:hAnsi="맑은 고딕" w:eastAsia="맑은 고딕"/>
+          <w:sz w:val="21"/>
+        </w:rPr>
+        <w:t>: 정렬 보정 하위 흐름을 이 상태 머신으로 옮기는 별도 설계를 진행합니다. §5의 전제 조건 3가지를 수용 기준으로 삼습니다.</w:t>
       </w:r>
     </w:p>
     <w:sectPr>

</xml_diff>